<commit_message>
Manuscrito: correções das revisões e estudo de caso no Box 1
Co-Authored-By: Claude Opus 5.5 <noreply@anthropic.com>
</commit_message>
<xml_diff>
--- a/manuscript/methods_results.docx
+++ b/manuscript/methods_results.docx
@@ -162,7 +162,7 @@
         <w:pStyle w:val="BodyText"/>
       </w:pPr>
       <w:r>
-        <w:t xml:space="preserve">The levels of the grid were taken from the empirical distribution of tree shape in anurans. We pruned all clades with 40–250 tips from the time-calibrated species-level tree of Portik et al. (2023) and computed γ [CITAR: Pybus &amp; Harvey 2000] and the Colless index normalized against its Yule expectation with the R package treestats [CITAR: Janzen et al. 2024]. For each pool size N (50, 100 and 200 species, as in Duarte et al. 2016), γ took three levels (zero, as in a Yule tree; the median of the empirical clades; and their 10% quantile) and the Colless index took three levels (zero, as in a Yule tree; the median; and the 90% quantile). The resulting targets ranged from −3.79 to −8.92 for γ and from 0.94 to 2.98 for the Colless index (Table S1). We calibrated c and β for each N with curves of the mean statistic against the parameter and accepted a tree only when both statistics fell within 0.5 units of the targets of its cell, which gave acceptance rates of 9–25%. Every cell of the 3 × 3 grid could be filled, so the generator covers the whole empirical space of anuran tree shapes, and the Yule × Yule cell reproduces the trees used in previous validations (Duarte et al. 2016; Peres-Neto &amp; Kembel 2015). We drew 1,000 trees per cell and N, and replicate r of every scenario used tree r of its cell, so that the scenarios were paired by tree.</w:t>
+        <w:t xml:space="preserve">The levels of the grid were taken from the empirical distribution of tree shape in anurans. We pruned all clades with 40–250 tips from the time-calibrated species-level tree of Portik et al. (2023) and computed γ [CITAR: Pybus &amp; Harvey 2000] and the Colless index normalized against its Yule expectation with the R package treestats [CITAR: Janzen et al. 2024]. For each pool size N (50, 100 and 200 species, as in Duarte et al. 2016), γ took three levels (zero, as in a Yule tree; the median of the empirical clades; and their 10% quantile) and the Colless index took three levels (zero, as in a Yule tree; the median; and the 90% quantile). The resulting targets ranged from −3.79 to −8.92 for γ and from 0.94 to 2.98 for the Colless index (Table S1). We calibrated c and β for each N with curves of the mean statistic against the parameter and accepted a tree only when both statistics fell within 0.5 units of the targets of its cell, which gave acceptance rates of 9–25%. Every cell of the 3 × 3 grid could be filled, so the grid spans the empirical range between the 10% and 90% quantiles, although it has no level with γ &gt; 0, and the Yule × Yule cell approximates the trees used in previous validations (Duarte et al. 2016; Peres-Neto &amp; Kembel 2015), since the acceptance window truncates the Yule distribution. We drew 1,000 trees per cell and N, and replicate r of every scenario used tree r of its cell, so that the scenarios were paired by tree.</w:t>
       </w:r>
     </w:p>
     <w:bookmarkEnd w:id="25"/>
@@ -198,7 +198,7 @@
         <w:pStyle w:val="FirstParagraph"/>
       </w:pPr>
       <w:r>
-        <w:t xml:space="preserve">Layer B followed the equations of Thompson et al. (2020), which we implemented in R because neither the original Julia code nor the R package mcomsimr carry a licence. At each time step, the expected abundance of species j at site i was its density-independent growth rate, a Gaussian function of the mismatch between u_j and E_i with breadth σ_j and maximum r_j, multiplied by its abundance and divided by one plus the sum of the competitive effects of all species, following a Beverton–Holt model. Abundances were then drawn from a Poisson distribution, each individual emigrated with probability a, and emigrants were redistributed among sites in proportion to the number of emigrants from the other sites. The environment was static and the sites had no spatial structure, as the dispersal kernel was uniform; this keeps sites exchangeable, so that the site shuffle remains a valid null model and spatial autocorrelation does not confound the phylogenetic tests. All species were seeded with Poisson(0.5) individuals per site every 10 steps during the first 100 steps, the dynamics ran for 1,000 steps, and the final state was analysed as incidence data. Maximum growth rate r_j, drawn between 2 and 8, took the role of h_j in the trait scenarios.</w:t>
+        <w:t xml:space="preserve">Layer B followed the equations of Thompson et al. (2020), which we implemented in R because neither the original Julia code nor the R package mcomsimr carry a licence. At each time step, the expected abundance of species j at site i was its density-independent growth rate, a Gaussian function of the mismatch between u_j and E_i with breadth σ_j and maximum r_j, multiplied by its abundance and divided by one plus the sum of the competitive effects of all species, following a Beverton–Holt model. Abundances were then drawn from a Poisson distribution, each individual emigrated with probability a, and emigrants were redistributed among sites in proportion to the number of emigrants from the other sites. The environment was static and the sites had no spatial structure, as the dispersal kernel was uniform; this keeps sites exchangeable, so that the site shuffle remains a valid null model and spatial autocorrelation does not confound the phylogenetic tests. All species were seeded with Poisson(0.5) individuals per site every 10 steps during the first 100 steps, the dynamics ran for 1,000 steps, and the final state was analysed as incidence data. Maximum growth rate r_j, drawn from a uniform distribution between 2 and 8, took the role of h_j in the trait scenarios.</w:t>
       </w:r>
     </w:p>
     <w:p>
@@ -850,7 +850,7 @@
         <w:pStyle w:val="FirstParagraph"/>
       </w:pPr>
       <w:r>
-        <w:t xml:space="preserve">All tests relate the matrix P of phylogeny-weighted species composition (Pillar &amp; Duarte 2010; Duarte et al. 2016), or the phylogenetic eigenvectors, to the gradient. We computed P with phylogenetic fuzzy weighting and the square-rooted Bray–Curtis dissimilarity between sites (D_P), and tested its association with E with a permutational analysis of variance (PERMANOVA, the adonis statistic) and a Mantel test (Duarte et al. 2016). We also extracted the principal coordinates of phylogenetic structure (PCPS) from D_P and fitted a linear model of each of the first two axes on E (GLM PCPS1 and GLM PCPS2) and a redundancy analysis of both axes on E (RDA PCPS). We re-implemented the phylogenetic community composition approach (PCC) of Peres-Neto and Kembel (2015) from the equations in the original article, using the variance of the adjusted R² across phylogenetic eigenvectors as the test statistic. Every test was evaluated with 999 permutations under two null models, the site shuffle, which permutes the sites, and the taxa shuffle, which permutes the tips of the tree while keeping its topology, and we report the largest of the two p-values (max test), which controls the type I error when either null hypothesis holds (Peres-Neto &amp; Kembel 2015; Duarte et al. 2016).</w:t>
+        <w:t xml:space="preserve">All tests relate the matrix P of phylogeny-weighted species composition (Pillar &amp; Duarte 2010; Duarte et al. 2016), or the phylogenetic eigenvectors, to the gradient. We computed P with phylogenetic fuzzy weighting and the square-rooted Bray–Curtis dissimilarity between sites (D_P), and tested its association with E with a permutational analysis of variance (PERMANOVA, the adonis statistic) and a Mantel test (Duarte et al. 2016). We also extracted the principal coordinates of phylogenetic structure (PCPS) from D_P and fitted a linear model of each of the first two axes on E (GLM PCPS1 and GLM PCPS2) and, in Layer B, a redundancy analysis of both axes on E (RDA PCPS). We re-implemented the phylogenetic community composition approach (PCC) of Peres-Neto and Kembel (2015) from the equations in the original article, using the variance of the adjusted R² across phylogenetic eigenvectors as the test statistic. Every test was evaluated with 999 permutations under two null models, the site shuffle, which permutes the sites, and the taxa shuffle, which permutes the tips of the tree while keeping its topology, and we report the largest of the two p-values (max test), which controls the type I error when either null hypothesis holds (Peres-Neto &amp; Kembel 2015; Duarte et al. 2016).</w:t>
       </w:r>
     </w:p>
     <w:bookmarkEnd w:id="30"/>
@@ -876,7 +876,7 @@
         <w:pStyle w:val="BodyText"/>
       </w:pPr>
       <w:r>
-        <w:t xml:space="preserve">We compared four methods. For PCPS, PCC and the evolutionary principal component analysis (evoPCA; Pavoine 2016), each method took the axis most correlated with E among its first four, and the score of each internal node was the absolute correlation between membership of its clade and the species scores on that axis: the correlations of the columns of P with the PCPS axis, which equal the species scores of the R package PCPS [CITAR: Debastiani &amp; Duarte 2014]; the values of the phylogenetic eigenvector; and the correlations of the species columns of the Hellinger-transformed table of evoPCA (R package adiv; [CITAR: Pavoine 2020, adiv]). We did not use the branch loadings of evoPCA because, with incidence data, a branch is present wherever any of its descendants is, so the branch above a planted clade saturates and small subclades always correlate better with the axis. For phylofactorization (Washburne et al. 2017), the score of each split was the objective of the generalized algorithm, the deviance explained by the phylogenetic factor in a binomial model with incidence data or the variance explained by the isometric log-ratio balance with abundance data; we computed it for every node, which gives the same best split as the R package phylofactor while also ranking all nodes. A method recovered the clade when its best-scoring clade was the planted one (or its complement), and we also recorded the rank of the planted node and the Jaccard similarity between the best-scoring and the planted clades.</w:t>
+        <w:t xml:space="preserve">We compared four methods. For PCPS, PCC and the evolutionary principal component analysis (evoPCA; Pavoine 2016), each method took the axis most correlated with E among its first four, and the score of each internal node was the absolute correlation between membership of its clade and the species scores on that axis: the correlations of the columns of P with the PCPS axis, which equal the species scores of the R package PCPS [CITAR: Debastiani &amp; Duarte 2014]; the values of the phylogenetic eigenvector; and the correlations of the species columns of the Hellinger-transformed table of evoPCA (R package adiv; [CITAR: Pavoine 2020, adiv]). We did not use the branch loadings of evoPCA because, with incidence data, a branch is present wherever any of its descendants is, so the branch above a planted clade saturates and small subclades always correlate better with the axis. For phylofactorization (Washburne et al. 2017), the score of each split was the objective of the generalized algorithm, the deviance explained by the phylogenetic factor in a binomial model with incidence data or the variance explained by the isometric log-ratio balance with abundance data; we computed it for every node, which gives the same best split as the R package phylofactor [CITAR: phylofactor package] while also ranking all nodes. A method recovered the clade when its best-scoring clade was the planted one (or its complement), and we also recorded the rank of the planted node and the Jaccard similarity between the best-scoring and the planted clades.</w:t>
       </w:r>
     </w:p>
     <w:bookmarkEnd w:id="31"/>
@@ -920,7 +920,7 @@
         <w:pStyle w:val="BodyText"/>
       </w:pPr>
       <w:r>
-        <w:t xml:space="preserve">Priors were declared explicitly on the logit scale: normal(0, 1.5) for all coefficients; normal(−2.9, 1.5) for the intercept of the type I models, centred on logit(0.05), and normal(0, 1.5) for the other intercepts; and gamma(2, 0.01) for φ, which is weakly informative around the values implied by the quasibinomial dispersion (φ of about 75–500). We ran four chains of 2,000 iterations (1,000 of warm-up) with adapt_delta = 0.95 and a maximum tree depth of 10, or 12 in the Layer B type I model, in which about 1% of the transitions hit depth 10. We checked convergence with the rank-normalized R̂, the bulk and tail effective sample sizes, the number of divergent transitions and the number of transitions at the maximum tree depth, and model fit with posterior predictive checks, both for each condition and for the sums over the conditions of each test, N and cell. We summarized the results as posterior rates and contrasts between tree shapes or archetypes, with medians and 95% credible intervals.</w:t>
+        <w:t xml:space="preserve">Priors were declared explicitly on the logit scale: normal(0, 1.5) for all coefficients; normal(−2.9, 1.5) for the intercept of the type I models, centred on logit(0.05), and normal(0, 1.5) for the other intercepts; and gamma(2, 0.01) for φ, which is weakly informative around the values implied by the quasibinomial dispersion (φ of about 75–830). We ran four chains of 2,000 iterations (1,000 of warm-up) with adapt_delta = 0.95 and a maximum tree depth of 10 in Layer A and 12 in Layer B, where about 1% of the transitions of the type I model reached depth 10. We checked convergence with the rank-normalized R̂, the bulk and tail effective sample sizes, the number of divergent transitions and the number of transitions at the maximum tree depth, and model fit with posterior predictive checks, both for each condition and for the sums over the conditions of each test, N and cell. We summarized the results as posterior rates and contrasts between tree shapes or archetypes, with medians and 95% credible intervals.</w:t>
       </w:r>
     </w:p>
     <w:bookmarkEnd w:id="33"/>
@@ -984,7 +984,7 @@
         <w:pStyle w:val="FirstParagraph"/>
       </w:pPr>
       <w:r>
-        <w:t xml:space="preserve">The static layer reproduced the published validations. In the Yule trees of Duarte et al. (2016), the rejection rates of the site shuffle, the taxa shuffle and the max test fell within the 95% binomial interval of our estimates in 68 of 72 cells, which is about the number expected by chance when comparing some 60 rates at the 95% level, and the mean adonis R² and Mantel ρ agreed to the second decimal place. The PCC matched the published rates in the scenarios that do not depend on the tree; its power was slightly lower than published, but it varied between 0.71 and 0.93 among 20 Yule trees, and the published values sit at the upper end of that range, as expected from a single favourable tree.</w:t>
+        <w:t xml:space="preserve">The static layer reproduced the published validations. In the Yule trees of Duarte et al. (2016), the rejection rates of the site shuffle, the taxa shuffle and the max test fell within the 95% binomial interval of our estimates in 66 of 72 cells; the six exceptions came from two conditions that fell outside in more than one null model, slightly more than the 3.6 expected by chance. The mean PERMANOVA R² and Mantel ρ agreed to the second decimal place when we used the Bray–Curtis dissimilarity without the square root, as in Duarte et al. (2016); elsewhere we used the square-rooted version. The PCC matched the published rates in the scenarios that do not depend on the tree; its power was slightly lower than published, but it varied between 0.71 and 0.93 among 20 Yule trees, and the published values sit at the upper end of that range, which seems to reflect a single favourable tree.</w:t>
       </w:r>
     </w:p>
     <w:bookmarkEnd w:id="37"/>
@@ -1013,7 +1013,7 @@
         </w:r>
       </w:hyperlink>
       <w:r>
-        <w:t xml:space="preserve">). Under phylogenetic signal in the optima but an independent gradient (S0 and S1), all tests were conservative, and four of them became more conservative in trees with low γ (by 0.011–0.019 in S0).</w:t>
+        <w:t xml:space="preserve">). In S0, where optima had no phylogenetic signal and the gradient was independent, all tests were conservative, and four of them became more conservative in trees with low γ (by 0.011–0.019).</w:t>
       </w:r>
     </w:p>
     <w:p>
@@ -1032,7 +1032,7 @@
         </w:r>
       </w:hyperlink>
       <w:r>
-        <w:t xml:space="preserve">). The PCC was also inflated (+0.045 in Yule trees), but less so with low γ (+0.02), although the credible intervals of the two contrasts overlapped. Interestingly, PERMANOVA, GLM PCPS1 and the Mantel test became more conservative under signal in σ (by 0.01–0.025), and signal in maximum abundance (S2h) did not change the rejection rate of any test. Therefore, the nuisance structure created by a phylogenetically conserved niche breadth seems to affect only the methods that rely on the second PCPS axis or on phylogenetic eigenvectors, and its effect on GLM PCPS2 depends strongly on the distribution of branching times.</w:t>
+        <w:t xml:space="preserve">). The raw rates were even higher at N = 200, up to 0.36 in low-γ trees, since the model shares the scenario effects across N on the logit scale. The PCC was also inflated (+0.045 in Yule trees), but less so with low γ (+0.02), although the credible intervals of the two contrasts overlapped. Interestingly, PERMANOVA, GLM PCPS1 and the Mantel test became more conservative under signal in σ (by 0.01–0.025), and signal in maximum abundance (S2h) did not change the rejection rate of any test. Therefore, the nuisance structure created by a phylogenetically conserved niche breadth seems to affect only the methods that rely on the second PCPS axis or on phylogenetic eigenvectors, and its effect on GLM PCPS2 depends strongly on the distribution of branching times.</w:t>
       </w:r>
     </w:p>
     <w:tbl>
@@ -1140,7 +1140,7 @@
         </w:r>
       </w:hyperlink>
       <w:r>
-        <w:t xml:space="preserve">). At N = 100 with incidence data, low γ reduced the power of GLM PCPS1 from 0.735 to 0.336 in S3b, and similarly in S3a and S3σ (contrasts of −0.32 to −0.46 across N), and the power of the PCC from 0.970 to 0.738 in S3b. The Mantel test lost 0.09–0.18, whereas the power of PERMANOVA was almost insensitive to γ (0.811 in Yule trees and 0.824 with low γ in S3b) and, at N = 200, slightly higher with low γ (+0.04 to +0.08). High imbalance reduced power by at most 0.08. As a result, the rank of the tests changed with tree shape: in S3b, the PCC was the most powerful test in Yule trees and the third with low γ, and in S3a GLM PCPS1 fell from second to fourth. The effect of γ also changed with N in opposite directions among tests, since the loss of GLM PCPS1 increased with N whereas that of the PCC in S3b decreased from 0.48 at N = 50 to 0.10 at N = 200.</w:t>
+        <w:t xml:space="preserve">). At N = 100 with incidence data, low γ reduced the power of GLM PCPS1 from 0.735 to 0.336 in S3b, and similarly in S3a and S3σ (contrasts of −0.32 to −0.46 across N), and the power of the PCC from 0.970 to 0.738 in S3b. The Mantel test lost 0.05–0.14 at N = 100 and up to 0.23 at N = 50, whereas the power of PERMANOVA was almost insensitive to γ (0.811 in Yule trees and 0.824 with low γ in S3b) and, at N = 200, slightly higher with low γ (+0.04 to +0.08). High imbalance reduced power by at most 0.10. As a result, the rank of the tests changed with tree shape: in S3b, the PCC was the most powerful test in Yule trees and the third with low γ, and in S3a GLM PCPS1 fell from third to fourth. The effect of γ also changed with N in opposite directions among tests, since the loss of GLM PCPS1 increased with N whereas that of the PCC in S3b decreased from 0.48 at N = 50 to 0.10 at N = 200.</w:t>
       </w:r>
     </w:p>
     <w:tbl>
@@ -1248,7 +1248,7 @@
         </w:r>
       </w:hyperlink>
       <w:r>
-        <w:t xml:space="preserve">). Under species sorting without competition, power at N = 100 in S3b ranged from 0.87 (PERMANOVA) and 0.92 (Mantel) to 0.96 (PCC) in Yule pool trees, a level similar to that of Layer A. Mass effects reduced the power of every test except GLM PCPS2: relative to species sorting, PERMANOVA lost 0.62 in Yule trees and 0.72 with low γ, the Mantel test 0.75 and 0.79, RDA PCPS 0.58 and 0.55, GLM PCPS1 0.55 and 0.27, and the PCC 0.93 and 0.76, so that the PCC detected the phylogenetic signal in almost no replicate. Surprisingly, adding phylogenetic competition to mass effects partly restored power (for instance, PERMANOVA lost 0.46 instead of 0.62 in Yule trees), whereas phylogenetic competition under species sorting changed power by −0.12 to +0.11. This last contrast should be read with care, since competition prunes close relatives and makes the analysed tree differ from the pool tree, so the effect of the process cannot be separated from a change of tree shape. Under the null hypothesis, no condition at N = 100 had a credible interval above 0.075 (largest posterior median 0.088), but raw rejection rates exceeded that limit at N = 200 for the PCC in S2h (0.111 under species sorting and 0.143 under mass effects, in Yule trees) and for GLM PCPS2 in S2σ under species sorting (0.104–0.129).</w:t>
+        <w:t xml:space="preserve">). Under species sorting without competition, power at N = 100 in S3b ranged from 0.87 (PERMANOVA) and 0.92 (Mantel) to 0.96 (PCC) in Yule pool trees, a level similar to that of Layer A. Mass effects reduced the power of every test except GLM PCPS2: relative to species sorting, PERMANOVA lost 0.62 in Yule trees and 0.72 with low γ, the Mantel test 0.75 and 0.79, RDA PCPS 0.58 and 0.55, GLM PCPS1 0.55 and 0.27, and the PCC 0.93 and 0.76, so that the PCC detected the phylogenetic signal in almost no replicate. Surprisingly, adding phylogenetic competition to mass effects partly restored power (for instance, PERMANOVA lost 0.46 instead of 0.62 in Yule trees), whereas phylogenetic competition under species sorting changed power by −0.12 to +0.11. These contrasts should be read with care, since competition prunes close relatives and changes the analysed tree relative to the pool tree, most strongly under mass effects (Colless about 75% lower), so the effect of the process cannot be separated from a change of tree shape. Under the null hypothesis, no condition at N = 100 had a credible interval above 0.075 (largest posterior median 0.088), but raw rejection rates exceeded that limit at N = 200 for the PCC in S2h (0.111 under species sorting and 0.143 under mass effects, in Yule trees) and for GLM PCPS2 in S2σ under species sorting in the low- and mid-γ cells (0.104–0.129).</w:t>
       </w:r>
     </w:p>
     <w:tbl>
@@ -1364,7 +1364,7 @@
         <w:pStyle w:val="BodyText"/>
       </w:pPr>
       <w:r>
-        <w:t xml:space="preserve">Tree shape changed recovery only for PCPS and PCC. With low γ, PCPS recovered basal clades in 0.58 of the replicates against 0.21 in Yule trees, and recent clades in 0.35 against 0.04 (N = 100), and this advantage grew with N (+0.23 to +0.45 across N and depths). In contrast, the recovery of evoPCA and phylofactorization did not change with γ, and high imbalance reduced recovery by 0.02–0.07 in all methods. Interestingly, low γ improved PCPS for recent as well as for basal clades, so the advantage of basal clades seems to be a matter of degree rather than a different behaviour of the method. With abundance data, the patterns were the same, with lower recovery for the compositional phylofactorization (0.68 and 0.56 for old and recent clades at N = 100).</w:t>
+        <w:t xml:space="preserve">Tree shape changed recovery only for PCPS and PCC. With low γ, PCPS recovered basal clades in 0.58 of the replicates against 0.21 in Yule trees, and recent clades in 0.35 against 0.04 (N = 100), and this advantage grew with N (+0.23 to +0.45 across N and depths). In contrast, the recovery of evoPCA and phylofactorization did not change with γ, and high imbalance reduced recovery by 0.01–0.10 in all methods. Interestingly, low γ improved PCPS for recent as well as for basal clades, so the advantage of basal clades seems to be a matter of degree rather than a different behaviour of the method. With abundance data, the patterns were the same, with lower recovery for the compositional phylofactorization (0.68 and 0.56 for old and recent clades at N = 100).</w:t>
       </w:r>
     </w:p>
     <w:tbl>
@@ -1439,7 +1439,7 @@
               <w:pStyle w:val="ImageCaption"/>
             </w:pPr>
             <w:r>
-              <w:t xml:space="preserve">Figure 5: Probability of recovering the planted clade over the γ × Colless grid at N = 100, incidence data and a shift of 2 (posterior medians), for basal (old) and recent (young) clades. Notice that only PCPS changes markedly with γ, whereas evoPCA and phylofactorization recover the clade at a similar rate in every cell.</w:t>
+              <w:t xml:space="preserve">Figure 5: Probability of recovering the planted clade over the γ × Colless grid at N = 100, incidence data and a shift of 2 (posterior medians), for basal (old) and recent (young) clades. Notice that PCPS gains markedly with low γ and PCC changes in opposite directions for basal and recent clades, whereas evoPCA and phylofactorization recover the clade at a similar rate in every cell.</w:t>
             </w:r>
           </w:p>
           <w:bookmarkEnd w:id="56"/>
@@ -1451,7 +1451,7 @@
         <w:pStyle w:val="BodyText"/>
       </w:pPr>
       <w:r>
-        <w:t xml:space="preserve">All models converged (R̂ ≤ 1.01, bulk effective sample size ≥ 835, tail effective sample size ≥ 1,232, no divergent transitions and no transition at the maximum tree depth), and the posterior predictive intervals of 95% contained 97–98% of the observed rates of each condition (Table S3).</w:t>
+        <w:t xml:space="preserve">All models converged (R̂ ≤ 1.01, bulk effective sample size ≥ 835, tail effective sample size ≥ 1,596, no divergent transitions and no transition at the maximum tree depth), and the posterior predictive intervals of 95% contained 97–98% of the observed rates of each condition (Table S3).</w:t>
       </w:r>
     </w:p>
     <w:bookmarkEnd w:id="57"/>
@@ -1481,7 +1481,7 @@
         </w:r>
       </w:hyperlink>
       <w:r>
-        <w:t xml:space="preserve">). The Atlantic Forest pool (60 species) had γ = −2.51 and a normalized Colless index of 0.67; adding the metacommunities of the interior of São Paulo (81 species) lowered γ to −3.16 with a similar Colless (0.67), and the South American pool (123 species) had γ = −3.90 and a Colless index of 1.99. Thus, γ of the three pools lies between the Yule and the median levels of the grid, and imbalance between the Yule and the median levels except in the largest pool, which lies between the median and the 90% quantile. Across the 100 bootstrap trees of Portik et al. (2023), γ varied by about one unit and the Colless index by up to 1.1 units, and the point-estimate tree sat at the lower edge of the distribution of γ, since the bootstrap trees have deeper roots. As a consequence, the conditions under which we found the largest effects of tree shape, the low-γ cells, are more extreme than these pools, but within the range of the anuran clades used to define the grid. [The application of the methods to the 14 empirical metacommunities will complete this box.]</w:t>
+        <w:t xml:space="preserve">). The Atlantic Forest pool (60 species) had γ = −2.51 and a normalized Colless index of 0.67; adding the metacommunities of the interior of São Paulo (81 species) lowered γ to −3.16 with a similar Colless (0.67), and the South American pool (123 species) had γ = −3.90 and a Colless index of 1.99. Thus, γ of the three pools lies between the Yule and the median levels of the grid, and imbalance between the Yule and the median levels except in the largest pool, which lies between the median and the 90% quantile. Across the 100 bootstrap trees of Portik et al. (2023), γ varied by about one unit and the Colless index by up to 1.1 units, and the point-estimate tree sat at the lower edge of the distribution of γ, probably because the bootstrap trees differ in topology and have deeper roots. As a consequence, the conditions under which we found the largest effects of tree shape, the low-γ cells, are more extreme than these pools, but within the range of the anuran clades used to define the grid. The three metacommunities of the case study (Bocaina, Provete et al. 2014; southern Brazil, Both et al. [CITAR: confirmar 2009 Hydrobiologia 624: 125–138 ou 2011 Acta Oecologica]; northwestern São Paulo, Prado &amp; Rossa-Feres 2014) had small trees, with negative γ in Bocaina (15 species, 13 ponds; −1.59) and southern Brazil (21 species, 32 ponds; −1.53) and positive γ in northwestern São Paulo (26 species, 40 ponds; 1.39), outside the grid. No test rejected the null hypothesis of no association between phylogenetic structure and pond depth with the max test (all p ≥ 0.11). In Bocaina, canopy cover was associated with phylogenetic composition under the site shuffle (p = 0.048–0.053 for PERMANOVA, GLM PCPS1, RDA PCPS and PCC) but not under the taxa shuffle (p = 0.23–0.56). This means that canopy cover structures composition, as found with PCPS by Provete (2018), but that the phylogenetic arrangement of the species adds nothing beyond composition once tips are permuted, which is the inference the max test protects. The clade-scoring methods agreed where the simulation predicts: in Bocaina, PCC, evoPCA and phylofactorization chose the same clade of five Dendropsophus and Scinax species along depth, and in northwestern São Paulo PCC and evoPCA chose the three microhylids; without a significant test, these clades describe the strongest phylogenetic contrast rather than a demonstrated association.</w:t>
       </w:r>
     </w:p>
     <w:tbl>
@@ -1718,6 +1718,69 @@
       </w:r>
       <w:r>
         <w:t xml:space="preserve">, 188, 107907.</w:t>
+      </w:r>
+    </w:p>
+    <w:p>
+      <w:pPr>
+        <w:pStyle w:val="BodyText"/>
+      </w:pPr>
+      <w:r>
+        <w:t xml:space="preserve">Prado, V. H. M., &amp; Rossa-Feres, D. C. (2014). The influence of niche and neutral processes on a neotropical anuran metacommunity.</w:t>
+      </w:r>
+      <w:r>
+        <w:t xml:space="preserve"> </w:t>
+      </w:r>
+      <w:r>
+        <w:rPr>
+          <w:i/>
+          <w:iCs/>
+        </w:rPr>
+        <w:t xml:space="preserve">Austral Ecology</w:t>
+      </w:r>
+      <w:r>
+        <w:t xml:space="preserve">, 39, 540–547.</w:t>
+      </w:r>
+    </w:p>
+    <w:p>
+      <w:pPr>
+        <w:pStyle w:val="BodyText"/>
+      </w:pPr>
+      <w:r>
+        <w:t xml:space="preserve">Provete, D. B. (2018). Canopy cover and structural complexity affect the phylogenetic composition of a pond-dwelling Neotropical anuran metacommunity.</w:t>
+      </w:r>
+      <w:r>
+        <w:t xml:space="preserve"> </w:t>
+      </w:r>
+      <w:r>
+        <w:rPr>
+          <w:i/>
+          <w:iCs/>
+        </w:rPr>
+        <w:t xml:space="preserve">bioRxiv</w:t>
+      </w:r>
+      <w:r>
+        <w:t xml:space="preserve">, doi:10.1101/252478.</w:t>
+      </w:r>
+    </w:p>
+    <w:p>
+      <w:pPr>
+        <w:pStyle w:val="BodyText"/>
+      </w:pPr>
+      <w:r>
+        <w:t xml:space="preserve">Provete, D. B., Gonçalves-Souza, T., Garey, M. V., Martins, I. A., &amp; Rossa-Feres, D. C. (2014). Broad-scale spatial patterns of canopy cover and pond morphology affect the structure of a Neotropical amphibian metacommunity.</w:t>
+      </w:r>
+      <w:r>
+        <w:t xml:space="preserve"> </w:t>
+      </w:r>
+      <w:r>
+        <w:rPr>
+          <w:i/>
+          <w:iCs/>
+        </w:rPr>
+        <w:t xml:space="preserve">Hydrobiologia</w:t>
+      </w:r>
+      <w:r>
+        <w:t xml:space="preserve">, 734, 69–79.</w:t>
       </w:r>
     </w:p>
     <w:p>

</xml_diff>

<commit_message>
Manuscrito: Métodos e Resultados revistos (ICs, versões, H1–H4, posto e Jaccard, Both et al. 2011) e Material Suplementar (Tabelas S1–S3)
Co-Authored-By: Claude Opus 5.5 <noreply@anthropic.com>
</commit_message>
<xml_diff>
--- a/manuscript/methods_results.docx
+++ b/manuscript/methods_results.docx
@@ -31,7 +31,7 @@
         <w:pStyle w:val="Date"/>
       </w:pPr>
       <w:r>
-        <w:t xml:space="preserve">2026-10-19</w:t>
+        <w:t xml:space="preserve">2026-10-20</w:t>
       </w:r>
     </w:p>
     <w:bookmarkStart w:id="36" w:name="methods"/>
@@ -57,7 +57,15 @@
         <w:pStyle w:val="FirstParagraph"/>
       </w:pPr>
       <w:r>
-        <w:t xml:space="preserve">We designed the simulation study following the aims, data-generating mechanisms, estimands, methods and performance measures structure recommended for simulation studies that evaluate statistical methods (DiRenzo et al. 2023; Williams et al. 2024). The study had three aims: (i) to estimate how the shape of the phylogenetic tree, measured as the distribution of branching times (Pybus and Harvey’s γ) and the imbalance of the topology (the Colless index), affects the type I error and the power of tests that relate the phylogenetic structure of metacommunities to an environmental gradient; (ii) to estimate how the same tests perform under different processes of metacommunity assembly, which neither the articles that proposed these tests nor later benchmarks evaluated (Duarte et al. 2016; Peres-Neto &amp; Kembel 2015); and (iii) to estimate how well ordination and factorization methods recover a clade associated with the gradient. We generated metacommunities in two layers (Fig. 1). Layer A follows the static protocol of Peres-Neto, Leibold and Dray (2012), which was also used to validate the tests we evaluated (Duarte et al. 2016; Peres-Neto &amp; Kembel 2015), so our results can be compared directly with the published ones. Layer B simulates metacommunity dynamics with the process-based framework of Thompson et al. (2020), in which species sorting, mass effects and competition emerge from local population dynamics and dispersal. The study was not preregistered; the design was written down before the main runs (docs/PLANO_SIMULACAO.md in the code repository), and we report the departures from that plan where they occur.</w:t>
+        <w:t xml:space="preserve">We designed the simulation study following the aims, data-generating mechanisms, estimands, methods and performance measures structure recommended for simulation studies that evaluate statistical methods (DiRenzo et al. 2023; Williams et al. 2024). The study had three aims: (i) to estimate how the shape of the phylogenetic tree, measured as the distribution of branching times (the γ statistic; [CITAR: Pybus &amp; Harvey 2000]) and the imbalance of the topology (the Colless index; [CITAR: Colless 1982]), affects the type I error and the power of tests that relate the phylogenetic structure of metacommunities to an environmental gradient; (ii) to estimate how the same tests perform under different processes of metacommunity assembly, which, to the best of our knowledge, neither the articles that proposed these tests nor later evaluations of them have addressed (Peres-Neto &amp; Kembel 2015; Duarte et al. 2016); and (iii) to estimate how well ordination and factorization methods recover a clade associated with the gradient. We generated metacommunities in two layers (Fig. 1). Layer A follows the static protocol of Peres-Neto, Leibold and Dray (2012), which was also used to validate the tests we evaluated, so our results can be compared directly with the published ones. Layer B simulates metacommunity dynamics with the process-based framework of Thompson et al. (2020), in which species sorting, mass effects and competition emerge from local population dynamics and dispersal.</w:t>
+      </w:r>
+    </w:p>
+    <w:p>
+      <w:pPr>
+        <w:pStyle w:val="BodyText"/>
+      </w:pPr>
+      <w:r>
+        <w:t xml:space="preserve">We stated four hypotheses before the main runs. We expected that (i) tree imbalance would move the type I error of the taxa shuffle away from the nominal level, since the phylogenetic weights of matrix P are heterogeneous among tips in imbalanced trees (H1); (ii) phylogenetic signal in niche breadth or maximum abundance would inflate the type I error of all tests, with a magnitude that depends on tree shape (H2); (iii) very negative γ, that is, long internal branches near the root, would concentrate variation on the first PCPS axis and favour the recovery of basal over recent clades (H3); and (iv) the ranking of the methods in power and in clade recovery would change with tree shape (H4). The study was not registered. However, we wrote the design and the hypotheses down before the main runs (docs/PLANO_SIMULACAO.md, first committed on 16 October 2026 as commit 668fa60 of the code repository), and we report the departures from that plan where they occur.</w:t>
       </w:r>
     </w:p>
     <w:tbl>
@@ -132,7 +140,7 @@
               <w:pStyle w:val="ImageCaption"/>
             </w:pPr>
             <w:r>
-              <w:t xml:space="preserve">Figure 1: Schematic of the simulation design. Notice that tree shape is controlled before traits are simulated, so that every trait scenario and every assembly process is crossed with the same grid of tree shapes; the inference step uses the same two permutation null models for all tests on matrix P.</w:t>
+              <w:t xml:space="preserve">Figure 1: Schematic of the simulation design. Notice that tree shape is controlled before traits are simulated, so that every trait scenario and every assembly process is crossed with the same grid of tree shapes, and that the inference step uses the same two permutation null models for all tests on matrix P.</w:t>
             </w:r>
           </w:p>
           <w:bookmarkEnd w:id="23"/>
@@ -154,7 +162,7 @@
         <w:pStyle w:val="FirstParagraph"/>
       </w:pPr>
       <w:r>
-        <w:t xml:space="preserve">We controlled γ and the Colless index independently by generating topology and branching times from separate processes. The topology was drawn from Aldous’s β-splitting model [CITAR: Aldous 1996], in which β = 0 gives Yule trees and smaller values give increasingly imbalanced trees. Branching times were drawn from a pure-birth process in which each of the k lineages diversifies at rate k^c, so that c = 0 corresponds to a Yule process and c &lt; 0 to a slowdown in diversification, as under diversity dependence, which produces negative γ. Nodes were ordered by a uniform linear extension of the partial order of the tree, and root depth was set to one. Because γ depends only on the intervals between nodes and the Colless index only on the topology, this construction controls the two axes separately; this generator is our own design choice and not a published model.</w:t>
+        <w:t xml:space="preserve">We controlled γ and the Colless index independently by generating topology and branching times from separate processes. We drew topologies from Aldous’s β-splitting model [CITAR: Aldous 1996], in which β = 0 gives Yule trees and smaller values give increasingly imbalanced trees, and branching times from a pure-birth process in which each of the k lineages diversifies at rate k^c, so that c = 0 corresponds to a Yule process and c &lt; 0 to a slowdown in diversification, as under diversity dependence, which produces negative γ. We then ordered the nodes by a uniform linear extension of the partial order of the tree and set the root depth to one. Because γ depends only on the intervals between nodes and the Colless index only on the topology, this construction controls the two axes separately. This generator is our own design choice and not a published model; it replaced the library of trees from several generators, sampled by strata, that we had planned, because it gives independent control by construction.</w:t>
       </w:r>
     </w:p>
     <w:p>
@@ -162,7 +170,7 @@
         <w:pStyle w:val="BodyText"/>
       </w:pPr>
       <w:r>
-        <w:t xml:space="preserve">The levels of the grid were taken from the empirical distribution of tree shape in anurans. We pruned all clades with 40–250 tips from the time-calibrated species-level tree of Portik et al. (2023) and computed γ [CITAR: Pybus &amp; Harvey 2000] and the Colless index normalized against its Yule expectation with the R package treestats [CITAR: Janzen et al. 2024]. For each pool size N (50, 100 and 200 species, as in Duarte et al. 2016), γ took three levels (zero, as in a Yule tree; the median of the empirical clades; and their 10% quantile) and the Colless index took three levels (zero, as in a Yule tree; the median; and the 90% quantile). The resulting targets ranged from −3.79 to −8.92 for γ and from 0.94 to 2.98 for the Colless index (Table S1). We calibrated c and β for each N with curves of the mean statistic against the parameter and accepted a tree only when both statistics fell within 0.5 units of the targets of its cell, which gave acceptance rates of 9–25%. Every cell of the 3 × 3 grid could be filled, so the grid spans the empirical range between the 10% and 90% quantiles, although it has no level with γ &gt; 0, and the Yule × Yule cell approximates the trees used in previous validations (Duarte et al. 2016; Peres-Neto &amp; Kembel 2015), since the acceptance window truncates the Yule distribution. We drew 1,000 trees per cell and N, and replicate r of every scenario used tree r of its cell, so that the scenarios were paired by tree.</w:t>
+        <w:t xml:space="preserve">We took the levels of the grid from the empirical distribution of tree shape in anurans. We pruned all clades with 40–250 tips from the time-calibrated species-level tree of Portik et al. (2023) and computed γ and the Colless index normalized against its Yule expectation with the R package treestats v. 1.71.13 [CITAR: Janzen et al. 2024]. For each pool size N (50, 100 and 200 species, as in Duarte et al. 2016), γ took three levels, namely zero (as in a Yule tree), the median of the empirical clades and their 10% quantile, and the Colless index took three levels, zero, the median and the 90% quantile (Table S1). We calibrated c and β for each N with curves of the mean statistic against the parameter, and accepted a tree only when both statistics fell within 0.5 units of the targets of its cell, which gave acceptance rates of 9–25%. Thus, every cell of the 3 × 3 grid could be filled, and the grid spans the empirical range of anuran tree shapes between the 10% and 90% quantiles, although it has no level with γ &gt; 0. The Yule × Yule cell approximates the trees used in previous validations (Peres-Neto &amp; Kembel 2015; Duarte et al. 2016), since the acceptance window truncates the Yule distribution of both statistics. We drew 1,000 trees per cell and N, and replicate r of every scenario used tree r of its cell, so that the scenarios were paired by tree.</w:t>
       </w:r>
     </w:p>
     <w:bookmarkEnd w:id="25"/>
@@ -180,7 +188,7 @@
         <w:pStyle w:val="FirstParagraph"/>
       </w:pPr>
       <w:r>
-        <w:t xml:space="preserve">Each metacommunity had 100 sites along an environmental gradient E drawn from a uniform distribution between 0 and 100. The expected abundance of species j at site i followed a Gaussian response, L_ij = h_j exp[−(E_i − u_j)² / (2σ_j²)], and the observed abundance was drawn from a Poisson distribution with mean L_ij (Peres-Neto et al. 2012). The optimum u_j was simulated as a continuous trait on the tree under Brownian motion transformed by Pagel’s λ [CITAR: Pagel 1999] and rescaled to the interval [−1, 101]; niche breadth σ_j was drawn from a normal distribution with mean 10 and standard deviation 10, truncated at zero, and maximum abundance h_j from a uniform distribution between 0 and 30. A novelty of our design is that σ_j and h_j could also carry phylogenetic signal: in that case, we simulated a Brownian trait on the tree (λ = 1) and imposed on it the same marginal distribution by ranks, so that scenarios with and without signal differed only in how the values were arranged on the tree. Empty sites were removed and species absent from every site were pruned from the tree before analysis. We analysed both incidence and abundance data.</w:t>
+        <w:t xml:space="preserve">Each metacommunity had 100 sites along an environmental gradient E drawn from a uniform distribution between 0 and 100. The expected abundance of species j at site i followed a Gaussian response, L_ij = h_j exp[−(E_i − u_j)² / (2σ_j²)], and we drew the observed abundance from a Poisson distribution with mean L_ij (Peres-Neto et al. 2012). We simulated the optimum u_j as a continuous trait on the tree under Brownian motion transformed by Pagel’s λ [CITAR: Pagel 1999] and rescaled it to the interval [−1, 101]; niche breadth σ_j came from a normal distribution with mean 10 and standard deviation 10, truncated at zero, and maximum abundance h_j from a uniform distribution between 0 and 30. In addition, σ_j and h_j could carry phylogenetic signal. In that case, we simulated a Brownian trait on the tree (λ = 1) and imposed on it the same marginal distribution by ranks, so that scenarios with and without signal differed only in how the values were arranged on the tree. We removed empty sites and pruned species absent from every site from the tree before analysis, as one would with real data, and analysed both incidence and abundance data.</w:t>
       </w:r>
     </w:p>
     <w:bookmarkEnd w:id="26"/>
@@ -198,7 +206,7 @@
         <w:pStyle w:val="FirstParagraph"/>
       </w:pPr>
       <w:r>
-        <w:t xml:space="preserve">Layer B followed the equations of Thompson et al. (2020), which we implemented in R because neither the original Julia code nor the R package mcomsimr carry a licence. At each time step, the expected abundance of species j at site i was its density-independent growth rate, a Gaussian function of the mismatch between u_j and E_i with breadth σ_j and maximum r_j, multiplied by its abundance and divided by one plus the sum of the competitive effects of all species, following a Beverton–Holt model. Abundances were then drawn from a Poisson distribution, each individual emigrated with probability a, and emigrants were redistributed among sites in proportion to the number of emigrants from the other sites. The environment was static and the sites had no spatial structure, as the dispersal kernel was uniform; this keeps sites exchangeable, so that the site shuffle remains a valid null model and spatial autocorrelation does not confound the phylogenetic tests. All species were seeded with Poisson(0.5) individuals per site every 10 steps during the first 100 steps, the dynamics ran for 1,000 steps, and the final state was analysed as incidence data. Maximum growth rate r_j, drawn from a uniform distribution between 2 and 8, took the role of h_j in the trait scenarios.</w:t>
+        <w:t xml:space="preserve">Layer B followed the equations of Thompson et al. (2020), which we implemented in R because neither the original Julia code nor the R package mcomsimr [CITAR: Thompson et al., mcomsimr] carry a licence. At each time step, the expected abundance of species j at site i was its density-independent growth rate, a Gaussian function of the mismatch between u_j and E_i with breadth σ_j and maximum r_j, multiplied by its abundance and divided by one plus the sum of the competitive effects of all species at the site, following a Beverton–Holt model [CITAR: Beverton &amp; Holt 1957]. We then drew abundances from a Poisson distribution; each individual emigrated with probability a, and emigrants were redistributed among sites in proportion to the number of emigrants from the other sites. The environment was static and the sites had no spatial structure, because the dispersal kernel was uniform. This keeps sites exchangeable, so that the site shuffle remains a valid null model and spatial autocorrelation does not confound the phylogenetic tests. All species were seeded with Poisson(0.5) individuals per site every 10 steps during the first 100 steps, the dynamics ran for 1,000 steps, and we analysed the final state as incidence data. Maximum growth rate r_j, drawn from a uniform distribution between 2 and 8, took the role of h_j in the trait scenarios.</w:t>
       </w:r>
     </w:p>
     <w:p>
@@ -206,7 +214,7 @@
         <w:pStyle w:val="BodyText"/>
       </w:pPr>
       <w:r>
-        <w:t xml:space="preserve">We crossed two dispersal regimes with two competition structures, giving four archetypes. Dispersal was low (a = 0.01) in species sorting and high (a = 0.5) in mass effects. Competition was either intraspecific only or also interspecific and structured by phylogeny: interspecific coefficients were drawn from a uniform distribution between 0 and 0.1 (relative to an intraspecific coefficient of 1, both multiplied by 0.05) and assigned to species pairs by the rank of their phylogenetic similarity, so that close relatives competed more strongly. Because competition and dispersal remove species, the cell of the grid defined the tree of the regional pool rather than the tree of the analysed metacommunity. We calibrated the size of the pool for each archetype, scenario and N so that the mean number of species left after the dynamics was close to N, and drew the pool tree with the targets of its cell, recalibrating β and c for each pool size. Mass effects with phylogenetic competition could not reach N = 200, since pools of up to 2,900 species left only about 150 species, and this combination was dropped. Layer B used five cells of the grid (the four corners and the centre) and 1,000 replicates per combination, and we recorded the γ and the Colless index of both the pool tree and the analysed tree.</w:t>
+        <w:t xml:space="preserve">We crossed two dispersal regimes with two competition structures, giving four archetypes. Dispersal was low (a = 0.01) in species sorting and high (a = 0.5) in mass effects. Competition was either intraspecific only or also interspecific and structured by phylogeny: interspecific coefficients came from a uniform distribution between 0 and 0.1, relative to an intraspecific coefficient of 1 (both multiplied by 0.05), and were assigned to species pairs by the rank of their phylogenetic similarity, so that close relatives competed more strongly. Since competition and dispersal remove species, the cell of the grid defined the tree of the regional pool rather than the tree of the analysed metacommunity. We therefore calibrated the size of the pool for each archetype, scenario and N so that the mean number of species left after the dynamics was close to N, and drew the pool tree with the targets of its cell, recalibrating β and c for each pool size. However, mass effects with phylogenetic competition could not reach N = 200, since pools of up to 2,900 species left only about 150 species, and we dropped this combination. Layer B used five cells of the grid (the four corners and the centre) and 1,000 replicates per combination, and we recorded γ and the Colless index of both the pool tree and the analysed tree.</w:t>
       </w:r>
     </w:p>
     <w:bookmarkEnd w:id="27"/>
@@ -224,7 +232,7 @@
         <w:pStyle w:val="FirstParagraph"/>
       </w:pPr>
       <w:r>
-        <w:t xml:space="preserve">The eight trait scenarios were the same in both layers (Table 1). In S0 and S1, we analysed a gradient independent of the one that generated the data, with species optima without (S0) or with (S1) phylogenetic signal, so any association between phylogenetic structure and the analysed gradient arises by chance. Scenarios S2, S2σ and S2h used the gradient that generated the data with optima without phylogenetic signal, so they estimate the type I error of the phylogenetic component of each test; S2σ and S2h add phylogenetic signal in niche breadth or in maximum abundance, which creates a nuisance structure, that is, a phylogenetic pattern in the data that is not an association between phylogeny and the gradient. The scenarios under the alternative hypothesis had optima with intermediate (S3a, λ = 0.5) or full (S3b, λ = 1) phylogenetic signal, and S3σ added signal in niche breadth. The estimand of every test was its rejection rate at α = 0.05: the type I error in S0–S2h and the power in S3a–S3σ. For aim (iii), the estimand was the probability that a method identifies a planted clade (see below).</w:t>
+        <w:t xml:space="preserve">The eight trait scenarios were the same in both layers (Table 1). In S0 and S1, we analysed a gradient independent of the one that generated the data, with species optima without (S0) or with (S1) phylogenetic signal, so any association between phylogenetic structure and the analysed gradient arises by chance. Scenarios S2, S2σ and S2h used the gradient that generated the data with optima without phylogenetic signal, so they estimate the type I error of the phylogenetic component of each test. S2σ and S2h add phylogenetic signal in niche breadth or in maximum abundance, which creates a nuisance structure, that is, a phylogenetic pattern in the data that is not an association between phylogeny and the gradient. The scenarios under the alternative hypothesis had optima with intermediate (S3a, λ = 0.5) or full (S3b, λ = 1) phylogenetic signal, and S3σ added signal in niche breadth. Accordingly, the estimand of every test was its rejection rate at α = 0.05, which is the type I error in S0–S2h and the power in S3a–S3σ. For aim (iii), the estimand was the probability that a method identifies a planted clade.</w:t>
       </w:r>
     </w:p>
     <w:tbl>
@@ -850,7 +858,7 @@
         <w:pStyle w:val="FirstParagraph"/>
       </w:pPr>
       <w:r>
-        <w:t xml:space="preserve">All tests relate the matrix P of phylogeny-weighted species composition (Pillar &amp; Duarte 2010; Duarte et al. 2016), or the phylogenetic eigenvectors, to the gradient. We computed P with phylogenetic fuzzy weighting and the square-rooted Bray–Curtis dissimilarity between sites (D_P), and tested its association with E with a permutational analysis of variance (PERMANOVA, the adonis statistic) and a Mantel test (Duarte et al. 2016). We also extracted the principal coordinates of phylogenetic structure (PCPS) from D_P and fitted a linear model of each of the first two axes on E (GLM PCPS1 and GLM PCPS2) and, in Layer B, a redundancy analysis of both axes on E (RDA PCPS). We re-implemented the phylogenetic community composition approach (PCC) of Peres-Neto and Kembel (2015) from the equations in the original article, using the variance of the adjusted R² across phylogenetic eigenvectors as the test statistic. Every test was evaluated with 999 permutations under two null models, the site shuffle, which permutes the sites, and the taxa shuffle, which permutes the tips of the tree while keeping its topology, and we report the largest of the two p-values (max test), which controls the type I error when either null hypothesis holds (Peres-Neto &amp; Kembel 2015; Duarte et al. 2016).</w:t>
+        <w:t xml:space="preserve">All tests relate the matrix P of phylogeny-weighted species composition (Pillar &amp; Duarte 2010; Duarte et al. 2016), or the phylogenetic eigenvectors, to the gradient. We computed P with phylogenetic fuzzy weighting and the square-rooted Bray–Curtis dissimilarity between sites (D_P), and tested its association with E with a permutational multivariate analysis of variance (PERMANOVA; [CITAR: Anderson 2001]) and a Mantel test [CITAR: Mantel 1967], as in Duarte et al. (2016). We also extracted the principal coordinates of phylogenetic structure (PCPS; [CITAR: Duarte 2011; Duarte et al. 2012]) from D_P and fitted a linear model of each of the first two axes on E (GLM PCPS1 and GLM PCPS2); in Layer B, we also fitted a redundancy analysis of both axes on E (RDA PCPS). We re-implemented the phylogenetic community composition approach (PCC) of Peres-Neto and Kembel (2015) from the equations in the original article, using the variance of the adjusted R² across phylogenetic eigenvectors as the test statistic. Every test was evaluated with 999 permutations under two null models, the site shuffle, which permutes the sites, and the taxa shuffle, which permutes the tips of the tree while keeping its topology. We report the largest of the two p-values (max test), which controls the type I error when either null hypothesis holds (Peres-Neto &amp; Kembel 2015; Duarte et al. 2016). We wrote the permutation loops ourselves for efficiency and checked, in unit tests, that the observed statistics equal those of the R packages vegan v. 2.7-6 [CITAR: Oksanen et al. 2025] and PCPS v. 1.0.9 [CITAR: Debastiani &amp; Duarte 2014].</w:t>
       </w:r>
     </w:p>
     <w:bookmarkEnd w:id="30"/>
@@ -868,7 +876,7 @@
         <w:pStyle w:val="FirstParagraph"/>
       </w:pPr>
       <w:r>
-        <w:t xml:space="preserve">To evaluate aim (iii), we planted a clade associated with the gradient in each replicate of Layer A. We drew one internal node whose clade held 10–30% of the tips, either among the older or among the younger half of the eligible nodes, so that basal and recent clades of similar size could be compared. The optima of all species were u_j = −1 + 102 Φ(z_j + δ I_j), where z_j are independent standard normal deviates, I_j indicates membership of the planted clade and δ is the shift; the other species therefore had no phylogenetic signal in their optima, and the shift has the same meaning for every tree size. We used shifts of 0.5, 1 and 2, all nine cells of the grid, N = 50, 100 and 200 with incidence data, and N = 100 with abundance data, with 1,000 replicates per combination. For a given replicate, the planted clade, the optima and the gradient were the same across shifts and data types, so that only the factor of interest changed.</w:t>
+        <w:t xml:space="preserve">To evaluate aim (iii), we planted a clade associated with the gradient in each replicate of Layer A. We drew one internal node whose clade held 10–30% of the tips, either among the older or among the younger half of the eligible nodes, so that basal and recent clades of similar size could be compared. The optima of all species were u_j = −1 + 102 Φ(z_j + δI_j), where z_j are independent standard normal deviates, I_j indicates membership of the planted clade and δ is the shift; the other species therefore had no phylogenetic signal in their optima, and the shift has the same meaning for every tree size. We used shifts of 0.5, 1 and 2, all nine cells of the grid, N = 50, 100 and 200 with incidence data, and N = 100 with abundance data, with 1,000 replicates per combination. For a given replicate, the planted clade, the optima and the gradient were the same across shifts and data types, so that only the factor of interest changed. This objective replaced the per-node effect sizes under continuous Brownian motion that we had planned, because a planted clade defines unambiguously which answer is correct.</w:t>
       </w:r>
     </w:p>
     <w:p>
@@ -876,7 +884,7 @@
         <w:pStyle w:val="BodyText"/>
       </w:pPr>
       <w:r>
-        <w:t xml:space="preserve">We compared four methods. For PCPS, PCC and the evolutionary principal component analysis (evoPCA; Pavoine 2016), each method took the axis most correlated with E among its first four, and the score of each internal node was the absolute correlation between membership of its clade and the species scores on that axis: the correlations of the columns of P with the PCPS axis, which equal the species scores of the R package PCPS [CITAR: Debastiani &amp; Duarte 2014]; the values of the phylogenetic eigenvector; and the correlations of the species columns of the Hellinger-transformed table of evoPCA (R package adiv; [CITAR: Pavoine 2020, adiv]). We did not use the branch loadings of evoPCA because, with incidence data, a branch is present wherever any of its descendants is, so the branch above a planted clade saturates and small subclades always correlate better with the axis. For phylofactorization (Washburne et al. 2017), the score of each split was the objective of the generalized algorithm, the deviance explained by the phylogenetic factor in a binomial model with incidence data or the variance explained by the isometric log-ratio balance with abundance data; we computed it for every node, which gives the same best split as the R package phylofactor [CITAR: phylofactor package] while also ranking all nodes. A method recovered the clade when its best-scoring clade was the planted one (or its complement), and we also recorded the rank of the planted node and the Jaccard similarity between the best-scoring and the planted clades.</w:t>
+        <w:t xml:space="preserve">We compared four methods. For PCPS, PCC and the evolutionary principal component analysis (evoPCA; Pavoine 2016), each method took the axis most correlated with E among its first four, and the score of each internal node was the absolute correlation between membership of its clade and the species scores on that axis. The species scores were the correlations of the columns of P with the PCPS axis, which equal the species scores of the R package PCPS; the values of the phylogenetic eigenvector; and the correlations of the species columns of the Hellinger-transformed table of evoPCA [CITAR: Legendre &amp; Gallagher 2001], computed with the R package adiv v. 2.2.1 [CITAR: Pavoine 2020]. We did not use the branch loadings of evoPCA because, with incidence data, a branch is present wherever any of its descendants is, so the branch above a planted clade saturates and small subclades always correlate better with the axis. For phylofactorization (Washburne et al. 2017), the score of each split was the objective of the algorithm, the deviance explained by the phylogenetic factor in a binomial model with incidence data or the variance explained by the isometric log-ratio balance with abundance data; we computed it for every node, which gives the same best split as the R package phylofactor v. 0.0.1 [CITAR: Washburne et al., phylofactor package] while also ranking all nodes. A method recovered the clade when its best-scoring clade was the planted one or its complement. As complementary measures, which give partial credit to a method that chooses a nested or a slightly larger clade, we recorded the rank of the planted node among all nodes and the Jaccard similarity between the best-scoring and the planted clades.</w:t>
       </w:r>
     </w:p>
     <w:bookmarkEnd w:id="31"/>
@@ -894,7 +902,7 @@
         <w:pStyle w:val="FirstParagraph"/>
       </w:pPr>
       <w:r>
-        <w:t xml:space="preserve">The performance measure of each test was its rejection rate across the 1,000 replicates of a condition, and the performance of each clade-recovery method was its proportion of hits. With K = 1,000 replicates, the Monte Carlo standard error of a rate p is [p(1 − p)/K]^½, which is 0.007 at p = 0.05 and at most 0.016 at p = 0.5, so a 95% Monte Carlo interval around the nominal level spans about ±0.014. We chose K so that this interval would fall within Bradley’s liberal criterion for acceptable type I error, [0.025, 0.075] [CITAR: Bradley 1978], and used 999 permutations so that p-values had a resolution of 0.001. We report the Monte Carlo standard error of every rate in the Supporting Information (Table S2), and the credible intervals of the formal models below include the binomial variation among replicates.</w:t>
+        <w:t xml:space="preserve">The performance measure of each test was its rejection rate across the 1,000 replicates of a condition, and that of each clade-recovery method was its proportion of hits. With K = 1,000 replicates, the Monte Carlo standard error of a rate p is [p(1 − p)/K]^½, which is 0.007 at p = 0.05 and at most 0.016 at p = 0.5, so a 95% Monte Carlo interval around the nominal level spans about ±0.014. We chose K so that this interval falls within Bradley’s liberal criterion for acceptable type I error, [0.025, 0.075] [CITAR: Bradley 1978], and used 999 permutations so that p-values have a resolution of 0.001. We report every rate with its Monte Carlo standard error in the Supporting Information (Table S2), and the credible intervals of the formal models below include the binomial variation among replicates.</w:t>
       </w:r>
     </w:p>
     <w:bookmarkEnd w:id="32"/>
@@ -912,7 +920,7 @@
         <w:pStyle w:val="FirstParagraph"/>
       </w:pPr>
       <w:r>
-        <w:t xml:space="preserve">We modelled the rates aggregated by condition with beta-binomial models in the R package brms [CITAR: Bürkner 2017] using cmdstanr [CITAR: Gabry et al., cmdstanr], with one model for the type I error and one for the power in each layer, and one for clade recovery. The plan was to treat γ and the Colless index as continuous covariates, but each cell of the grid has a single target per axis, and layer A did not store the shape of every tree, so a continuous term would only interpolate three points; we therefore entered the levels of γ and of the Colless index as factors, with their interaction, which estimates the full γ × imbalance surface without assuming its form. In Layer A, the shape effects could differ among tests and scenarios (which is what testing a nuisance effect that depends on tree shape requires) and with N and data type; the model was test × scenario × (γ + Colless) + test × (γ:Colless + N + data type) + test × (γ + Colless) × (N + data type), in the R formula notation. In Layer B, where only five cells were simulated, the cell entered as a five-level factor: test × archetype × (scenario + cell) + test × N × (archetype + scenario + cell). The clade-recovery model was method × (γ × depth + Colless + γ:Colless + shift + N + data type) + method × (γ + Colless) × (N + data type + shift). We first fitted quasibinomial generalized linear models to the same structures, which showed dispersion 2.2–14 times larger than binomial; the beta-binomial accounts for this extra variation with a single precision parameter φ, whereas a first version with an observation-level random effect hit the maximum tree depth of the sampler in almost every transition.</w:t>
+        <w:t xml:space="preserve">We modelled the rates aggregated by condition with beta-binomial models fitted in the R package brms v. 2.23.0 [CITAR: Bürkner 2017] with CmdStan v. 2.39.0 through cmdstanr [CITAR: Gabry et al. 2024], with one model for the type I error and one for the power in each layer, and one for clade recovery. The plan was to treat γ and the Colless index as continuous covariates, but each cell of the grid has a single target per axis, and Layer A did not store the shape of every tree, so a continuous term would only interpolate three points. Therefore, we entered the levels of γ and of the Colless index as factors, with their interaction, which estimates the full γ × imbalance surface without assuming its form. In Layer A, the shape effects could differ among tests and scenarios, which is what testing a nuisance effect that depends on tree shape requires, and with N and data type; in the R formula notation, the model was test * scenario * (γ + Colless) + test * (γ:Colless + N + data type) + test:(γ + Colless):(N + data type). In Layer B, where only five cells were simulated, the cell entered as a five-level factor, in test * archetype * (scenario + cell) + test * N * (archetype + scenario + cell). The clade-recovery model was method * (γ * depth + Colless + γ:Colless + shift + N + data type) + method:(γ + Colless):(N + data type + shift). We first fitted quasibinomial generalized linear models to the same structures, which showed a dispersion 2.2–14 times larger than binomial. The beta-binomial accounts for this extra variation with a single precision parameter φ, whereas a first version with an observation-level random effect hit the maximum tree depth of the sampler in almost every transition.</w:t>
       </w:r>
     </w:p>
     <w:p>
@@ -920,17 +928,17 @@
         <w:pStyle w:val="BodyText"/>
       </w:pPr>
       <w:r>
-        <w:t xml:space="preserve">Priors were declared explicitly on the logit scale: normal(0, 1.5) for all coefficients; normal(−2.9, 1.5) for the intercept of the type I models, centred on logit(0.05), and normal(0, 1.5) for the other intercepts; and gamma(2, 0.01) for φ, which is weakly informative around the values implied by the quasibinomial dispersion (φ of about 75–830). We ran four chains of 2,000 iterations (1,000 of warm-up) with adapt_delta = 0.95 and a maximum tree depth of 10 in Layer A and 12 in Layer B, where about 1% of the transitions of the type I model reached depth 10. We checked convergence with the rank-normalized R̂, the bulk and tail effective sample sizes, the number of divergent transitions and the number of transitions at the maximum tree depth, and model fit with posterior predictive checks, both for each condition and for the sums over the conditions of each test, N and cell. We summarized the results as posterior rates and contrasts between tree shapes or archetypes, with medians and 95% credible intervals.</w:t>
+        <w:t xml:space="preserve">Priors were declared explicitly on the logit scale. We used normal(0, 1.5) for all coefficients; normal(−2.9, 1.5) for the intercept of the type I models, centred on logit(0.05), and normal(0, 1.5) for the other intercepts; and gamma(2, 0.01) for φ, which is weakly informative around the values implied by the quasibinomial dispersion (φ of about 75–830). We ran four chains of 2,000 iterations (1,000 of warm-up) with adapt_delta = 0.95 and a maximum tree depth of 10 in Layer A and 12 in Layer B, where about 1% of the transitions of the type I model reached depth 10. We checked convergence with the rank-normalized R̂, the bulk and tail effective sample sizes, the number of divergent transitions and the number of transitions at the maximum tree depth, and model fit with in-sample posterior predictive checks, both for each condition and for the sums over the conditions of each test, N and cell. We summarize the results as posterior rates and contrasts between tree shapes or archetypes, with medians and 95% credible intervals (CI). Since the models share the scenario effects across N on the logit scale and have no scenario × N interaction, we also report the raw rates where they exceed the modelled ones.</w:t>
       </w:r>
     </w:p>
     <w:bookmarkEnd w:id="33"/>
-    <w:bookmarkStart w:id="34" w:name="regional-pools-as-an-empirical-reference"/>
+    <w:bookmarkStart w:id="34" w:name="empirical-reference-and-case-study"/>
     <w:p>
       <w:pPr>
         <w:pStyle w:val="Heading2"/>
       </w:pPr>
       <w:r>
-        <w:t xml:space="preserve">Regional pools as an empirical reference</w:t>
+        <w:t xml:space="preserve">Empirical reference and case study</w:t>
       </w:r>
     </w:p>
     <w:p>
@@ -938,7 +946,7 @@
         <w:pStyle w:val="FirstParagraph"/>
       </w:pPr>
       <w:r>
-        <w:t xml:space="preserve">To show where real regional species pools fall in the grid of tree shapes, we assembled pools from 14 tadpole metacommunities compiled from the literature and from unpublished data (Box 1). Species names were harmonized with the Amphibian Species of the World using the R package AmphiNom [CITAR: Liedtke 2019; Frost 2025, ASW], undetermined taxa were excluded, and the remaining 123 species were matched to the tips of the Portik et al. (2023) tree. We built three nested pools (Atlantic Forest; Atlantic Forest and interior of São Paulo; all South American metacommunities), pruned the tree to each, and computed γ and the normalized Colless index on the point-estimate tree and on its 100 time-calibrated bootstrap trees.</w:t>
+        <w:t xml:space="preserve">To show where real regional species pools fall in the grid of tree shapes, and how the methods behave with real data, we used 14 tadpole metacommunities compiled from the literature and from unpublished data (Box 1). We harmonized species names with the Amphibian Species of the World [CITAR: Frost 2025] using the R package AmphiNom v. 1.1.0 [CITAR: Liedtke 2019], excluded undetermined taxa, and matched the remaining 123 species to the tips of the Portik et al. (2023) tree. We built three nested pools (Atlantic Forest; Atlantic Forest and interior of São Paulo; all South American metacommunities), pruned the tree to each, and computed γ and the normalized Colless index on the point-estimate tree and on its 100 time-calibrated bootstrap trees. For the case study, we used the three metacommunities with at least 10 ponds and pond depth measured in every pond, namely Serra da Bocaina (13 ponds; Provete et al. 2014), southern Brazil (32 ponds; Both et al. 2011) and northwestern São Paulo (40 ponds; Prado &amp; Rossa-Feres 2014). We applied all tests and the four clade-scoring methods to incidence data with pond depth as the gradient, and also with canopy cover in Bocaina, the variable associated with its phylogenetic composition in a previous analysis with PCPS (Provete 2018).</w:t>
       </w:r>
     </w:p>
     <w:bookmarkEnd w:id="34"/>
@@ -956,12 +964,12 @@
         <w:pStyle w:val="FirstParagraph"/>
       </w:pPr>
       <w:r>
-        <w:t xml:space="preserve">All analyses were run in R v. 4.6.1 [CITAR: R Core Team 2026], with the package versions recorded in the renv lockfile of the repository [CITAR: renv]. Trees were handled with ape [CITAR: Paradis &amp; Schliep 2019], permutation tests were written for efficiency and checked against vegan and PCPS [CITAR: Oksanen et al., vegan; Debastiani &amp; Duarte 2014], and the simulations of Layer A and Layer B were orchestrated with targets and crew [CITAR: Landau 2021] in a Docker image on cloud instances, with one random seed per branch of the pipeline; the clade-recovery runs used one seed per tree, depth and replicate. Code is available at [CITAR: repository and Zenodo DOI], together with the rates aggregated by condition, which reproduce every table and figure without rerunning the simulations.</w:t>
+        <w:t xml:space="preserve">We ran all analyses in R v. 4.6.1 [CITAR: R Core Team 2026], with the versions of every package recorded in the renv lockfile of the repository [CITAR: Ushey &amp; Wickham, renv]; besides those cited above, we used ape v. 5.8-1 [CITAR: Paradis &amp; Schliep 2019] and mgcv v. 1.9-4 [CITAR: Wood 2017]. We orchestrated the simulations of Layer A and Layer B with targets v. 1.12.0 and crew v. 1.3.3 [CITAR: Landau 2021] in a Docker image on spot cloud instances with 192 virtual CPUs (190 workers); the pipeline seed was 20261018, from which targets derives one seed per branch. Layer A took about 8 h for the 432,000 metacommunities of the main run and Layer B about 7.5 h for its 440,000. The clade-recovery runs took 1.2 h on a 16-core workstation, with one seed per tree, depth and replicate, and each formal model 1–7 min. Code is available at [CITAR: repository and Zenodo DOI], together with the rates aggregated by condition and the scripts that compute the performance measures and the models from them, which reproduce every table and figure without rerunning the simulations.</w:t>
       </w:r>
     </w:p>
     <w:bookmarkEnd w:id="35"/>
     <w:bookmarkEnd w:id="36"/>
-    <w:bookmarkStart w:id="58" w:name="results"/>
+    <w:bookmarkStart w:id="59" w:name="results"/>
     <w:p>
       <w:pPr>
         <w:pStyle w:val="Heading1"/>
@@ -984,7 +992,7 @@
         <w:pStyle w:val="FirstParagraph"/>
       </w:pPr>
       <w:r>
-        <w:t xml:space="preserve">The static layer reproduced the published validations. In the Yule trees of Duarte et al. (2016), the rejection rates of the site shuffle, the taxa shuffle and the max test fell within the 95% binomial interval of our estimates in 66 of 72 cells; the six exceptions came from two conditions that fell outside in more than one null model, slightly more than the 3.6 expected by chance. The mean PERMANOVA R² and Mantel ρ agreed to the second decimal place when we used the Bray–Curtis dissimilarity without the square root, as in Duarte et al. (2016); elsewhere we used the square-rooted version. The PCC matched the published rates in the scenarios that do not depend on the tree; its power was slightly lower than published, but it varied between 0.71 and 0.93 among 20 Yule trees, and the published values sit at the upper end of that range, which seems to reflect a single favourable tree.</w:t>
+        <w:t xml:space="preserve">The static layer reproduced the published validations. In the Yule trees of Duarte et al. (2016), the rejection rates of the site shuffle, the taxa shuffle and the max test fell within the 95% binomial interval of our estimates in 66 of 72 cells. The six exceptions came from two conditions, PERMANOVA with both components at N = 100 and the Mantel test with environment only at N = 200, which fell outside in more than one null model, slightly more than the 3.6 cells expected by chance. The mean PERMANOVA R² and Mantel ρ agreed to the second decimal place when we used the Bray–Curtis dissimilarity without the square root, as in the code of Duarte et al. (2016); in the rest of the study we used the square-rooted version. The PCC matched the published rates in the scenarios that do not depend on the tree. Its power was slightly lower than published, but it varied between 0.71 and 0.93 among 20 Yule trees, and the published values sit at the upper end of that range, which seems to reflect a single favourable tree. Thus, our implementation reproduces both benchmarks within Monte Carlo error.</w:t>
       </w:r>
     </w:p>
     <w:bookmarkEnd w:id="37"/>
@@ -1002,7 +1010,7 @@
         <w:pStyle w:val="FirstParagraph"/>
       </w:pPr>
       <w:r>
-        <w:t xml:space="preserve">Tree imbalance did not affect the type I error of any test. In all 75 combinations of test, null scenario and N, the difference between high and Yule Colless in the distance of the type I error from the nominal level was within ±0.011, and no credible interval excluded zero, with incidence or abundance data (</w:t>
+        <w:t xml:space="preserve">Tree imbalance did not affect the type I error of any test. In all 75 combinations of test, null scenario and N, the difference in the distance of the type I error from the nominal level between highly imbalanced and Yule trees was within ±0.011, and no 95% CI excluded zero, with incidence or abundance data (</w:t>
       </w:r>
       <w:hyperlink w:anchor="fig-type1">
         <w:r>
@@ -1013,7 +1021,7 @@
         </w:r>
       </w:hyperlink>
       <w:r>
-        <w:t xml:space="preserve">). In S0, where optima had no phylogenetic signal and the gradient was independent, all tests were conservative, and four of them became more conservative in trees with low γ (by 0.011–0.019).</w:t>
+        <w:t xml:space="preserve">). In S0, where optima had no phylogenetic signal and the gradient was independent, all tests were conservative, and four of them became more conservative in trees with low γ (by 0.011–0.019). Therefore, H1 was not supported at the resolution of our design, although we did not test the medium level of imbalance separately from the high one.</w:t>
       </w:r>
     </w:p>
     <w:p>
@@ -1021,7 +1029,7 @@
         <w:pStyle w:val="BodyText"/>
       </w:pPr>
       <w:r>
-        <w:t xml:space="preserve">Phylogenetic signal in niche breadth inflated the type I error of only two tests. Compared with the same scenario without signal (S2), signal in σ (S2σ) increased the rejection rate of GLM PCPS2 by 0.03 in Yule trees and by 0.09, 0.11 and 0.16 with low γ at N = 50, 100 and 200, reaching 0.164 at N = 100 (</w:t>
+        <w:t xml:space="preserve">Phylogenetic signal in niche breadth inflated the type I error of only two tests. Compared with the same scenario without signal (S2), signal in σ (S2σ) increased the rejection rate of GLM PCPS2 by 0.03 (95% CI 0.02–0.04) in Yule trees at N = 100, and by 0.09 (0.07–0.10), 0.11 (0.09–0.13) and 0.16 (0.13–0.18) with low γ at N = 50, 100 and 200 (</w:t>
       </w:r>
       <w:hyperlink w:anchor="fig-type1">
         <w:r>
@@ -1032,7 +1040,7 @@
         </w:r>
       </w:hyperlink>
       <w:r>
-        <w:t xml:space="preserve">). The raw rates were even higher at N = 200, up to 0.36 in low-γ trees, since the model shares the scenario effects across N on the logit scale. The PCC was also inflated (+0.045 in Yule trees), but less so with low γ (+0.02), although the credible intervals of the two contrasts overlapped. Interestingly, PERMANOVA, GLM PCPS1 and the Mantel test became more conservative under signal in σ (by 0.01–0.025), and signal in maximum abundance (S2h) did not change the rejection rate of any test. Therefore, the nuisance structure created by a phylogenetically conserved niche breadth seems to affect only the methods that rely on the second PCPS axis or on phylogenetic eigenvectors, and its effect on GLM PCPS2 depends strongly on the distribution of branching times.</w:t>
+        <w:t xml:space="preserve">). The raw rates were even higher at N = 200, where GLM PCPS2 rejected the null hypothesis in up to 0.36 of the replicates in low-γ trees, since the model shares the scenario effects across N on the logit scale. The PCC was also inflated, by 0.045 (0.031–0.060) in Yule trees and by 0.021 (0.009–0.033) with low γ, with raw rates of up to 0.22 at N = 200 in Yule trees. Interestingly, PERMANOVA, GLM PCPS1 and the Mantel test became more conservative under signal in σ (by 0.01–0.025), and signal in maximum abundance (S2h) did not change the rejection rate of any test. With abundance data, the inflation of GLM PCPS2 was smaller (0.05, 0.04–0.07, with low γ at N = 100). As a result, H2 was rejected as stated: the nuisance structure created by a phylogenetically conserved niche breadth seems to affect only the methods that rely on the second PCPS axis or on phylogenetic eigenvectors, and its effect on GLM PCPS2 depends strongly on the distribution of branching times.</w:t>
       </w:r>
     </w:p>
     <w:tbl>
@@ -1140,7 +1148,7 @@
         </w:r>
       </w:hyperlink>
       <w:r>
-        <w:t xml:space="preserve">). At N = 100 with incidence data, low γ reduced the power of GLM PCPS1 from 0.735 to 0.336 in S3b, and similarly in S3a and S3σ (contrasts of −0.32 to −0.46 across N), and the power of the PCC from 0.970 to 0.738 in S3b. The Mantel test lost 0.05–0.14 at N = 100 and up to 0.23 at N = 50, whereas the power of PERMANOVA was almost insensitive to γ (0.811 in Yule trees and 0.824 with low γ in S3b) and, at N = 200, slightly higher with low γ (+0.04 to +0.08). High imbalance reduced power by at most 0.10. As a result, the rank of the tests changed with tree shape: in S3b, the PCC was the most powerful test in Yule trees and the third with low γ, and in S3a GLM PCPS1 fell from third to fourth. The effect of γ also changed with N in opposite directions among tests, since the loss of GLM PCPS1 increased with N whereas that of the PCC in S3b decreased from 0.48 at N = 50 to 0.10 at N = 200.</w:t>
+        <w:t xml:space="preserve">). At N = 100 with incidence data, low γ reduced the power of GLM PCPS1 from 0.74 to 0.34 in S3b (contrast −0.40, 95% CI −0.46 to −0.33), with similar losses in S3a and S3σ, and that of the PCC from 0.97 to 0.74 (−0.23, −0.29 to −0.18). The Mantel test lost 0.05–0.14 at N = 100 and up to 0.23 at N = 50. In contrast, the power of PERMANOVA did not change with γ at N = 100 in S3b (0.01, −0.03 to 0.06), was lower with low γ at N = 50 (−0.07 to −0.17 across scenarios) and higher at N = 200 (+0.04 to +0.08). High imbalance reduced power by at most 0.10. Consequently, the ranking of the tests changed with tree shape: in S3b, the PCC was the most powerful test in Yule trees and the third with low γ, and in S3a GLM PCPS1 fell from third to fourth. The effect of γ also changed with N in opposite directions among tests, since the loss of GLM PCPS1 increased with N (−0.38 at N = 50 and −0.46 at N = 200 in S3b), whereas that of the PCC decreased (−0.48 at N = 50 and −0.10 at N = 200). Thus, H4 was supported for power.</w:t>
       </w:r>
     </w:p>
     <w:tbl>
@@ -1248,7 +1256,7 @@
         </w:r>
       </w:hyperlink>
       <w:r>
-        <w:t xml:space="preserve">). Under species sorting without competition, power at N = 100 in S3b ranged from 0.87 (PERMANOVA) and 0.92 (Mantel) to 0.96 (PCC) in Yule pool trees, a level similar to that of Layer A. Mass effects reduced the power of every test except GLM PCPS2: relative to species sorting, PERMANOVA lost 0.62 in Yule trees and 0.72 with low γ, the Mantel test 0.75 and 0.79, RDA PCPS 0.58 and 0.55, GLM PCPS1 0.55 and 0.27, and the PCC 0.93 and 0.76, so that the PCC detected the phylogenetic signal in almost no replicate. Surprisingly, adding phylogenetic competition to mass effects partly restored power (for instance, PERMANOVA lost 0.46 instead of 0.62 in Yule trees), whereas phylogenetic competition under species sorting changed power by −0.12 to +0.11. These contrasts should be read with care, since competition prunes close relatives and changes the analysed tree relative to the pool tree, most strongly under mass effects (Colless about 75% lower), so the effect of the process cannot be separated from a change of tree shape. Under the null hypothesis, no condition at N = 100 had a credible interval above 0.075 (largest posterior median 0.088), but raw rejection rates exceeded that limit at N = 200 for the PCC in S2h (0.111 under species sorting and 0.143 under mass effects, in Yule trees) and for GLM PCPS2 in S2σ under species sorting in the low- and mid-γ cells (0.104–0.129).</w:t>
+        <w:t xml:space="preserve">). Under species sorting without competition, power at N = 100 in S3b in Yule pool trees ranged from 0.78 (GLM PCPS1) and 0.83 (RDA PCPS) to 0.87 (PERMANOVA), 0.92 (Mantel) and 0.96 (PCC), whereas GLM PCPS2 had almost no power (0.03), as in Layer A. Mass effects reduced the power of every test except GLM PCPS2, which gained 0.08 (0.06–0.11) from its low baseline. Relative to species sorting, PERMANOVA lost 0.62 (0.58–0.65) in Yule pool trees and 0.72 (0.69–0.75) with low γ, the Mantel test 0.75 and 0.79, RDA PCPS 0.58 and 0.55, GLM PCPS1 0.55 and 0.27, and the PCC 0.93 (0.92–0.94) and 0.76, so that the PCC detected the phylogenetic signal in almost no replicate. Surprisingly, adding phylogenetic competition to mass effects partly restored power; for instance, PERMANOVA lost 0.46 (0.42–0.50) instead of 0.62 in Yule pool trees. Under species sorting, phylogenetic competition changed power by −0.12 to +0.11. These two contrasts should be read with care, because competition prunes close relatives and changes the shape of the analysed tree relative to the pool tree, so the effect of the process cannot be separated from that of a change in tree shape; this pruning is strongest under mass effects, where the Colless index of the analysed tree was about 75% lower than that of the pool. Under the null hypothesis, no condition at N = 100 had a 95% CI above 0.075 (largest posterior median 0.088). However, raw rejection rates exceeded that limit at N = 200 for the PCC in S2h (0.111 under species sorting and 0.143 under mass effects, in Yule pool trees) and for GLM PCPS2 in S2σ under species sorting in the low- and mid-γ cells (0.104–0.129).</w:t>
       </w:r>
     </w:p>
     <w:tbl>
@@ -1356,7 +1364,7 @@
         </w:r>
       </w:hyperlink>
       <w:r>
-        <w:t xml:space="preserve">). With a shift of 2 and incidence data, evoPCA and phylofactorization identified the planted node in 0.44–0.88 of the replicates, depending on N and depth, and recovered basal clades more often than recent ones (0.79 and 0.66 at N = 100). PCPS recovered the clade in 0.12–0.42 of the replicates and PCC in only 0.08–0.12, probably because its four leading eigenvectors follow the deepest splits of the tree. With a shift of 0.5, no method exceeded 0.21.</w:t>
+        <w:t xml:space="preserve">). With a shift of 2 and incidence data, evoPCA and phylofactorization identified the planted node in 0.44–0.88 of the replicates, depending on N and depth, and recovered basal clades more often than recent ones (0.79 against 0.66 at N = 100). PCPS recovered the clade in 0.12–0.42 of the replicates and PCC in only 0.08–0.12. The complementary measures agree with this ranking: at N = 100, the median rank of the planted node was 1 for evoPCA and phylofactorization, 2 (basal clades) and 6 (recent clades) for PCPS, and 7 and 9 for PCC, and the mean Jaccard similarity between the chosen and the planted clades was 0.89–0.94, 0.60–0.75 and 0.45–0.50, respectively. Hence, PCPS often chose a clade that overlapped the planted one, whereas PCC usually chose a different part of the tree, which seems to reflect that its four leading eigenvectors follow the deepest splits. With a shift of 0.5, no method exceeded 0.21.</w:t>
       </w:r>
     </w:p>
     <w:p>
@@ -1364,7 +1372,7 @@
         <w:pStyle w:val="BodyText"/>
       </w:pPr>
       <w:r>
-        <w:t xml:space="preserve">Tree shape changed recovery only for PCPS and PCC. With low γ, PCPS recovered basal clades in 0.58 of the replicates against 0.21 in Yule trees, and recent clades in 0.35 against 0.04 (N = 100), and this advantage grew with N (+0.23 to +0.45 across N and depths). In contrast, the recovery of evoPCA and phylofactorization did not change with γ, and high imbalance reduced recovery by 0.01–0.10 in all methods. Interestingly, low γ improved PCPS for recent as well as for basal clades, so the advantage of basal clades seems to be a matter of degree rather than a different behaviour of the method. With abundance data, the patterns were the same, with lower recovery for the compositional phylofactorization (0.68 and 0.56 for old and recent clades at N = 100).</w:t>
+        <w:t xml:space="preserve">Tree shape changed recovery only for PCPS and PCC. With low γ, PCPS recovered basal clades in 0.58 of the replicates against 0.21 in Yule trees, and recent clades in 0.35 against 0.04 (N = 100), and this advantage grew with N (+0.23 to +0.45 across N and depths). The PCC lost 0.10–0.14 in basal clades with low γ and gained 0.07–0.09 in recent ones, whereas the recovery of evoPCA and phylofactorization did not change with γ (all 95% CI included zero), and high imbalance reduced recovery by 0.01–0.10 in all methods. Interestingly, low γ improved PCPS for recent as well as for basal clades, so H3 was only partly supported: the advantage of basal clades seems to be a matter of degree rather than a different behaviour of the method, and the share of variation on the first PCPS axis decreased rather than increased with low γ in the descriptive summaries of Layer A. With abundance data, the patterns were the same, with lower recovery for the compositional phylofactorization (0.68 and 0.56 for basal and recent clades at N = 100) than for evoPCA (0.78 and 0.65), and PCPS gained 0.29 (0.25–0.32) and 0.23 (0.20–0.25) with low γ. Taken together, H4 was also supported for clade recovery, but only through the shift between PCPS and PCC.</w:t>
       </w:r>
     </w:p>
     <w:tbl>
@@ -1446,23 +1454,33 @@
         </w:tc>
       </w:tr>
     </w:tbl>
-    <w:p>
-      <w:pPr>
-        <w:pStyle w:val="BodyText"/>
-      </w:pPr>
-      <w:r>
-        <w:t xml:space="preserve">All models converged (R̂ ≤ 1.01, bulk effective sample size ≥ 835, tail effective sample size ≥ 1,596, no divergent transitions and no transition at the maximum tree depth), and the posterior predictive intervals of 95% contained 97–98% of the observed rates of each condition (Table S3).</w:t>
-      </w:r>
-    </w:p>
     <w:bookmarkEnd w:id="57"/>
+    <w:bookmarkStart w:id="58" w:name="convergence-and-fit-of-the-formal-models"/>
+    <w:p>
+      <w:pPr>
+        <w:pStyle w:val="Heading2"/>
+      </w:pPr>
+      <w:r>
+        <w:t xml:space="preserve">Convergence and fit of the formal models</w:t>
+      </w:r>
+    </w:p>
+    <w:p>
+      <w:pPr>
+        <w:pStyle w:val="FirstParagraph"/>
+      </w:pPr>
+      <w:r>
+        <w:t xml:space="preserve">All models converged, with R̂ ≤ 1.01, bulk effective sample size ≥ 835 and tail effective sample size ≥ 1,596, no divergent transitions and no transition at the maximum tree depth (Table S3). The in-sample posterior predictive intervals of 95% contained 97–98% of the observed rates of each condition, and those of 50% contained 61–70%, so the models are slightly conservative; when we summed the conditions of each test, N and cell, every group fell within its 95% interval.</w:t>
+      </w:r>
+    </w:p>
     <w:bookmarkEnd w:id="58"/>
-    <w:bookmarkStart w:id="63" w:name="X86b424abbb3574ac0aa0caa1d4fc972db0dba82"/>
+    <w:bookmarkEnd w:id="59"/>
+    <w:bookmarkStart w:id="64" w:name="Xada27c83b7f8db009b1df1795077522469ebf9f"/>
     <w:p>
       <w:pPr>
         <w:pStyle w:val="Heading1"/>
       </w:pPr>
       <w:r>
-        <w:t xml:space="preserve">Box 1. Where do real regional pools fall in the tree-shape grid?</w:t>
+        <w:t xml:space="preserve">Box 1. Real pools and real metacommunities</w:t>
       </w:r>
     </w:p>
     <w:p>
@@ -1481,7 +1499,15 @@
         </w:r>
       </w:hyperlink>
       <w:r>
-        <w:t xml:space="preserve">). The Atlantic Forest pool (60 species) had γ = −2.51 and a normalized Colless index of 0.67; adding the metacommunities of the interior of São Paulo (81 species) lowered γ to −3.16 with a similar Colless (0.67), and the South American pool (123 species) had γ = −3.90 and a Colless index of 1.99. Thus, γ of the three pools lies between the Yule and the median levels of the grid, and imbalance between the Yule and the median levels except in the largest pool, which lies between the median and the 90% quantile. Across the 100 bootstrap trees of Portik et al. (2023), γ varied by about one unit and the Colless index by up to 1.1 units, and the point-estimate tree sat at the lower edge of the distribution of γ, probably because the bootstrap trees differ in topology and have deeper roots. As a consequence, the conditions under which we found the largest effects of tree shape, the low-γ cells, are more extreme than these pools, but within the range of the anuran clades used to define the grid. The three metacommunities of the case study (Bocaina, Provete et al. 2014; southern Brazil, Both et al. [CITAR: confirmar 2009 Hydrobiologia 624: 125–138 ou 2011 Acta Oecologica]; northwestern São Paulo, Prado &amp; Rossa-Feres 2014) had small trees, with negative γ in Bocaina (15 species, 13 ponds; −1.59) and southern Brazil (21 species, 32 ponds; −1.53) and positive γ in northwestern São Paulo (26 species, 40 ponds; 1.39), outside the grid. No test rejected the null hypothesis of no association between phylogenetic structure and pond depth with the max test (all p ≥ 0.11). In Bocaina, canopy cover was associated with phylogenetic composition under the site shuffle (p = 0.048–0.053 for PERMANOVA, GLM PCPS1, RDA PCPS and PCC) but not under the taxa shuffle (p = 0.23–0.56). This means that canopy cover structures composition, as found with PCPS by Provete (2018), but that the phylogenetic arrangement of the species adds nothing beyond composition once tips are permuted, which is the inference the max test protects. The clade-scoring methods agreed where the simulation predicts: in Bocaina, PCC, evoPCA and phylofactorization chose the same clade of five Dendropsophus and Scinax species along depth, and in northwestern São Paulo PCC and evoPCA chose the three microhylids; without a significant test, these clades describe the strongest phylogenetic contrast rather than a demonstrated association.</w:t>
+        <w:t xml:space="preserve">). The Atlantic Forest pool (60 species) had γ = −2.51 and a normalized Colless index of 0.67; adding the metacommunities of the interior of São Paulo (81 species) lowered γ to −3.16 with the same Colless index (0.67), and the South American pool (123 species) had γ = −3.90 and a Colless index of 1.99. Thus, γ of the three pools lies between the Yule and the median levels of the grid, and imbalance between the Yule and the median levels except in the largest pool, which lies between the median and the 90% quantile. Across the 100 bootstrap trees of Portik et al. (2023), γ varied by about one unit and the Colless index by up to 1.1 units, and the point-estimate tree sat at the lower edge of the distribution of γ, probably because the bootstrap trees differ in topology and have deeper roots. As a consequence, the low-γ cells, where we found the largest effects of tree shape, are more extreme than these pools, but within the range of the anuran clades used to define the grid.</w:t>
+      </w:r>
+    </w:p>
+    <w:p>
+      <w:pPr>
+        <w:pStyle w:val="BodyText"/>
+      </w:pPr>
+      <w:r>
+        <w:t xml:space="preserve">The three metacommunities of the case study had small trees with contrasting shapes. Bocaina (Provete et al. 2014; 15 species in 13 ponds) and southern Brazil (Both et al. 2011; 21 species in 32 ponds) had negative γ (−1.59 and −1.53), whereas northwestern São Paulo (Prado &amp; Rossa-Feres 2014; 26 species in 40 ponds) had positive γ (1.39), outside the range of the grid. No test rejected the null hypothesis of no association between phylogenetic structure and pond depth with the max test (all p ≥ 0.11). In Bocaina, canopy cover was associated with phylogenetic composition under the site shuffle (p = 0.048–0.053 for PERMANOVA, GLM PCPS1, RDA PCPS and PCC), but not under the taxa shuffle (p = 0.23–0.56). This means that canopy cover structures the composition of these ponds, as found with PCPS by Provete (2018), but that the phylogenetic arrangement of the species adds nothing beyond composition once the tips are permuted, which is the inference the max test protects. The clade-scoring methods agreed where the simulation predicts they should: in Bocaina, PCC, evoPCA and phylofactorization chose the same clade of five Dendropsophus and Scinax species along the depth gradient, and in northwestern São Paulo PCC and evoPCA chose the three microhylids. However, with 13–40 ponds and without a significant test, these clades describe the strongest phylogenetic contrast along the gradient rather than a demonstrated association.</w:t>
       </w:r>
     </w:p>
     <w:tbl>
@@ -1497,7 +1523,7 @@
       <w:tr>
         <w:tc>
           <w:tcPr/>
-          <w:bookmarkStart w:id="62" w:name="fig-box1"/>
+          <w:bookmarkStart w:id="63" w:name="fig-box1"/>
           <w:p>
             <w:pPr>
               <w:pStyle w:val="Compact"/>
@@ -1508,18 +1534,18 @@
                 <wp:inline>
                   <wp:extent cx="4890135" cy="3261010"/>
                   <wp:effectExtent b="0" l="0" r="0" t="0"/>
-                  <wp:docPr descr="" title="" id="60" name="Picture"/>
+                  <wp:docPr descr="" title="" id="61" name="Picture"/>
                   <a:graphic>
                     <a:graphicData uri="http://schemas.openxmlformats.org/drawingml/2006/picture">
                       <pic:pic>
                         <pic:nvPicPr>
-                          <pic:cNvPr descr="figures/box1_pools.png" id="61" name="Picture"/>
+                          <pic:cNvPr descr="figures/box1_pools.png" id="62" name="Picture"/>
                           <pic:cNvPicPr>
                             <a:picLocks noChangeArrowheads="1" noChangeAspect="1"/>
                           </pic:cNvPicPr>
                         </pic:nvPicPr>
                         <pic:blipFill>
-                          <a:blip r:embed="rId59"/>
+                          <a:blip r:embed="rId60"/>
                           <a:stretch>
                             <a:fillRect/>
                           </a:stretch>
@@ -1559,12 +1585,12 @@
               <w:t xml:space="preserve">Figure 6: Tree shape of three nested regional pools of anurans (coloured points, point-estimate tree; bars, 2.5–97.5% quantiles across 100 bootstrap trees, centred on their median) against the targets of the simulation grid (open symbols, by N) and the anuran clades with 40–250 tips of Portik et al. (2023) (grey points). Notice that the pools fall inside the grid and close to its Yule and median levels.</w:t>
             </w:r>
           </w:p>
-          <w:bookmarkEnd w:id="62"/>
+          <w:bookmarkEnd w:id="63"/>
         </w:tc>
       </w:tr>
     </w:tbl>
-    <w:bookmarkEnd w:id="63"/>
-    <w:bookmarkStart w:id="64" w:name="references-verified"/>
+    <w:bookmarkEnd w:id="64"/>
+    <w:bookmarkStart w:id="65" w:name="references-verified"/>
     <w:p>
       <w:pPr>
         <w:pStyle w:val="Heading1"/>
@@ -1576,6 +1602,27 @@
     <w:p>
       <w:pPr>
         <w:pStyle w:val="FirstParagraph"/>
+      </w:pPr>
+      <w:r>
+        <w:t xml:space="preserve">Both, C., Melo, A. S., Cechin, S. Z., &amp; Hartz, S. M. (2011). Tadpole co-occurrence in ponds: when do guilds and time matter?</w:t>
+      </w:r>
+      <w:r>
+        <w:t xml:space="preserve"> </w:t>
+      </w:r>
+      <w:r>
+        <w:rPr>
+          <w:i/>
+          <w:iCs/>
+        </w:rPr>
+        <w:t xml:space="preserve">Acta Oecologica</w:t>
+      </w:r>
+      <w:r>
+        <w:t xml:space="preserve">, 37, 140–145.</w:t>
+      </w:r>
+    </w:p>
+    <w:p>
+      <w:pPr>
+        <w:pStyle w:val="BodyText"/>
       </w:pPr>
       <w:r>
         <w:t xml:space="preserve">DiRenzo, G. V., Hanks, E., &amp; Miller, D. A. W. (2023). A practical guide to understanding and validating complex models using data simulations.</w:t>
@@ -1846,7 +1893,7 @@
         <w:t xml:space="preserve">, 15, 1926–1939.</w:t>
       </w:r>
     </w:p>
-    <w:bookmarkEnd w:id="64"/>
+    <w:bookmarkEnd w:id="65"/>
     <w:sectPr>
       <w:footerReference r:id="rId9" w:type="default"/>
       <w:footnotePr>

</xml_diff>

<commit_message>
Modelos da camada A com cenário × N e treedepth 12; manuscrito atualizado (citações verificadas, estilo da MEE, correções das revisões)
Co-Authored-By: Claude Opus 5.5 <noreply@anthropic.com>
</commit_message>
<xml_diff>
--- a/manuscript/methods_results.docx
+++ b/manuscript/methods_results.docx
@@ -57,7 +57,7 @@
         <w:pStyle w:val="FirstParagraph"/>
       </w:pPr>
       <w:r>
-        <w:t xml:space="preserve">We designed the simulation study following the aims, data-generating mechanisms, estimands, methods and performance measures structure recommended for simulation studies that evaluate statistical methods (DiRenzo et al. 2023; Williams et al. 2024). The study had three aims: (i) to estimate how the shape of the phylogenetic tree, measured as the distribution of branching times (the γ statistic; [CITAR: Pybus &amp; Harvey 2000]) and the imbalance of the topology (the Colless index; [CITAR: Colless 1982]), affects the type I error and the power of tests that relate the phylogenetic structure of metacommunities to an environmental gradient; (ii) to estimate how the same tests perform under different processes of metacommunity assembly, which, to the best of our knowledge, neither the articles that proposed these tests nor later evaluations of them have addressed (Peres-Neto &amp; Kembel 2015; Duarte et al. 2016); and (iii) to estimate how well ordination and factorization methods recover a clade associated with the gradient. We generated metacommunities in two layers (Fig. 1). Layer A follows the static protocol of Peres-Neto, Leibold and Dray (2012), which was also used to validate the tests we evaluated, so our results can be compared directly with the published ones. Layer B simulates metacommunity dynamics with the process-based framework of Thompson et al. (2020), in which species sorting, mass effects and competition emerge from local population dynamics and dispersal.</w:t>
+        <w:t xml:space="preserve">We designed the simulation study following the aims, data-generating mechanisms, estimands, methods and performance measures structure recommended for simulation studies that evaluate statistical methods (DiRenzo et al., 2023; Williams et al., 2024). The study had three aims: (i) to estimate how the shape of the phylogenetic tree, measured as the distribution of branching times (the γ statistic; Pybus &amp; Harvey, 2000) and the imbalance of the topology (the Colless index; Colless, 1982), affects the type I error and the power of tests that relate the phylogenetic structure of metacommunities to an environmental gradient; (ii) to estimate how the same tests perform under different processes of metacommunity assembly, which, to the best of our knowledge, neither the articles that proposed these tests nor later evaluations of them have addressed (Peres-Neto &amp; Kembel, 2015; Duarte et al., 2016); and (iii) to estimate how well ordination and factorization methods recover a clade associated with the gradient. We generated metacommunities in two layers (Fig. 1). Layer A follows the static protocol of Peres-Neto, Leibold and Dray (2012), which was also used to validate the tests we evaluated, so our results can be compared directly with the published ones. Layer B simulates metacommunity dynamics with the process-based framework of Thompson et al. (2020), in which species sorting, mass effects and competition emerge from local population dynamics and dispersal.</w:t>
       </w:r>
     </w:p>
     <w:p>
@@ -170,7 +170,7 @@
         <w:pStyle w:val="BodyText"/>
       </w:pPr>
       <w:r>
-        <w:t xml:space="preserve">We took the levels of the grid from the empirical distribution of tree shape in anurans. We pruned all clades with 40–250 tips from the time-calibrated species-level tree of Portik et al. (2023) and computed γ and the Colless index normalized against its Yule expectation with the R package treestats v. 1.71.13 [CITAR: Janzen et al. 2024]. For each pool size N (50, 100 and 200 species, as in Duarte et al. 2016), γ took three levels, namely zero (as in a Yule tree), the median of the empirical clades and their 10% quantile, and the Colless index took three levels, zero, the median and the 90% quantile (Table S1). We calibrated c and β for each N with curves of the mean statistic against the parameter, and accepted a tree only when both statistics fell within 0.5 units of the targets of its cell, which gave acceptance rates of 9–25%. Thus, every cell of the 3 × 3 grid could be filled, and the grid spans the empirical range of anuran tree shapes between the 10% and 90% quantiles, although it has no level with γ &gt; 0. The Yule × Yule cell approximates the trees used in previous validations (Peres-Neto &amp; Kembel 2015; Duarte et al. 2016), since the acceptance window truncates the Yule distribution of both statistics. We drew 1,000 trees per cell and N, and replicate r of every scenario used tree r of its cell, so that the scenarios were paired by tree.</w:t>
+        <w:t xml:space="preserve">We took the levels of the grid from the empirical distribution of tree shape in anurans. We pruned all clades with 40–250 tips from the time-calibrated species-level tree of Portik et al. (2023) and computed γ and the Colless index normalized against its Yule expectation with the R package treestats v. 1.71.13 (Janzen &amp; Etienne, 2024). For each pool size N (50, 100 and 200 species, as in Duarte et al., 2016), γ took three levels, namely zero (as in a Yule tree), the median of the empirical clades and their 10% quantile, and the Colless index took three levels, zero, the median and the 90% quantile (Table S1). We calibrated c and β for each N with curves of the mean statistic against the parameter, and accepted a tree only when both statistics fell within 0.5 units of the targets of its cell, which gave acceptance rates of 9–25%. Thus, every cell of the 3 × 3 grid could be filled, and the grid spans the empirical range of anuran tree shapes between the 10% and 90% quantiles, although it has no level with γ &gt; 0. The Yule × Yule cell approximates the trees used in previous validations (Peres-Neto &amp; Kembel, 2015; Duarte et al., 2016), since the acceptance window truncates the Yule distribution of both statistics. We drew 1,000 trees per cell and N, and replicate r of every scenario used tree r of its cell, so that the scenarios were paired by tree.</w:t>
       </w:r>
     </w:p>
     <w:bookmarkEnd w:id="25"/>
@@ -188,7 +188,7 @@
         <w:pStyle w:val="FirstParagraph"/>
       </w:pPr>
       <w:r>
-        <w:t xml:space="preserve">Each metacommunity had 100 sites along an environmental gradient E drawn from a uniform distribution between 0 and 100. The expected abundance of species j at site i followed a Gaussian response, L_ij = h_j exp[−(E_i − u_j)² / (2σ_j²)], and we drew the observed abundance from a Poisson distribution with mean L_ij (Peres-Neto et al. 2012). We simulated the optimum u_j as a continuous trait on the tree under Brownian motion transformed by Pagel’s λ [CITAR: Pagel 1999] and rescaled it to the interval [−1, 101]; niche breadth σ_j came from a normal distribution with mean 10 and standard deviation 10, truncated at zero, and maximum abundance h_j from a uniform distribution between 0 and 30. In addition, σ_j and h_j could carry phylogenetic signal. In that case, we simulated a Brownian trait on the tree (λ = 1) and imposed on it the same marginal distribution by ranks, so that scenarios with and without signal differed only in how the values were arranged on the tree. We removed empty sites and pruned species absent from every site from the tree before analysis, as one would with real data, and analysed both incidence and abundance data.</w:t>
+        <w:t xml:space="preserve">Each metacommunity had 100 sites along an environmental gradient E drawn from a uniform distribution between 0 and 100. The expected abundance of species j at site i followed a Gaussian response, L_ij = h_j exp[−(E_i − u_j)² / (2σ_j²)], and we drew the observed abundance from a Poisson distribution with mean L_ij (Peres-Neto et al., 2012). We simulated the optimum u_j as a continuous trait on the tree under Brownian motion transformed by Pagel’s λ (Pagel, 1999) and rescaled it to the interval [−1, 101]; niche breadth σ_j came from a normal distribution with mean 10 and standard deviation 10, truncated at zero, and maximum abundance h_j from a uniform distribution between 0 and 30. In addition, σ_j and h_j could carry phylogenetic signal. In that case, we simulated a Brownian trait on the tree (λ = 1) and imposed on it the same marginal distribution by ranks, so that scenarios with and without signal differed only in how the values were arranged on the tree. We removed empty sites and pruned species absent from every site from the tree before analysis, as one would with real data, and analysed both incidence and abundance data.</w:t>
       </w:r>
     </w:p>
     <w:bookmarkEnd w:id="26"/>
@@ -206,7 +206,7 @@
         <w:pStyle w:val="FirstParagraph"/>
       </w:pPr>
       <w:r>
-        <w:t xml:space="preserve">Layer B followed the equations of Thompson et al. (2020), which we implemented in R because neither the original Julia code nor the R package mcomsimr [CITAR: Thompson et al., mcomsimr] carry a licence. At each time step, the expected abundance of species j at site i was its density-independent growth rate, a Gaussian function of the mismatch between u_j and E_i with breadth σ_j and maximum r_j, multiplied by its abundance and divided by one plus the sum of the competitive effects of all species at the site, following a Beverton–Holt model [CITAR: Beverton &amp; Holt 1957]. We then drew abundances from a Poisson distribution; each individual emigrated with probability a, and emigrants were redistributed among sites in proportion to the number of emigrants from the other sites. The environment was static and the sites had no spatial structure, because the dispersal kernel was uniform. This keeps sites exchangeable, so that the site shuffle remains a valid null model and spatial autocorrelation does not confound the phylogenetic tests. All species were seeded with Poisson(0.5) individuals per site every 10 steps during the first 100 steps, the dynamics ran for 1,000 steps, and we analysed the final state as incidence data. Maximum growth rate r_j, drawn from a uniform distribution between 2 and 8, took the role of h_j in the trait scenarios.</w:t>
+        <w:t xml:space="preserve">Layer B followed the equations of Thompson et al. (2020), which we implemented in R because neither the original Julia code nor the R package mcomsimr (Thompson et al., 2020) carries a licence. At each time step, the expected abundance of species j at site i was its density-independent growth rate, a Gaussian function of the mismatch between u_j and E_i with breadth σ_j and maximum r_j, multiplied by its abundance and divided by one plus the sum of the competitive effects of all species at the site, following a Beverton–Holt model (Beverton &amp; Holt, 1957). We then drew abundances from a Poisson distribution; each individual emigrated with probability a, and each site received immigrants in proportion to the emigrants from all other sites. The environment was static and the sites had no spatial structure, because the dispersal kernel was uniform. This keeps sites exchangeable, so that the site shuffle remains a valid null model and spatial autocorrelation does not confound the phylogenetic tests. All species were seeded with Poisson(0.5) individuals per site every 10 steps during the first 100 steps, the dynamics ran for 1,000 steps, and we analysed the final state as incidence data. Maximum growth rate r_j, drawn from a uniform distribution between 2 and 8, took the role of h_j in the trait scenarios.</w:t>
       </w:r>
     </w:p>
     <w:p>
@@ -858,7 +858,7 @@
         <w:pStyle w:val="FirstParagraph"/>
       </w:pPr>
       <w:r>
-        <w:t xml:space="preserve">All tests relate the matrix P of phylogeny-weighted species composition (Pillar &amp; Duarte 2010; Duarte et al. 2016), or the phylogenetic eigenvectors, to the gradient. We computed P with phylogenetic fuzzy weighting and the square-rooted Bray–Curtis dissimilarity between sites (D_P), and tested its association with E with a permutational multivariate analysis of variance (PERMANOVA; [CITAR: Anderson 2001]) and a Mantel test [CITAR: Mantel 1967], as in Duarte et al. (2016). We also extracted the principal coordinates of phylogenetic structure (PCPS; [CITAR: Duarte 2011; Duarte et al. 2012]) from D_P and fitted a linear model of each of the first two axes on E (GLM PCPS1 and GLM PCPS2); in Layer B, we also fitted a redundancy analysis of both axes on E (RDA PCPS). We re-implemented the phylogenetic community composition approach (PCC) of Peres-Neto and Kembel (2015) from the equations in the original article, using the variance of the adjusted R² across phylogenetic eigenvectors as the test statistic. Every test was evaluated with 999 permutations under two null models, the site shuffle, which permutes the sites, and the taxa shuffle, which permutes the tips of the tree while keeping its topology. We report the largest of the two p-values (max test), which controls the type I error when either null hypothesis holds (Peres-Neto &amp; Kembel 2015; Duarte et al. 2016). We wrote the permutation loops ourselves for efficiency and checked, in unit tests, that the observed statistics equal those of the R packages vegan v. 2.7-6 [CITAR: Oksanen et al. 2025] and PCPS v. 1.0.9 [CITAR: Debastiani &amp; Duarte 2014].</w:t>
+        <w:t xml:space="preserve">All tests relate the matrix P of phylogeny-weighted species composition (Pillar &amp; Duarte, 2010; Duarte et al., 2016), or the phylogenetic eigenvectors, to the gradient. We computed P with phylogenetic fuzzy weighting and the square-rooted Bray–Curtis dissimilarity between sites (D_P), and tested its association with E with a permutational multivariate analysis of variance (PERMANOVA; Anderson, 2001) and a Mantel test (Mantel, 1967), as in Duarte et al. (2016). We also extracted the principal coordinates of phylogenetic structure (PCPS; Duarte, 2011; Duarte et al., 2012) from D_P and fitted a linear model of each of the first two axes on E (GLM PCPS1 and GLM PCPS2); in Layer B, we also fitted a redundancy analysis of both axes on E (RDA PCPS). We re-implemented the phylogenetic community composition approach (PCC) of Peres-Neto and Kembel (2015) from the equations in the original article, using the variance of the adjusted R² across phylogenetic eigenvectors as the test statistic. Every test was evaluated with 999 permutations under two null models, the site shuffle, which permutes the sites, and the taxa shuffle, which permutes the tips of the tree while keeping its topology. We report the largest of the two P-values (max test), which controls the type I error when either null hypothesis holds (Peres-Neto &amp; Kembel, 2015; Duarte et al., 2016). We wrote the permutation loops ourselves for efficiency and checked, in unit tests, that the observed statistics equal those of the R packages vegan v. 2.7-6 (Oksanen et al., 2026) and PCPS v. 1.0.9 (Debastiani, 2026).</w:t>
       </w:r>
     </w:p>
     <w:bookmarkEnd w:id="30"/>
@@ -884,7 +884,7 @@
         <w:pStyle w:val="BodyText"/>
       </w:pPr>
       <w:r>
-        <w:t xml:space="preserve">We compared four methods. For PCPS, PCC and the evolutionary principal component analysis (evoPCA; Pavoine 2016), each method took the axis most correlated with E among its first four, and the score of each internal node was the absolute correlation between membership of its clade and the species scores on that axis. The species scores were the correlations of the columns of P with the PCPS axis, which equal the species scores of the R package PCPS; the values of the phylogenetic eigenvector; and the correlations of the species columns of the Hellinger-transformed table of evoPCA [CITAR: Legendre &amp; Gallagher 2001], computed with the R package adiv v. 2.2.1 [CITAR: Pavoine 2020]. We did not use the branch loadings of evoPCA because, with incidence data, a branch is present wherever any of its descendants is, so the branch above a planted clade saturates and small subclades always correlate better with the axis. For phylofactorization (Washburne et al. 2017), the score of each split was the objective of the algorithm, the deviance explained by the phylogenetic factor in a binomial model with incidence data or the variance explained by the isometric log-ratio balance with abundance data; we computed it for every node, which gives the same best split as the R package phylofactor v. 0.0.1 [CITAR: Washburne et al., phylofactor package] while also ranking all nodes. A method recovered the clade when its best-scoring clade was the planted one or its complement. As complementary measures, which give partial credit to a method that chooses a nested or a slightly larger clade, we recorded the rank of the planted node among all nodes and the Jaccard similarity between the best-scoring and the planted clades.</w:t>
+        <w:t xml:space="preserve">We compared four methods. For PCPS, PCC and the evolutionary principal component analysis (evoPCA; Pavoine, 2016), each method took the axis most correlated with E among its first four, and the score of each internal node was the absolute correlation between membership of its clade and the species scores on that axis. The species scores were the correlations of the columns of P with the PCPS axis, which equal the species scores of the R package PCPS; the values of the phylogenetic eigenvector; and the correlations of the species columns of the Hellinger-transformed table of evoPCA (Legendre &amp; Gallagher, 2001), computed with the R package adiv v. 2.2.1 (Pavoine, 2020). We did not use the branch loadings of evoPCA because, with incidence data, a branch is present wherever any of its descendants is, so the branch above a planted clade saturates and small subclades always correlate better with the axis. For phylofactorization (Washburne et al., 2017), the score of each split was the objective of the algorithm, the deviance explained by the phylogenetic factor in a binomial model with incidence data or the variance explained by the isometric log-ratio balance with abundance data; we computed it for every node, which gives the same best split as the R package phylofactor v. 0.0.1 (Washburne et al., 2017) while also ranking all nodes. A method recovered the clade when its best-scoring clade was the planted one or its complement. As complementary measures, which give partial credit to a method that chooses a nested or a slightly larger clade, we recorded the rank of the planted node among all nodes and the Jaccard similarity between the best-scoring and the planted clades.</w:t>
       </w:r>
     </w:p>
     <w:bookmarkEnd w:id="31"/>
@@ -902,7 +902,7 @@
         <w:pStyle w:val="FirstParagraph"/>
       </w:pPr>
       <w:r>
-        <w:t xml:space="preserve">The performance measure of each test was its rejection rate across the 1,000 replicates of a condition, and that of each clade-recovery method was its proportion of hits. With K = 1,000 replicates, the Monte Carlo standard error of a rate p is [p(1 − p)/K]^½, which is 0.007 at p = 0.05 and at most 0.016 at p = 0.5, so a 95% Monte Carlo interval around the nominal level spans about ±0.014. We chose K so that this interval falls within Bradley’s liberal criterion for acceptable type I error, [0.025, 0.075] [CITAR: Bradley 1978], and used 999 permutations so that p-values have a resolution of 0.001. We report every rate with its Monte Carlo standard error in the Supporting Information (Table S2), and the credible intervals of the formal models below include the binomial variation among replicates.</w:t>
+        <w:t xml:space="preserve">The performance measure of each test was its rejection rate across the 1,000 replicates of a condition, and that of each clade-recovery method was its proportion of hits. With K = 1,000 replicates, the Monte Carlo standard error of a rate p is [p(1 − p)/K]^½, which is 0.007 at P = 0.05 and at most 0.016 at P = 0.5, so a 95% Monte Carlo interval around the nominal level spans about ±0.014. We chose K so that this interval falls within Bradley’s liberal criterion for acceptable type I error, [0.025, 0.075] (Bradley, 1978), and used 999 permutations so that P-values have a resolution of 0.001. We report every rate with its Monte Carlo standard error in the Supporting Information (Table S2), and the credible intervals of the formal models below include the binomial variation among replicates.</w:t>
       </w:r>
     </w:p>
     <w:bookmarkEnd w:id="32"/>
@@ -920,15 +920,15 @@
         <w:pStyle w:val="FirstParagraph"/>
       </w:pPr>
       <w:r>
-        <w:t xml:space="preserve">We modelled the rates aggregated by condition with beta-binomial models fitted in the R package brms v. 2.23.0 [CITAR: Bürkner 2017] with CmdStan v. 2.39.0 through cmdstanr [CITAR: Gabry et al. 2024], with one model for the type I error and one for the power in each layer, and one for clade recovery. The plan was to treat γ and the Colless index as continuous covariates, but each cell of the grid has a single target per axis, and Layer A did not store the shape of every tree, so a continuous term would only interpolate three points. Therefore, we entered the levels of γ and of the Colless index as factors, with their interaction, which estimates the full γ × imbalance surface without assuming its form. In Layer A, the shape effects could differ among tests and scenarios, which is what testing a nuisance effect that depends on tree shape requires, and with N and data type; in the R formula notation, the model was test * scenario * (γ + Colless) + test * (γ:Colless + N + data type) + test:(γ + Colless):(N + data type). In Layer B, where only five cells were simulated, the cell entered as a five-level factor, in test * archetype * (scenario + cell) + test * N * (archetype + scenario + cell). The clade-recovery model was method * (γ * depth + Colless + γ:Colless + shift + N + data type) + method:(γ + Colless):(N + data type + shift). We first fitted quasibinomial generalized linear models to the same structures, which showed a dispersion 2.2–14 times larger than binomial. The beta-binomial accounts for this extra variation with a single precision parameter φ, whereas a first version with an observation-level random effect hit the maximum tree depth of the sampler in almost every transition.</w:t>
-      </w:r>
-    </w:p>
-    <w:p>
-      <w:pPr>
-        <w:pStyle w:val="BodyText"/>
-      </w:pPr>
-      <w:r>
-        <w:t xml:space="preserve">Priors were declared explicitly on the logit scale. We used normal(0, 1.5) for all coefficients; normal(−2.9, 1.5) for the intercept of the type I models, centred on logit(0.05), and normal(0, 1.5) for the other intercepts; and gamma(2, 0.01) for φ, which is weakly informative around the values implied by the quasibinomial dispersion (φ of about 75–830). We ran four chains of 2,000 iterations (1,000 of warm-up) with adapt_delta = 0.95 and a maximum tree depth of 10 in Layer A and 12 in Layer B, where about 1% of the transitions of the type I model reached depth 10. We checked convergence with the rank-normalized R̂, the bulk and tail effective sample sizes, the number of divergent transitions and the number of transitions at the maximum tree depth, and model fit with in-sample posterior predictive checks, both for each condition and for the sums over the conditions of each test, N and cell. We summarize the results as posterior rates and contrasts between tree shapes or archetypes, with medians and 95% credible intervals (CI). Since the models share the scenario effects across N on the logit scale and have no scenario × N interaction, we also report the raw rates where they exceed the modelled ones.</w:t>
+        <w:t xml:space="preserve">We modelled the rates aggregated by condition with beta-binomial models fitted in the R package brms v. 2.23.0 (Bürkner, 2017) with CmdStan v. 2.39.0 through cmdstanr v. 0.9.0 (Gabry et al., 2025), with one model for the type I error and one for the power in each layer, and one for clade recovery. The plan was to treat γ and the Colless index as continuous covariates, but each cell of the grid has a single target per axis, and Layer A did not store the shape of every tree, so a continuous term would only interpolate three points. Therefore, we entered the levels of γ and of the Colless index as factors, with their interaction, which estimates the full γ × imbalance surface without assuming its form. In Layer A, the shape effects could differ among tests and scenarios, which is what testing a nuisance effect that depends on tree shape requires, and with N and data type; in the R formula notation, the model was test * scenario * (γ + Colless) + test * (γ:Colless + N + data type) + test:(γ + Colless):(N + data type) + test:scenario:N, where the last term lets the scenario effects, such as the inflation under nuisance structure, differ with N. In Layer B, where only five cells were simulated, the cell entered as a five-level factor, in test * archetype * (scenario + cell) + test * N * (archetype + scenario + cell). The clade-recovery model was method * (γ * depth + Colless + γ:Colless + shift + N + data type) + method:(γ + Colless):(N + data type + shift). We first fitted quasibinomial generalized linear models to the same structures, which showed a dispersion 2.1–8.5 times larger than binomial. The beta-binomial accounts for this extra variation with a single precision parameter φ, whereas a first version with an observation-level random effect hit the maximum tree depth of the sampler in almost every transition.</w:t>
+      </w:r>
+    </w:p>
+    <w:p>
+      <w:pPr>
+        <w:pStyle w:val="BodyText"/>
+      </w:pPr>
+      <w:r>
+        <w:t xml:space="preserve">Priors were declared explicitly on the logit scale. We used normal(0, 1.5) for all coefficients; normal(−2.9, 1.5) for the intercept of the type I models, centred on logit(0.05), and normal(0, 1.5) for the other intercepts; and gamma(2, 0.01) for φ, which is weakly informative around the values implied by the quasibinomial dispersion (φ of about 130–910). We ran four chains of 2,000 iterations (1,000 of warm-up) with adapt_delta = 0.95 and a maximum tree depth of 12, since with the default of 10 a few transitions of the type I models reached the limit. We checked convergence with the rank-normalized R̂, the bulk and tail effective sample sizes, the number of divergent transitions and the number of transitions at the maximum tree depth, and model fit with in-sample posterior predictive checks, both for each condition and for the sums over the conditions of each test, N and cell. We summarize the results as posterior rates and contrasts between tree shapes or archetypes, with medians and 95% credible intervals (CI). Because the raw rates can still exceed the modelled ones in the most extreme conditions, we also report them where they do.</w:t>
       </w:r>
     </w:p>
     <w:bookmarkEnd w:id="33"/>
@@ -946,7 +946,7 @@
         <w:pStyle w:val="FirstParagraph"/>
       </w:pPr>
       <w:r>
-        <w:t xml:space="preserve">To show where real regional species pools fall in the grid of tree shapes, and how the methods behave with real data, we used 14 tadpole metacommunities compiled from the literature and from unpublished data (Box 1). We harmonized species names with the Amphibian Species of the World [CITAR: Frost 2025] using the R package AmphiNom v. 1.1.0 [CITAR: Liedtke 2019], excluded undetermined taxa, and matched the remaining 123 species to the tips of the Portik et al. (2023) tree. We built three nested pools (Atlantic Forest; Atlantic Forest and interior of São Paulo; all South American metacommunities), pruned the tree to each, and computed γ and the normalized Colless index on the point-estimate tree and on its 100 time-calibrated bootstrap trees. For the case study, we used the three metacommunities with at least 10 ponds and pond depth measured in every pond, namely Serra da Bocaina (13 ponds; Provete et al. 2014), southern Brazil (32 ponds; Both et al. 2011) and northwestern São Paulo (40 ponds; Prado &amp; Rossa-Feres 2014). We applied all tests and the four clade-scoring methods to incidence data with pond depth as the gradient, and also with canopy cover in Bocaina, the variable associated with its phylogenetic composition in a previous analysis with PCPS (Provete 2018).</w:t>
+        <w:t xml:space="preserve">To show where real regional species pools fall in the grid of tree shapes, and how the methods behave with real data, we used 14 tadpole metacommunities compiled from the literature and from unpublished data (Box 1). We harmonized species names with the Amphibian Species of the World [CITAR: Frost 2025] using the R package AmphiNom v. 1.1.0 (Liedtke, 2019), excluded undetermined taxa, and matched the remaining 123 species to the tips of the Portik et al. (2023) tree. We built three nested pools (Atlantic Forest; Atlantic Forest and interior of São Paulo; all South American metacommunities), pruned the tree to each, and computed γ and the normalized Colless index on the point-estimate tree and on its 100 time-calibrated bootstrap trees. For the case study, we used the metacommunities with at least 10 ponds and pond depth measured in every pond, namely two of the 14 and one additional published dataset: Serra da Bocaina (13 ponds; Provete et al., 2014), southern Brazil (32 ponds; Both et al., 2011) and northwestern São Paulo (40 ponds; Prado &amp; Rossa-Feres, 2014). We applied all tests and the four clade-scoring methods to incidence data with pond depth as the gradient, and also with canopy cover in Bocaina, the variable associated with its phylogenetic composition in a previous analysis with PCPS (Provete, 2018).</w:t>
       </w:r>
     </w:p>
     <w:bookmarkEnd w:id="34"/>
@@ -964,7 +964,7 @@
         <w:pStyle w:val="FirstParagraph"/>
       </w:pPr>
       <w:r>
-        <w:t xml:space="preserve">We ran all analyses in R v. 4.6.1 [CITAR: R Core Team 2026], with the versions of every package recorded in the renv lockfile of the repository [CITAR: Ushey &amp; Wickham, renv]; besides those cited above, we used ape v. 5.8-1 [CITAR: Paradis &amp; Schliep 2019] and mgcv v. 1.9-4 [CITAR: Wood 2017]. We orchestrated the simulations of Layer A and Layer B with targets v. 1.12.0 and crew v. 1.3.3 [CITAR: Landau 2021] in a Docker image on spot cloud instances with 192 virtual CPUs (190 workers); the pipeline seed was 20261018, from which targets derives one seed per branch. Layer A took about 8 h for the 432,000 metacommunities of the main run and Layer B about 7.5 h for its 440,000. The clade-recovery runs took 1.2 h on a 16-core workstation, with one seed per tree, depth and replicate, and each formal model 1–7 min. Code is available at [CITAR: repository and Zenodo DOI], together with the rates aggregated by condition and the scripts that compute the performance measures and the models from them, which reproduce every table and figure without rerunning the simulations.</w:t>
+        <w:t xml:space="preserve">We ran all analyses in R v. 4.6.1 (R Core Team, 2026), with the versions of every package recorded in the lockfile of renv v. 1.3.1 (Ushey &amp; Wickham, 2026); trees were handled with ape v. 5.8-1 (Paradis &amp; Schliep, 2019), and the trait simulation, the β-splitting and branching-time generator and the calibration of the grid are our own R code in the repository. We orchestrated the simulations of Layer A and Layer B with targets v. 1.12.0 (Landau, 2021) and crew v. 1.3.3 (Landau, 2026) in a Docker image on spot cloud instances with 192 virtual CPUs (190 workers); the pipeline seed was 20261018, from which targets derives one seed per branch. Layer A took about 8 h for the 432,000 metacommunities of the main run and Layer B about 7.5 h for its 440,000. The clade-recovery runs took 1.2 h on a 16-core workstation, with one seed per tree, depth and replicate, and each formal model 1–7 min. Code is available at [CITAR: GitHub repository and Zenodo DOI], together with the rates aggregated by condition and the scripts that compute the performance measures and the models from them, which reproduce every table and figure without rerunning the simulations.</w:t>
       </w:r>
     </w:p>
     <w:bookmarkEnd w:id="35"/>
@@ -992,7 +992,7 @@
         <w:pStyle w:val="FirstParagraph"/>
       </w:pPr>
       <w:r>
-        <w:t xml:space="preserve">The static layer reproduced the published validations. In the Yule trees of Duarte et al. (2016), the rejection rates of the site shuffle, the taxa shuffle and the max test fell within the 95% binomial interval of our estimates in 66 of 72 cells. The six exceptions came from two conditions, PERMANOVA with both components at N = 100 and the Mantel test with environment only at N = 200, which fell outside in more than one null model, slightly more than the 3.6 cells expected by chance. The mean PERMANOVA R² and Mantel ρ agreed to the second decimal place when we used the Bray–Curtis dissimilarity without the square root, as in the code of Duarte et al. (2016); in the rest of the study we used the square-rooted version. The PCC matched the published rates in the scenarios that do not depend on the tree. Its power was slightly lower than published, but it varied between 0.71 and 0.93 among 20 Yule trees, and the published values sit at the upper end of that range, which seems to reflect a single favourable tree. Thus, our implementation reproduces both benchmarks within Monte Carlo error.</w:t>
+        <w:t xml:space="preserve">The static layer reproduced the published validations. In the Yule trees of Duarte et al. (2016), the rejection rates of the site shuffle, the taxa shuffle and the max test fell within the 95% binomial interval of our estimates in 66 of 72 cells. The six exceptions came from four conditions (PERMANOVA with both components at N = 100, with environment only at N = 200 and with phylogeny only at N = 200, and the Mantel test with environment only at N = 200), slightly more than the 3.6 cells expected by chance. The mean PERMANOVA R² and Mantel ρ agreed to the second decimal place when we used the Bray–Curtis dissimilarity without the square root, as in the code of Duarte et al. (2016); in the rest of the study we used the square-rooted version. The PCC matched the published rates in the scenarios that do not depend on the tree. Its power was lower than published (0.93 against 0.95), and it varied between 0.71 and 0.93 among 20 Yule trees, so the published values lie just above that range, which seems to reflect a single favourable tree. Thus, our implementation closely reproduces both benchmarks.</w:t>
       </w:r>
     </w:p>
     <w:bookmarkEnd w:id="37"/>
@@ -1010,37 +1010,37 @@
         <w:pStyle w:val="FirstParagraph"/>
       </w:pPr>
       <w:r>
-        <w:t xml:space="preserve">Tree imbalance did not affect the type I error of any test. In all 75 combinations of test, null scenario and N, the difference in the distance of the type I error from the nominal level between highly imbalanced and Yule trees was within ±0.011, and no 95% CI excluded zero, with incidence or abundance data (</w:t>
+        <w:t xml:space="preserve">Tree imbalance did not affect the type I error of any test. In all 75 combinations of test, null scenario and N, the difference in the distance of the type I error from the nominal level between highly imbalanced and Yule trees was within ±0.012, and no 95% CI excluded zero, with incidence or abundance data (</w:t>
       </w:r>
       <w:hyperlink w:anchor="fig-type1">
         <w:r>
           <w:rPr>
             <w:rStyle w:val="Hyperlink"/>
           </w:rPr>
-          <w:t xml:space="preserve">Figure 2</w:t>
+          <w:t xml:space="preserve">Fig. 2</w:t>
         </w:r>
       </w:hyperlink>
       <w:r>
-        <w:t xml:space="preserve">). In S0, where optima had no phylogenetic signal and the gradient was independent, all tests were conservative, and four of them became more conservative in trees with low γ (by 0.011–0.019). Therefore, H1 was not supported at the resolution of our design, although we did not test the medium level of imbalance separately from the high one.</w:t>
-      </w:r>
-    </w:p>
-    <w:p>
-      <w:pPr>
-        <w:pStyle w:val="BodyText"/>
-      </w:pPr>
-      <w:r>
-        <w:t xml:space="preserve">Phylogenetic signal in niche breadth inflated the type I error of only two tests. Compared with the same scenario without signal (S2), signal in σ (S2σ) increased the rejection rate of GLM PCPS2 by 0.03 (95% CI 0.02–0.04) in Yule trees at N = 100, and by 0.09 (0.07–0.10), 0.11 (0.09–0.13) and 0.16 (0.13–0.18) with low γ at N = 50, 100 and 200 (</w:t>
+        <w:t xml:space="preserve">). In S0, where optima had no phylogenetic signal and the gradient was independent, all tests were conservative, and four of them became more conservative in trees with low γ (by 0.008–0.020). Therefore, H1 was not supported at the resolution of our design, although we did not test the medium level of imbalance separately from the high one.</w:t>
+      </w:r>
+    </w:p>
+    <w:p>
+      <w:pPr>
+        <w:pStyle w:val="BodyText"/>
+      </w:pPr>
+      <w:r>
+        <w:t xml:space="preserve">Phylogenetic signal in niche breadth inflated the type I error of only two tests. Compared with the same scenario without signal (S2), signal in σ (S2σ) increased the rejection rate of GLM PCPS2 by 0.02 (95% CI 0.01–0.03) in Yule trees at N = 100, and by 0.05 (0.04–0.06), 0.10 (0.08–0.12) and 0.21 (0.19–0.23) with low γ at N = 50, 100 and 200 (</w:t>
       </w:r>
       <w:hyperlink w:anchor="fig-type1">
         <w:r>
           <w:rPr>
             <w:rStyle w:val="Hyperlink"/>
           </w:rPr>
-          <w:t xml:space="preserve">Figure 2</w:t>
+          <w:t xml:space="preserve">Fig. 2</w:t>
         </w:r>
       </w:hyperlink>
       <w:r>
-        <w:t xml:space="preserve">). The raw rates were even higher at N = 200, where GLM PCPS2 rejected the null hypothesis in up to 0.36 of the replicates in low-γ trees, since the model shares the scenario effects across N on the logit scale. The PCC was also inflated, by 0.045 (0.031–0.060) in Yule trees and by 0.021 (0.009–0.033) with low γ, with raw rates of up to 0.22 at N = 200 in Yule trees. Interestingly, PERMANOVA, GLM PCPS1 and the Mantel test became more conservative under signal in σ (by 0.01–0.025), and signal in maximum abundance (S2h) did not change the rejection rate of any test. With abundance data, the inflation of GLM PCPS2 was smaller (0.05, 0.04–0.07, with low γ at N = 100). As a result, H2 was rejected as stated: the nuisance structure created by a phylogenetically conserved niche breadth seems to affect only the methods that rely on the second PCPS axis or on phylogenetic eigenvectors, and its effect on GLM PCPS2 depends strongly on the distribution of branching times.</w:t>
+        <w:t xml:space="preserve">). The raw rates reached 0.36 at N = 200 in low-γ trees. The PCC was also inflated, by 0.05 (0.03–0.06) in Yule trees and by 0.02 (0.01–0.03) with low γ at N = 100, with raw rates of up to 0.22 at N = 200 in Yule trees. Interestingly, PERMANOVA, GLM PCPS1 and the Mantel test became more conservative under signal in σ (by 0.005–0.030), and signal in maximum abundance (S2h) did not change the rejection rate of any test. With abundance data, the inflation of GLM PCPS2 was smaller (0.08, 0.06–0.09, with low γ at N = 100). As a result, H2 was rejected as stated: the nuisance structure created by a phylogenetically conserved niche breadth seems to affect only the methods that rely on the second PCPS axis or on phylogenetic eigenvectors, and its effect on GLM PCPS2 depends strongly on the distribution of branching times.</w:t>
       </w:r>
     </w:p>
     <w:tbl>
@@ -1144,11 +1144,11 @@
           <w:rPr>
             <w:rStyle w:val="Hyperlink"/>
           </w:rPr>
-          <w:t xml:space="preserve">Figure 3</w:t>
+          <w:t xml:space="preserve">Fig. 3</w:t>
         </w:r>
       </w:hyperlink>
       <w:r>
-        <w:t xml:space="preserve">). At N = 100 with incidence data, low γ reduced the power of GLM PCPS1 from 0.74 to 0.34 in S3b (contrast −0.40, 95% CI −0.46 to −0.33), with similar losses in S3a and S3σ, and that of the PCC from 0.97 to 0.74 (−0.23, −0.29 to −0.18). The Mantel test lost 0.05–0.14 at N = 100 and up to 0.23 at N = 50. In contrast, the power of PERMANOVA did not change with γ at N = 100 in S3b (0.01, −0.03 to 0.06), was lower with low γ at N = 50 (−0.07 to −0.17 across scenarios) and higher at N = 200 (+0.04 to +0.08). High imbalance reduced power by at most 0.10. Consequently, the ranking of the tests changed with tree shape: in S3b, the PCC was the most powerful test in Yule trees and the third with low γ, and in S3a GLM PCPS1 fell from third to fourth. The effect of γ also changed with N in opposite directions among tests, since the loss of GLM PCPS1 increased with N (−0.38 at N = 50 and −0.46 at N = 200 in S3b), whereas that of the PCC decreased (−0.48 at N = 50 and −0.10 at N = 200). Thus, H4 was supported for power.</w:t>
+        <w:t xml:space="preserve">). At N = 100 with incidence data, low γ reduced the power of GLM PCPS1 from 0.74 to 0.34 in S3b (contrast −0.40, 95% CI −0.45 to −0.34), with similar losses in S3a and S3σ, and that of the PCC from 0.98 to 0.73 (−0.25, −0.30 to −0.21). The Mantel test lost 0.05–0.14 at N = 100 and up to 0.23 at N = 50. In contrast, the power of PERMANOVA did not change with γ at N = 100 in S3b (0.01, −0.02 to 0.05), was lower with low γ at N = 50 (−0.03 to −0.17 across scenarios) and higher at N = 200 (+0.04 to +0.08). High imbalance reduced power by at most 0.09. Consequently, the ranking of the tests changed with tree shape: in S3b, the PCC was the most powerful test in Yule trees and the third with low γ, and in S3a GLM PCPS1 fell from third to fourth. The effect of γ also changed with N in opposite directions among tests, since the loss of GLM PCPS1 increased with N (−0.38 at N = 50 and −0.46 at N = 200 in S3b), whereas that of the PCC decreased (−0.48 at N = 50 and −0.06 at N = 200). Thus, H4 was supported for power.</w:t>
       </w:r>
     </w:p>
     <w:tbl>
@@ -1252,11 +1252,11 @@
           <w:rPr>
             <w:rStyle w:val="Hyperlink"/>
           </w:rPr>
-          <w:t xml:space="preserve">Figure 4</w:t>
+          <w:t xml:space="preserve">Fig. 4</w:t>
         </w:r>
       </w:hyperlink>
       <w:r>
-        <w:t xml:space="preserve">). Under species sorting without competition, power at N = 100 in S3b in Yule pool trees ranged from 0.78 (GLM PCPS1) and 0.83 (RDA PCPS) to 0.87 (PERMANOVA), 0.92 (Mantel) and 0.96 (PCC), whereas GLM PCPS2 had almost no power (0.03), as in Layer A. Mass effects reduced the power of every test except GLM PCPS2, which gained 0.08 (0.06–0.11) from its low baseline. Relative to species sorting, PERMANOVA lost 0.62 (0.58–0.65) in Yule pool trees and 0.72 (0.69–0.75) with low γ, the Mantel test 0.75 and 0.79, RDA PCPS 0.58 and 0.55, GLM PCPS1 0.55 and 0.27, and the PCC 0.93 (0.92–0.94) and 0.76, so that the PCC detected the phylogenetic signal in almost no replicate. Surprisingly, adding phylogenetic competition to mass effects partly restored power; for instance, PERMANOVA lost 0.46 (0.42–0.50) instead of 0.62 in Yule pool trees. Under species sorting, phylogenetic competition changed power by −0.12 to +0.11. These two contrasts should be read with care, because competition prunes close relatives and changes the shape of the analysed tree relative to the pool tree, so the effect of the process cannot be separated from that of a change in tree shape; this pruning is strongest under mass effects, where the Colless index of the analysed tree was about 75% lower than that of the pool. Under the null hypothesis, no condition at N = 100 had a 95% CI above 0.075 (largest posterior median 0.088). However, raw rejection rates exceeded that limit at N = 200 for the PCC in S2h (0.111 under species sorting and 0.143 under mass effects, in Yule pool trees) and for GLM PCPS2 in S2σ under species sorting in the low- and mid-γ cells (0.104–0.129).</w:t>
+        <w:t xml:space="preserve">). Under species sorting without competition, power at N = 100 in S3b in Yule pool trees ranged from 0.78 (GLM PCPS1) and 0.83 (RDA PCPS) to 0.87 (PERMANOVA), 0.92 (Mantel) and 0.96 (PCC), whereas GLM PCPS2 had almost no power (0.03), as in Layer A. Mass effects reduced the power of every test except GLM PCPS2, which gained 0.08 (0.06–0.11) from its low baseline. Relative to species sorting, PERMANOVA lost 0.62 (0.58–0.65) in Yule pool trees and 0.72 (0.69–0.75) with low γ, the Mantel test 0.75 and 0.79, RDA PCPS 0.58 and 0.55, GLM PCPS1 0.55 and 0.27, and the PCC 0.93 (0.92–0.94) and 0.76, so that the PCC detected the phylogenetic signal in almost no replicates. Surprisingly, adding phylogenetic competition to mass effects partly restored the power of every test except the PCC; for instance, PERMANOVA lost 0.46 (0.42–0.50) instead of 0.62 in Yule pool trees. Under species sorting, phylogenetic competition changed power by −0.12 to +0.11. These two contrasts should be read with care, because competition prunes close relatives and changes the shape of the analysed tree relative to the pool tree, so the effect of the process cannot be separated from that of a change in tree shape; this pruning is strongest under mass effects, where the Colless index of the analysed tree was about 75% lower than that of the pool. Under the null hypothesis, no lower CI bound exceeded 0.075 at N = 100 (largest posterior median 0.088). However, raw rejection rates exceeded that limit for GLM PCPS2 in S2σ under species sorting (0.094 at N = 100 and 0.104–0.129 at N = 200 in the low- and mid-γ cells) and for the PCC in S2h (0.085–0.089 at N = 100; 0.111 under species sorting and 0.116–0.143 under mass effects at N = 200).</w:t>
       </w:r>
     </w:p>
     <w:tbl>
@@ -1353,14 +1353,14 @@
         <w:pStyle w:val="FirstParagraph"/>
       </w:pPr>
       <w:r>
-        <w:t xml:space="preserve">evoPCA and phylofactorization recovered the planted clade far more often than PCPS and PCC (</w:t>
+        <w:t xml:space="preserve">The evoPCA and phylofactorization recovered the planted clade far more often than PCPS and PCC (</w:t>
       </w:r>
       <w:hyperlink w:anchor="fig-clade">
         <w:r>
           <w:rPr>
             <w:rStyle w:val="Hyperlink"/>
           </w:rPr>
-          <w:t xml:space="preserve">Figure 5</w:t>
+          <w:t xml:space="preserve">Fig. 5</w:t>
         </w:r>
       </w:hyperlink>
       <w:r>
@@ -1372,7 +1372,7 @@
         <w:pStyle w:val="BodyText"/>
       </w:pPr>
       <w:r>
-        <w:t xml:space="preserve">Tree shape changed recovery only for PCPS and PCC. With low γ, PCPS recovered basal clades in 0.58 of the replicates against 0.21 in Yule trees, and recent clades in 0.35 against 0.04 (N = 100), and this advantage grew with N (+0.23 to +0.45 across N and depths). The PCC lost 0.10–0.14 in basal clades with low γ and gained 0.07–0.09 in recent ones, whereas the recovery of evoPCA and phylofactorization did not change with γ (all 95% CI included zero), and high imbalance reduced recovery by 0.01–0.10 in all methods. Interestingly, low γ improved PCPS for recent as well as for basal clades, so H3 was only partly supported: the advantage of basal clades seems to be a matter of degree rather than a different behaviour of the method, and the share of variation on the first PCPS axis decreased rather than increased with low γ in the descriptive summaries of Layer A. With abundance data, the patterns were the same, with lower recovery for the compositional phylofactorization (0.68 and 0.56 for basal and recent clades at N = 100) than for evoPCA (0.78 and 0.65), and PCPS gained 0.29 (0.25–0.32) and 0.23 (0.20–0.25) with low γ. Taken together, H4 was also supported for clade recovery, but only through the shift between PCPS and PCC.</w:t>
+        <w:t xml:space="preserve">Tree shape changed recovery only for PCPS and PCC. With low γ, PCPS recovered basal clades in 0.58 of the replicates against 0.21 in Yule trees, and recent clades in 0.35 against 0.04 (N = 100), and this advantage grew with N (+0.23 to +0.45 across N and depths). The PCC lost 0.10–0.14 in basal clades with low γ and gained 0.07–0.09 in recent ones, whereas the recovery of evoPCA and phylofactorization did not change with γ (all 95% CI included zero), and high imbalance reduced recovery by 0.01–0.10 in all methods. Interestingly, low γ improved PCPS for recent as well as for basal clades, so H3 was only partly supported: the advantage of basal clades seems to be a matter of degree rather than a different behaviour of the method, and the share of variation on the first PCPS axis decreased rather than increased with low γ in the descriptive summaries of Layer A. With abundance data, the patterns were the same, with lower recovery for the compositional phylofactorization (0.68 and 0.56 for basal and recent clades at N = 100) than for evoPCA (0.78 and 0.65), and PCPS gained 0.29 (0.25–0.33) and 0.23 (0.21–0.25) with low γ. Taken together, H4 was also supported for clade recovery, but only through the change in rank between PCPS and PCC.</w:t>
       </w:r>
     </w:p>
     <w:tbl>
@@ -1469,7 +1469,7 @@
         <w:pStyle w:val="FirstParagraph"/>
       </w:pPr>
       <w:r>
-        <w:t xml:space="preserve">All models converged, with R̂ ≤ 1.01, bulk effective sample size ≥ 835 and tail effective sample size ≥ 1,596, no divergent transitions and no transition at the maximum tree depth (Table S3). The in-sample posterior predictive intervals of 95% contained 97–98% of the observed rates of each condition, and those of 50% contained 61–70%, so the models are slightly conservative; when we summed the conditions of each test, N and cell, every group fell within its 95% interval.</w:t>
+        <w:t xml:space="preserve">All models converged, with R̂ ≤ 1.01, bulk effective sample size ≥ 908 and tail effective sample size ≥ 1,477, no divergent transitions and no transition at the maximum tree depth (Table S3). The in-sample 95% posterior predictive intervals contained 96–98% of the observed rates of each condition and the 50% intervals 61–70%, so the predictive intervals are slightly wider than needed; when we summed the conditions of each test, N and cell, every group fell within its 95% interval.</w:t>
       </w:r>
     </w:p>
     <w:bookmarkEnd w:id="58"/>
@@ -1495,7 +1495,7 @@
           <w:rPr>
             <w:rStyle w:val="Hyperlink"/>
           </w:rPr>
-          <w:t xml:space="preserve">Figure 6</w:t>
+          <w:t xml:space="preserve">Fig. 6</w:t>
         </w:r>
       </w:hyperlink>
       <w:r>
@@ -1507,7 +1507,7 @@
         <w:pStyle w:val="BodyText"/>
       </w:pPr>
       <w:r>
-        <w:t xml:space="preserve">The three metacommunities of the case study had small trees with contrasting shapes. Bocaina (Provete et al. 2014; 15 species in 13 ponds) and southern Brazil (Both et al. 2011; 21 species in 32 ponds) had negative γ (−1.59 and −1.53), whereas northwestern São Paulo (Prado &amp; Rossa-Feres 2014; 26 species in 40 ponds) had positive γ (1.39), outside the range of the grid. No test rejected the null hypothesis of no association between phylogenetic structure and pond depth with the max test (all p ≥ 0.11). In Bocaina, canopy cover was associated with phylogenetic composition under the site shuffle (p = 0.048–0.053 for PERMANOVA, GLM PCPS1, RDA PCPS and PCC), but not under the taxa shuffle (p = 0.23–0.56). This means that canopy cover structures the composition of these ponds, as found with PCPS by Provete (2018), but that the phylogenetic arrangement of the species adds nothing beyond composition once the tips are permuted, which is the inference the max test protects. The clade-scoring methods agreed where the simulation predicts they should: in Bocaina, PCC, evoPCA and phylofactorization chose the same clade of five Dendropsophus and Scinax species along the depth gradient, and in northwestern São Paulo PCC and evoPCA chose the three microhylids. However, with 13–40 ponds and without a significant test, these clades describe the strongest phylogenetic contrast along the gradient rather than a demonstrated association.</w:t>
+        <w:t xml:space="preserve">The three metacommunities of the case study had small trees with contrasting shapes. Bocaina (Provete et al., 2014; 15 species in 13 ponds) and southern Brazil (Both et al., 2011; 21 species in 32 ponds) had negative γ (−1.59 and −1.53), whereas northwestern São Paulo (Prado &amp; Rossa-Feres, 2014; 26 species in 40 ponds) had positive γ (1.39), outside the range of the grid. No test rejected the null hypothesis of no association between phylogenetic structure and pond depth with the max test (all P ≥ 0.107). In Bocaina, canopy cover was marginally associated with phylogenetic composition under the site shuffle (P = 0.048 for PERMANOVA and 0.050–0.053 for GLM PCPS1, RDA PCPS and PCC), but not under the taxa shuffle (P = 0.23–0.56). This seems to indicate that canopy cover is related to the composition of these ponds, in line with the analysis with PCPS of Provete (2018), but that the phylogenetic arrangement of the species adds no detectable signal once the tips are permuted, which is the inference the max test protects. The clade-scoring methods partly agreed: in Bocaina, PCC, evoPCA and phylofactorization chose the same clade of five Dendropsophus and Scinax species along the depth gradient, and in northwestern São Paulo PCC and evoPCA chose the three microhylids; the agreement of the PCC is unexpected, given its poor recovery in the simulations. However, with 13–40 ponds and without a significant test, these clades describe the strongest phylogenetic contrast along the gradient rather than a demonstrated association.</w:t>
       </w:r>
     </w:p>
     <w:tbl>
@@ -1604,6 +1604,48 @@
         <w:pStyle w:val="FirstParagraph"/>
       </w:pPr>
       <w:r>
+        <w:t xml:space="preserve">Anderson, M. J. (2001). A new method for non-parametric multivariate analysis of variance.</w:t>
+      </w:r>
+      <w:r>
+        <w:t xml:space="preserve"> </w:t>
+      </w:r>
+      <w:r>
+        <w:rPr>
+          <w:i/>
+          <w:iCs/>
+        </w:rPr>
+        <w:t xml:space="preserve">Austral Ecology</w:t>
+      </w:r>
+      <w:r>
+        <w:t xml:space="preserve">, 26, 32–46.</w:t>
+      </w:r>
+    </w:p>
+    <w:p>
+      <w:pPr>
+        <w:pStyle w:val="BodyText"/>
+      </w:pPr>
+      <w:r>
+        <w:t xml:space="preserve">Beverton, R. J. H., &amp; Holt, S. J. (1957).</w:t>
+      </w:r>
+      <w:r>
+        <w:t xml:space="preserve"> </w:t>
+      </w:r>
+      <w:r>
+        <w:rPr>
+          <w:i/>
+          <w:iCs/>
+        </w:rPr>
+        <w:t xml:space="preserve">On the dynamics of exploited fish populations</w:t>
+      </w:r>
+      <w:r>
+        <w:t xml:space="preserve">. Fishery Investigations Series II, Vol. 19. London: HMSO (reprinted 1993, Springer, doi:10.1007/978-94-011-2106-4).</w:t>
+      </w:r>
+    </w:p>
+    <w:p>
+      <w:pPr>
+        <w:pStyle w:val="BodyText"/>
+      </w:pPr>
+      <w:r>
         <w:t xml:space="preserve">Both, C., Melo, A. S., Cechin, S. Z., &amp; Hartz, S. M. (2011). Tadpole co-occurrence in ponds: when do guilds and time matter?</w:t>
       </w:r>
       <w:r>
@@ -1625,6 +1667,77 @@
         <w:pStyle w:val="BodyText"/>
       </w:pPr>
       <w:r>
+        <w:t xml:space="preserve">Bradley, J. V. (1978). Robustness?</w:t>
+      </w:r>
+      <w:r>
+        <w:t xml:space="preserve"> </w:t>
+      </w:r>
+      <w:r>
+        <w:rPr>
+          <w:i/>
+          <w:iCs/>
+        </w:rPr>
+        <w:t xml:space="preserve">British Journal of Mathematical and Statistical Psychology</w:t>
+      </w:r>
+      <w:r>
+        <w:t xml:space="preserve">, 31, 144–152.</w:t>
+      </w:r>
+    </w:p>
+    <w:p>
+      <w:pPr>
+        <w:pStyle w:val="BodyText"/>
+      </w:pPr>
+      <w:r>
+        <w:t xml:space="preserve">Bürkner, P.-C. (2017). brms: an R package for Bayesian multilevel models using Stan.</w:t>
+      </w:r>
+      <w:r>
+        <w:t xml:space="preserve"> </w:t>
+      </w:r>
+      <w:r>
+        <w:rPr>
+          <w:i/>
+          <w:iCs/>
+        </w:rPr>
+        <w:t xml:space="preserve">Journal of Statistical Software</w:t>
+      </w:r>
+      <w:r>
+        <w:t xml:space="preserve">, 80(1), 1–28.</w:t>
+      </w:r>
+    </w:p>
+    <w:p>
+      <w:pPr>
+        <w:pStyle w:val="BodyText"/>
+      </w:pPr>
+      <w:r>
+        <w:t xml:space="preserve">Colless, D. H. (1982). Review of Phylogenetics: the theory and practice of phylogenetic systematics.</w:t>
+      </w:r>
+      <w:r>
+        <w:t xml:space="preserve"> </w:t>
+      </w:r>
+      <w:r>
+        <w:rPr>
+          <w:i/>
+          <w:iCs/>
+        </w:rPr>
+        <w:t xml:space="preserve">Systematic Zoology</w:t>
+      </w:r>
+      <w:r>
+        <w:t xml:space="preserve">, 31, 100–104. [CITAR: conferir página final]</w:t>
+      </w:r>
+    </w:p>
+    <w:p>
+      <w:pPr>
+        <w:pStyle w:val="BodyText"/>
+      </w:pPr>
+      <w:r>
+        <w:t xml:space="preserve">Debastiani, V. J. (2026). PCPS: principal coordinates of phylogenetic structure. R package version 1.0.9. doi:10.32614/CRAN.package.PCPS.</w:t>
+      </w:r>
+    </w:p>
+    <w:p>
+      <w:pPr>
+        <w:pStyle w:val="BodyText"/>
+      </w:pPr>
+      <w:r>
         <w:t xml:space="preserve">DiRenzo, G. V., Hanks, E., &amp; Miller, D. A. W. (2023). A practical guide to understanding and validating complex models using data simulations.</w:t>
       </w:r>
       <w:r>
@@ -1646,6 +1759,27 @@
         <w:pStyle w:val="BodyText"/>
       </w:pPr>
       <w:r>
+        <w:t xml:space="preserve">Duarte, L. D. S. (2011). Phylogenetic habitat filtering influences forest nucleation in grasslands.</w:t>
+      </w:r>
+      <w:r>
+        <w:t xml:space="preserve"> </w:t>
+      </w:r>
+      <w:r>
+        <w:rPr>
+          <w:i/>
+          <w:iCs/>
+        </w:rPr>
+        <w:t xml:space="preserve">Oikos</w:t>
+      </w:r>
+      <w:r>
+        <w:t xml:space="preserve">, 120, 208–215.</w:t>
+      </w:r>
+    </w:p>
+    <w:p>
+      <w:pPr>
+        <w:pStyle w:val="BodyText"/>
+      </w:pPr>
+      <w:r>
         <w:t xml:space="preserve">Duarte, L. D. S., Debastiani, V. J., Freitas, A. V. L., &amp; Pillar, V. D. (2016). Dissecting phylogenetic fuzzy weighting: theory and application in metacommunity phylogenetics.</w:t>
       </w:r>
       <w:r>
@@ -1667,6 +1801,198 @@
         <w:pStyle w:val="BodyText"/>
       </w:pPr>
       <w:r>
+        <w:t xml:space="preserve">Duarte, L. D. S., Prieto, P. V., &amp; Pillar, V. D. (2012). Assessing spatial and environmental drivers of phylogenetic structure in Brazilian Araucaria forests.</w:t>
+      </w:r>
+      <w:r>
+        <w:t xml:space="preserve"> </w:t>
+      </w:r>
+      <w:r>
+        <w:rPr>
+          <w:i/>
+          <w:iCs/>
+        </w:rPr>
+        <w:t xml:space="preserve">Ecography</w:t>
+      </w:r>
+      <w:r>
+        <w:t xml:space="preserve">, 35, 952–960.</w:t>
+      </w:r>
+    </w:p>
+    <w:p>
+      <w:pPr>
+        <w:pStyle w:val="BodyText"/>
+      </w:pPr>
+      <w:r>
+        <w:t xml:space="preserve">Gabry, J., Češnovar, R., Johnson, A., &amp; Bronder, S. (2025). cmdstanr: R interface to CmdStan. R package version 0.9.0. https://github.com/stan-dev/cmdstanr.</w:t>
+      </w:r>
+    </w:p>
+    <w:p>
+      <w:pPr>
+        <w:pStyle w:val="BodyText"/>
+      </w:pPr>
+      <w:r>
+        <w:t xml:space="preserve">Janzen, T., &amp; Etienne, R. S. (2024). Phylogenetic tree statistics: a systematic overview using the new R package treestats.</w:t>
+      </w:r>
+      <w:r>
+        <w:t xml:space="preserve"> </w:t>
+      </w:r>
+      <w:r>
+        <w:rPr>
+          <w:i/>
+          <w:iCs/>
+        </w:rPr>
+        <w:t xml:space="preserve">Molecular Phylogenetics and Evolution</w:t>
+      </w:r>
+      <w:r>
+        <w:t xml:space="preserve">, 200, 108168.</w:t>
+      </w:r>
+    </w:p>
+    <w:p>
+      <w:pPr>
+        <w:pStyle w:val="BodyText"/>
+      </w:pPr>
+      <w:r>
+        <w:t xml:space="preserve">Landau, W. M. (2021). The targets R package: a dynamic Make-like function-oriented pipeline toolkit for reproducibility and high-performance computing.</w:t>
+      </w:r>
+      <w:r>
+        <w:t xml:space="preserve"> </w:t>
+      </w:r>
+      <w:r>
+        <w:rPr>
+          <w:i/>
+          <w:iCs/>
+        </w:rPr>
+        <w:t xml:space="preserve">Journal of Open Source Software</w:t>
+      </w:r>
+      <w:r>
+        <w:t xml:space="preserve">, 6(57), 2959.</w:t>
+      </w:r>
+    </w:p>
+    <w:p>
+      <w:pPr>
+        <w:pStyle w:val="BodyText"/>
+      </w:pPr>
+      <w:r>
+        <w:t xml:space="preserve">Landau, W. M. (2026). crew: a distributed worker launcher framework. R package version 1.3.3. doi:10.32614/CRAN.package.crew.</w:t>
+      </w:r>
+    </w:p>
+    <w:p>
+      <w:pPr>
+        <w:pStyle w:val="BodyText"/>
+      </w:pPr>
+      <w:r>
+        <w:t xml:space="preserve">Legendre, P., &amp; Gallagher, E. D. (2001). Ecologically meaningful transformations for ordination of species data.</w:t>
+      </w:r>
+      <w:r>
+        <w:t xml:space="preserve"> </w:t>
+      </w:r>
+      <w:r>
+        <w:rPr>
+          <w:i/>
+          <w:iCs/>
+        </w:rPr>
+        <w:t xml:space="preserve">Oecologia</w:t>
+      </w:r>
+      <w:r>
+        <w:t xml:space="preserve">, 129, 271–280.</w:t>
+      </w:r>
+    </w:p>
+    <w:p>
+      <w:pPr>
+        <w:pStyle w:val="BodyText"/>
+      </w:pPr>
+      <w:r>
+        <w:t xml:space="preserve">Liedtke, H. C. (2019). AmphiNom: an amphibian systematics tool.</w:t>
+      </w:r>
+      <w:r>
+        <w:t xml:space="preserve"> </w:t>
+      </w:r>
+      <w:r>
+        <w:rPr>
+          <w:i/>
+          <w:iCs/>
+        </w:rPr>
+        <w:t xml:space="preserve">Systematics and Biodiversity</w:t>
+      </w:r>
+      <w:r>
+        <w:t xml:space="preserve">, 17, 1–6.</w:t>
+      </w:r>
+    </w:p>
+    <w:p>
+      <w:pPr>
+        <w:pStyle w:val="BodyText"/>
+      </w:pPr>
+      <w:r>
+        <w:t xml:space="preserve">Mantel, N. (1967). The detection of disease clustering and a generalized regression approach.</w:t>
+      </w:r>
+      <w:r>
+        <w:t xml:space="preserve"> </w:t>
+      </w:r>
+      <w:r>
+        <w:rPr>
+          <w:i/>
+          <w:iCs/>
+        </w:rPr>
+        <w:t xml:space="preserve">Cancer Research</w:t>
+      </w:r>
+      <w:r>
+        <w:t xml:space="preserve">, 27, 209–220.</w:t>
+      </w:r>
+    </w:p>
+    <w:p>
+      <w:pPr>
+        <w:pStyle w:val="BodyText"/>
+      </w:pPr>
+      <w:r>
+        <w:t xml:space="preserve">Oksanen, J., Simpson, G. L., Blanchet, F. G., Kindt, R., Legendre, P., Minchin, P. R., et al. (2026). vegan: community ecology package. R package version 2.7-6. doi:10.32614/CRAN.package.vegan.</w:t>
+      </w:r>
+    </w:p>
+    <w:p>
+      <w:pPr>
+        <w:pStyle w:val="BodyText"/>
+      </w:pPr>
+      <w:r>
+        <w:t xml:space="preserve">Pagel, M. (1999). Inferring the historical patterns of biological evolution.</w:t>
+      </w:r>
+      <w:r>
+        <w:t xml:space="preserve"> </w:t>
+      </w:r>
+      <w:r>
+        <w:rPr>
+          <w:i/>
+          <w:iCs/>
+        </w:rPr>
+        <w:t xml:space="preserve">Nature</w:t>
+      </w:r>
+      <w:r>
+        <w:t xml:space="preserve">, 401, 877–884.</w:t>
+      </w:r>
+    </w:p>
+    <w:p>
+      <w:pPr>
+        <w:pStyle w:val="BodyText"/>
+      </w:pPr>
+      <w:r>
+        <w:t xml:space="preserve">Paradis, E., &amp; Schliep, K. (2019). ape 5.0: an environment for modern phylogenetics and evolutionary analyses in R.</w:t>
+      </w:r>
+      <w:r>
+        <w:t xml:space="preserve"> </w:t>
+      </w:r>
+      <w:r>
+        <w:rPr>
+          <w:i/>
+          <w:iCs/>
+        </w:rPr>
+        <w:t xml:space="preserve">Bioinformatics</w:t>
+      </w:r>
+      <w:r>
+        <w:t xml:space="preserve">, 35, 526–528.</w:t>
+      </w:r>
+    </w:p>
+    <w:p>
+      <w:pPr>
+        <w:pStyle w:val="BodyText"/>
+      </w:pPr>
+      <w:r>
         <w:t xml:space="preserve">Pavoine, S. (2016). A guide through a family of phylogenetic dissimilarity measures among sites.</w:t>
       </w:r>
       <w:r>
@@ -1688,6 +2014,27 @@
         <w:pStyle w:val="BodyText"/>
       </w:pPr>
       <w:r>
+        <w:t xml:space="preserve">Pavoine, S. (2020). adiv: an R package to analyse biodiversity in ecology.</w:t>
+      </w:r>
+      <w:r>
+        <w:t xml:space="preserve"> </w:t>
+      </w:r>
+      <w:r>
+        <w:rPr>
+          <w:i/>
+          <w:iCs/>
+        </w:rPr>
+        <w:t xml:space="preserve">Methods in Ecology and Evolution</w:t>
+      </w:r>
+      <w:r>
+        <w:t xml:space="preserve">, 11, 1106–1112.</w:t>
+      </w:r>
+    </w:p>
+    <w:p>
+      <w:pPr>
+        <w:pStyle w:val="BodyText"/>
+      </w:pPr>
+      <w:r>
         <w:t xml:space="preserve">Peres-Neto, P. R., &amp; Kembel, S. W. (2015). Phylogenetic gradient analysis: environmental drivers of phylogenetic variation across ecological communities.</w:t>
       </w:r>
       <w:r>
@@ -1722,7 +2069,7 @@
         <w:t xml:space="preserve">Ecology</w:t>
       </w:r>
       <w:r>
-        <w:t xml:space="preserve">, 93(sp8), [CITAR: páginas não verificadas].</w:t>
+        <w:t xml:space="preserve">, 93, S14–S30.</w:t>
       </w:r>
     </w:p>
     <w:p>
@@ -1835,6 +2182,48 @@
         <w:pStyle w:val="BodyText"/>
       </w:pPr>
       <w:r>
+        <w:t xml:space="preserve">Pybus, O. G., &amp; Harvey, P. H. (2000). Testing macro-evolutionary models using incomplete molecular phylogenies.</w:t>
+      </w:r>
+      <w:r>
+        <w:t xml:space="preserve"> </w:t>
+      </w:r>
+      <w:r>
+        <w:rPr>
+          <w:i/>
+          <w:iCs/>
+        </w:rPr>
+        <w:t xml:space="preserve">Proceedings of the Royal Society B</w:t>
+      </w:r>
+      <w:r>
+        <w:t xml:space="preserve">, 267, 2267–2272.</w:t>
+      </w:r>
+    </w:p>
+    <w:p>
+      <w:pPr>
+        <w:pStyle w:val="BodyText"/>
+      </w:pPr>
+      <w:r>
+        <w:t xml:space="preserve">R Core Team (2026).</w:t>
+      </w:r>
+      <w:r>
+        <w:t xml:space="preserve"> </w:t>
+      </w:r>
+      <w:r>
+        <w:rPr>
+          <w:i/>
+          <w:iCs/>
+        </w:rPr>
+        <w:t xml:space="preserve">R: a language and environment for statistical computing</w:t>
+      </w:r>
+      <w:r>
+        <w:t xml:space="preserve">. Vienna: R Foundation for Statistical Computing. doi:10.32614/R.manuals.</w:t>
+      </w:r>
+    </w:p>
+    <w:p>
+      <w:pPr>
+        <w:pStyle w:val="BodyText"/>
+      </w:pPr>
+      <w:r>
         <w:t xml:space="preserve">Thompson, P. L., Guzman, L. M., De Meester, L., Horváth, Z., Ptacnik, R., Vanschoenwinkel, B., Viana, D. S., &amp; Chase, J. M. (2020). A process-based metacommunity framework linking local and regional scale community ecology.</w:t>
       </w:r>
       <w:r>
@@ -1849,6 +2238,14 @@
       </w:r>
       <w:r>
         <w:t xml:space="preserve">, 23, 1314–1329.</w:t>
+      </w:r>
+    </w:p>
+    <w:p>
+      <w:pPr>
+        <w:pStyle w:val="BodyText"/>
+      </w:pPr>
+      <w:r>
+        <w:t xml:space="preserve">Ushey, K., &amp; Wickham, H. (2026). renv: project environments. R package version 1.3.1. doi:10.32614/CRAN.package.renv.</w:t>
       </w:r>
     </w:p>
     <w:p>

</xml_diff>

<commit_message>
Manuscrito: Aldous 1996 e Frost 2026; DOIs nas referências
Co-Authored-By: Claude Opus 5.5 <noreply@anthropic.com>
</commit_message>
<xml_diff>
--- a/manuscript/methods_results.docx
+++ b/manuscript/methods_results.docx
@@ -162,7 +162,7 @@
         <w:pStyle w:val="FirstParagraph"/>
       </w:pPr>
       <w:r>
-        <w:t xml:space="preserve">We controlled γ and the Colless index independently by generating topology and branching times from separate processes. We drew topologies from Aldous’s β-splitting model [CITAR: Aldous 1996], in which β = 0 gives Yule trees and smaller values give increasingly imbalanced trees, and branching times from a pure-birth process in which each of the k lineages diversifies at rate k^c, so that c = 0 corresponds to a Yule process and c &lt; 0 to a slowdown in diversification, as under diversity dependence, which produces negative γ. We then ordered the nodes by a uniform linear extension of the partial order of the tree and set the root depth to one. Because γ depends only on the intervals between nodes and the Colless index only on the topology, this construction controls the two axes separately. This generator is our own design choice and not a published model; it replaced the library of trees from several generators, sampled by strata, that we had planned, because it gives independent control by construction.</w:t>
+        <w:t xml:space="preserve">We controlled γ and the Colless index independently by generating topology and branching times from separate processes. We drew topologies from Aldous’s β-splitting model (Aldous, 1996), in which β = 0 gives Yule trees and smaller values give increasingly imbalanced trees, and branching times from a pure-birth process in which each of the k lineages diversifies at rate k^c, so that c = 0 corresponds to a Yule process and c &lt; 0 to a slowdown in diversification, as under diversity dependence, which produces negative γ. We then ordered the nodes by a uniform linear extension of the partial order of the tree and set the root depth to one. Because γ depends only on the intervals between nodes and the Colless index only on the topology, this construction controls the two axes separately. This generator is our own design choice and not a published model; it replaced the library of trees from several generators, sampled by strata, that we had planned, because it gives independent control by construction.</w:t>
       </w:r>
     </w:p>
     <w:p>
@@ -946,7 +946,7 @@
         <w:pStyle w:val="FirstParagraph"/>
       </w:pPr>
       <w:r>
-        <w:t xml:space="preserve">To show where real regional species pools fall in the grid of tree shapes, and how the methods behave with real data, we used 14 tadpole metacommunities compiled from the literature and from unpublished data (Box 1). We harmonized species names with the Amphibian Species of the World [CITAR: Frost 2025] using the R package AmphiNom v. 1.1.0 (Liedtke, 2019), excluded undetermined taxa, and matched the remaining 123 species to the tips of the Portik et al. (2023) tree. We built three nested pools (Atlantic Forest; Atlantic Forest and interior of São Paulo; all South American metacommunities), pruned the tree to each, and computed γ and the normalized Colless index on the point-estimate tree and on its 100 time-calibrated bootstrap trees. For the case study, we used the metacommunities with at least 10 ponds and pond depth measured in every pond, namely two of the 14 and one additional published dataset: Serra da Bocaina (13 ponds; Provete et al., 2014), southern Brazil (32 ponds; Both et al., 2011) and northwestern São Paulo (40 ponds; Prado &amp; Rossa-Feres, 2014). We applied all tests and the four clade-scoring methods to incidence data with pond depth as the gradient, and also with canopy cover in Bocaina, the variable associated with its phylogenetic composition in a previous analysis with PCPS (Provete, 2018).</w:t>
+        <w:t xml:space="preserve">To show where real regional species pools fall in the grid of tree shapes, and how the methods behave with real data, we used 14 tadpole metacommunities compiled from the literature and from unpublished data (Box 1). We harmonized species names with the Amphibian Species of the World (Frost, 2026; through the internal dataset of AmphiNom, updated on 16 October 2025) using the R package AmphiNom v. 1.1.0 (Liedtke, 2019), excluded undetermined taxa, and matched the remaining 123 species to the tips of the Portik et al. (2023) tree. We built three nested pools (Atlantic Forest; Atlantic Forest and interior of São Paulo; all South American metacommunities), pruned the tree to each, and computed γ and the normalized Colless index on the point-estimate tree and on its 100 time-calibrated bootstrap trees. For the case study, we used the metacommunities with at least 10 ponds and pond depth measured in every pond, namely two of the 14 and one additional published dataset: Serra da Bocaina (13 ponds; Provete et al., 2014), southern Brazil (32 ponds; Both et al., 2011) and northwestern São Paulo (40 ponds; Prado &amp; Rossa-Feres, 2014). We applied all tests and the four clade-scoring methods to incidence data with pond depth as the gradient, and also with canopy cover in Bocaina, the variable associated with its phylogenetic composition in a previous analysis with PCPS (Provete, 2018).</w:t>
       </w:r>
     </w:p>
     <w:bookmarkEnd w:id="34"/>
@@ -1604,6 +1604,30 @@
         <w:pStyle w:val="FirstParagraph"/>
       </w:pPr>
       <w:r>
+        <w:t xml:space="preserve">Aldous, D. (1996). Probability distributions on cladograms. In D. Aldous &amp; R. Pemantle (Eds.),</w:t>
+      </w:r>
+      <w:r>
+        <w:t xml:space="preserve"> </w:t>
+      </w:r>
+      <w:r>
+        <w:rPr>
+          <w:i/>
+          <w:iCs/>
+        </w:rPr>
+        <w:t xml:space="preserve">Random discrete structures</w:t>
+      </w:r>
+      <w:r>
+        <w:t xml:space="preserve"> </w:t>
+      </w:r>
+      <w:r>
+        <w:t xml:space="preserve">(pp. 1–18). The IMA Volumes in Mathematics and its Applications, Vol. 76. Springer. https://doi.org/10.1007/978-1-4612-0719-1_1</w:t>
+      </w:r>
+    </w:p>
+    <w:p>
+      <w:pPr>
+        <w:pStyle w:val="BodyText"/>
+      </w:pPr>
+      <w:r>
         <w:t xml:space="preserve">Anderson, M. J. (2001). A new method for non-parametric multivariate analysis of variance.</w:t>
       </w:r>
       <w:r>
@@ -1617,7 +1641,7 @@
         <w:t xml:space="preserve">Austral Ecology</w:t>
       </w:r>
       <w:r>
-        <w:t xml:space="preserve">, 26, 32–46.</w:t>
+        <w:t xml:space="preserve">, 26, 32–46. https://doi.org/10.1111/j.1442-9993.2001.01070.pp.x</w:t>
       </w:r>
     </w:p>
     <w:p>
@@ -1659,7 +1683,7 @@
         <w:t xml:space="preserve">Acta Oecologica</w:t>
       </w:r>
       <w:r>
-        <w:t xml:space="preserve">, 37, 140–145.</w:t>
+        <w:t xml:space="preserve">, 37, 140–145. https://doi.org/10.1016/j.actao.2011.01.008</w:t>
       </w:r>
     </w:p>
     <w:p>
@@ -1680,7 +1704,7 @@
         <w:t xml:space="preserve">British Journal of Mathematical and Statistical Psychology</w:t>
       </w:r>
       <w:r>
-        <w:t xml:space="preserve">, 31, 144–152.</w:t>
+        <w:t xml:space="preserve">, 31, 144–152. https://doi.org/10.1111/j.2044-8317.1978.tb00581.x</w:t>
       </w:r>
     </w:p>
     <w:p>
@@ -1701,7 +1725,7 @@
         <w:t xml:space="preserve">Journal of Statistical Software</w:t>
       </w:r>
       <w:r>
-        <w:t xml:space="preserve">, 80(1), 1–28.</w:t>
+        <w:t xml:space="preserve">, 80(1), 1–28. https://doi.org/10.18637/jss.v080.i01</w:t>
       </w:r>
     </w:p>
     <w:p>
@@ -1722,7 +1746,7 @@
         <w:t xml:space="preserve">Systematic Zoology</w:t>
       </w:r>
       <w:r>
-        <w:t xml:space="preserve">, 31, 100–104. [CITAR: conferir página final]</w:t>
+        <w:t xml:space="preserve">, 31, 100–104. [CITAR: conferir página final] https://doi.org/10.2307/2413420</w:t>
       </w:r>
     </w:p>
     <w:p>
@@ -1751,7 +1775,7 @@
         <w:t xml:space="preserve">Methods in Ecology and Evolution</w:t>
       </w:r>
       <w:r>
-        <w:t xml:space="preserve">, 14, 203–217.</w:t>
+        <w:t xml:space="preserve">, 14, 203–217. https://doi.org/10.1111/2041-210X.14030</w:t>
       </w:r>
     </w:p>
     <w:p>
@@ -1772,7 +1796,7 @@
         <w:t xml:space="preserve">Oikos</w:t>
       </w:r>
       <w:r>
-        <w:t xml:space="preserve">, 120, 208–215.</w:t>
+        <w:t xml:space="preserve">, 120, 208–215. https://doi.org/10.1111/j.1600-0706.2010.18898.x</w:t>
       </w:r>
     </w:p>
     <w:p>
@@ -1793,7 +1817,7 @@
         <w:t xml:space="preserve">Methods in Ecology and Evolution</w:t>
       </w:r>
       <w:r>
-        <w:t xml:space="preserve">, 7, 937–946.</w:t>
+        <w:t xml:space="preserve">, 7, 937–946. https://doi.org/10.1111/2041-210X.12547</w:t>
       </w:r>
     </w:p>
     <w:p>
@@ -1814,7 +1838,28 @@
         <w:t xml:space="preserve">Ecography</w:t>
       </w:r>
       <w:r>
-        <w:t xml:space="preserve">, 35, 952–960.</w:t>
+        <w:t xml:space="preserve">, 35, 952–960. https://doi.org/10.1111/j.1600-0587.2011.07193.x</w:t>
+      </w:r>
+    </w:p>
+    <w:p>
+      <w:pPr>
+        <w:pStyle w:val="BodyText"/>
+      </w:pPr>
+      <w:r>
+        <w:t xml:space="preserve">Frost, D. R. (2026).</w:t>
+      </w:r>
+      <w:r>
+        <w:t xml:space="preserve"> </w:t>
+      </w:r>
+      <w:r>
+        <w:rPr>
+          <w:i/>
+          <w:iCs/>
+        </w:rPr>
+        <w:t xml:space="preserve">Amphibian Species of the World: an online reference</w:t>
+      </w:r>
+      <w:r>
+        <w:t xml:space="preserve">. Version 6.2. American Museum of Natural History. https://amphibiansoftheworld.amnh.org/index.php https://doi.org/10.5531/db.vz.0001</w:t>
       </w:r>
     </w:p>
     <w:p>
@@ -1843,7 +1888,7 @@
         <w:t xml:space="preserve">Molecular Phylogenetics and Evolution</w:t>
       </w:r>
       <w:r>
-        <w:t xml:space="preserve">, 200, 108168.</w:t>
+        <w:t xml:space="preserve">, 200, 108168. https://doi.org/10.1016/j.ympev.2024.108168</w:t>
       </w:r>
     </w:p>
     <w:p>
@@ -1864,7 +1909,7 @@
         <w:t xml:space="preserve">Journal of Open Source Software</w:t>
       </w:r>
       <w:r>
-        <w:t xml:space="preserve">, 6(57), 2959.</w:t>
+        <w:t xml:space="preserve">, 6(57), 2959. https://doi.org/10.21105/joss.02959</w:t>
       </w:r>
     </w:p>
     <w:p>
@@ -1893,7 +1938,7 @@
         <w:t xml:space="preserve">Oecologia</w:t>
       </w:r>
       <w:r>
-        <w:t xml:space="preserve">, 129, 271–280.</w:t>
+        <w:t xml:space="preserve">, 129, 271–280. https://doi.org/10.1007/s004420100716</w:t>
       </w:r>
     </w:p>
     <w:p>
@@ -1914,7 +1959,7 @@
         <w:t xml:space="preserve">Systematics and Biodiversity</w:t>
       </w:r>
       <w:r>
-        <w:t xml:space="preserve">, 17, 1–6.</w:t>
+        <w:t xml:space="preserve">, 17, 1–6. https://doi.org/10.1080/14772000.2018.1518935</w:t>
       </w:r>
     </w:p>
     <w:p>
@@ -1964,7 +2009,7 @@
         <w:t xml:space="preserve">Nature</w:t>
       </w:r>
       <w:r>
-        <w:t xml:space="preserve">, 401, 877–884.</w:t>
+        <w:t xml:space="preserve">, 401, 877–884. https://doi.org/10.1038/44766</w:t>
       </w:r>
     </w:p>
     <w:p>
@@ -1985,7 +2030,7 @@
         <w:t xml:space="preserve">Bioinformatics</w:t>
       </w:r>
       <w:r>
-        <w:t xml:space="preserve">, 35, 526–528.</w:t>
+        <w:t xml:space="preserve">, 35, 526–528. https://doi.org/10.1093/bioinformatics/bty633</w:t>
       </w:r>
     </w:p>
     <w:p>
@@ -2006,7 +2051,7 @@
         <w:t xml:space="preserve">Oikos</w:t>
       </w:r>
       <w:r>
-        <w:t xml:space="preserve">, 125, 1719–1732.</w:t>
+        <w:t xml:space="preserve">, 125, 1719–1732. https://doi.org/10.1111/oik.03262</w:t>
       </w:r>
     </w:p>
     <w:p>
@@ -2027,7 +2072,7 @@
         <w:t xml:space="preserve">Methods in Ecology and Evolution</w:t>
       </w:r>
       <w:r>
-        <w:t xml:space="preserve">, 11, 1106–1112.</w:t>
+        <w:t xml:space="preserve">, 11, 1106–1112. https://doi.org/10.1111/2041-210X.13430</w:t>
       </w:r>
     </w:p>
     <w:p>
@@ -2048,7 +2093,7 @@
         <w:t xml:space="preserve">Plant Ecology</w:t>
       </w:r>
       <w:r>
-        <w:t xml:space="preserve">, 216, 709–724.</w:t>
+        <w:t xml:space="preserve">, 216, 709–724. https://doi.org/10.1007/s11258-014-0405-0</w:t>
       </w:r>
     </w:p>
     <w:p>
@@ -2069,7 +2114,7 @@
         <w:t xml:space="preserve">Ecology</w:t>
       </w:r>
       <w:r>
-        <w:t xml:space="preserve">, 93, S14–S30.</w:t>
+        <w:t xml:space="preserve">, 93, S14–S30. https://doi.org/10.1890/11-0494.1</w:t>
       </w:r>
     </w:p>
     <w:p>
@@ -2090,7 +2135,7 @@
         <w:t xml:space="preserve">Ecology Letters</w:t>
       </w:r>
       <w:r>
-        <w:t xml:space="preserve">, 13, 587–596.</w:t>
+        <w:t xml:space="preserve">, 13, 587–596. https://doi.org/10.1111/j.1461-0248.2010.01456.x</w:t>
       </w:r>
     </w:p>
     <w:p>
@@ -2111,7 +2156,7 @@
         <w:t xml:space="preserve">Molecular Phylogenetics and Evolution</w:t>
       </w:r>
       <w:r>
-        <w:t xml:space="preserve">, 188, 107907.</w:t>
+        <w:t xml:space="preserve">, 188, 107907. https://doi.org/10.1016/j.ympev.2023.107907</w:t>
       </w:r>
     </w:p>
     <w:p>
@@ -2132,7 +2177,7 @@
         <w:t xml:space="preserve">Austral Ecology</w:t>
       </w:r>
       <w:r>
-        <w:t xml:space="preserve">, 39, 540–547.</w:t>
+        <w:t xml:space="preserve">, 39, 540–547. https://doi.org/10.1111/aec.12114</w:t>
       </w:r>
     </w:p>
     <w:p>
@@ -2174,7 +2219,7 @@
         <w:t xml:space="preserve">Hydrobiologia</w:t>
       </w:r>
       <w:r>
-        <w:t xml:space="preserve">, 734, 69–79.</w:t>
+        <w:t xml:space="preserve">, 734, 69–79. https://doi.org/10.1007/s10750-014-1870-0</w:t>
       </w:r>
     </w:p>
     <w:p>
@@ -2195,7 +2240,7 @@
         <w:t xml:space="preserve">Proceedings of the Royal Society B</w:t>
       </w:r>
       <w:r>
-        <w:t xml:space="preserve">, 267, 2267–2272.</w:t>
+        <w:t xml:space="preserve">, 267, 2267–2272. https://doi.org/10.1098/rspb.2000.1278</w:t>
       </w:r>
     </w:p>
     <w:p>
@@ -2237,7 +2282,7 @@
         <w:t xml:space="preserve">Ecology Letters</w:t>
       </w:r>
       <w:r>
-        <w:t xml:space="preserve">, 23, 1314–1329.</w:t>
+        <w:t xml:space="preserve">, 23, 1314–1329. https://doi.org/10.1111/ele.13568</w:t>
       </w:r>
     </w:p>
     <w:p>
@@ -2266,7 +2311,7 @@
         <w:t xml:space="preserve">PeerJ</w:t>
       </w:r>
       <w:r>
-        <w:t xml:space="preserve">, 5, e2969.</w:t>
+        <w:t xml:space="preserve">, 5, e2969. https://doi.org/10.7717/peerj.2969</w:t>
       </w:r>
     </w:p>
     <w:p>
@@ -2287,7 +2332,7 @@
         <w:t xml:space="preserve">Methods in Ecology and Evolution</w:t>
       </w:r>
       <w:r>
-        <w:t xml:space="preserve">, 15, 1926–1939.</w:t>
+        <w:t xml:space="preserve">, 15, 1926–1939. https://doi.org/10.1111/2041-210X.14415</w:t>
       </w:r>
     </w:p>
     <w:bookmarkEnd w:id="65"/>

</xml_diff>

<commit_message>
Manuscrito enxuto: detalhes de métodos e resultados para os Apêndices S1–S2, equações nativas do Word, paletas legíveis, setas da RDA e Fig. 6 corrigida
Co-Authored-By: Claude Opus 5.5 <noreply@anthropic.com>
</commit_message>
<xml_diff>
--- a/manuscript/methods_results.docx
+++ b/manuscript/methods_results.docx
@@ -34,7 +34,7 @@
         <w:t xml:space="preserve">2026-10-20</w:t>
       </w:r>
     </w:p>
-    <w:bookmarkStart w:id="36" w:name="methods"/>
+    <w:bookmarkStart w:id="35" w:name="methods"/>
     <w:p>
       <w:pPr>
         <w:pStyle w:val="Heading1"/>
@@ -57,7 +57,18 @@
         <w:pStyle w:val="FirstParagraph"/>
       </w:pPr>
       <w:r>
-        <w:t xml:space="preserve">We designed the simulation study following the aims, data-generating mechanisms, estimands, methods and performance measures structure recommended for simulation studies that evaluate statistical methods (DiRenzo et al., 2023; Williams et al., 2024). The study had three aims: (i) to estimate how the shape of the phylogenetic tree, measured as the distribution of branching times (the γ statistic; Pybus &amp; Harvey, 2000) and the imbalance of the topology (the Colless index; Colless, 1982), affects the type I error and the power of tests that relate the phylogenetic structure of metacommunities to an environmental gradient; (ii) to estimate how the same tests perform under different processes of metacommunity assembly, which, to the best of our knowledge, neither the articles that proposed these tests nor later evaluations of them have addressed (Peres-Neto &amp; Kembel, 2015; Duarte et al., 2016); and (iii) to estimate how well ordination and factorization methods recover a clade associated with the gradient. We generated metacommunities in two layers (Fig. 1). Layer A follows the static protocol of Peres-Neto, Leibold and Dray (2012), which was also used to validate the tests we evaluated, so our results can be compared directly with the published ones. Layer B simulates metacommunity dynamics with the process-based framework of Thompson et al. (2020), in which species sorting, mass effects and competition emerge from local population dynamics and dispersal.</w:t>
+        <w:t xml:space="preserve">We designed the simulation study following the aims, data-generating mechanisms, estimands, methods and performance measures structure recommended for simulation studies that evaluate statistical methods (DiRenzo et al., 2023; Williams et al., 2024). The study had three aims: (i) to estimate how the shape of the phylogenetic tree, measured as the distribution of branching times (the γ statistic; Pybus &amp; Harvey, 2000) and the imbalance of the topology (the Colless index; Colless, 1982), affects the type I error and the power of tests that relate the phylogenetic structure of metacommunities to an environmental gradient; (ii) to estimate how the same tests perform under different processes of metacommunity assembly, which, to the best of our knowledge, neither the articles that proposed these tests nor later evaluations of them have addressed (Peres-Neto &amp; Kembel, 2015; Duarte et al., 2016); and (iii) to estimate how well ordination and factorization methods recover a clade associated with the gradient. We generated metacommunities in two layers (</w:t>
+      </w:r>
+      <w:hyperlink w:anchor="fig-design">
+        <w:r>
+          <w:rPr>
+            <w:rStyle w:val="Hyperlink"/>
+          </w:rPr>
+          <w:t xml:space="preserve">Fig. 1</w:t>
+        </w:r>
+      </w:hyperlink>
+      <w:r>
+        <w:t xml:space="preserve">). Layer A follows the static protocol of Peres-Neto, Leibold and Dray (2012), which was also used to validate the tests we evaluated, so our results can be compared directly with the published ones. Layer B simulates metacommunity dynamics with the process-based framework of Thompson et al. (2020), in which species sorting, mass effects and competition emerge from local population dynamics and dispersal.</w:t>
       </w:r>
     </w:p>
     <w:p>
@@ -65,7 +76,24 @@
         <w:pStyle w:val="BodyText"/>
       </w:pPr>
       <w:r>
-        <w:t xml:space="preserve">We stated four hypotheses before the main runs. We expected that (i) tree imbalance would move the type I error of the taxa shuffle away from the nominal level, since the phylogenetic weights of matrix P are heterogeneous among tips in imbalanced trees (H1); (ii) phylogenetic signal in niche breadth or maximum abundance would inflate the type I error of all tests, with a magnitude that depends on tree shape (H2); (iii) very negative γ, that is, long internal branches near the root, would concentrate variation on the first PCPS axis and favour the recovery of basal over recent clades (H3); and (iv) the ranking of the methods in power and in clade recovery would change with tree shape (H4). The study was not registered. However, we wrote the design and the hypotheses down before the main runs (docs/PLANO_SIMULACAO.md, first committed on 16 October 2026 as commit 668fa60 of the code repository), and we report the departures from that plan where they occur.</w:t>
+        <w:t xml:space="preserve">We stated four hypotheses before the main runs. We expected that (i) tree imbalance would move the type I error of the taxa shuffle away from the nominal level, since the phylogenetic weights of matrix</w:t>
+      </w:r>
+      <w:r>
+        <w:t xml:space="preserve"> </w:t>
+      </w:r>
+      <m:oMath>
+        <m:r>
+          <m:rPr>
+            <m:sty m:val="b"/>
+          </m:rPr>
+          <m:t>P</m:t>
+        </m:r>
+      </m:oMath>
+      <w:r>
+        <w:t xml:space="preserve"> </w:t>
+      </w:r>
+      <w:r>
+        <w:t xml:space="preserve">are heterogeneous among tips in imbalanced trees (H1); (ii) phylogenetic signal in niche breadth or maximum abundance would inflate the type I error of all tests, with a magnitude that depends on tree shape (H2); (iii) very negative γ, that is, long internal branches near the root, would concentrate variation on the first PCPS axis and favour the recovery of basal over recent clades (H3); and (iv) the ranking of the methods in power and in clade recovery would change with tree shape (H4). The study was not registered. However, we wrote the design and the hypotheses down before the main runs (docs/PLANO_SIMULACAO.md, first committed on 16 October 2026 as commit 668fa60 of the code repository), and we report the departures from that plan in Appendix S1.</w:t>
       </w:r>
     </w:p>
     <w:tbl>
@@ -140,7 +168,21 @@
               <w:pStyle w:val="ImageCaption"/>
             </w:pPr>
             <w:r>
-              <w:t xml:space="preserve">Figure 1: Schematic of the simulation design. Notice that tree shape is controlled before traits are simulated, so that every trait scenario and every assembly process is crossed with the same grid of tree shapes, and that the inference step uses the same two permutation null models for all tests on matrix P.</w:t>
+              <w:t xml:space="preserve">Figure 1: Schematic of the simulation design. Notice that tree shape is controlled before traits are simulated, so that every trait scenario and every assembly process is crossed with the same grid of tree shapes, and that the inference step uses the same two permutation null models for all tests on matrix</w:t>
+            </w:r>
+            <w:r>
+              <w:t xml:space="preserve"> </w:t>
+            </w:r>
+            <m:oMath>
+              <m:r>
+                <m:rPr>
+                  <m:sty m:val="b"/>
+                </m:rPr>
+                <m:t>P</m:t>
+              </m:r>
+            </m:oMath>
+            <w:r>
+              <w:t xml:space="preserve">.</w:t>
             </w:r>
           </w:p>
           <w:bookmarkEnd w:id="23"/>
@@ -148,13 +190,13 @@
       </w:tr>
     </w:tbl>
     <w:bookmarkEnd w:id="24"/>
-    <w:bookmarkStart w:id="25" w:name="tree-generation-and-the-tree-shape-grid"/>
+    <w:bookmarkStart w:id="25" w:name="tree-shapes"/>
     <w:p>
       <w:pPr>
         <w:pStyle w:val="Heading2"/>
       </w:pPr>
       <w:r>
-        <w:t xml:space="preserve">Tree generation and the tree-shape grid</w:t>
+        <w:t xml:space="preserve">Tree shapes</w:t>
       </w:r>
     </w:p>
     <w:p>
@@ -162,15 +204,138 @@
         <w:pStyle w:val="FirstParagraph"/>
       </w:pPr>
       <w:r>
-        <w:t xml:space="preserve">We controlled γ and the Colless index independently by generating topology and branching times from separate processes. We drew topologies from Aldous’s β-splitting model (Aldous, 1996), in which β = 0 gives Yule trees and smaller values give increasingly imbalanced trees, and branching times from a pure-birth process in which each of the k lineages diversifies at rate k^c, so that c = 0 corresponds to a Yule process and c &lt; 0 to a slowdown in diversification, as under diversity dependence, which produces negative γ. We then ordered the nodes by a uniform linear extension of the partial order of the tree and set the root depth to one. Because γ depends only on the intervals between nodes and the Colless index only on the topology, this construction controls the two axes separately. This generator is our own design choice and not a published model; it replaced the library of trees from several generators, sampled by strata, that we had planned, because it gives independent control by construction.</w:t>
-      </w:r>
-    </w:p>
-    <w:p>
-      <w:pPr>
-        <w:pStyle w:val="BodyText"/>
-      </w:pPr>
-      <w:r>
-        <w:t xml:space="preserve">We took the levels of the grid from the empirical distribution of tree shape in anurans. We pruned all clades with 40–250 tips from the time-calibrated species-level tree of Portik et al. (2023) and computed γ and the Colless index normalized against its Yule expectation with the R package treestats v. 1.71.13 (Janzen &amp; Etienne, 2024). For each pool size N (50, 100 and 200 species, as in Duarte et al., 2016), γ took three levels, namely zero (as in a Yule tree), the median of the empirical clades and their 10% quantile, and the Colless index took three levels, zero, the median and the 90% quantile (Table S1). We calibrated c and β for each N with curves of the mean statistic against the parameter, and accepted a tree only when both statistics fell within 0.5 units of the targets of its cell, which gave acceptance rates of 9–25%. Thus, every cell of the 3 × 3 grid could be filled, and the grid spans the empirical range of anuran tree shapes between the 10% and 90% quantiles, although it has no level with γ &gt; 0. The Yule × Yule cell approximates the trees used in previous validations (Peres-Neto &amp; Kembel, 2015; Duarte et al., 2016), since the acceptance window truncates the Yule distribution of both statistics. We drew 1,000 trees per cell and N, and replicate r of every scenario used tree r of its cell, so that the scenarios were paired by tree.</w:t>
+        <w:t xml:space="preserve">We controlled γ and the Colless index independently by generating topology and branching times from separate processes. We drew topologies from Aldous’s β-splitting model (Aldous, 1996), in which</w:t>
+      </w:r>
+      <w:r>
+        <w:t xml:space="preserve"> </w:t>
+      </w:r>
+      <m:oMath>
+        <m:r>
+          <m:t>β</m:t>
+        </m:r>
+        <m:r>
+          <m:rPr>
+            <m:sty m:val="p"/>
+          </m:rPr>
+          <m:t>=</m:t>
+        </m:r>
+        <m:r>
+          <m:t>0</m:t>
+        </m:r>
+      </m:oMath>
+      <w:r>
+        <w:t xml:space="preserve"> </w:t>
+      </w:r>
+      <w:r>
+        <w:t xml:space="preserve">gives Yule trees and smaller values give increasingly imbalanced trees, and branching times from a pure-birth process in which each of the</w:t>
+      </w:r>
+      <w:r>
+        <w:t xml:space="preserve"> </w:t>
+      </w:r>
+      <m:oMath>
+        <m:r>
+          <m:t>k</m:t>
+        </m:r>
+      </m:oMath>
+      <w:r>
+        <w:t xml:space="preserve"> </w:t>
+      </w:r>
+      <w:r>
+        <w:t xml:space="preserve">lineages diversifies at rate</w:t>
+      </w:r>
+      <w:r>
+        <w:t xml:space="preserve"> </w:t>
+      </w:r>
+      <m:oMath>
+        <m:sSup>
+          <m:e>
+            <m:r>
+              <m:t>k</m:t>
+            </m:r>
+          </m:e>
+          <m:sup>
+            <m:r>
+              <m:t>c</m:t>
+            </m:r>
+          </m:sup>
+        </m:sSup>
+      </m:oMath>
+      <w:r>
+        <w:t xml:space="preserve">, so that</w:t>
+      </w:r>
+      <w:r>
+        <w:t xml:space="preserve"> </w:t>
+      </w:r>
+      <m:oMath>
+        <m:r>
+          <m:t>c</m:t>
+        </m:r>
+        <m:r>
+          <m:rPr>
+            <m:sty m:val="p"/>
+          </m:rPr>
+          <m:t>=</m:t>
+        </m:r>
+        <m:r>
+          <m:t>0</m:t>
+        </m:r>
+      </m:oMath>
+      <w:r>
+        <w:t xml:space="preserve"> </w:t>
+      </w:r>
+      <w:r>
+        <w:t xml:space="preserve">corresponds to a Yule process and</w:t>
+      </w:r>
+      <w:r>
+        <w:t xml:space="preserve"> </w:t>
+      </w:r>
+      <m:oMath>
+        <m:r>
+          <m:t>c</m:t>
+        </m:r>
+        <m:r>
+          <m:rPr>
+            <m:sty m:val="p"/>
+          </m:rPr>
+          <m:t>&lt;</m:t>
+        </m:r>
+        <m:r>
+          <m:t>0</m:t>
+        </m:r>
+      </m:oMath>
+      <w:r>
+        <w:t xml:space="preserve"> </w:t>
+      </w:r>
+      <w:r>
+        <w:t xml:space="preserve">to a slowdown in diversification, which produces negative γ. Because γ depends only on the intervals between nodes and the Colless index only on the topology, this construction controls the two axes separately (Appendix S1). We took the levels of the grid from the anuran clades with 40–250 tips of the time-calibrated species-level tree of Portik et al. (2023), with the Colless index normalized against its Yule expectation and both statistics computed with the R package treestats v. 1.71.13 (Janzen &amp; Etienne, 2024). For each pool size N (50, 100 and 200 species, as in Duarte et al., 2016), γ took three levels, namely zero (as in a Yule tree), the median of the empirical clades and their 10% quantile, and the Colless index took three levels, zero, the median and the 90% quantile (Table S1). Thus, the 3 × 3 grid spans the empirical range of anuran tree shapes between the 10% and 90% quantiles, although it has no level with γ &gt; 0, and its Yule × Yule cell approximates the trees used in previous validations (Peres-Neto &amp; Kembel, 2015; Duarte et al., 2016). We drew 1,000 trees per cell and N, and replicate</w:t>
+      </w:r>
+      <w:r>
+        <w:t xml:space="preserve"> </w:t>
+      </w:r>
+      <m:oMath>
+        <m:r>
+          <m:t>r</m:t>
+        </m:r>
+      </m:oMath>
+      <w:r>
+        <w:t xml:space="preserve"> </w:t>
+      </w:r>
+      <w:r>
+        <w:t xml:space="preserve">of every scenario used tree</w:t>
+      </w:r>
+      <w:r>
+        <w:t xml:space="preserve"> </w:t>
+      </w:r>
+      <m:oMath>
+        <m:r>
+          <m:t>r</m:t>
+        </m:r>
+      </m:oMath>
+      <w:r>
+        <w:t xml:space="preserve"> </w:t>
+      </w:r>
+      <w:r>
+        <w:t xml:space="preserve">of its cell, so that the scenarios were paired by tree.</w:t>
       </w:r>
     </w:p>
     <w:bookmarkEnd w:id="25"/>
@@ -188,7 +353,349 @@
         <w:pStyle w:val="FirstParagraph"/>
       </w:pPr>
       <w:r>
-        <w:t xml:space="preserve">Each metacommunity had 100 sites along an environmental gradient E drawn from a uniform distribution between 0 and 100. The expected abundance of species j at site i followed a Gaussian response, L_ij = h_j exp[−(E_i − u_j)² / (2σ_j²)], and we drew the observed abundance from a Poisson distribution with mean L_ij (Peres-Neto et al., 2012). We simulated the optimum u_j as a continuous trait on the tree under Brownian motion transformed by Pagel’s λ (Pagel, 1999) and rescaled it to the interval [−1, 101]; niche breadth σ_j came from a normal distribution with mean 10 and standard deviation 10, truncated at zero, and maximum abundance h_j from a uniform distribution between 0 and 30. In addition, σ_j and h_j could carry phylogenetic signal. In that case, we simulated a Brownian trait on the tree (λ = 1) and imposed on it the same marginal distribution by ranks, so that scenarios with and without signal differed only in how the values were arranged on the tree. We removed empty sites and pruned species absent from every site from the tree before analysis, as one would with real data, and analysed both incidence and abundance data.</w:t>
+        <w:t xml:space="preserve">Each metacommunity had 100 sites along an environmental gradient</w:t>
+      </w:r>
+      <w:r>
+        <w:t xml:space="preserve"> </w:t>
+      </w:r>
+      <m:oMath>
+        <m:r>
+          <m:t>E</m:t>
+        </m:r>
+      </m:oMath>
+      <w:r>
+        <w:t xml:space="preserve"> </w:t>
+      </w:r>
+      <w:r>
+        <w:t xml:space="preserve">drawn from a uniform distribution between 0 and 100. The expected abundance of species</w:t>
+      </w:r>
+      <w:r>
+        <w:t xml:space="preserve"> </w:t>
+      </w:r>
+      <m:oMath>
+        <m:r>
+          <m:t>j</m:t>
+        </m:r>
+      </m:oMath>
+      <w:r>
+        <w:t xml:space="preserve"> </w:t>
+      </w:r>
+      <w:r>
+        <w:t xml:space="preserve">at site</w:t>
+      </w:r>
+      <w:r>
+        <w:t xml:space="preserve"> </w:t>
+      </w:r>
+      <m:oMath>
+        <m:r>
+          <m:t>i</m:t>
+        </m:r>
+      </m:oMath>
+      <w:r>
+        <w:t xml:space="preserve"> </w:t>
+      </w:r>
+      <w:r>
+        <w:t xml:space="preserve">followed a Gaussian response,</w:t>
+      </w:r>
+    </w:p>
+    <w:p>
+      <w:pPr>
+        <w:pStyle w:val="BodyText"/>
+      </w:pPr>
+      <m:oMathPara>
+        <m:oMathParaPr>
+          <m:jc m:val="center"/>
+        </m:oMathParaPr>
+        <m:oMath>
+          <m:sSub>
+            <m:e>
+              <m:r>
+                <m:t>L</m:t>
+              </m:r>
+            </m:e>
+            <m:sub>
+              <m:r>
+                <m:t>i</m:t>
+              </m:r>
+              <m:r>
+                <m:t>j</m:t>
+              </m:r>
+            </m:sub>
+          </m:sSub>
+          <m:r>
+            <m:rPr>
+              <m:sty m:val="p"/>
+            </m:rPr>
+            <m:t>=</m:t>
+          </m:r>
+          <m:sSub>
+            <m:e>
+              <m:r>
+                <m:t>h</m:t>
+              </m:r>
+            </m:e>
+            <m:sub>
+              <m:r>
+                <m:t>j</m:t>
+              </m:r>
+            </m:sub>
+          </m:sSub>
+          <m:r>
+            <m:rPr>
+              <m:sty m:val="p"/>
+            </m:rPr>
+            <m:t>exp</m:t>
+          </m:r>
+          <m:d>
+            <m:dPr>
+              <m:begChr m:val="["/>
+              <m:sepChr m:val=""/>
+              <m:endChr m:val="]"/>
+              <m:grow/>
+            </m:dPr>
+            <m:e>
+              <m:r>
+                <m:rPr>
+                  <m:sty m:val="p"/>
+                </m:rPr>
+                <m:t>−</m:t>
+              </m:r>
+              <m:f>
+                <m:fPr>
+                  <m:type m:val="bar"/>
+                </m:fPr>
+                <m:num>
+                  <m:sSup>
+                    <m:e>
+                      <m:d>
+                        <m:dPr>
+                          <m:begChr m:val="("/>
+                          <m:sepChr m:val=""/>
+                          <m:endChr m:val=")"/>
+                          <m:grow/>
+                        </m:dPr>
+                        <m:e>
+                          <m:sSub>
+                            <m:e>
+                              <m:r>
+                                <m:t>E</m:t>
+                              </m:r>
+                            </m:e>
+                            <m:sub>
+                              <m:r>
+                                <m:t>i</m:t>
+                              </m:r>
+                            </m:sub>
+                          </m:sSub>
+                          <m:r>
+                            <m:rPr>
+                              <m:sty m:val="p"/>
+                            </m:rPr>
+                            <m:t>−</m:t>
+                          </m:r>
+                          <m:sSub>
+                            <m:e>
+                              <m:r>
+                                <m:t>u</m:t>
+                              </m:r>
+                            </m:e>
+                            <m:sub>
+                              <m:r>
+                                <m:t>j</m:t>
+                              </m:r>
+                            </m:sub>
+                          </m:sSub>
+                        </m:e>
+                      </m:d>
+                    </m:e>
+                    <m:sup>
+                      <m:r>
+                        <m:t>2</m:t>
+                      </m:r>
+                    </m:sup>
+                  </m:sSup>
+                </m:num>
+                <m:den>
+                  <m:r>
+                    <m:t>2</m:t>
+                  </m:r>
+                  <m:sSubSup>
+                    <m:e>
+                      <m:r>
+                        <m:t>σ</m:t>
+                      </m:r>
+                    </m:e>
+                    <m:sub>
+                      <m:r>
+                        <m:t>j</m:t>
+                      </m:r>
+                    </m:sub>
+                    <m:sup>
+                      <m:r>
+                        <m:t>2</m:t>
+                      </m:r>
+                    </m:sup>
+                  </m:sSubSup>
+                </m:den>
+              </m:f>
+            </m:e>
+          </m:d>
+          <m:r>
+            <m:rPr>
+              <m:sty m:val="p"/>
+            </m:rPr>
+            <m:t>,</m:t>
+          </m:r>
+        </m:oMath>
+      </m:oMathPara>
+    </w:p>
+    <w:p>
+      <w:pPr>
+        <w:pStyle w:val="FirstParagraph"/>
+      </w:pPr>
+      <w:r>
+        <w:t xml:space="preserve">and we drew the observed abundance from a Poisson distribution with mean</w:t>
+      </w:r>
+      <w:r>
+        <w:t xml:space="preserve"> </w:t>
+      </w:r>
+      <m:oMath>
+        <m:sSub>
+          <m:e>
+            <m:r>
+              <m:t>L</m:t>
+            </m:r>
+          </m:e>
+          <m:sub>
+            <m:r>
+              <m:t>i</m:t>
+            </m:r>
+            <m:r>
+              <m:t>j</m:t>
+            </m:r>
+          </m:sub>
+        </m:sSub>
+      </m:oMath>
+      <w:r>
+        <w:t xml:space="preserve"> </w:t>
+      </w:r>
+      <w:r>
+        <w:t xml:space="preserve">(Peres-Neto et al., 2012). We simulated the optimum</w:t>
+      </w:r>
+      <w:r>
+        <w:t xml:space="preserve"> </w:t>
+      </w:r>
+      <m:oMath>
+        <m:sSub>
+          <m:e>
+            <m:r>
+              <m:t>u</m:t>
+            </m:r>
+          </m:e>
+          <m:sub>
+            <m:r>
+              <m:t>j</m:t>
+            </m:r>
+          </m:sub>
+        </m:sSub>
+      </m:oMath>
+      <w:r>
+        <w:t xml:space="preserve"> </w:t>
+      </w:r>
+      <w:r>
+        <w:t xml:space="preserve">as a continuous trait on the tree under Brownian motion transformed by Pagel’s λ (Pagel, 1999) and rescaled it to the interval [−1, 101]; niche breadth</w:t>
+      </w:r>
+      <w:r>
+        <w:t xml:space="preserve"> </w:t>
+      </w:r>
+      <m:oMath>
+        <m:sSub>
+          <m:e>
+            <m:r>
+              <m:t>σ</m:t>
+            </m:r>
+          </m:e>
+          <m:sub>
+            <m:r>
+              <m:t>j</m:t>
+            </m:r>
+          </m:sub>
+        </m:sSub>
+      </m:oMath>
+      <w:r>
+        <w:t xml:space="preserve"> </w:t>
+      </w:r>
+      <w:r>
+        <w:t xml:space="preserve">came from a normal distribution with mean 10 and standard deviation 10, truncated at zero, and maximum abundance</w:t>
+      </w:r>
+      <w:r>
+        <w:t xml:space="preserve"> </w:t>
+      </w:r>
+      <m:oMath>
+        <m:sSub>
+          <m:e>
+            <m:r>
+              <m:t>h</m:t>
+            </m:r>
+          </m:e>
+          <m:sub>
+            <m:r>
+              <m:t>j</m:t>
+            </m:r>
+          </m:sub>
+        </m:sSub>
+      </m:oMath>
+      <w:r>
+        <w:t xml:space="preserve"> </w:t>
+      </w:r>
+      <w:r>
+        <w:t xml:space="preserve">from a uniform distribution between 0 and 30. In addition,</w:t>
+      </w:r>
+      <w:r>
+        <w:t xml:space="preserve"> </w:t>
+      </w:r>
+      <m:oMath>
+        <m:sSub>
+          <m:e>
+            <m:r>
+              <m:t>σ</m:t>
+            </m:r>
+          </m:e>
+          <m:sub>
+            <m:r>
+              <m:t>j</m:t>
+            </m:r>
+          </m:sub>
+        </m:sSub>
+      </m:oMath>
+      <w:r>
+        <w:t xml:space="preserve"> </w:t>
+      </w:r>
+      <w:r>
+        <w:t xml:space="preserve">and</w:t>
+      </w:r>
+      <w:r>
+        <w:t xml:space="preserve"> </w:t>
+      </w:r>
+      <m:oMath>
+        <m:sSub>
+          <m:e>
+            <m:r>
+              <m:t>h</m:t>
+            </m:r>
+          </m:e>
+          <m:sub>
+            <m:r>
+              <m:t>j</m:t>
+            </m:r>
+          </m:sub>
+        </m:sSub>
+      </m:oMath>
+      <w:r>
+        <w:t xml:space="preserve"> </w:t>
+      </w:r>
+      <w:r>
+        <w:t xml:space="preserve">could carry phylogenetic signal, with the same marginal distribution as without signal, so that the two cases differed only in how the values were arranged on the tree (Appendix S1). We removed empty sites and pruned absent species from the tree before analysis, as one would with real data, and analysed both incidence and abundance data.</w:t>
       </w:r>
     </w:p>
     <w:bookmarkEnd w:id="26"/>
@@ -206,15 +713,172 @@
         <w:pStyle w:val="FirstParagraph"/>
       </w:pPr>
       <w:r>
-        <w:t xml:space="preserve">Layer B followed the equations of Thompson et al. (2020), which we implemented in R because neither the original Julia code nor the R package mcomsimr (Thompson et al., 2020) carries a licence. At each time step, the expected abundance of species j at site i was its density-independent growth rate, a Gaussian function of the mismatch between u_j and E_i with breadth σ_j and maximum r_j, multiplied by its abundance and divided by one plus the sum of the competitive effects of all species at the site, following a Beverton–Holt model (Beverton &amp; Holt, 1957). We then drew abundances from a Poisson distribution; each individual emigrated with probability a, and each site received immigrants in proportion to the emigrants from all other sites. The environment was static and the sites had no spatial structure, because the dispersal kernel was uniform. This keeps sites exchangeable, so that the site shuffle remains a valid null model and spatial autocorrelation does not confound the phylogenetic tests. All species were seeded with Poisson(0.5) individuals per site every 10 steps during the first 100 steps, the dynamics ran for 1,000 steps, and we analysed the final state as incidence data. Maximum growth rate r_j, drawn from a uniform distribution between 2 and 8, took the role of h_j in the trait scenarios.</w:t>
-      </w:r>
-    </w:p>
-    <w:p>
-      <w:pPr>
-        <w:pStyle w:val="BodyText"/>
-      </w:pPr>
-      <w:r>
-        <w:t xml:space="preserve">We crossed two dispersal regimes with two competition structures, giving four archetypes. Dispersal was low (a = 0.01) in species sorting and high (a = 0.5) in mass effects. Competition was either intraspecific only or also interspecific and structured by phylogeny: interspecific coefficients came from a uniform distribution between 0 and 0.1, relative to an intraspecific coefficient of 1 (both multiplied by 0.05), and were assigned to species pairs by the rank of their phylogenetic similarity, so that close relatives competed more strongly. Since competition and dispersal remove species, the cell of the grid defined the tree of the regional pool rather than the tree of the analysed metacommunity. We therefore calibrated the size of the pool for each archetype, scenario and N so that the mean number of species left after the dynamics was close to N, and drew the pool tree with the targets of its cell, recalibrating β and c for each pool size. However, mass effects with phylogenetic competition could not reach N = 200, since pools of up to 2,900 species left only about 150 species, and we dropped this combination. Layer B used five cells of the grid (the four corners and the centre) and 1,000 replicates per combination, and we recorded γ and the Colless index of both the pool tree and the analysed tree.</w:t>
+        <w:t xml:space="preserve">Layer B followed the equations of Thompson et al. (2020), which we implemented in R. At each time step, the expected abundance of species</w:t>
+      </w:r>
+      <w:r>
+        <w:t xml:space="preserve"> </w:t>
+      </w:r>
+      <m:oMath>
+        <m:r>
+          <m:t>j</m:t>
+        </m:r>
+      </m:oMath>
+      <w:r>
+        <w:t xml:space="preserve"> </w:t>
+      </w:r>
+      <w:r>
+        <w:t xml:space="preserve">at site</w:t>
+      </w:r>
+      <w:r>
+        <w:t xml:space="preserve"> </w:t>
+      </w:r>
+      <m:oMath>
+        <m:r>
+          <m:t>i</m:t>
+        </m:r>
+      </m:oMath>
+      <w:r>
+        <w:t xml:space="preserve"> </w:t>
+      </w:r>
+      <w:r>
+        <w:t xml:space="preserve">was its density-independent growth rate, a Gaussian function of the mismatch between</w:t>
+      </w:r>
+      <w:r>
+        <w:t xml:space="preserve"> </w:t>
+      </w:r>
+      <m:oMath>
+        <m:sSub>
+          <m:e>
+            <m:r>
+              <m:t>u</m:t>
+            </m:r>
+          </m:e>
+          <m:sub>
+            <m:r>
+              <m:t>j</m:t>
+            </m:r>
+          </m:sub>
+        </m:sSub>
+      </m:oMath>
+      <w:r>
+        <w:t xml:space="preserve"> </w:t>
+      </w:r>
+      <w:r>
+        <w:t xml:space="preserve">and</w:t>
+      </w:r>
+      <w:r>
+        <w:t xml:space="preserve"> </w:t>
+      </w:r>
+      <m:oMath>
+        <m:sSub>
+          <m:e>
+            <m:r>
+              <m:t>E</m:t>
+            </m:r>
+          </m:e>
+          <m:sub>
+            <m:r>
+              <m:t>i</m:t>
+            </m:r>
+          </m:sub>
+        </m:sSub>
+      </m:oMath>
+      <w:r>
+        <w:t xml:space="preserve"> </w:t>
+      </w:r>
+      <w:r>
+        <w:t xml:space="preserve">with breadth</w:t>
+      </w:r>
+      <w:r>
+        <w:t xml:space="preserve"> </w:t>
+      </w:r>
+      <m:oMath>
+        <m:sSub>
+          <m:e>
+            <m:r>
+              <m:t>σ</m:t>
+            </m:r>
+          </m:e>
+          <m:sub>
+            <m:r>
+              <m:t>j</m:t>
+            </m:r>
+          </m:sub>
+        </m:sSub>
+      </m:oMath>
+      <w:r>
+        <w:t xml:space="preserve"> </w:t>
+      </w:r>
+      <w:r>
+        <w:t xml:space="preserve">and maximum</w:t>
+      </w:r>
+      <w:r>
+        <w:t xml:space="preserve"> </w:t>
+      </w:r>
+      <m:oMath>
+        <m:sSub>
+          <m:e>
+            <m:r>
+              <m:t>r</m:t>
+            </m:r>
+          </m:e>
+          <m:sub>
+            <m:r>
+              <m:t>j</m:t>
+            </m:r>
+          </m:sub>
+        </m:sSub>
+      </m:oMath>
+      <w:r>
+        <w:t xml:space="preserve">, multiplied by its abundance and divided by one plus the summed competitive effects of all species at the site, following a Beverton–Holt model (Beverton &amp; Holt, 1957). Abundances were then drawn from a Poisson distribution, and a proportion</w:t>
+      </w:r>
+      <w:r>
+        <w:t xml:space="preserve"> </w:t>
+      </w:r>
+      <m:oMath>
+        <m:r>
+          <m:t>a</m:t>
+        </m:r>
+      </m:oMath>
+      <w:r>
+        <w:t xml:space="preserve"> </w:t>
+      </w:r>
+      <w:r>
+        <w:t xml:space="preserve">of the individuals dispersed uniformly among sites, so that sites had no spatial structure and remained exchangeable, which keeps the site shuffle a valid null model. The dynamics ran for 1,000 steps, and we analysed the final state as incidence data; the full model and its settings are given in Appendix S1. We crossed two dispersal regimes with two competition structures, giving four archetypes. Dispersal was low (</w:t>
+      </w:r>
+      <m:oMath>
+        <m:r>
+          <m:t>a</m:t>
+        </m:r>
+        <m:r>
+          <m:rPr>
+            <m:sty m:val="p"/>
+          </m:rPr>
+          <m:t>=</m:t>
+        </m:r>
+        <m:r>
+          <m:t>0.01</m:t>
+        </m:r>
+      </m:oMath>
+      <w:r>
+        <w:t xml:space="preserve">) in species sorting and high (</w:t>
+      </w:r>
+      <m:oMath>
+        <m:r>
+          <m:t>a</m:t>
+        </m:r>
+        <m:r>
+          <m:rPr>
+            <m:sty m:val="p"/>
+          </m:rPr>
+          <m:t>=</m:t>
+        </m:r>
+        <m:r>
+          <m:t>0.5</m:t>
+        </m:r>
+      </m:oMath>
+      <w:r>
+        <w:t xml:space="preserve">) in mass effects, and competition was either intraspecific only or also interspecific and structured by phylogeny, so that close relatives competed more strongly. Since competition and dispersal remove species, the cell of the grid defined the tree of the regional pool rather than the tree of the analysed metacommunity, and we calibrated the size of the pool so that the mean number of species left after the dynamics was close to N. Mass effects with phylogenetic competition could not reach N = 200, and we dropped this combination. Layer B used five cells of the grid (the four corners and the centre) and 1,000 replicates per combination.</w:t>
       </w:r>
     </w:p>
     <w:bookmarkEnd w:id="27"/>
@@ -232,7 +896,18 @@
         <w:pStyle w:val="FirstParagraph"/>
       </w:pPr>
       <w:r>
-        <w:t xml:space="preserve">The eight trait scenarios were the same in both layers (Table 1). In S0 and S1, we analysed a gradient independent of the one that generated the data, with species optima without (S0) or with (S1) phylogenetic signal, so any association between phylogenetic structure and the analysed gradient arises by chance. Scenarios S2, S2σ and S2h used the gradient that generated the data with optima without phylogenetic signal, so they estimate the type I error of the phylogenetic component of each test. S2σ and S2h add phylogenetic signal in niche breadth or in maximum abundance, which creates a nuisance structure, that is, a phylogenetic pattern in the data that is not an association between phylogeny and the gradient. The scenarios under the alternative hypothesis had optima with intermediate (S3a, λ = 0.5) or full (S3b, λ = 1) phylogenetic signal, and S3σ added signal in niche breadth. Accordingly, the estimand of every test was its rejection rate at α = 0.05, which is the type I error in S0–S2h and the power in S3a–S3σ. For aim (iii), the estimand was the probability that a method identifies a planted clade.</w:t>
+        <w:t xml:space="preserve">The eight trait scenarios were the same in both layers (</w:t>
+      </w:r>
+      <w:hyperlink w:anchor="tbl-scenarios">
+        <w:r>
+          <w:rPr>
+            <w:rStyle w:val="Hyperlink"/>
+          </w:rPr>
+          <w:t xml:space="preserve">Table 1</w:t>
+        </w:r>
+      </w:hyperlink>
+      <w:r>
+        <w:t xml:space="preserve">). In S0 and S1, we analysed a gradient independent of the one that generated the data, with species optima without (S0) or with (S1) phylogenetic signal, so any association between phylogenetic structure and the analysed gradient arises by chance. Scenarios S2, S2σ and S2h used the gradient that generated the data with optima without phylogenetic signal, so they estimate the type I error of the phylogenetic component of each test. S2σ and S2h add phylogenetic signal in niche breadth or in maximum abundance, which creates a nuisance structure, that is, a phylogenetic pattern in the data that is not an association between phylogeny and the gradient. The scenarios under the alternative hypothesis had optima with intermediate (S3a, λ = 0.5) or full (S3b, λ = 1) phylogenetic signal, and S3σ added signal in niche breadth. Accordingly, the estimand of every test was its rejection rate at α = 0.05, which is the type I error in S0–S2h and the power in S3a–S3σ. For aim (iii), the estimand was the probability that a method identifies a planted clade.</w:t>
       </w:r>
     </w:p>
     <w:tbl>
@@ -858,7 +1533,123 @@
         <w:pStyle w:val="FirstParagraph"/>
       </w:pPr>
       <w:r>
-        <w:t xml:space="preserve">All tests relate the matrix P of phylogeny-weighted species composition (Pillar &amp; Duarte, 2010; Duarte et al., 2016), or the phylogenetic eigenvectors, to the gradient. We computed P with phylogenetic fuzzy weighting and the square-rooted Bray–Curtis dissimilarity between sites (D_P), and tested its association with E with a permutational multivariate analysis of variance (PERMANOVA; Anderson, 2001) and a Mantel test (Mantel, 1967), as in Duarte et al. (2016). We also extracted the principal coordinates of phylogenetic structure (PCPS; Duarte, 2011; Duarte et al., 2012) from D_P and fitted a linear model of each of the first two axes on E (GLM PCPS1 and GLM PCPS2); in Layer B, we also fitted a redundancy analysis of both axes on E (RDA PCPS). We re-implemented the phylogenetic community composition approach (PCC) of Peres-Neto and Kembel (2015) from the equations in the original article, using the variance of the adjusted R² across phylogenetic eigenvectors as the test statistic. Every test was evaluated with 999 permutations under two null models, the site shuffle, which permutes the sites, and the taxa shuffle, which permutes the tips of the tree while keeping its topology. We report the largest of the two P-values (max test), which controls the type I error when either null hypothesis holds (Peres-Neto &amp; Kembel, 2015; Duarte et al., 2016). We wrote the permutation loops ourselves for efficiency and checked, in unit tests, that the observed statistics equal those of the R packages vegan v. 2.7-6 (Oksanen et al., 2026) and PCPS v. 1.0.9 (Debastiani, 2026).</w:t>
+        <w:t xml:space="preserve">All tests relate the matrix</w:t>
+      </w:r>
+      <w:r>
+        <w:t xml:space="preserve"> </w:t>
+      </w:r>
+      <m:oMath>
+        <m:r>
+          <m:rPr>
+            <m:sty m:val="b"/>
+          </m:rPr>
+          <m:t>P</m:t>
+        </m:r>
+      </m:oMath>
+      <w:r>
+        <w:t xml:space="preserve"> </w:t>
+      </w:r>
+      <w:r>
+        <w:t xml:space="preserve">of phylogeny-weighted species composition (Pillar &amp; Duarte, 2010; Duarte et al., 2016), or the phylogenetic eigenvectors, to the gradient. We computed</w:t>
+      </w:r>
+      <w:r>
+        <w:t xml:space="preserve"> </w:t>
+      </w:r>
+      <m:oMath>
+        <m:r>
+          <m:rPr>
+            <m:sty m:val="b"/>
+          </m:rPr>
+          <m:t>P</m:t>
+        </m:r>
+      </m:oMath>
+      <w:r>
+        <w:t xml:space="preserve"> </w:t>
+      </w:r>
+      <w:r>
+        <w:t xml:space="preserve">with phylogenetic fuzzy weighting and the square-rooted Bray–Curtis dissimilarity between sites (</w:t>
+      </w:r>
+      <m:oMath>
+        <m:sSub>
+          <m:e>
+            <m:r>
+              <m:t>D</m:t>
+            </m:r>
+          </m:e>
+          <m:sub>
+            <m:r>
+              <m:t>P</m:t>
+            </m:r>
+          </m:sub>
+        </m:sSub>
+      </m:oMath>
+      <w:r>
+        <w:t xml:space="preserve">), and tested its association with</w:t>
+      </w:r>
+      <w:r>
+        <w:t xml:space="preserve"> </w:t>
+      </w:r>
+      <m:oMath>
+        <m:r>
+          <m:t>E</m:t>
+        </m:r>
+      </m:oMath>
+      <w:r>
+        <w:t xml:space="preserve"> </w:t>
+      </w:r>
+      <w:r>
+        <w:t xml:space="preserve">with a permutational multivariate analysis of variance (PERMANOVA; Anderson, 2001) and a Mantel test (Mantel, 1967), as in Duarte et al. (2016). We also extracted the principal coordinates of phylogenetic structure (PCPS; Duarte, 2011; Duarte et al., 2012) from</w:t>
+      </w:r>
+      <w:r>
+        <w:t xml:space="preserve"> </w:t>
+      </w:r>
+      <m:oMath>
+        <m:sSub>
+          <m:e>
+            <m:r>
+              <m:t>D</m:t>
+            </m:r>
+          </m:e>
+          <m:sub>
+            <m:r>
+              <m:t>P</m:t>
+            </m:r>
+          </m:sub>
+        </m:sSub>
+      </m:oMath>
+      <w:r>
+        <w:t xml:space="preserve"> </w:t>
+      </w:r>
+      <w:r>
+        <w:t xml:space="preserve">and fitted a linear model of each of the first two axes on</w:t>
+      </w:r>
+      <w:r>
+        <w:t xml:space="preserve"> </w:t>
+      </w:r>
+      <m:oMath>
+        <m:r>
+          <m:t>E</m:t>
+        </m:r>
+      </m:oMath>
+      <w:r>
+        <w:t xml:space="preserve"> </w:t>
+      </w:r>
+      <w:r>
+        <w:t xml:space="preserve">(GLM PCPS1 and GLM PCPS2); in Layer B, we also fitted a redundancy analysis of both axes on</w:t>
+      </w:r>
+      <w:r>
+        <w:t xml:space="preserve"> </w:t>
+      </w:r>
+      <m:oMath>
+        <m:r>
+          <m:t>E</m:t>
+        </m:r>
+      </m:oMath>
+      <w:r>
+        <w:t xml:space="preserve"> </w:t>
+      </w:r>
+      <w:r>
+        <w:t xml:space="preserve">(RDA PCPS). We re-implemented the phylogenetic community composition approach (PCC) of Peres-Neto and Kembel (2015) from the equations in the original article, using the variance of the adjusted R² across phylogenetic eigenvectors as the test statistic. Every test was evaluated with 999 permutations under two null models, the site shuffle, which permutes the sites, and the taxa shuffle, which permutes the tips of the tree while keeping its topology. We report the largest of the two P-values (max test), which controls the type I error when either null hypothesis holds (Peres-Neto &amp; Kembel, 2015; Duarte et al., 2016). The observed statistics of our permutation code equal those of the R packages vegan v. 2.7-6 (Oksanen et al., 2026) and PCPS v. 1.0.9 (Debastiani, 2026), which we checked in unit tests.</w:t>
       </w:r>
     </w:p>
     <w:bookmarkEnd w:id="30"/>
@@ -876,25 +1667,202 @@
         <w:pStyle w:val="FirstParagraph"/>
       </w:pPr>
       <w:r>
-        <w:t xml:space="preserve">To evaluate aim (iii), we planted a clade associated with the gradient in each replicate of Layer A. We drew one internal node whose clade held 10–30% of the tips, either among the older or among the younger half of the eligible nodes, so that basal and recent clades of similar size could be compared. The optima of all species were u_j = −1 + 102 Φ(z_j + δI_j), where z_j are independent standard normal deviates, I_j indicates membership of the planted clade and δ is the shift; the other species therefore had no phylogenetic signal in their optima, and the shift has the same meaning for every tree size. We used shifts of 0.5, 1 and 2, all nine cells of the grid, N = 50, 100 and 200 with incidence data, and N = 100 with abundance data, with 1,000 replicates per combination. For a given replicate, the planted clade, the optima and the gradient were the same across shifts and data types, so that only the factor of interest changed. This objective replaced the per-node effect sizes under continuous Brownian motion that we had planned, because a planted clade defines unambiguously which answer is correct.</w:t>
+        <w:t xml:space="preserve">To evaluate aim (iii), we planted a clade associated with the gradient in each replicate of Layer A. We drew one internal node whose clade held 10–30% of the tips, either among the older or among the younger half of the eligible nodes, so that basal and recent clades of similar size could be compared. The optima of all species were</w:t>
       </w:r>
     </w:p>
     <w:p>
       <w:pPr>
         <w:pStyle w:val="BodyText"/>
       </w:pPr>
-      <w:r>
-        <w:t xml:space="preserve">We compared four methods. For PCPS, PCC and the evolutionary principal component analysis (evoPCA; Pavoine, 2016), each method took the axis most correlated with E among its first four, and the score of each internal node was the absolute correlation between membership of its clade and the species scores on that axis. The species scores were the correlations of the columns of P with the PCPS axis, which equal the species scores of the R package PCPS; the values of the phylogenetic eigenvector; and the correlations of the species columns of the Hellinger-transformed table of evoPCA (Legendre &amp; Gallagher, 2001), computed with the R package adiv v. 2.2.1 (Pavoine, 2020). We did not use the branch loadings of evoPCA because, with incidence data, a branch is present wherever any of its descendants is, so the branch above a planted clade saturates and small subclades always correlate better with the axis. For phylofactorization (Washburne et al., 2017), the score of each split was the objective of the algorithm, the deviance explained by the phylogenetic factor in a binomial model with incidence data or the variance explained by the isometric log-ratio balance with abundance data; we computed it for every node, which gives the same best split as the R package phylofactor v. 0.0.1 (Washburne et al., 2017) while also ranking all nodes. A method recovered the clade when its best-scoring clade was the planted one or its complement. As complementary measures, which give partial credit to a method that chooses a nested or a slightly larger clade, we recorded the rank of the planted node among all nodes and the Jaccard similarity between the best-scoring and the planted clades.</w:t>
+      <m:oMathPara>
+        <m:oMathParaPr>
+          <m:jc m:val="center"/>
+        </m:oMathParaPr>
+        <m:oMath>
+          <m:sSub>
+            <m:e>
+              <m:r>
+                <m:t>u</m:t>
+              </m:r>
+            </m:e>
+            <m:sub>
+              <m:r>
+                <m:t>j</m:t>
+              </m:r>
+            </m:sub>
+          </m:sSub>
+          <m:r>
+            <m:rPr>
+              <m:sty m:val="p"/>
+            </m:rPr>
+            <m:t>=</m:t>
+          </m:r>
+          <m:r>
+            <m:rPr>
+              <m:sty m:val="p"/>
+            </m:rPr>
+            <m:t>−</m:t>
+          </m:r>
+          <m:r>
+            <m:t>1</m:t>
+          </m:r>
+          <m:r>
+            <m:rPr>
+              <m:sty m:val="p"/>
+            </m:rPr>
+            <m:t>+</m:t>
+          </m:r>
+          <m:r>
+            <m:t>102</m:t>
+          </m:r>
+          <m:r>
+            <m:t> </m:t>
+          </m:r>
+          <m:r>
+            <m:t>Φ</m:t>
+          </m:r>
+          <m:d>
+            <m:dPr>
+              <m:begChr m:val="("/>
+              <m:sepChr m:val=""/>
+              <m:endChr m:val=")"/>
+              <m:grow/>
+            </m:dPr>
+            <m:e>
+              <m:sSub>
+                <m:e>
+                  <m:r>
+                    <m:t>z</m:t>
+                  </m:r>
+                </m:e>
+                <m:sub>
+                  <m:r>
+                    <m:t>j</m:t>
+                  </m:r>
+                </m:sub>
+              </m:sSub>
+              <m:r>
+                <m:rPr>
+                  <m:sty m:val="p"/>
+                </m:rPr>
+                <m:t>+</m:t>
+              </m:r>
+              <m:r>
+                <m:t>δ</m:t>
+              </m:r>
+              <m:sSub>
+                <m:e>
+                  <m:r>
+                    <m:t>I</m:t>
+                  </m:r>
+                </m:e>
+                <m:sub>
+                  <m:r>
+                    <m:t>j</m:t>
+                  </m:r>
+                </m:sub>
+              </m:sSub>
+            </m:e>
+          </m:d>
+          <m:r>
+            <m:rPr>
+              <m:sty m:val="p"/>
+            </m:rPr>
+            <m:t>,</m:t>
+          </m:r>
+        </m:oMath>
+      </m:oMathPara>
+    </w:p>
+    <w:p>
+      <w:pPr>
+        <w:pStyle w:val="FirstParagraph"/>
+      </w:pPr>
+      <w:r>
+        <w:t xml:space="preserve">where</w:t>
+      </w:r>
+      <w:r>
+        <w:t xml:space="preserve"> </w:t>
+      </w:r>
+      <m:oMath>
+        <m:sSub>
+          <m:e>
+            <m:r>
+              <m:t>z</m:t>
+            </m:r>
+          </m:e>
+          <m:sub>
+            <m:r>
+              <m:t>j</m:t>
+            </m:r>
+          </m:sub>
+        </m:sSub>
+      </m:oMath>
+      <w:r>
+        <w:t xml:space="preserve"> </w:t>
+      </w:r>
+      <w:r>
+        <w:t xml:space="preserve">are independent standard normal deviates,</w:t>
+      </w:r>
+      <w:r>
+        <w:t xml:space="preserve"> </w:t>
+      </w:r>
+      <m:oMath>
+        <m:sSub>
+          <m:e>
+            <m:r>
+              <m:t>I</m:t>
+            </m:r>
+          </m:e>
+          <m:sub>
+            <m:r>
+              <m:t>j</m:t>
+            </m:r>
+          </m:sub>
+        </m:sSub>
+      </m:oMath>
+      <w:r>
+        <w:t xml:space="preserve"> </w:t>
+      </w:r>
+      <w:r>
+        <w:t xml:space="preserve">indicates membership of the planted clade,</w:t>
+      </w:r>
+      <w:r>
+        <w:t xml:space="preserve"> </w:t>
+      </w:r>
+      <m:oMath>
+        <m:r>
+          <m:t>δ</m:t>
+        </m:r>
+      </m:oMath>
+      <w:r>
+        <w:t xml:space="preserve"> </w:t>
+      </w:r>
+      <w:r>
+        <w:t xml:space="preserve">is the shift and Φ is the standard normal distribution function; the other species therefore had no phylogenetic signal in their optima. We used shifts of 0.5, 1 and 2, all nine cells of the grid, N = 50, 100 and 200 with incidence data, and N = 100 with abundance data, with 1,000 replicates per combination, and the planted clade, the optima and the gradient of a replicate were the same across shifts and data types. We compared PCPS, PCC, the evolutionary principal component analysis (evoPCA; Pavoine, 2016), computed with the R package adiv v. 2.2.1 (Pavoine, 2020), and phylofactorization (Washburne et al., 2017). Each method gave a score to every internal node: for the three ordinations, the absolute correlation between membership of its clade and the species scores on the axis most correlated with</w:t>
+      </w:r>
+      <w:r>
+        <w:t xml:space="preserve"> </w:t>
+      </w:r>
+      <m:oMath>
+        <m:r>
+          <m:t>E</m:t>
+        </m:r>
+      </m:oMath>
+      <w:r>
+        <w:t xml:space="preserve"> </w:t>
+      </w:r>
+      <w:r>
+        <w:t xml:space="preserve">among the first four, and for phylofactorization the objective of the algorithm (Appendix S1). A method recovered the clade when its best-scoring clade was the planted one or its complement. As complementary measures, which give partial credit to a method that chooses a nested or a slightly larger clade, we recorded the rank of the planted node among all nodes and the Jaccard similarity between the best-scoring and the planted clades.</w:t>
       </w:r>
     </w:p>
     <w:bookmarkEnd w:id="31"/>
-    <w:bookmarkStart w:id="32" w:name="X2522e64decf6525bb30723c7b80a6a0d51ddcf2"/>
+    <w:bookmarkStart w:id="32" w:name="X53da85fff317b1dec52893db24bd78d79ba735e"/>
     <w:p>
       <w:pPr>
         <w:pStyle w:val="Heading2"/>
       </w:pPr>
       <w:r>
-        <w:t xml:space="preserve">Performance measures and Monte Carlo error</w:t>
+        <w:t xml:space="preserve">Performance measures and statistical models</w:t>
       </w:r>
     </w:p>
     <w:p>
@@ -902,17 +1870,151 @@
         <w:pStyle w:val="FirstParagraph"/>
       </w:pPr>
       <w:r>
-        <w:t xml:space="preserve">The performance measure of each test was its rejection rate across the 1,000 replicates of a condition, and that of each clade-recovery method was its proportion of hits. With K = 1,000 replicates, the Monte Carlo standard error of a rate p is [p(1 − p)/K]^½, which is 0.007 at P = 0.05 and at most 0.016 at P = 0.5, so a 95% Monte Carlo interval around the nominal level spans about ±0.014. We chose K so that this interval falls within Bradley’s liberal criterion for acceptable type I error, [0.025, 0.075] (Bradley, 1978), and used 999 permutations so that P-values have a resolution of 0.001. We report every rate with its Monte Carlo standard error in the Supporting Information (Table S2), and the credible intervals of the formal models below include the binomial variation among replicates.</w:t>
+        <w:t xml:space="preserve">The performance measure of each test was its rejection rate across the</w:t>
+      </w:r>
+      <w:r>
+        <w:t xml:space="preserve"> </w:t>
+      </w:r>
+      <m:oMath>
+        <m:r>
+          <m:t>K</m:t>
+        </m:r>
+        <m:r>
+          <m:rPr>
+            <m:sty m:val="p"/>
+          </m:rPr>
+          <m:t>=</m:t>
+        </m:r>
+        <m:r>
+          <m:t>1</m:t>
+        </m:r>
+        <m:r>
+          <m:rPr>
+            <m:sty m:val="p"/>
+          </m:rPr>
+          <m:t>,</m:t>
+        </m:r>
+        <m:r>
+          <m:t>000</m:t>
+        </m:r>
+      </m:oMath>
+      <w:r>
+        <w:t xml:space="preserve"> </w:t>
+      </w:r>
+      <w:r>
+        <w:t xml:space="preserve">replicates of a condition, and that of each clade-recovery method was its proportion of hits. The Monte Carlo standard error of a rate</w:t>
+      </w:r>
+      <w:r>
+        <w:t xml:space="preserve"> </w:t>
+      </w:r>
+      <m:oMath>
+        <m:r>
+          <m:t>p</m:t>
+        </m:r>
+      </m:oMath>
+      <w:r>
+        <w:t xml:space="preserve"> </w:t>
+      </w:r>
+      <w:r>
+        <w:t xml:space="preserve">is</w:t>
+      </w:r>
+      <w:r>
+        <w:t xml:space="preserve"> </w:t>
+      </w:r>
+      <m:oMath>
+        <m:rad>
+          <m:radPr>
+            <m:degHide m:val="on"/>
+          </m:radPr>
+          <m:deg/>
+          <m:e>
+            <m:r>
+              <m:t>p</m:t>
+            </m:r>
+            <m:d>
+              <m:dPr>
+                <m:begChr m:val="("/>
+                <m:sepChr m:val=""/>
+                <m:endChr m:val=")"/>
+                <m:grow/>
+              </m:dPr>
+              <m:e>
+                <m:r>
+                  <m:t>1</m:t>
+                </m:r>
+                <m:r>
+                  <m:rPr>
+                    <m:sty m:val="p"/>
+                  </m:rPr>
+                  <m:t>−</m:t>
+                </m:r>
+                <m:r>
+                  <m:t>p</m:t>
+                </m:r>
+              </m:e>
+            </m:d>
+            <m:r>
+              <m:rPr>
+                <m:sty m:val="p"/>
+              </m:rPr>
+              <m:t>/</m:t>
+            </m:r>
+            <m:r>
+              <m:t>K</m:t>
+            </m:r>
+          </m:e>
+        </m:rad>
+      </m:oMath>
+      <w:r>
+        <w:t xml:space="preserve">, which is 0.007 at</w:t>
+      </w:r>
+      <w:r>
+        <w:t xml:space="preserve"> </w:t>
+      </w:r>
+      <m:oMath>
+        <m:r>
+          <m:t>p</m:t>
+        </m:r>
+        <m:r>
+          <m:rPr>
+            <m:sty m:val="p"/>
+          </m:rPr>
+          <m:t>=</m:t>
+        </m:r>
+        <m:r>
+          <m:t>0.05</m:t>
+        </m:r>
+      </m:oMath>
+      <w:r>
+        <w:t xml:space="preserve">, so a 95% Monte Carlo interval around the nominal level spans about ±0.014 and falls within Bradley’s liberal criterion for acceptable type I error, [0.025, 0.075] (Bradley, 1978). We report every rate with its Monte Carlo standard error in Table S2. We then modelled the rates aggregated by condition with beta-binomial models fitted in the R package brms v. 2.23.0 (Bürkner, 2017) with CmdStan v. 2.39.0 through cmdstanr v. 0.9.0 (Gabry et al., 2025), with one model for the type I error and one for the power in each layer, and one for clade recovery. We entered the levels of γ and of the Colless index as factors, with their interaction, which estimates the full γ × imbalance surface without assuming its form, and let the shape effects differ among tests (or methods), scenarios, N and data type (Appendix S1). The beta-binomial accounts for the dispersion of the rates, which was 2.1–8.5 times larger than binomial in quasibinomial models with the same structure. Priors were declared explicitly on the logit scale, normal(0, 1.5) for the coefficients, normal(−2.9, 1.5) for the intercept of the type I models, centred on logit(0.05), and gamma(2, 0.01) for the precision φ. We checked convergence with the rank-normalized</w:t>
+      </w:r>
+      <w:r>
+        <w:t xml:space="preserve"> </w:t>
+      </w:r>
+      <m:oMath>
+        <m:acc>
+          <m:accPr>
+            <m:chr m:val="̂"/>
+          </m:accPr>
+          <m:e>
+            <m:r>
+              <m:t>R</m:t>
+            </m:r>
+          </m:e>
+        </m:acc>
+      </m:oMath>
+      <w:r>
+        <w:t xml:space="preserve">, the bulk and tail effective sample sizes and the numbers of divergent transitions and of transitions at the maximum tree depth, and model fit with posterior predictive checks. We summarize the results as posterior rates and contrasts between tree shapes or archetypes, with medians and 95% credible intervals (CI), and report the raw rates where they exceed the modelled ones.</w:t>
       </w:r>
     </w:p>
     <w:bookmarkEnd w:id="32"/>
-    <w:bookmarkStart w:id="33" w:name="X968b5b6f617a54290eb0a3f0f7090b7eeb8eddb"/>
+    <w:bookmarkStart w:id="33" w:name="empirical-reference-and-case-study"/>
     <w:p>
       <w:pPr>
         <w:pStyle w:val="Heading2"/>
       </w:pPr>
       <w:r>
-        <w:t xml:space="preserve">Statistical models of the simulation results</w:t>
+        <w:t xml:space="preserve">Empirical reference and case study</w:t>
       </w:r>
     </w:p>
     <w:p>
@@ -920,94 +2022,67 @@
         <w:pStyle w:val="FirstParagraph"/>
       </w:pPr>
       <w:r>
-        <w:t xml:space="preserve">We modelled the rates aggregated by condition with beta-binomial models fitted in the R package brms v. 2.23.0 (Bürkner, 2017) with CmdStan v. 2.39.0 through cmdstanr v. 0.9.0 (Gabry et al., 2025), with one model for the type I error and one for the power in each layer, and one for clade recovery. The plan was to treat γ and the Colless index as continuous covariates, but each cell of the grid has a single target per axis, and Layer A did not store the shape of every tree, so a continuous term would only interpolate three points. Therefore, we entered the levels of γ and of the Colless index as factors, with their interaction, which estimates the full γ × imbalance surface without assuming its form. In Layer A, the shape effects could differ among tests and scenarios, which is what testing a nuisance effect that depends on tree shape requires, and with N and data type; in the R formula notation, the model was test * scenario * (γ + Colless) + test * (γ:Colless + N + data type) + test:(γ + Colless):(N + data type) + test:scenario:N, where the last term lets the scenario effects, such as the inflation under nuisance structure, differ with N. In Layer B, where only five cells were simulated, the cell entered as a five-level factor, in test * archetype * (scenario + cell) + test * N * (archetype + scenario + cell). The clade-recovery model was method * (γ * depth + Colless + γ:Colless + shift + N + data type) + method:(γ + Colless):(N + data type + shift). We first fitted quasibinomial generalized linear models to the same structures, which showed a dispersion 2.1–8.5 times larger than binomial. The beta-binomial accounts for this extra variation with a single precision parameter φ, whereas a first version with an observation-level random effect hit the maximum tree depth of the sampler in almost every transition.</w:t>
+        <w:t xml:space="preserve">To show where real regional species pools fall in the grid of tree shapes, and how the methods behave with real data, we used 14 tadpole metacommunities compiled from the literature and from unpublished data (Box 1). We harmonized species names with the Amphibian Species of the World (Frost, 2026; through the internal dataset of AmphiNom, updated on 16 October 2025) using the R package AmphiNom v. 1.1.0 (Liedtke, 2019), excluded undetermined taxa, and matched the remaining 123 species to the tips of the Portik et al. (2023) tree. We built three nested pools (Atlantic Forest; Atlantic Forest and interior of São Paulo; all South American metacommunities) and computed γ and the normalized Colless index on the point-estimate tree and on its 100 time-calibrated bootstrap trees. For the case study, we used the metacommunities with at least 10 ponds and pond depth measured in every pond, namely Serra da Bocaina (13 ponds; Provete et al., 2014), southern Brazil (32 ponds; Both et al., 2011) and northwestern São Paulo (40 ponds; Prado &amp; Rossa-Feres, 2014). We applied all tests and the four clade-scoring methods to incidence data with pond depth as the gradient, and also with canopy cover in Bocaina, the variable associated with its phylogenetic composition in a previous analysis with PCPS (Provete, 2018).</w:t>
+      </w:r>
+    </w:p>
+    <w:bookmarkEnd w:id="33"/>
+    <w:bookmarkStart w:id="34" w:name="implementation-and-reproducibility"/>
+    <w:p>
+      <w:pPr>
+        <w:pStyle w:val="Heading2"/>
+      </w:pPr>
+      <w:r>
+        <w:t xml:space="preserve">Implementation and reproducibility</w:t>
+      </w:r>
+    </w:p>
+    <w:p>
+      <w:pPr>
+        <w:pStyle w:val="FirstParagraph"/>
+      </w:pPr>
+      <w:r>
+        <w:t xml:space="preserve">We ran all analyses in R v. 4.6.1 (R Core Team, 2026), with the versions of every package recorded in the lockfile of renv v. 1.3.1 (Ushey &amp; Wickham, 2026); trees were handled with ape v. 5.8-1 (Paradis &amp; Schliep, 2019). We orchestrated the simulations with targets v. 1.12.0 (Landau, 2021) and crew v. 1.3.3 (Landau, 2026) in a Docker image, with seeds derived from a single pipeline seed (Appendix S1). Code is available at [CITAR: GitHub repository and Zenodo DOI], together with the rates aggregated by condition and the scripts that compute the performance measures and the models from them, which reproduce every table and figure without rerunning the simulations.</w:t>
+      </w:r>
+    </w:p>
+    <w:bookmarkEnd w:id="34"/>
+    <w:bookmarkEnd w:id="35"/>
+    <w:bookmarkStart w:id="52" w:name="results"/>
+    <w:p>
+      <w:pPr>
+        <w:pStyle w:val="Heading1"/>
+      </w:pPr>
+      <w:r>
+        <w:t xml:space="preserve">Results</w:t>
+      </w:r>
+    </w:p>
+    <w:p>
+      <w:pPr>
+        <w:pStyle w:val="FirstParagraph"/>
+      </w:pPr>
+      <w:r>
+        <w:t xml:space="preserve">The static layer reproduced the published validations (Appendix S2): in the Yule trees of Duarte et al. (2016), 66 of 72 published rejection rates fell within the 95% binomial interval of our estimates, and the PCC matched the rates of Peres-Neto and Kembel (2015) in the scenarios that do not depend on the tree. All formal models converged (</w:t>
+      </w:r>
+      <m:oMath>
+        <m:acc>
+          <m:accPr>
+            <m:chr m:val="̂"/>
+          </m:accPr>
+          <m:e>
+            <m:r>
+              <m:t>R</m:t>
+            </m:r>
+          </m:e>
+        </m:acc>
+      </m:oMath>
+      <w:r>
+        <w:t xml:space="preserve"> </w:t>
+      </w:r>
+      <w:r>
+        <w:t xml:space="preserve">≤ 1.01, no divergent transitions), and their posterior predictive intervals covered the observed rates (Appendix S2, Table S3).</w:t>
       </w:r>
     </w:p>
     <w:p>
       <w:pPr>
         <w:pStyle w:val="BodyText"/>
-      </w:pPr>
-      <w:r>
-        <w:t xml:space="preserve">Priors were declared explicitly on the logit scale. We used normal(0, 1.5) for all coefficients; normal(−2.9, 1.5) for the intercept of the type I models, centred on logit(0.05), and normal(0, 1.5) for the other intercepts; and gamma(2, 0.01) for φ, which is weakly informative around the values implied by the quasibinomial dispersion (φ of about 130–910). We ran four chains of 2,000 iterations (1,000 of warm-up) with adapt_delta = 0.95 and a maximum tree depth of 12, since with the default of 10 a few transitions of the type I models reached the limit. We checked convergence with the rank-normalized R̂, the bulk and tail effective sample sizes, the number of divergent transitions and the number of transitions at the maximum tree depth, and model fit with in-sample posterior predictive checks, both for each condition and for the sums over the conditions of each test, N and cell. We summarize the results as posterior rates and contrasts between tree shapes or archetypes, with medians and 95% credible intervals (CI). Because the raw rates can still exceed the modelled ones in the most extreme conditions, we also report them where they do.</w:t>
-      </w:r>
-    </w:p>
-    <w:bookmarkEnd w:id="33"/>
-    <w:bookmarkStart w:id="34" w:name="empirical-reference-and-case-study"/>
-    <w:p>
-      <w:pPr>
-        <w:pStyle w:val="Heading2"/>
-      </w:pPr>
-      <w:r>
-        <w:t xml:space="preserve">Empirical reference and case study</w:t>
-      </w:r>
-    </w:p>
-    <w:p>
-      <w:pPr>
-        <w:pStyle w:val="FirstParagraph"/>
-      </w:pPr>
-      <w:r>
-        <w:t xml:space="preserve">To show where real regional species pools fall in the grid of tree shapes, and how the methods behave with real data, we used 14 tadpole metacommunities compiled from the literature and from unpublished data (Box 1). We harmonized species names with the Amphibian Species of the World (Frost, 2026; through the internal dataset of AmphiNom, updated on 16 October 2025) using the R package AmphiNom v. 1.1.0 (Liedtke, 2019), excluded undetermined taxa, and matched the remaining 123 species to the tips of the Portik et al. (2023) tree. We built three nested pools (Atlantic Forest; Atlantic Forest and interior of São Paulo; all South American metacommunities), pruned the tree to each, and computed γ and the normalized Colless index on the point-estimate tree and on its 100 time-calibrated bootstrap trees. For the case study, we used the metacommunities with at least 10 ponds and pond depth measured in every pond, namely two of the 14 and one additional published dataset: Serra da Bocaina (13 ponds; Provete et al., 2014), southern Brazil (32 ponds; Both et al., 2011) and northwestern São Paulo (40 ponds; Prado &amp; Rossa-Feres, 2014). We applied all tests and the four clade-scoring methods to incidence data with pond depth as the gradient, and also with canopy cover in Bocaina, the variable associated with its phylogenetic composition in a previous analysis with PCPS (Provete, 2018).</w:t>
-      </w:r>
-    </w:p>
-    <w:bookmarkEnd w:id="34"/>
-    <w:bookmarkStart w:id="35" w:name="implementation-and-reproducibility"/>
-    <w:p>
-      <w:pPr>
-        <w:pStyle w:val="Heading2"/>
-      </w:pPr>
-      <w:r>
-        <w:t xml:space="preserve">Implementation and reproducibility</w:t>
-      </w:r>
-    </w:p>
-    <w:p>
-      <w:pPr>
-        <w:pStyle w:val="FirstParagraph"/>
-      </w:pPr>
-      <w:r>
-        <w:t xml:space="preserve">We ran all analyses in R v. 4.6.1 (R Core Team, 2026), with the versions of every package recorded in the lockfile of renv v. 1.3.1 (Ushey &amp; Wickham, 2026); trees were handled with ape v. 5.8-1 (Paradis &amp; Schliep, 2019), and the trait simulation, the β-splitting and branching-time generator and the calibration of the grid are our own R code in the repository. We orchestrated the simulations of Layer A and Layer B with targets v. 1.12.0 (Landau, 2021) and crew v. 1.3.3 (Landau, 2026) in a Docker image on spot cloud instances with 192 virtual CPUs (190 workers); the pipeline seed was 20261018, from which targets derives one seed per branch. Layer A took about 8 h for the 432,000 metacommunities of the main run and Layer B about 7.5 h for its 440,000. The clade-recovery runs took 1.2 h on a 16-core workstation, with one seed per tree, depth and replicate, and each formal model 1–7 min. Code is available at [CITAR: GitHub repository and Zenodo DOI], together with the rates aggregated by condition and the scripts that compute the performance measures and the models from them, which reproduce every table and figure without rerunning the simulations.</w:t>
-      </w:r>
-    </w:p>
-    <w:bookmarkEnd w:id="35"/>
-    <w:bookmarkEnd w:id="36"/>
-    <w:bookmarkStart w:id="59" w:name="results"/>
-    <w:p>
-      <w:pPr>
-        <w:pStyle w:val="Heading1"/>
-      </w:pPr>
-      <w:r>
-        <w:t xml:space="preserve">Results</w:t>
-      </w:r>
-    </w:p>
-    <w:bookmarkStart w:id="37" w:name="validation"/>
-    <w:p>
-      <w:pPr>
-        <w:pStyle w:val="Heading2"/>
-      </w:pPr>
-      <w:r>
-        <w:t xml:space="preserve">Validation</w:t>
-      </w:r>
-    </w:p>
-    <w:p>
-      <w:pPr>
-        <w:pStyle w:val="FirstParagraph"/>
-      </w:pPr>
-      <w:r>
-        <w:t xml:space="preserve">The static layer reproduced the published validations. In the Yule trees of Duarte et al. (2016), the rejection rates of the site shuffle, the taxa shuffle and the max test fell within the 95% binomial interval of our estimates in 66 of 72 cells. The six exceptions came from four conditions (PERMANOVA with both components at N = 100, with environment only at N = 200 and with phylogeny only at N = 200, and the Mantel test with environment only at N = 200), slightly more than the 3.6 cells expected by chance. The mean PERMANOVA R² and Mantel ρ agreed to the second decimal place when we used the Bray–Curtis dissimilarity without the square root, as in the code of Duarte et al. (2016); in the rest of the study we used the square-rooted version. The PCC matched the published rates in the scenarios that do not depend on the tree. Its power was lower than published (0.93 against 0.95), and it varied between 0.71 and 0.93 among 20 Yule trees, so the published values lie just above that range, which seems to reflect a single favourable tree. Thus, our implementation closely reproduces both benchmarks.</w:t>
-      </w:r>
-    </w:p>
-    <w:bookmarkEnd w:id="37"/>
-    <w:bookmarkStart w:id="42" w:name="X6fda0e17f756476fcb0af05453767d4dea2fefb"/>
-    <w:p>
-      <w:pPr>
-        <w:pStyle w:val="Heading2"/>
-      </w:pPr>
-      <w:r>
-        <w:t xml:space="preserve">Type I error under tree shape and nuisance structure</w:t>
-      </w:r>
-    </w:p>
-    <w:p>
-      <w:pPr>
-        <w:pStyle w:val="FirstParagraph"/>
       </w:pPr>
       <w:r>
         <w:t xml:space="preserve">Tree imbalance did not affect the type I error of any test. In all 75 combinations of test, null scenario and N, the difference in the distance of the type I error from the nominal level between highly imbalanced and Yule trees was within ±0.012, and no 95% CI excluded zero, with incidence or abundance data (</w:t>
@@ -1056,7 +2131,7 @@
       <w:tr>
         <w:tc>
           <w:tcPr/>
-          <w:bookmarkStart w:id="41" w:name="fig-type1"/>
+          <w:bookmarkStart w:id="39" w:name="fig-type1"/>
           <w:p>
             <w:pPr>
               <w:pStyle w:val="Compact"/>
@@ -1067,18 +2142,18 @@
                 <wp:inline>
                   <wp:extent cx="5753100" cy="4738352"/>
                   <wp:effectExtent b="0" l="0" r="0" t="0"/>
-                  <wp:docPr descr="" title="" id="39" name="Picture"/>
+                  <wp:docPr descr="" title="" id="37" name="Picture"/>
                   <a:graphic>
                     <a:graphicData uri="http://schemas.openxmlformats.org/drawingml/2006/picture">
                       <pic:pic>
                         <pic:nvPicPr>
-                          <pic:cNvPr descr="figures/fig2_type1.png" id="40" name="Picture"/>
+                          <pic:cNvPr descr="figures/fig2_type1.png" id="38" name="Picture"/>
                           <pic:cNvPicPr>
                             <a:picLocks noChangeArrowheads="1" noChangeAspect="1"/>
                           </pic:cNvPicPr>
                         </pic:nvPicPr>
                         <pic:blipFill>
-                          <a:blip r:embed="rId38"/>
+                          <a:blip r:embed="rId36"/>
                           <a:stretch>
                             <a:fillRect/>
                           </a:stretch>
@@ -1118,23 +2193,13 @@
               <w:t xml:space="preserve">Figure 2: Type I error of each test over the γ × Colless grid at N = 100 with incidence data (posterior medians of the beta-binomial model). Notice that rows S0 to S2h are almost uniform across the grid, whereas GLM PCPS2 doubles its rejection rate in the low-γ cells of S2σ.</w:t>
             </w:r>
           </w:p>
-          <w:bookmarkEnd w:id="41"/>
+          <w:bookmarkEnd w:id="39"/>
         </w:tc>
       </w:tr>
     </w:tbl>
-    <w:bookmarkEnd w:id="42"/>
-    <w:bookmarkStart w:id="47" w:name="power-and-tree-shape"/>
-    <w:p>
-      <w:pPr>
-        <w:pStyle w:val="Heading2"/>
-      </w:pPr>
-      <w:r>
-        <w:t xml:space="preserve">Power and tree shape</w:t>
-      </w:r>
-    </w:p>
-    <w:p>
-      <w:pPr>
-        <w:pStyle w:val="FirstParagraph"/>
+    <w:p>
+      <w:pPr>
+        <w:pStyle w:val="BodyText"/>
       </w:pPr>
       <w:r>
         <w:t xml:space="preserve">The distribution of branching times, but not imbalance, changed the power of most tests (</w:t>
@@ -1164,7 +2229,7 @@
       <w:tr>
         <w:tc>
           <w:tcPr/>
-          <w:bookmarkStart w:id="46" w:name="fig-power"/>
+          <w:bookmarkStart w:id="43" w:name="fig-power"/>
           <w:p>
             <w:pPr>
               <w:pStyle w:val="Compact"/>
@@ -1175,18 +2240,18 @@
                 <wp:inline>
                   <wp:extent cx="5753100" cy="3044241"/>
                   <wp:effectExtent b="0" l="0" r="0" t="0"/>
-                  <wp:docPr descr="" title="" id="44" name="Picture"/>
+                  <wp:docPr descr="" title="" id="41" name="Picture"/>
                   <a:graphic>
                     <a:graphicData uri="http://schemas.openxmlformats.org/drawingml/2006/picture">
                       <pic:pic>
                         <pic:nvPicPr>
-                          <pic:cNvPr descr="figures/fig3_power.png" id="45" name="Picture"/>
+                          <pic:cNvPr descr="figures/fig3_power.png" id="42" name="Picture"/>
                           <pic:cNvPicPr>
                             <a:picLocks noChangeArrowheads="1" noChangeAspect="1"/>
                           </pic:cNvPicPr>
                         </pic:nvPicPr>
                         <pic:blipFill>
-                          <a:blip r:embed="rId43"/>
+                          <a:blip r:embed="rId40"/>
                           <a:stretch>
                             <a:fillRect/>
                           </a:stretch>
@@ -1226,23 +2291,13 @@
               <w:t xml:space="preserve">Figure 3: Power of each test over the γ × Colless grid at N = 100 with incidence data (posterior medians). Notice that the low-γ rows lose power in GLM PCPS1 and PCC, whereas PERMANOVA keeps a similar power in every cell.</w:t>
             </w:r>
           </w:p>
-          <w:bookmarkEnd w:id="46"/>
+          <w:bookmarkEnd w:id="43"/>
         </w:tc>
       </w:tr>
     </w:tbl>
-    <w:bookmarkEnd w:id="47"/>
-    <w:bookmarkStart w:id="52" w:name="X72ad4947fb5ab40bd19643bc3dd668044f061db"/>
-    <w:p>
-      <w:pPr>
-        <w:pStyle w:val="Heading2"/>
-      </w:pPr>
-      <w:r>
-        <w:t xml:space="preserve">Performance under metacommunity assembly processes</w:t>
-      </w:r>
-    </w:p>
-    <w:p>
-      <w:pPr>
-        <w:pStyle w:val="FirstParagraph"/>
+    <w:p>
+      <w:pPr>
+        <w:pStyle w:val="BodyText"/>
       </w:pPr>
       <w:r>
         <w:t xml:space="preserve">The assembly process mattered more than tree shape for power (</w:t>
@@ -1256,7 +2311,7 @@
         </w:r>
       </w:hyperlink>
       <w:r>
-        <w:t xml:space="preserve">). Under species sorting without competition, power at N = 100 in S3b in Yule pool trees ranged from 0.78 (GLM PCPS1) and 0.83 (RDA PCPS) to 0.87 (PERMANOVA), 0.92 (Mantel) and 0.96 (PCC), whereas GLM PCPS2 had almost no power (0.03), as in Layer A. Mass effects reduced the power of every test except GLM PCPS2, which gained 0.08 (0.06–0.11) from its low baseline. Relative to species sorting, PERMANOVA lost 0.62 (0.58–0.65) in Yule pool trees and 0.72 (0.69–0.75) with low γ, the Mantel test 0.75 and 0.79, RDA PCPS 0.58 and 0.55, GLM PCPS1 0.55 and 0.27, and the PCC 0.93 (0.92–0.94) and 0.76, so that the PCC detected the phylogenetic signal in almost no replicates. Surprisingly, adding phylogenetic competition to mass effects partly restored the power of every test except the PCC; for instance, PERMANOVA lost 0.46 (0.42–0.50) instead of 0.62 in Yule pool trees. Under species sorting, phylogenetic competition changed power by −0.12 to +0.11. These two contrasts should be read with care, because competition prunes close relatives and changes the shape of the analysed tree relative to the pool tree, so the effect of the process cannot be separated from that of a change in tree shape; this pruning is strongest under mass effects, where the Colless index of the analysed tree was about 75% lower than that of the pool. Under the null hypothesis, no lower CI bound exceeded 0.075 at N = 100 (largest posterior median 0.088). However, raw rejection rates exceeded that limit for GLM PCPS2 in S2σ under species sorting (0.094 at N = 100 and 0.104–0.129 at N = 200 in the low- and mid-γ cells) and for the PCC in S2h (0.085–0.089 at N = 100; 0.111 under species sorting and 0.116–0.143 under mass effects at N = 200).</w:t>
+        <w:t xml:space="preserve">). Under species sorting without competition, power at N = 100 in S3b in Yule pool trees ranged from 0.78 (GLM PCPS1) and 0.83 (RDA PCPS) to 0.87 (PERMANOVA), 0.92 (Mantel) and 0.96 (PCC), whereas GLM PCPS2 had almost no power (0.03), as in Layer A. Mass effects reduced the power of every test except GLM PCPS2, which gained 0.08 (0.06–0.11) from its low baseline. Relative to species sorting, PERMANOVA lost 0.62 (0.58–0.65) in Yule pool trees and 0.72 (0.69–0.75) with low γ, the Mantel test 0.75 and 0.79, RDA PCPS 0.58 and 0.55, GLM PCPS1 0.55 and 0.27, and the PCC 0.93 (0.92–0.94) and 0.76, so that the PCC detected the phylogenetic signal in almost no replicates. Surprisingly, adding phylogenetic competition to mass effects partly restored the power of every test except the PCC; for instance, PERMANOVA lost 0.46 (0.42–0.50) instead of 0.62 in Yule pool trees. Under species sorting, phylogenetic competition changed power by −0.12 to +0.11. These two contrasts should be read with care, because competition prunes close relatives and changes the shape of the analysed tree relative to the pool tree, so the effect of the process cannot be separated from that of a change in tree shape; this pruning is strongest under mass effects, where the Colless index of the analysed tree was about 75% lower than that of the pool. Under the null hypothesis, no lower CI bound exceeded 0.075 at N = 100, although some raw rates of GLM PCPS2 in S2σ and of the PCC in S2h did at N = 200 (Appendix S2).</w:t>
       </w:r>
     </w:p>
     <w:tbl>
@@ -1272,7 +2327,7 @@
       <w:tr>
         <w:tc>
           <w:tcPr/>
-          <w:bookmarkStart w:id="51" w:name="fig-layerB"/>
+          <w:bookmarkStart w:id="47" w:name="fig-layerB"/>
           <w:p>
             <w:pPr>
               <w:pStyle w:val="Compact"/>
@@ -1283,18 +2338,18 @@
                 <wp:inline>
                   <wp:extent cx="5753100" cy="3723605"/>
                   <wp:effectExtent b="0" l="0" r="0" t="0"/>
-                  <wp:docPr descr="" title="" id="49" name="Picture"/>
+                  <wp:docPr descr="" title="" id="45" name="Picture"/>
                   <a:graphic>
                     <a:graphicData uri="http://schemas.openxmlformats.org/drawingml/2006/picture">
                       <pic:pic>
                         <pic:nvPicPr>
-                          <pic:cNvPr descr="figures/fig4_layerB_power.png" id="50" name="Picture"/>
+                          <pic:cNvPr descr="figures/fig4_layerB_power.png" id="46" name="Picture"/>
                           <pic:cNvPicPr>
                             <a:picLocks noChangeArrowheads="1" noChangeAspect="1"/>
                           </pic:cNvPicPr>
                         </pic:nvPicPr>
                         <pic:blipFill>
-                          <a:blip r:embed="rId48"/>
+                          <a:blip r:embed="rId44"/>
                           <a:stretch>
                             <a:fillRect/>
                           </a:stretch>
@@ -1334,23 +2389,13 @@
               <w:t xml:space="preserve">Figure 4: Power in Layer B by assembly archetype and pool tree cell at N = 100 (posterior medians and 95% credible intervals). Notice that mass effects (orange) lower the power of every test except GLM PCPS2 and almost abolish that of the PCC, and that phylogenetic competition under mass effects (pink) recovers part of the power lost.</w:t>
             </w:r>
           </w:p>
-          <w:bookmarkEnd w:id="51"/>
+          <w:bookmarkEnd w:id="47"/>
         </w:tc>
       </w:tr>
     </w:tbl>
-    <w:bookmarkEnd w:id="52"/>
-    <w:bookmarkStart w:id="57" w:name="recovery-of-a-planted-clade-1"/>
-    <w:p>
-      <w:pPr>
-        <w:pStyle w:val="Heading2"/>
-      </w:pPr>
-      <w:r>
-        <w:t xml:space="preserve">Recovery of a planted clade</w:t>
-      </w:r>
-    </w:p>
-    <w:p>
-      <w:pPr>
-        <w:pStyle w:val="FirstParagraph"/>
+    <w:p>
+      <w:pPr>
+        <w:pStyle w:val="BodyText"/>
       </w:pPr>
       <w:r>
         <w:t xml:space="preserve">The evoPCA and phylofactorization recovered the planted clade far more often than PCPS and PCC (</w:t>
@@ -1372,7 +2417,7 @@
         <w:pStyle w:val="BodyText"/>
       </w:pPr>
       <w:r>
-        <w:t xml:space="preserve">Tree shape changed recovery only for PCPS and PCC. With low γ, PCPS recovered basal clades in 0.58 of the replicates against 0.21 in Yule trees, and recent clades in 0.35 against 0.04 (N = 100), and this advantage grew with N (+0.23 to +0.45 across N and depths). The PCC lost 0.10–0.14 in basal clades with low γ and gained 0.07–0.09 in recent ones, whereas the recovery of evoPCA and phylofactorization did not change with γ (all 95% CI included zero), and high imbalance reduced recovery by 0.01–0.10 in all methods. Interestingly, low γ improved PCPS for recent as well as for basal clades, so H3 was only partly supported: the advantage of basal clades seems to be a matter of degree rather than a different behaviour of the method, and the share of variation on the first PCPS axis decreased rather than increased with low γ in the descriptive summaries of Layer A. With abundance data, the patterns were the same, with lower recovery for the compositional phylofactorization (0.68 and 0.56 for basal and recent clades at N = 100) than for evoPCA (0.78 and 0.65), and PCPS gained 0.29 (0.25–0.33) and 0.23 (0.21–0.25) with low γ. Taken together, H4 was also supported for clade recovery, but only through the change in rank between PCPS and PCC.</w:t>
+        <w:t xml:space="preserve">Tree shape changed recovery only for PCPS and PCC. With low γ, PCPS recovered basal clades in 0.58 of the replicates against 0.21 in Yule trees, and recent clades in 0.35 against 0.04 (N = 100), and this advantage grew with N (+0.23 to +0.45 across N and depths). The PCC lost 0.10–0.14 in basal clades with low γ and gained 0.07–0.09 in recent ones, whereas the recovery of evoPCA and phylofactorization did not change with γ (all 95% CI included zero), and high imbalance reduced recovery by 0.01–0.10 in all methods. Interestingly, low γ improved PCPS for recent as well as for basal clades, so H3 was only partly supported: the advantage of basal clades seems to be a matter of degree rather than a different behaviour of the method, and the share of variation on the first PCPS axis decreased rather than increased with low γ in the descriptive summaries of Layer A. With abundance data, the patterns were the same (Appendix S2). Taken together, H4 was also supported for clade recovery, but only through the change in rank between PCPS and PCC.</w:t>
       </w:r>
     </w:p>
     <w:tbl>
@@ -1388,7 +2433,7 @@
       <w:tr>
         <w:tc>
           <w:tcPr/>
-          <w:bookmarkStart w:id="56" w:name="fig-clade"/>
+          <w:bookmarkStart w:id="51" w:name="fig-clade"/>
           <w:p>
             <w:pPr>
               <w:pStyle w:val="Compact"/>
@@ -1399,18 +2444,18 @@
                 <wp:inline>
                   <wp:extent cx="5416061" cy="2886935"/>
                   <wp:effectExtent b="0" l="0" r="0" t="0"/>
-                  <wp:docPr descr="" title="" id="54" name="Picture"/>
+                  <wp:docPr descr="" title="" id="49" name="Picture"/>
                   <a:graphic>
                     <a:graphicData uri="http://schemas.openxmlformats.org/drawingml/2006/picture">
                       <pic:pic>
                         <pic:nvPicPr>
-                          <pic:cNvPr descr="figures/fig5_clade.png" id="55" name="Picture"/>
+                          <pic:cNvPr descr="figures/fig5_clade.png" id="50" name="Picture"/>
                           <pic:cNvPicPr>
                             <a:picLocks noChangeArrowheads="1" noChangeAspect="1"/>
                           </pic:cNvPicPr>
                         </pic:nvPicPr>
                         <pic:blipFill>
-                          <a:blip r:embed="rId53"/>
+                          <a:blip r:embed="rId48"/>
                           <a:stretch>
                             <a:fillRect/>
                           </a:stretch>
@@ -1450,31 +2495,12 @@
               <w:t xml:space="preserve">Figure 5: Probability of recovering the planted clade over the γ × Colless grid at N = 100, incidence data and a shift of 2 (posterior medians), for basal (old) and recent (young) clades. Notice that PCPS gains markedly with low γ and PCC changes in opposite directions for basal and recent clades, whereas evoPCA and phylofactorization recover the clade at a similar rate in every cell.</w:t>
             </w:r>
           </w:p>
-          <w:bookmarkEnd w:id="56"/>
+          <w:bookmarkEnd w:id="51"/>
         </w:tc>
       </w:tr>
     </w:tbl>
-    <w:bookmarkEnd w:id="57"/>
-    <w:bookmarkStart w:id="58" w:name="convergence-and-fit-of-the-formal-models"/>
-    <w:p>
-      <w:pPr>
-        <w:pStyle w:val="Heading2"/>
-      </w:pPr>
-      <w:r>
-        <w:t xml:space="preserve">Convergence and fit of the formal models</w:t>
-      </w:r>
-    </w:p>
-    <w:p>
-      <w:pPr>
-        <w:pStyle w:val="FirstParagraph"/>
-      </w:pPr>
-      <w:r>
-        <w:t xml:space="preserve">All models converged, with R̂ ≤ 1.01, bulk effective sample size ≥ 908 and tail effective sample size ≥ 1,477, no divergent transitions and no transition at the maximum tree depth (Table S3). The in-sample 95% posterior predictive intervals contained 96–98% of the observed rates of each condition and the 50% intervals 61–70%, so the predictive intervals are slightly wider than needed; when we summed the conditions of each test, N and cell, every group fell within its 95% interval.</w:t>
-      </w:r>
-    </w:p>
-    <w:bookmarkEnd w:id="58"/>
-    <w:bookmarkEnd w:id="59"/>
-    <w:bookmarkStart w:id="64" w:name="Xada27c83b7f8db009b1df1795077522469ebf9f"/>
+    <w:bookmarkEnd w:id="52"/>
+    <w:bookmarkStart w:id="57" w:name="Xada27c83b7f8db009b1df1795077522469ebf9f"/>
     <w:p>
       <w:pPr>
         <w:pStyle w:val="Heading1"/>
@@ -1523,7 +2549,7 @@
       <w:tr>
         <w:tc>
           <w:tcPr/>
-          <w:bookmarkStart w:id="63" w:name="fig-box1"/>
+          <w:bookmarkStart w:id="56" w:name="fig-box1"/>
           <w:p>
             <w:pPr>
               <w:pStyle w:val="Compact"/>
@@ -1534,18 +2560,18 @@
                 <wp:inline>
                   <wp:extent cx="4890135" cy="3261010"/>
                   <wp:effectExtent b="0" l="0" r="0" t="0"/>
-                  <wp:docPr descr="" title="" id="61" name="Picture"/>
+                  <wp:docPr descr="" title="" id="54" name="Picture"/>
                   <a:graphic>
                     <a:graphicData uri="http://schemas.openxmlformats.org/drawingml/2006/picture">
                       <pic:pic>
                         <pic:nvPicPr>
-                          <pic:cNvPr descr="figures/box1_pools.png" id="62" name="Picture"/>
+                          <pic:cNvPr descr="figures/box1_pools.png" id="55" name="Picture"/>
                           <pic:cNvPicPr>
                             <a:picLocks noChangeArrowheads="1" noChangeAspect="1"/>
                           </pic:cNvPicPr>
                         </pic:nvPicPr>
                         <pic:blipFill>
-                          <a:blip r:embed="rId60"/>
+                          <a:blip r:embed="rId53"/>
                           <a:stretch>
                             <a:fillRect/>
                           </a:stretch>
@@ -1582,15 +2608,15 @@
               <w:pStyle w:val="ImageCaption"/>
             </w:pPr>
             <w:r>
-              <w:t xml:space="preserve">Figure 6: Tree shape of three nested regional pools of anurans (coloured points, point-estimate tree; bars, 2.5–97.5% quantiles across 100 bootstrap trees, centred on their median) against the targets of the simulation grid (open symbols, by N) and the anuran clades with 40–250 tips of Portik et al. (2023) (grey points). Notice that the pools fall inside the grid and close to its Yule and median levels.</w:t>
+              <w:t xml:space="preserve">Figure 6: Tree shape of three nested regional pools of anurans (filled points and bars, median and 2.5–97.5% quantiles across 100 bootstrap trees; open diamonds, point-estimate tree) against the targets of the simulation grid (open symbols, by N) and the anuran clades with 40–250 tips of Portik et al. (2023) (grey points). Notice that the pools fall inside the grid and close to its Yule and median levels, and that the point-estimate tree has a lower γ than most bootstrap trees.</w:t>
             </w:r>
           </w:p>
-          <w:bookmarkEnd w:id="63"/>
+          <w:bookmarkEnd w:id="56"/>
         </w:tc>
       </w:tr>
     </w:tbl>
-    <w:bookmarkEnd w:id="64"/>
-    <w:bookmarkStart w:id="65" w:name="references-verified"/>
+    <w:bookmarkEnd w:id="57"/>
+    <w:bookmarkStart w:id="58" w:name="references-verified"/>
     <w:p>
       <w:pPr>
         <w:pStyle w:val="Heading1"/>
@@ -1925,27 +2951,6 @@
         <w:pStyle w:val="BodyText"/>
       </w:pPr>
       <w:r>
-        <w:t xml:space="preserve">Legendre, P., &amp; Gallagher, E. D. (2001). Ecologically meaningful transformations for ordination of species data.</w:t>
-      </w:r>
-      <w:r>
-        <w:t xml:space="preserve"> </w:t>
-      </w:r>
-      <w:r>
-        <w:rPr>
-          <w:i/>
-          <w:iCs/>
-        </w:rPr>
-        <w:t xml:space="preserve">Oecologia</w:t>
-      </w:r>
-      <w:r>
-        <w:t xml:space="preserve">, 129, 271–280. https://doi.org/10.1007/s004420100716</w:t>
-      </w:r>
-    </w:p>
-    <w:p>
-      <w:pPr>
-        <w:pStyle w:val="BodyText"/>
-      </w:pPr>
-      <w:r>
         <w:t xml:space="preserve">Liedtke, H. C. (2019). AmphiNom: an amphibian systematics tool.</w:t>
       </w:r>
       <w:r>
@@ -2335,7 +3340,7 @@
         <w:t xml:space="preserve">, 15, 1926–1939. https://doi.org/10.1111/2041-210X.14415</w:t>
       </w:r>
     </w:p>
-    <w:bookmarkEnd w:id="65"/>
+    <w:bookmarkEnd w:id="58"/>
     <w:sectPr>
       <w:footerReference r:id="rId9" w:type="default"/>
       <w:footnotePr>

</xml_diff>

<commit_message>
Correções das revisões: fatos restaurados, referências e math no SI, paleta do Box 1, notação μ na camada B; log e memória atualizados
Co-Authored-By: Claude Opus 5.5 <noreply@anthropic.com>
</commit_message>
<xml_diff>
--- a/manuscript/methods_results.docx
+++ b/manuscript/methods_results.docx
@@ -1838,7 +1838,7 @@
         <w:t xml:space="preserve"> </w:t>
       </w:r>
       <w:r>
-        <w:t xml:space="preserve">is the shift and Φ is the standard normal distribution function; the other species therefore had no phylogenetic signal in their optima. We used shifts of 0.5, 1 and 2, all nine cells of the grid, N = 50, 100 and 200 with incidence data, and N = 100 with abundance data, with 1,000 replicates per combination, and the planted clade, the optima and the gradient of a replicate were the same across shifts and data types. We compared PCPS, PCC, the evolutionary principal component analysis (evoPCA; Pavoine, 2016), computed with the R package adiv v. 2.2.1 (Pavoine, 2020), and phylofactorization (Washburne et al., 2017). Each method gave a score to every internal node: for the three ordinations, the absolute correlation between membership of its clade and the species scores on the axis most correlated with</w:t>
+        <w:t xml:space="preserve">is the shift and Φ is the standard normal distribution function; the other species therefore had no phylogenetic signal in their optima, and the shift has the same meaning for every tree size. We used shifts of 0.5, 1 and 2, all nine cells of the grid, N = 50, 100 and 200 with incidence data, and N = 100 with abundance data, with 1,000 replicates per combination, and the planted clade, the optima and the gradient of a replicate were the same across shifts and data types. We compared PCPS, PCC, the evolutionary principal component analysis (evoPCA; Pavoine, 2016), computed with the R package adiv v. 2.2.1 (Pavoine, 2020), and phylofactorization (Washburne et al., 2017). Each method gave a score to every internal node: for the three ordinations, the absolute correlation between membership of its clade and the species scores on the axis most correlated with</w:t>
       </w:r>
       <w:r>
         <w:t xml:space="preserve"> </w:t>
@@ -1986,7 +1986,44 @@
         </m:r>
       </m:oMath>
       <w:r>
-        <w:t xml:space="preserve">, so a 95% Monte Carlo interval around the nominal level spans about ±0.014 and falls within Bradley’s liberal criterion for acceptable type I error, [0.025, 0.075] (Bradley, 1978). We report every rate with its Monte Carlo standard error in Table S2. We then modelled the rates aggregated by condition with beta-binomial models fitted in the R package brms v. 2.23.0 (Bürkner, 2017) with CmdStan v. 2.39.0 through cmdstanr v. 0.9.0 (Gabry et al., 2025), with one model for the type I error and one for the power in each layer, and one for clade recovery. We entered the levels of γ and of the Colless index as factors, with their interaction, which estimates the full γ × imbalance surface without assuming its form, and let the shape effects differ among tests (or methods), scenarios, N and data type (Appendix S1). The beta-binomial accounts for the dispersion of the rates, which was 2.1–8.5 times larger than binomial in quasibinomial models with the same structure. Priors were declared explicitly on the logit scale, normal(0, 1.5) for the coefficients, normal(−2.9, 1.5) for the intercept of the type I models, centred on logit(0.05), and gamma(2, 0.01) for the precision φ. We checked convergence with the rank-normalized</w:t>
+        <w:t xml:space="preserve"> </w:t>
+      </w:r>
+      <w:r>
+        <w:t xml:space="preserve">and at most 0.016 at</w:t>
+      </w:r>
+      <w:r>
+        <w:t xml:space="preserve"> </w:t>
+      </w:r>
+      <m:oMath>
+        <m:r>
+          <m:t>p</m:t>
+        </m:r>
+        <m:r>
+          <m:rPr>
+            <m:sty m:val="p"/>
+          </m:rPr>
+          <m:t>=</m:t>
+        </m:r>
+        <m:r>
+          <m:t>0.5</m:t>
+        </m:r>
+      </m:oMath>
+      <w:r>
+        <w:t xml:space="preserve">, so a 95% Monte Carlo interval around the nominal level spans about ±0.014. We chose</w:t>
+      </w:r>
+      <w:r>
+        <w:t xml:space="preserve"> </w:t>
+      </w:r>
+      <m:oMath>
+        <m:r>
+          <m:t>K</m:t>
+        </m:r>
+      </m:oMath>
+      <w:r>
+        <w:t xml:space="preserve"> </w:t>
+      </w:r>
+      <w:r>
+        <w:t xml:space="preserve">so that this interval falls within Bradley’s liberal criterion for acceptable type I error, [0.025, 0.075] (Bradley, 1978). We report every rate with its Monte Carlo standard error in Table S2, and the credible intervals of the formal models below include the binomial variation among replicates. We then modelled the rates aggregated by condition with beta-binomial models fitted in the R package brms v. 2.23.0 (Bürkner, 2017) with CmdStan v. 2.39.0 through cmdstanr v. 0.9.0 (Gabry et al., 2025), with one model for the type I error and one for the power in each layer, and one for clade recovery. We entered the levels of γ and of the Colless index as factors, with their interaction, which estimates the full γ × imbalance surface without assuming its form, and let the shape effects differ among tests (or methods), scenarios, N and data type (Appendix S1). The beta-binomial accounts for the dispersion of the rates, which was 2.1–8.5 times larger than binomial in quasibinomial models with the same structure. Priors were declared explicitly on the logit scale, normal(0, 1.5) for the coefficients, normal(−2.9, 1.5) for the intercept of the type I models, centred on logit(0.05), and gamma(2, 0.01) for the precision φ. We checked convergence with the rank-normalized</w:t>
       </w:r>
       <w:r>
         <w:t xml:space="preserve"> </w:t>
@@ -2022,7 +2059,7 @@
         <w:pStyle w:val="FirstParagraph"/>
       </w:pPr>
       <w:r>
-        <w:t xml:space="preserve">To show where real regional species pools fall in the grid of tree shapes, and how the methods behave with real data, we used 14 tadpole metacommunities compiled from the literature and from unpublished data (Box 1). We harmonized species names with the Amphibian Species of the World (Frost, 2026; through the internal dataset of AmphiNom, updated on 16 October 2025) using the R package AmphiNom v. 1.1.0 (Liedtke, 2019), excluded undetermined taxa, and matched the remaining 123 species to the tips of the Portik et al. (2023) tree. We built three nested pools (Atlantic Forest; Atlantic Forest and interior of São Paulo; all South American metacommunities) and computed γ and the normalized Colless index on the point-estimate tree and on its 100 time-calibrated bootstrap trees. For the case study, we used the metacommunities with at least 10 ponds and pond depth measured in every pond, namely Serra da Bocaina (13 ponds; Provete et al., 2014), southern Brazil (32 ponds; Both et al., 2011) and northwestern São Paulo (40 ponds; Prado &amp; Rossa-Feres, 2014). We applied all tests and the four clade-scoring methods to incidence data with pond depth as the gradient, and also with canopy cover in Bocaina, the variable associated with its phylogenetic composition in a previous analysis with PCPS (Provete, 2018).</w:t>
+        <w:t xml:space="preserve">To show where real regional species pools fall in the grid of tree shapes, and how the methods behave with real data, we used 14 tadpole metacommunities compiled from the literature and from unpublished data (Box 1). We harmonized species names with the Amphibian Species of the World (Frost, 2026; through the internal dataset of AmphiNom, updated on 16 October 2025) using the R package AmphiNom v. 1.1.0 (Liedtke, 2019), excluded undetermined taxa, and matched the remaining 123 species to the tips of the Portik et al. (2023) tree. We built three nested pools (Atlantic Forest; Atlantic Forest and interior of São Paulo; all South American metacommunities) pruned the tree to each, and computed γ and the normalized Colless index on the point-estimate tree and on its 100 time-calibrated bootstrap trees. For the case study, we used the metacommunities with at least 10 ponds and pond depth measured in every pond, namely two of the 14 and one additional published dataset: Serra da Bocaina (13 ponds; Provete et al., 2014), southern Brazil (32 ponds; Both et al., 2011) and northwestern São Paulo (40 ponds; Prado &amp; Rossa-Feres, 2014). We applied all tests and the four clade-scoring methods to incidence data with pond depth as the gradient, and also with canopy cover in Bocaina, the variable associated with its phylogenetic composition in a previous analysis with PCPS (Provete, 2018).</w:t>
       </w:r>
     </w:p>
     <w:bookmarkEnd w:id="33"/>
@@ -2311,7 +2348,7 @@
         </w:r>
       </w:hyperlink>
       <w:r>
-        <w:t xml:space="preserve">). Under species sorting without competition, power at N = 100 in S3b in Yule pool trees ranged from 0.78 (GLM PCPS1) and 0.83 (RDA PCPS) to 0.87 (PERMANOVA), 0.92 (Mantel) and 0.96 (PCC), whereas GLM PCPS2 had almost no power (0.03), as in Layer A. Mass effects reduced the power of every test except GLM PCPS2, which gained 0.08 (0.06–0.11) from its low baseline. Relative to species sorting, PERMANOVA lost 0.62 (0.58–0.65) in Yule pool trees and 0.72 (0.69–0.75) with low γ, the Mantel test 0.75 and 0.79, RDA PCPS 0.58 and 0.55, GLM PCPS1 0.55 and 0.27, and the PCC 0.93 (0.92–0.94) and 0.76, so that the PCC detected the phylogenetic signal in almost no replicates. Surprisingly, adding phylogenetic competition to mass effects partly restored the power of every test except the PCC; for instance, PERMANOVA lost 0.46 (0.42–0.50) instead of 0.62 in Yule pool trees. Under species sorting, phylogenetic competition changed power by −0.12 to +0.11. These two contrasts should be read with care, because competition prunes close relatives and changes the shape of the analysed tree relative to the pool tree, so the effect of the process cannot be separated from that of a change in tree shape; this pruning is strongest under mass effects, where the Colless index of the analysed tree was about 75% lower than that of the pool. Under the null hypothesis, no lower CI bound exceeded 0.075 at N = 100, although some raw rates of GLM PCPS2 in S2σ and of the PCC in S2h did at N = 200 (Appendix S2).</w:t>
+        <w:t xml:space="preserve">). Under species sorting without competition, power at N = 100 in S3b in Yule pool trees ranged from 0.78 (GLM PCPS1) and 0.83 (RDA PCPS) to 0.87 (PERMANOVA), 0.92 (Mantel) and 0.96 (PCC), whereas GLM PCPS2 had almost no power (0.03), as in Layer A. Mass effects reduced the power of every test except GLM PCPS2, which gained 0.08 (0.06–0.11) from its low baseline. Relative to species sorting, PERMANOVA lost 0.62 (0.58–0.65) in Yule pool trees and 0.72 (0.69–0.75) with low γ, the Mantel test 0.75 and 0.79, RDA PCPS 0.58 and 0.55, GLM PCPS1 0.55 and 0.27, and the PCC 0.93 (0.92–0.94) and 0.76, so that the PCC detected the phylogenetic signal in almost no replicates. Surprisingly, adding phylogenetic competition to mass effects partly restored the power of every test except the PCC; for instance, PERMANOVA lost 0.46 (0.42–0.50) instead of 0.62 in Yule pool trees. Under species sorting, phylogenetic competition changed power by −0.12 to +0.11. These two contrasts should be read with care, because competition prunes close relatives and changes the shape of the analysed tree relative to the pool tree, so the effect of the process cannot be separated from that of a change in tree shape; this pruning is strongest under mass effects, where the Colless index of the analysed tree was about 75% lower than that of the pool. Under the null hypothesis, no lower CI bound exceeded 0.075 at N = 100, although some raw rates of GLM PCPS2 in S2σ and of the PCC in S2h exceeded that limit at N = 100 and, more often, at N = 200 (Appendix S2).</w:t>
       </w:r>
     </w:p>
     <w:tbl>

</xml_diff>

<commit_message>
Abstract numerado, palavras-chave, folha de rosto, resumos derivados no git e script do pacote anonimizado para revisão
Co-Authored-By: Claude Opus 5.5 <noreply@anthropic.com>
</commit_message>
<xml_diff>
--- a/manuscript/methods_results.docx
+++ b/manuscript/methods_results.docx
@@ -15,7 +15,7 @@
         <w:pStyle w:val="Subtitle"/>
       </w:pPr>
       <w:r>
-        <w:t xml:space="preserve">Methods and Results (draft)</w:t>
+        <w:t xml:space="preserve">Abstract, Methods and Results (draft)</w:t>
       </w:r>
     </w:p>
     <w:p>
@@ -34,16 +34,86 @@
         <w:t xml:space="preserve">2026-10-20</w:t>
       </w:r>
     </w:p>
-    <w:bookmarkStart w:id="35" w:name="methods"/>
+    <w:bookmarkStart w:id="20" w:name="abstract"/>
     <w:p>
       <w:pPr>
         <w:pStyle w:val="Heading1"/>
       </w:pPr>
       <w:r>
+        <w:t xml:space="preserve">Abstract</w:t>
+      </w:r>
+    </w:p>
+    <w:p>
+      <w:pPr>
+        <w:numPr>
+          <w:ilvl w:val="0"/>
+          <w:numId w:val="1001"/>
+        </w:numPr>
+      </w:pPr>
+      <w:r>
+        <w:t xml:space="preserve">Methods that relate the phylogenetic structure of metacommunities to environmental gradients, like the principal coordinates of phylogenetic structure (PCPS) and the phylogenetic community composition approach (PCC), were validated with static simulations on trees close to the Yule model. However, real phylogenies vary in topological imbalance and in the distribution of branching times, and dispersal and competition assemble metacommunities, so their published performance may not hold for empirical data.</w:t>
+      </w:r>
+    </w:p>
+    <w:p>
+      <w:pPr>
+        <w:numPr>
+          <w:ilvl w:val="0"/>
+          <w:numId w:val="1001"/>
+        </w:numPr>
+      </w:pPr>
+      <w:r>
+        <w:t xml:space="preserve">We simulated metacommunities on a grid of tree shapes that crossed the distribution of branching times (γ) with topological imbalance (Colless index), with levels from anuran clades, in a static layer that reproduces the original validations and in a process-based layer with species sorting, mass effects and phylogenetic competition. We estimated the type I error and power of six tests, and how often four ordination and factorization methods recovered a clade planted along the gradient, with beta-binomial models of these rates.</w:t>
+      </w:r>
+    </w:p>
+    <w:p>
+      <w:pPr>
+        <w:numPr>
+          <w:ilvl w:val="0"/>
+          <w:numId w:val="1001"/>
+        </w:numPr>
+      </w:pPr>
+      <w:r>
+        <w:t xml:space="preserve">Tree imbalance did not affect the type I error of any test. Phylogenetic signal in niche breadth inflated the type I error of the linear model on the second PCPS axis, up to 0.36 in trees with low γ, and of the PCC, up to 0.22. Low γ reduced the power of the linear model on the first PCPS axis by 0.40 and that of the PCC by 0.25, whereas PERMANOVA was almost insensitive to tree shape. Mass effects reduced power more than tree shape and almost abolished that of the PCC. The evoPCA and phylofactorization recovered the planted clade in 0.44–0.88 of the replicates in every tree shape, whereas PCPS depended strongly on γ and PCC rarely found the clade.</w:t>
+      </w:r>
+    </w:p>
+    <w:p>
+      <w:pPr>
+        <w:numPr>
+          <w:ilvl w:val="0"/>
+          <w:numId w:val="1001"/>
+        </w:numPr>
+      </w:pPr>
+      <w:r>
+        <w:t xml:space="preserve">The performance of these methods seems to depend on the distribution of branching times and on the assembly process rather than on tree imbalance. Three regional anuran pools fell inside the simulated grid, so these results seem to apply to real metacommunities. We therefore recommend reporting γ of the analysed tree, caution with the second PCPS axis when niche breadth may be phylogenetically conserved, and using evoPCA or phylofactorization to identify the clades associated with a gradient.</w:t>
+      </w:r>
+    </w:p>
+    <w:p>
+      <w:pPr>
+        <w:pStyle w:val="FirstParagraph"/>
+      </w:pPr>
+      <w:r>
+        <w:t xml:space="preserve">Data and code availability for review: the code, the rates aggregated by condition and the scripts that reproduce every table and figure are available at https://github.com/diogoprov/pcps-sim (archived at Zenodo, [CITAR: Zenodo DOI]).</w:t>
+      </w:r>
+    </w:p>
+    <w:p>
+      <w:pPr>
+        <w:pStyle w:val="BodyText"/>
+      </w:pPr>
+      <w:r>
+        <w:t xml:space="preserve">Keywords: γ statistic, metacommunity phylogenetics, phylogenetic fuzzy weighting, phylogenetic signal, simulation study, species sorting, tree balance, type I error</w:t>
+      </w:r>
+    </w:p>
+    <w:bookmarkEnd w:id="20"/>
+    <w:bookmarkStart w:id="36" w:name="methods"/>
+    <w:p>
+      <w:pPr>
+        <w:pStyle w:val="Heading1"/>
+      </w:pPr>
+      <w:r>
         <w:t xml:space="preserve">Methods</w:t>
       </w:r>
     </w:p>
-    <w:bookmarkStart w:id="24" w:name="overview-of-the-simulation-study"/>
+    <w:bookmarkStart w:id="25" w:name="overview-of-the-simulation-study"/>
     <w:p>
       <w:pPr>
         <w:pStyle w:val="Heading2"/>
@@ -109,7 +179,7 @@
       <w:tr>
         <w:tc>
           <w:tcPr/>
-          <w:bookmarkStart w:id="23" w:name="fig-design"/>
+          <w:bookmarkStart w:id="24" w:name="fig-design"/>
           <w:p>
             <w:pPr>
               <w:pStyle w:val="Compact"/>
@@ -120,18 +190,18 @@
                 <wp:inline>
                   <wp:extent cx="5753100" cy="2622454"/>
                   <wp:effectExtent b="0" l="0" r="0" t="0"/>
-                  <wp:docPr descr="" title="" id="21" name="Picture"/>
+                  <wp:docPr descr="" title="" id="22" name="Picture"/>
                   <a:graphic>
                     <a:graphicData uri="http://schemas.openxmlformats.org/drawingml/2006/picture">
                       <pic:pic>
                         <pic:nvPicPr>
-                          <pic:cNvPr descr="figures/fig1_schematic.png" id="22" name="Picture"/>
+                          <pic:cNvPr descr="figures/fig1_schematic.png" id="23" name="Picture"/>
                           <pic:cNvPicPr>
                             <a:picLocks noChangeArrowheads="1" noChangeAspect="1"/>
                           </pic:cNvPicPr>
                         </pic:nvPicPr>
                         <pic:blipFill>
-                          <a:blip r:embed="rId20"/>
+                          <a:blip r:embed="rId21"/>
                           <a:stretch>
                             <a:fillRect/>
                           </a:stretch>
@@ -185,12 +255,12 @@
               <w:t xml:space="preserve">.</w:t>
             </w:r>
           </w:p>
-          <w:bookmarkEnd w:id="23"/>
+          <w:bookmarkEnd w:id="24"/>
         </w:tc>
       </w:tr>
     </w:tbl>
-    <w:bookmarkEnd w:id="24"/>
-    <w:bookmarkStart w:id="25" w:name="tree-shapes"/>
+    <w:bookmarkEnd w:id="25"/>
+    <w:bookmarkStart w:id="26" w:name="tree-shapes"/>
     <w:p>
       <w:pPr>
         <w:pStyle w:val="Heading2"/>
@@ -338,8 +408,8 @@
         <w:t xml:space="preserve">of its cell, so that the scenarios were paired by tree.</w:t>
       </w:r>
     </w:p>
-    <w:bookmarkEnd w:id="25"/>
-    <w:bookmarkStart w:id="26" w:name="layer-a-static-metacommunities"/>
+    <w:bookmarkEnd w:id="26"/>
+    <w:bookmarkStart w:id="27" w:name="layer-a-static-metacommunities"/>
     <w:p>
       <w:pPr>
         <w:pStyle w:val="Heading2"/>
@@ -698,8 +768,8 @@
         <w:t xml:space="preserve">could carry phylogenetic signal, with the same marginal distribution as without signal, so that the two cases differed only in how the values were arranged on the tree (Appendix S1). We removed empty sites and pruned absent species from the tree before analysis, as one would with real data, and analysed both incidence and abundance data.</w:t>
       </w:r>
     </w:p>
-    <w:bookmarkEnd w:id="26"/>
-    <w:bookmarkStart w:id="27" w:name="layer-b-process-based-metacommunities"/>
+    <w:bookmarkEnd w:id="27"/>
+    <w:bookmarkStart w:id="28" w:name="layer-b-process-based-metacommunities"/>
     <w:p>
       <w:pPr>
         <w:pStyle w:val="Heading2"/>
@@ -881,8 +951,8 @@
         <w:t xml:space="preserve">) in mass effects, and competition was either intraspecific only or also interspecific and structured by phylogeny, so that close relatives competed more strongly. Since competition and dispersal remove species, the cell of the grid defined the tree of the regional pool rather than the tree of the analysed metacommunity, and we calibrated the size of the pool so that the mean number of species left after the dynamics was close to N. Mass effects with phylogenetic competition could not reach N = 200, and we dropped this combination. Layer B used five cells of the grid (the four corners and the centre) and 1,000 replicates per combination.</w:t>
       </w:r>
     </w:p>
-    <w:bookmarkEnd w:id="27"/>
-    <w:bookmarkStart w:id="29" w:name="scenarios-and-estimands"/>
+    <w:bookmarkEnd w:id="28"/>
+    <w:bookmarkStart w:id="30" w:name="scenarios-and-estimands"/>
     <w:p>
       <w:pPr>
         <w:pStyle w:val="Heading2"/>
@@ -923,7 +993,7 @@
       <w:tr>
         <w:tc>
           <w:tcPr/>
-          <w:bookmarkStart w:id="28" w:name="tbl-scenarios"/>
+          <w:bookmarkStart w:id="29" w:name="tbl-scenarios"/>
           <w:p>
             <w:pPr>
               <w:jc w:val="center"/>
@@ -1513,13 +1583,13 @@
               </w:tc>
             </w:tr>
           </w:tbl>
-          <w:bookmarkEnd w:id="28"/>
+          <w:bookmarkEnd w:id="29"/>
           <w:p/>
         </w:tc>
       </w:tr>
     </w:tbl>
-    <w:bookmarkEnd w:id="29"/>
-    <w:bookmarkStart w:id="30" w:name="methods-compared"/>
+    <w:bookmarkEnd w:id="30"/>
+    <w:bookmarkStart w:id="31" w:name="methods-compared"/>
     <w:p>
       <w:pPr>
         <w:pStyle w:val="Heading2"/>
@@ -1652,8 +1722,8 @@
         <w:t xml:space="preserve">(RDA PCPS). We re-implemented the phylogenetic community composition approach (PCC) of Peres-Neto and Kembel (2015) from the equations in the original article, using the variance of the adjusted R² across phylogenetic eigenvectors as the test statistic. Every test was evaluated with 999 permutations under two null models, the site shuffle, which permutes the sites, and the taxa shuffle, which permutes the tips of the tree while keeping its topology. We report the largest of the two P-values (max test), which controls the type I error when either null hypothesis holds (Peres-Neto &amp; Kembel, 2015; Duarte et al., 2016). The observed statistics of our permutation code equal those of the R packages vegan v. 2.7-6 (Oksanen et al., 2026) and PCPS v. 1.0.9 (Debastiani, 2026), which we checked in unit tests.</w:t>
       </w:r>
     </w:p>
-    <w:bookmarkEnd w:id="30"/>
-    <w:bookmarkStart w:id="31" w:name="recovery-of-a-planted-clade"/>
+    <w:bookmarkEnd w:id="31"/>
+    <w:bookmarkStart w:id="32" w:name="recovery-of-a-planted-clade"/>
     <w:p>
       <w:pPr>
         <w:pStyle w:val="Heading2"/>
@@ -1855,8 +1925,8 @@
         <w:t xml:space="preserve">among the first four, and for phylofactorization the objective of the algorithm (Appendix S1). A method recovered the clade when its best-scoring clade was the planted one or its complement. As complementary measures, which give partial credit to a method that chooses a nested or a slightly larger clade, we recorded the rank of the planted node among all nodes and the Jaccard similarity between the best-scoring and the planted clades.</w:t>
       </w:r>
     </w:p>
-    <w:bookmarkEnd w:id="31"/>
-    <w:bookmarkStart w:id="32" w:name="X53da85fff317b1dec52893db24bd78d79ba735e"/>
+    <w:bookmarkEnd w:id="32"/>
+    <w:bookmarkStart w:id="33" w:name="X53da85fff317b1dec52893db24bd78d79ba735e"/>
     <w:p>
       <w:pPr>
         <w:pStyle w:val="Heading2"/>
@@ -2044,8 +2114,8 @@
         <w:t xml:space="preserve">, the bulk and tail effective sample sizes and the numbers of divergent transitions and of transitions at the maximum tree depth, and model fit with posterior predictive checks. We summarize the results as posterior rates and contrasts between tree shapes or archetypes, with medians and 95% credible intervals (CI), and report the raw rates where they exceed the modelled ones.</w:t>
       </w:r>
     </w:p>
-    <w:bookmarkEnd w:id="32"/>
-    <w:bookmarkStart w:id="33" w:name="empirical-reference-and-case-study"/>
+    <w:bookmarkEnd w:id="33"/>
+    <w:bookmarkStart w:id="34" w:name="empirical-reference-and-case-study"/>
     <w:p>
       <w:pPr>
         <w:pStyle w:val="Heading2"/>
@@ -2062,8 +2132,8 @@
         <w:t xml:space="preserve">To show where real regional species pools fall in the grid of tree shapes, and how the methods behave with real data, we used 14 tadpole metacommunities compiled from the literature and from unpublished data (Box 1). We harmonized species names with the Amphibian Species of the World (Frost, 2026; through the internal dataset of AmphiNom, updated on 16 October 2025) using the R package AmphiNom v. 1.1.0 (Liedtke, 2019), excluded undetermined taxa, and matched the remaining 123 species to the tips of the Portik et al. (2023) tree. We built three nested pools (Atlantic Forest; Atlantic Forest and interior of São Paulo; all South American metacommunities) pruned the tree to each, and computed γ and the normalized Colless index on the point-estimate tree and on its 100 time-calibrated bootstrap trees. For the case study, we used the metacommunities with at least 10 ponds and pond depth measured in every pond, namely two of the 14 and one additional published dataset: Serra da Bocaina (13 ponds; Provete et al., 2014), southern Brazil (32 ponds; Both et al., 2011) and northwestern São Paulo (40 ponds; Prado &amp; Rossa-Feres, 2014). We applied all tests and the four clade-scoring methods to incidence data with pond depth as the gradient, and also with canopy cover in Bocaina, the variable associated with its phylogenetic composition in a previous analysis with PCPS (Provete, 2018).</w:t>
       </w:r>
     </w:p>
-    <w:bookmarkEnd w:id="33"/>
-    <w:bookmarkStart w:id="34" w:name="implementation-and-reproducibility"/>
+    <w:bookmarkEnd w:id="34"/>
+    <w:bookmarkStart w:id="35" w:name="implementation-and-reproducibility"/>
     <w:p>
       <w:pPr>
         <w:pStyle w:val="Heading2"/>
@@ -2077,12 +2147,12 @@
         <w:pStyle w:val="FirstParagraph"/>
       </w:pPr>
       <w:r>
-        <w:t xml:space="preserve">We ran all analyses in R v. 4.6.1 (R Core Team, 2026), with the versions of every package recorded in the lockfile of renv v. 1.3.1 (Ushey &amp; Wickham, 2026); trees were handled with ape v. 5.8-1 (Paradis &amp; Schliep, 2019). We orchestrated the simulations with targets v. 1.12.0 (Landau, 2021) and crew v. 1.3.3 (Landau, 2026) in a Docker image, with seeds derived from a single pipeline seed (Appendix S1). Code is available at [CITAR: GitHub repository and Zenodo DOI], together with the rates aggregated by condition and the scripts that compute the performance measures and the models from them, which reproduce every table and figure without rerunning the simulations.</w:t>
-      </w:r>
-    </w:p>
-    <w:bookmarkEnd w:id="34"/>
+        <w:t xml:space="preserve">We ran all analyses in R v. 4.6.1 (R Core Team, 2026), with the versions of every package recorded in the lockfile of renv v. 1.3.1 (Ushey &amp; Wickham, 2026); trees were handled with ape v. 5.8-1 (Paradis &amp; Schliep, 2019). We orchestrated the simulations with targets v. 1.12.0 (Landau, 2021) and crew v. 1.3.3 (Landau, 2026) in a Docker image, with seeds derived from a single pipeline seed (Appendix S1). Code is available at https://github.com/diogoprov/pcps-sim (archived at Zenodo, [CITAR: Zenodo DOI]), together with the rates aggregated by condition and the scripts that compute the performance measures and the models from them, which reproduce every table and figure without rerunning the simulations.</w:t>
+      </w:r>
+    </w:p>
     <w:bookmarkEnd w:id="35"/>
-    <w:bookmarkStart w:id="52" w:name="results"/>
+    <w:bookmarkEnd w:id="36"/>
+    <w:bookmarkStart w:id="53" w:name="results"/>
     <w:p>
       <w:pPr>
         <w:pStyle w:val="Heading1"/>
@@ -2168,7 +2238,7 @@
       <w:tr>
         <w:tc>
           <w:tcPr/>
-          <w:bookmarkStart w:id="39" w:name="fig-type1"/>
+          <w:bookmarkStart w:id="40" w:name="fig-type1"/>
           <w:p>
             <w:pPr>
               <w:pStyle w:val="Compact"/>
@@ -2179,18 +2249,18 @@
                 <wp:inline>
                   <wp:extent cx="5753100" cy="4738352"/>
                   <wp:effectExtent b="0" l="0" r="0" t="0"/>
-                  <wp:docPr descr="" title="" id="37" name="Picture"/>
+                  <wp:docPr descr="" title="" id="38" name="Picture"/>
                   <a:graphic>
                     <a:graphicData uri="http://schemas.openxmlformats.org/drawingml/2006/picture">
                       <pic:pic>
                         <pic:nvPicPr>
-                          <pic:cNvPr descr="figures/fig2_type1.png" id="38" name="Picture"/>
+                          <pic:cNvPr descr="figures/fig2_type1.png" id="39" name="Picture"/>
                           <pic:cNvPicPr>
                             <a:picLocks noChangeArrowheads="1" noChangeAspect="1"/>
                           </pic:cNvPicPr>
                         </pic:nvPicPr>
                         <pic:blipFill>
-                          <a:blip r:embed="rId36"/>
+                          <a:blip r:embed="rId37"/>
                           <a:stretch>
                             <a:fillRect/>
                           </a:stretch>
@@ -2230,7 +2300,7 @@
               <w:t xml:space="preserve">Figure 2: Type I error of each test over the γ × Colless grid at N = 100 with incidence data (posterior medians of the beta-binomial model). Notice that rows S0 to S2h are almost uniform across the grid, whereas GLM PCPS2 doubles its rejection rate in the low-γ cells of S2σ.</w:t>
             </w:r>
           </w:p>
-          <w:bookmarkEnd w:id="39"/>
+          <w:bookmarkEnd w:id="40"/>
         </w:tc>
       </w:tr>
     </w:tbl>
@@ -2266,7 +2336,7 @@
       <w:tr>
         <w:tc>
           <w:tcPr/>
-          <w:bookmarkStart w:id="43" w:name="fig-power"/>
+          <w:bookmarkStart w:id="44" w:name="fig-power"/>
           <w:p>
             <w:pPr>
               <w:pStyle w:val="Compact"/>
@@ -2277,18 +2347,18 @@
                 <wp:inline>
                   <wp:extent cx="5753100" cy="3044241"/>
                   <wp:effectExtent b="0" l="0" r="0" t="0"/>
-                  <wp:docPr descr="" title="" id="41" name="Picture"/>
+                  <wp:docPr descr="" title="" id="42" name="Picture"/>
                   <a:graphic>
                     <a:graphicData uri="http://schemas.openxmlformats.org/drawingml/2006/picture">
                       <pic:pic>
                         <pic:nvPicPr>
-                          <pic:cNvPr descr="figures/fig3_power.png" id="42" name="Picture"/>
+                          <pic:cNvPr descr="figures/fig3_power.png" id="43" name="Picture"/>
                           <pic:cNvPicPr>
                             <a:picLocks noChangeArrowheads="1" noChangeAspect="1"/>
                           </pic:cNvPicPr>
                         </pic:nvPicPr>
                         <pic:blipFill>
-                          <a:blip r:embed="rId40"/>
+                          <a:blip r:embed="rId41"/>
                           <a:stretch>
                             <a:fillRect/>
                           </a:stretch>
@@ -2328,7 +2398,7 @@
               <w:t xml:space="preserve">Figure 3: Power of each test over the γ × Colless grid at N = 100 with incidence data (posterior medians). Notice that the low-γ rows lose power in GLM PCPS1 and PCC, whereas PERMANOVA keeps a similar power in every cell.</w:t>
             </w:r>
           </w:p>
-          <w:bookmarkEnd w:id="43"/>
+          <w:bookmarkEnd w:id="44"/>
         </w:tc>
       </w:tr>
     </w:tbl>
@@ -2364,7 +2434,7 @@
       <w:tr>
         <w:tc>
           <w:tcPr/>
-          <w:bookmarkStart w:id="47" w:name="fig-layerB"/>
+          <w:bookmarkStart w:id="48" w:name="fig-layerB"/>
           <w:p>
             <w:pPr>
               <w:pStyle w:val="Compact"/>
@@ -2375,18 +2445,18 @@
                 <wp:inline>
                   <wp:extent cx="5753100" cy="3723605"/>
                   <wp:effectExtent b="0" l="0" r="0" t="0"/>
-                  <wp:docPr descr="" title="" id="45" name="Picture"/>
+                  <wp:docPr descr="" title="" id="46" name="Picture"/>
                   <a:graphic>
                     <a:graphicData uri="http://schemas.openxmlformats.org/drawingml/2006/picture">
                       <pic:pic>
                         <pic:nvPicPr>
-                          <pic:cNvPr descr="figures/fig4_layerB_power.png" id="46" name="Picture"/>
+                          <pic:cNvPr descr="figures/fig4_layerB_power.png" id="47" name="Picture"/>
                           <pic:cNvPicPr>
                             <a:picLocks noChangeArrowheads="1" noChangeAspect="1"/>
                           </pic:cNvPicPr>
                         </pic:nvPicPr>
                         <pic:blipFill>
-                          <a:blip r:embed="rId44"/>
+                          <a:blip r:embed="rId45"/>
                           <a:stretch>
                             <a:fillRect/>
                           </a:stretch>
@@ -2426,7 +2496,7 @@
               <w:t xml:space="preserve">Figure 4: Power in Layer B by assembly archetype and pool tree cell at N = 100 (posterior medians and 95% credible intervals). Notice that mass effects (orange) lower the power of every test except GLM PCPS2 and almost abolish that of the PCC, and that phylogenetic competition under mass effects (pink) recovers part of the power lost.</w:t>
             </w:r>
           </w:p>
-          <w:bookmarkEnd w:id="47"/>
+          <w:bookmarkEnd w:id="48"/>
         </w:tc>
       </w:tr>
     </w:tbl>
@@ -2470,7 +2540,7 @@
       <w:tr>
         <w:tc>
           <w:tcPr/>
-          <w:bookmarkStart w:id="51" w:name="fig-clade"/>
+          <w:bookmarkStart w:id="52" w:name="fig-clade"/>
           <w:p>
             <w:pPr>
               <w:pStyle w:val="Compact"/>
@@ -2481,18 +2551,18 @@
                 <wp:inline>
                   <wp:extent cx="5416061" cy="2886935"/>
                   <wp:effectExtent b="0" l="0" r="0" t="0"/>
-                  <wp:docPr descr="" title="" id="49" name="Picture"/>
+                  <wp:docPr descr="" title="" id="50" name="Picture"/>
                   <a:graphic>
                     <a:graphicData uri="http://schemas.openxmlformats.org/drawingml/2006/picture">
                       <pic:pic>
                         <pic:nvPicPr>
-                          <pic:cNvPr descr="figures/fig5_clade.png" id="50" name="Picture"/>
+                          <pic:cNvPr descr="figures/fig5_clade.png" id="51" name="Picture"/>
                           <pic:cNvPicPr>
                             <a:picLocks noChangeArrowheads="1" noChangeAspect="1"/>
                           </pic:cNvPicPr>
                         </pic:nvPicPr>
                         <pic:blipFill>
-                          <a:blip r:embed="rId48"/>
+                          <a:blip r:embed="rId49"/>
                           <a:stretch>
                             <a:fillRect/>
                           </a:stretch>
@@ -2532,12 +2602,12 @@
               <w:t xml:space="preserve">Figure 5: Probability of recovering the planted clade over the γ × Colless grid at N = 100, incidence data and a shift of 2 (posterior medians), for basal (old) and recent (young) clades. Notice that PCPS gains markedly with low γ and PCC changes in opposite directions for basal and recent clades, whereas evoPCA and phylofactorization recover the clade at a similar rate in every cell.</w:t>
             </w:r>
           </w:p>
-          <w:bookmarkEnd w:id="51"/>
+          <w:bookmarkEnd w:id="52"/>
         </w:tc>
       </w:tr>
     </w:tbl>
-    <w:bookmarkEnd w:id="52"/>
-    <w:bookmarkStart w:id="57" w:name="Xada27c83b7f8db009b1df1795077522469ebf9f"/>
+    <w:bookmarkEnd w:id="53"/>
+    <w:bookmarkStart w:id="58" w:name="Xada27c83b7f8db009b1df1795077522469ebf9f"/>
     <w:p>
       <w:pPr>
         <w:pStyle w:val="Heading1"/>
@@ -2586,7 +2656,7 @@
       <w:tr>
         <w:tc>
           <w:tcPr/>
-          <w:bookmarkStart w:id="56" w:name="fig-box1"/>
+          <w:bookmarkStart w:id="57" w:name="fig-box1"/>
           <w:p>
             <w:pPr>
               <w:pStyle w:val="Compact"/>
@@ -2597,18 +2667,18 @@
                 <wp:inline>
                   <wp:extent cx="4890135" cy="3261010"/>
                   <wp:effectExtent b="0" l="0" r="0" t="0"/>
-                  <wp:docPr descr="" title="" id="54" name="Picture"/>
+                  <wp:docPr descr="" title="" id="55" name="Picture"/>
                   <a:graphic>
                     <a:graphicData uri="http://schemas.openxmlformats.org/drawingml/2006/picture">
                       <pic:pic>
                         <pic:nvPicPr>
-                          <pic:cNvPr descr="figures/box1_pools.png" id="55" name="Picture"/>
+                          <pic:cNvPr descr="figures/box1_pools.png" id="56" name="Picture"/>
                           <pic:cNvPicPr>
                             <a:picLocks noChangeArrowheads="1" noChangeAspect="1"/>
                           </pic:cNvPicPr>
                         </pic:nvPicPr>
                         <pic:blipFill>
-                          <a:blip r:embed="rId53"/>
+                          <a:blip r:embed="rId54"/>
                           <a:stretch>
                             <a:fillRect/>
                           </a:stretch>
@@ -2648,12 +2718,12 @@
               <w:t xml:space="preserve">Figure 6: Tree shape of three nested regional pools of anurans (filled points and bars, median and 2.5–97.5% quantiles across 100 bootstrap trees; open diamonds, point-estimate tree) against the targets of the simulation grid (open symbols, by N) and the anuran clades with 40–250 tips of Portik et al. (2023) (grey points). Notice that the pools fall inside the grid and close to its Yule and median levels, and that the point-estimate tree has a lower γ than most bootstrap trees.</w:t>
             </w:r>
           </w:p>
-          <w:bookmarkEnd w:id="56"/>
+          <w:bookmarkEnd w:id="57"/>
         </w:tc>
       </w:tr>
     </w:tbl>
-    <w:bookmarkEnd w:id="57"/>
-    <w:bookmarkStart w:id="58" w:name="references-verified"/>
+    <w:bookmarkEnd w:id="58"/>
+    <w:bookmarkStart w:id="59" w:name="references-verified"/>
     <w:p>
       <w:pPr>
         <w:pStyle w:val="Heading1"/>
@@ -3377,7 +3447,7 @@
         <w:t xml:space="preserve">, 15, 1926–1939. https://doi.org/10.1111/2041-210X.14415</w:t>
       </w:r>
     </w:p>
-    <w:bookmarkEnd w:id="58"/>
+    <w:bookmarkEnd w:id="59"/>
     <w:sectPr>
       <w:footerReference r:id="rId9" w:type="default"/>
       <w:footnotePr>
@@ -3517,8 +3587,123 @@
       </w:pPr>
     </w:lvl>
   </w:abstractNum>
+  <w:abstractNum w:abstractNumId="99411">
+    <w:nsid w:val="00A99411"/>
+    <w:multiLevelType w:val="multilevel"/>
+    <w:lvl w:ilvl="0">
+      <w:start w:val="1"/>
+      <w:numFmt w:val="decimal"/>
+      <w:lvlText w:val="%1."/>
+      <w:lvlJc w:val="left"/>
+      <w:pPr>
+        <w:ind w:left="720" w:hanging="360"/>
+      </w:pPr>
+    </w:lvl>
+    <w:lvl w:ilvl="1">
+      <w:start w:val="1"/>
+      <w:numFmt w:val="decimal"/>
+      <w:lvlText w:val="%2."/>
+      <w:lvlJc w:val="left"/>
+      <w:pPr>
+        <w:ind w:left="1440" w:hanging="360"/>
+      </w:pPr>
+    </w:lvl>
+    <w:lvl w:ilvl="2">
+      <w:start w:val="1"/>
+      <w:numFmt w:val="decimal"/>
+      <w:lvlText w:val="%3."/>
+      <w:lvlJc w:val="left"/>
+      <w:pPr>
+        <w:ind w:left="2160" w:hanging="360"/>
+      </w:pPr>
+    </w:lvl>
+    <w:lvl w:ilvl="3">
+      <w:start w:val="1"/>
+      <w:numFmt w:val="decimal"/>
+      <w:lvlText w:val="%4."/>
+      <w:lvlJc w:val="left"/>
+      <w:pPr>
+        <w:ind w:left="2880" w:hanging="360"/>
+      </w:pPr>
+    </w:lvl>
+    <w:lvl w:ilvl="4">
+      <w:start w:val="1"/>
+      <w:numFmt w:val="decimal"/>
+      <w:lvlText w:val="%5."/>
+      <w:lvlJc w:val="left"/>
+      <w:pPr>
+        <w:ind w:left="3600" w:hanging="360"/>
+      </w:pPr>
+    </w:lvl>
+    <w:lvl w:ilvl="5">
+      <w:start w:val="1"/>
+      <w:numFmt w:val="decimal"/>
+      <w:lvlText w:val="%6."/>
+      <w:lvlJc w:val="left"/>
+      <w:pPr>
+        <w:ind w:left="4320" w:hanging="360"/>
+      </w:pPr>
+    </w:lvl>
+    <w:lvl w:ilvl="6">
+      <w:start w:val="1"/>
+      <w:numFmt w:val="decimal"/>
+      <w:lvlText w:val="%7."/>
+      <w:lvlJc w:val="left"/>
+      <w:pPr>
+        <w:ind w:left="5040" w:hanging="360"/>
+      </w:pPr>
+    </w:lvl>
+    <w:lvl w:ilvl="7">
+      <w:start w:val="1"/>
+      <w:numFmt w:val="decimal"/>
+      <w:lvlText w:val="%8."/>
+      <w:lvlJc w:val="left"/>
+      <w:pPr>
+        <w:ind w:left="5760" w:hanging="360"/>
+      </w:pPr>
+    </w:lvl>
+    <w:lvl w:ilvl="8">
+      <w:start w:val="1"/>
+      <w:numFmt w:val="decimal"/>
+      <w:lvlText w:val="%9."/>
+      <w:lvlJc w:val="left"/>
+      <w:pPr>
+        <w:ind w:left="6480" w:hanging="360"/>
+      </w:pPr>
+    </w:lvl>
+  </w:abstractNum>
   <w:num w:numId="1000">
     <w:abstractNumId w:val="990"/>
+  </w:num>
+  <w:num w:numId="1001">
+    <w:abstractNumId w:val="99411"/>
+    <w:lvlOverride w:ilvl="0">
+      <w:startOverride w:val="1"/>
+    </w:lvlOverride>
+    <w:lvlOverride w:ilvl="1">
+      <w:startOverride w:val="1"/>
+    </w:lvlOverride>
+    <w:lvlOverride w:ilvl="2">
+      <w:startOverride w:val="1"/>
+    </w:lvlOverride>
+    <w:lvlOverride w:ilvl="3">
+      <w:startOverride w:val="1"/>
+    </w:lvlOverride>
+    <w:lvlOverride w:ilvl="4">
+      <w:startOverride w:val="1"/>
+    </w:lvlOverride>
+    <w:lvlOverride w:ilvl="5">
+      <w:startOverride w:val="1"/>
+    </w:lvlOverride>
+    <w:lvlOverride w:ilvl="6">
+      <w:startOverride w:val="1"/>
+    </w:lvlOverride>
+    <w:lvlOverride w:ilvl="7">
+      <w:startOverride w:val="1"/>
+    </w:lvlOverride>
+    <w:lvlOverride w:ilvl="8">
+      <w:startOverride w:val="1"/>
+    </w:lvlOverride>
   </w:num>
 </w:numbering>
 </file>

</xml_diff>

<commit_message>
Folha de rosto com DOIs do Zenodo (v0.1.0) e cópia anonimizada para revisão
Co-Authored-By: Claude Opus 5.5 <noreply@anthropic.com>
</commit_message>
<xml_diff>
--- a/manuscript/methods_results.docx
+++ b/manuscript/methods_results.docx
@@ -92,7 +92,7 @@
         <w:pStyle w:val="FirstParagraph"/>
       </w:pPr>
       <w:r>
-        <w:t xml:space="preserve">Data and code availability for review: the code, the rates aggregated by condition and the scripts that reproduce every table and figure are available at https://github.com/diogoprov/pcps-sim (archived at Zenodo, [CITAR: Zenodo DOI]).</w:t>
+        <w:t xml:space="preserve">Data and code availability for review: the code, the rates aggregated by condition and the scripts that reproduce every table and figure are provided as an anonymized zip file with this submission; the public repository and its Zenodo archive will be cited after review.</w:t>
       </w:r>
     </w:p>
     <w:p>
@@ -2147,7 +2147,7 @@
         <w:pStyle w:val="FirstParagraph"/>
       </w:pPr>
       <w:r>
-        <w:t xml:space="preserve">We ran all analyses in R v. 4.6.1 (R Core Team, 2026), with the versions of every package recorded in the lockfile of renv v. 1.3.1 (Ushey &amp; Wickham, 2026); trees were handled with ape v. 5.8-1 (Paradis &amp; Schliep, 2019). We orchestrated the simulations with targets v. 1.12.0 (Landau, 2021) and crew v. 1.3.3 (Landau, 2026) in a Docker image, with seeds derived from a single pipeline seed (Appendix S1). Code is available at https://github.com/diogoprov/pcps-sim (archived at Zenodo, [CITAR: Zenodo DOI]), together with the rates aggregated by condition and the scripts that compute the performance measures and the models from them, which reproduce every table and figure without rerunning the simulations.</w:t>
+        <w:t xml:space="preserve">We ran all analyses in R v. 4.6.1 (R Core Team, 2026), with the versions of every package recorded in the lockfile of renv v. 1.3.1 (Ushey &amp; Wickham, 2026); trees were handled with ape v. 5.8-1 (Paradis &amp; Schliep, 2019). We orchestrated the simulations with targets v. 1.12.0 (Landau, 2021) and crew v. 1.3.3 (Landau, 2026) in a Docker image, with seeds derived from a single pipeline seed (Appendix S1). Code is available in the anonymized archive that accompanies this submission (Data Availability Statement), together with the rates aggregated by condition and the scripts that compute the performance measures and the models from them, which reproduce every table and figure without rerunning the simulations.</w:t>
       </w:r>
     </w:p>
     <w:bookmarkEnd w:id="35"/>

</xml_diff>

<commit_message>
Discussion redigida com revisão de literatura verificada (docs/lit_review)
Co-Authored-By: Claude Opus 5.5 <noreply@anthropic.com>
</commit_message>
<xml_diff>
--- a/manuscript/methods_results.docx
+++ b/manuscript/methods_results.docx
@@ -15,7 +15,7 @@
         <w:pStyle w:val="Subtitle"/>
       </w:pPr>
       <w:r>
-        <w:t xml:space="preserve">Abstract, Methods and Results (draft)</w:t>
+        <w:t xml:space="preserve">Abstract, Methods, Results and Discussion (draft)</w:t>
       </w:r>
     </w:p>
     <w:p>
@@ -2723,12 +2723,129 @@
       </w:tr>
     </w:tbl>
     <w:bookmarkEnd w:id="58"/>
-    <w:bookmarkStart w:id="59" w:name="references-verified"/>
+    <w:bookmarkStart w:id="59" w:name="discussion"/>
     <w:p>
       <w:pPr>
         <w:pStyle w:val="Heading1"/>
       </w:pPr>
       <w:r>
+        <w:t xml:space="preserve">Discussion</w:t>
+      </w:r>
+    </w:p>
+    <w:p>
+      <w:pPr>
+        <w:pStyle w:val="FirstParagraph"/>
+      </w:pPr>
+      <w:r>
+        <w:t xml:space="preserve">The shape of the phylogenetic tree and the process that assembles a metacommunity changed the performance of every method we evaluated, but not in the way we expected. The distribution of branching times, rather than the imbalance of the topology, governed both the power of the tests and the recovery of clades, and a phylogenetically conserved niche breadth inflated the type I error of only the two methods that rely on single phylogenetic axes. Mass effects reduced the power of all tests more than any tree shape did. To the best of our knowledge, this is the first simulation study that evaluates tests on phylogeny-weighted species composition across controlled gradients of branching times and imbalance, with both static and process-based metacommunities, and that compares them with branch-wise methods in their ability to locate the clade associated with an environmental gradient. In the following paragraphs, we discuss each of these results and their consequences for empirical studies.</w:t>
+      </w:r>
+    </w:p>
+    <w:p>
+      <w:pPr>
+        <w:pStyle w:val="BodyText"/>
+      </w:pPr>
+      <w:r>
+        <w:t xml:space="preserve">Tree imbalance did not affect the type I error of any test, whereas very negative γ reduced the power of the GLM on the first PCPS axis and of the PCC. This agrees with a general pattern in phylogenetic comparative methods, in which permutation tests keep the nominal level across topologies and the properties of the tree change mainly their power (Blomberg et al., 2003; Münkemüller et al., 2012). Accordingly, in an empirical case study, the bias of the net relatedness index caused by poor phylogenetic resolution depended on tree shape and consisted mostly of type II errors (Molina-Venegas &amp; Roquet, 2014), and metrics such as the mean pairwise distance, which weight deep branches, respond to the stemminess of the tree (Mazel et al., 2016). The loss of power with low γ seems to follow from how phylogenetic eigenvectors summarize trees with long internal branches near the root. The eigenstructure of a phylogenetic matrix is set by the tree (Diniz-Filho et al., 1998), and in such trees a few deep splits probably dominate it, so the first PCPS axis and the leading eigenvectors of the PCC probably capture the deepest dichotomy even when the gradient sorts species along another one. In contrast, PERMANOVA uses the whole matrix</w:t>
+      </w:r>
+      <w:r>
+        <w:t xml:space="preserve"> </w:t>
+      </w:r>
+      <m:oMath>
+        <m:r>
+          <m:rPr>
+            <m:sty m:val="b"/>
+          </m:rPr>
+          <m:t>P</m:t>
+        </m:r>
+      </m:oMath>
+      <w:r>
+        <w:t xml:space="preserve"> </w:t>
+      </w:r>
+      <w:r>
+        <w:t xml:space="preserve">and was much less sensitive to γ. However, we did not record the eigenvalue spectra or the axis loadings of each replicate, so we cannot confirm this mechanism with our data. Taken together, single-axis tests on phylogenetic eigenvectors seem to be fragile whenever the phylogenetic structure is spread over several axes, as already argued for the selection of eigenvectors in comparative analyses (Diniz-Filho et al., 2012).</w:t>
+      </w:r>
+    </w:p>
+    <w:p>
+      <w:pPr>
+        <w:pStyle w:val="BodyText"/>
+      </w:pPr>
+      <w:r>
+        <w:t xml:space="preserve">Phylogenetic signal in niche breadth created false positives that previous evaluations could not detect. The simulations of Duarte et al. (2016, 2018) and Peres-Neto et al. (2017) drew niche breadth and maximum abundance independently of the phylogeny, so their type I errors refer to a null hypothesis in which these nuisance parameters carry no phylogenetic signal. When σ is conserved, clades differ in how widely they spread along the gradient, which is a phylogenetic pattern in composition that is unrelated to the association between optima and environment. Permutation tests become liberal when the randomization breaks down a structure of the data that is unrelated to the null hypothesis (Hardy, 2008), and species-level variation in the response to the environment that is ignored by the test inflates the type I error of trait–environment analyses (ter Braak et al., 2017). This seems to explain why the second PCPS axis, which is orthogonal to the basal contrast captured by the first one, and the PCC were inflated, whereas PERMANOVA and the Mantel test, which average over all axes of</w:t>
+      </w:r>
+      <w:r>
+        <w:t xml:space="preserve"> </w:t>
+      </w:r>
+      <m:oMath>
+        <m:sSub>
+          <m:e>
+            <m:r>
+              <m:t>D</m:t>
+            </m:r>
+          </m:e>
+          <m:sub>
+            <m:r>
+              <m:t>P</m:t>
+            </m:r>
+          </m:sub>
+        </m:sSub>
+      </m:oMath>
+      <w:r>
+        <w:t xml:space="preserve">, were not. Interestingly, the largest inflation occurred in trees with low γ and at N = 200, which suggests that both the depth of the conserved structure and the number of species determine how much of it reaches a single axis. In addition, the more conservative behaviour of the other tests under signal in σ agrees with the conservative max test already reported for phylogenetic fuzzy weighting (Duarte et al., 2016). Unfortunately, the empirical distribution of phylogenetic signal in niche breadth is unknown for most groups, so we cannot say how often this situation arises in real metacommunities. Constrained randomizations that preserve phylogenetic structure, such as Moran spectral randomization (Braga et al., 2018), and model-based tests with phylogenetic random effects (Li &amp; Ives, 2017; Tsang &amp; Cadotte, 2025) seem to be promising alternatives to the taxa shuffle in this case.</w:t>
+      </w:r>
+    </w:p>
+    <w:p>
+      <w:pPr>
+        <w:pStyle w:val="BodyText"/>
+      </w:pPr>
+      <w:r>
+        <w:t xml:space="preserve">The assembly process mattered more than tree shape. Mass effects reduced the power of every test except GLM PCPS2 and almost abolished that of the PCC. This is expected from the theory of source–sink metacommunities, in which high dispersal homogenizes composition among sites and erodes β-diversity (Mouquet &amp; Loreau, 2003; Thompson et al., 2020), and it agrees with the low power of phylogenetic diversity indices under mass effects even when traits were strongly conserved (Mason &amp; Pavoine, 2013). Our design probably represents the most extreme case, because the dispersal kernel was uniform and the sites had no spatial structure; in spatially explicit landscapes, mass effects allow species to dominate subregions instead of homogenizing the whole metacommunity (Thompson et al., 2020), which would leave more signal for the tests. Surprisingly, phylogenetic competition partly restored the power lost under mass effects. However, competition also pruned close relatives and reduced the Colless index of the analysed tree by about 75% relative to the pool, so the effect of the process cannot be separated from that of the change in the shape of the analysed tree. Moreover, our competition kernel assumed that close relatives compete more strongly, an assumption that is weakly supported empirically (Cahill et al., 2008; Godoy et al., 2014; Gerhold et al., 2015), and competition can also exclude distant relatives when fitness differences are phylogenetically conserved (Mayfield &amp; Levine, 2010). Therefore, this result should be read as an upper bound for a particular competition structure rather than as a general effect of competition. Taken together, a non-significant test in a metacommunity with high dispersal does not seem to indicate the absence of environmental filtering on lineages, in line with the warning that the interpretation of community phylogenetic tests should account for dispersal (Kembel, 2009).</w:t>
+      </w:r>
+    </w:p>
+    <w:p>
+      <w:pPr>
+        <w:pStyle w:val="BodyText"/>
+      </w:pPr>
+      <w:r>
+        <w:t xml:space="preserve">The methods that treat branches as units recovered the planted clade far more often than those based on phylogenetic eigenvectors. evoPCA ordinates the abundances of evolutionary units, so the stem branch of a clade enters the ordination as a variable (Pavoine, 2016), and phylofactorization searches explicitly for the edge that best separates clades with contrasting responses (Washburne et al., 2017, 2019). As a result, both methods evaluate every partition of the tree, and their recovery did not depend on γ. In contrast, PCPS recovers a clade only when its stem node is among those weighted by the leading axes, which depends on the distribution of node depths and seems to explain why low γ improved its recovery of both basal and recent clades. Thus, H3 was only partly supported, since the advantage of basal clades under PCPS seems to be a matter of degree. Empirical applications of PCPS have also found that environmental effects concentrate on a few deep nodes (Duarte et al., 2012), which agrees with this interpretation. The PCC was not designed to locate clades, since it tests a global association between phylogenetic eigenvectors, composition and environment (Peres-Neto &amp; Kembel, 2015), and our results confirm that its leading eigenvectors rarely isolate the clade of interest. Node-based analyses of species distributions (Borregaard et al., 2014) belong to the same family as phylofactorization and could be added to future comparisons.</w:t>
+      </w:r>
+    </w:p>
+    <w:p>
+      <w:pPr>
+        <w:pStyle w:val="BodyText"/>
+      </w:pPr>
+      <w:r>
+        <w:t xml:space="preserve">Our conclusions apply to real metacommunities, at least for anurans. Negative γ is the norm in empirical phylogenies, with slowdowns in diversification in most clades of several groups (McPeek, 2008; Phillimore &amp; Price, 2008), and the major clades of frogs diversified rapidly at the Cretaceous–Paleogene boundary (Feng et al., 2017). The three regional pools of tadpoles fell inside our grid, between its Yule and median levels of γ (Box 1). However, γ is sensitive to incomplete sampling of deep nodes (Cusimano &amp; Renner, 2010), so we used it only as a descriptor of the shape of the analysed tree, not as evidence of a diversification process. Our study also has limitations. First, the grid had no level with γ &gt; 0, which one of the three metacommunities of the case study had. Second, Layer B had no spatial structure and used only incidence data and five cells of the grid. Third, every metacommunity had 100 sites, and we did not vary the length of the gradient or the number of sites, which also change power. Finally, the case study had 13–40 ponds and no significant association, so it illustrates how the methods behave with real data rather than validating them.</w:t>
+      </w:r>
+    </w:p>
+    <w:p>
+      <w:pPr>
+        <w:pStyle w:val="BodyText"/>
+      </w:pPr>
+      <w:r>
+        <w:t xml:space="preserve">In summary, we recommend that empirical studies (i) report γ and the normalized Colless index of the analysed tree, since tree shape changes the power and the ranking of the tests; (ii) prefer tests on the whole matrix</w:t>
+      </w:r>
+      <w:r>
+        <w:t xml:space="preserve"> </w:t>
+      </w:r>
+      <m:oMath>
+        <m:r>
+          <m:rPr>
+            <m:sty m:val="b"/>
+          </m:rPr>
+          <m:t>P</m:t>
+        </m:r>
+      </m:oMath>
+      <w:r>
+        <w:t xml:space="preserve">, such as PERMANOVA with the max test, to tests on single PCPS axes or phylogenetic eigenvectors, especially in trees with very negative γ; (iii) interpret the second PCPS axis and the PCC with caution when niche breadth may be phylogenetically conserved; (iv) interpret a lack of power under high dispersal as a property of the metacommunity rather than as evidence against niche-based assembly; and (v) use evoPCA or phylofactorization, rather than PCPS axes, to identify the clades associated with a gradient. These recommendations seem to hold across the range of tree shapes found in anuran clades and in the regional pools we examined.</w:t>
+      </w:r>
+    </w:p>
+    <w:bookmarkEnd w:id="59"/>
+    <w:bookmarkStart w:id="60" w:name="references-verified"/>
+    <w:p>
+      <w:pPr>
+        <w:pStyle w:val="Heading1"/>
+      </w:pPr>
+      <w:r>
         <w:t xml:space="preserve">References (verified)</w:t>
       </w:r>
     </w:p>
@@ -2803,6 +2920,48 @@
         <w:pStyle w:val="BodyText"/>
       </w:pPr>
       <w:r>
+        <w:t xml:space="preserve">Blomberg, S. P., Garland, T., &amp; Ives, A. R. (2003). Testing for phylogenetic signal in comparative data: behavioral traits are more labile.</w:t>
+      </w:r>
+      <w:r>
+        <w:t xml:space="preserve"> </w:t>
+      </w:r>
+      <w:r>
+        <w:rPr>
+          <w:i/>
+          <w:iCs/>
+        </w:rPr>
+        <w:t xml:space="preserve">Evolution</w:t>
+      </w:r>
+      <w:r>
+        <w:t xml:space="preserve">, 57, 717–745. https://doi.org/10.1111/j.0014-3820.2003.tb00285.x</w:t>
+      </w:r>
+    </w:p>
+    <w:p>
+      <w:pPr>
+        <w:pStyle w:val="BodyText"/>
+      </w:pPr>
+      <w:r>
+        <w:t xml:space="preserve">Borregaard, M. K., Rahbek, C., Fjeldså, J., Parra, J. L., Whittaker, R. J., &amp; Graham, C. H. (2014). Node-based analysis of species distributions.</w:t>
+      </w:r>
+      <w:r>
+        <w:t xml:space="preserve"> </w:t>
+      </w:r>
+      <w:r>
+        <w:rPr>
+          <w:i/>
+          <w:iCs/>
+        </w:rPr>
+        <w:t xml:space="preserve">Methods in Ecology and Evolution</w:t>
+      </w:r>
+      <w:r>
+        <w:t xml:space="preserve">, 5, 1225–1235. https://doi.org/10.1111/2041-210X.12283</w:t>
+      </w:r>
+    </w:p>
+    <w:p>
+      <w:pPr>
+        <w:pStyle w:val="BodyText"/>
+      </w:pPr>
+      <w:r>
         <w:t xml:space="preserve">Both, C., Melo, A. S., Cechin, S. Z., &amp; Hartz, S. M. (2011). Tadpole co-occurrence in ponds: when do guilds and time matter?</w:t>
       </w:r>
       <w:r>
@@ -2824,6 +2983,27 @@
         <w:pStyle w:val="BodyText"/>
       </w:pPr>
       <w:r>
+        <w:t xml:space="preserve">ter Braak, C. J. F., Peres-Neto, P. R., &amp; Dray, S. (2017). A critical issue in model-based inference for studying trait-based community assembly and a solution.</w:t>
+      </w:r>
+      <w:r>
+        <w:t xml:space="preserve"> </w:t>
+      </w:r>
+      <w:r>
+        <w:rPr>
+          <w:i/>
+          <w:iCs/>
+        </w:rPr>
+        <w:t xml:space="preserve">PeerJ</w:t>
+      </w:r>
+      <w:r>
+        <w:t xml:space="preserve">, 5, e2885. https://doi.org/10.7717/peerj.2885</w:t>
+      </w:r>
+    </w:p>
+    <w:p>
+      <w:pPr>
+        <w:pStyle w:val="BodyText"/>
+      </w:pPr>
+      <w:r>
         <w:t xml:space="preserve">Bradley, J. V. (1978). Robustness?</w:t>
       </w:r>
       <w:r>
@@ -2845,6 +3025,27 @@
         <w:pStyle w:val="BodyText"/>
       </w:pPr>
       <w:r>
+        <w:t xml:space="preserve">Braga, J., ter Braak, C. J. F., Thuiller, W., &amp; Dray, S. (2018). Integrating spatial and phylogenetic information in the fourth-corner analysis to test trait–environment relationships.</w:t>
+      </w:r>
+      <w:r>
+        <w:t xml:space="preserve"> </w:t>
+      </w:r>
+      <w:r>
+        <w:rPr>
+          <w:i/>
+          <w:iCs/>
+        </w:rPr>
+        <w:t xml:space="preserve">Ecology</w:t>
+      </w:r>
+      <w:r>
+        <w:t xml:space="preserve">, 99, 2667–2674. https://doi.org/10.1002/ecy.2530</w:t>
+      </w:r>
+    </w:p>
+    <w:p>
+      <w:pPr>
+        <w:pStyle w:val="BodyText"/>
+      </w:pPr>
+      <w:r>
         <w:t xml:space="preserve">Bürkner, P.-C. (2017). brms: an R package for Bayesian multilevel models using Stan.</w:t>
       </w:r>
       <w:r>
@@ -2866,6 +3067,27 @@
         <w:pStyle w:val="BodyText"/>
       </w:pPr>
       <w:r>
+        <w:t xml:space="preserve">Cahill, J. F., Kembel, S. W., Lamb, E. G., &amp; Keddy, P. A. (2008). Does phylogenetic relatedness influence the strength of competition among vascular plants?</w:t>
+      </w:r>
+      <w:r>
+        <w:t xml:space="preserve"> </w:t>
+      </w:r>
+      <w:r>
+        <w:rPr>
+          <w:i/>
+          <w:iCs/>
+        </w:rPr>
+        <w:t xml:space="preserve">Perspectives in Plant Ecology, Evolution and Systematics</w:t>
+      </w:r>
+      <w:r>
+        <w:t xml:space="preserve">, 10, 41–50. https://doi.org/10.1016/j.ppees.2007.10.001</w:t>
+      </w:r>
+    </w:p>
+    <w:p>
+      <w:pPr>
+        <w:pStyle w:val="BodyText"/>
+      </w:pPr>
+      <w:r>
         <w:t xml:space="preserve">Colless, D. H. (1982). Review of Phylogenetics: the theory and practice of phylogenetic systematics.</w:t>
       </w:r>
       <w:r>
@@ -2887,6 +3109,27 @@
         <w:pStyle w:val="BodyText"/>
       </w:pPr>
       <w:r>
+        <w:t xml:space="preserve">Cusimano, N., &amp; Renner, S. S. (2010). Slowdowns in diversification rates from real phylogenies may not be real.</w:t>
+      </w:r>
+      <w:r>
+        <w:t xml:space="preserve"> </w:t>
+      </w:r>
+      <w:r>
+        <w:rPr>
+          <w:i/>
+          <w:iCs/>
+        </w:rPr>
+        <w:t xml:space="preserve">Systematic Biology</w:t>
+      </w:r>
+      <w:r>
+        <w:t xml:space="preserve">, 59, 458–464. https://doi.org/10.1093/sysbio/syq032</w:t>
+      </w:r>
+    </w:p>
+    <w:p>
+      <w:pPr>
+        <w:pStyle w:val="BodyText"/>
+      </w:pPr>
+      <w:r>
         <w:t xml:space="preserve">Debastiani, V. J. (2026). PCPS: principal coordinates of phylogenetic structure. R package version 1.0.9. doi:10.32614/CRAN.package.PCPS.</w:t>
       </w:r>
     </w:p>
@@ -2895,6 +3138,48 @@
         <w:pStyle w:val="BodyText"/>
       </w:pPr>
       <w:r>
+        <w:t xml:space="preserve">Diniz-Filho, J. A. F., Bini, L. M., Rangel, T. F., Morales-Castilla, I., Olalla-Tárraga, M. Á., Rodríguez, M. Á., &amp; Hawkins, B. A. (2012). On the selection of phylogenetic eigenvectors for ecological analyses.</w:t>
+      </w:r>
+      <w:r>
+        <w:t xml:space="preserve"> </w:t>
+      </w:r>
+      <w:r>
+        <w:rPr>
+          <w:i/>
+          <w:iCs/>
+        </w:rPr>
+        <w:t xml:space="preserve">Ecography</w:t>
+      </w:r>
+      <w:r>
+        <w:t xml:space="preserve">, 35, 239–249. https://doi.org/10.1111/j.1600-0587.2011.06949.x</w:t>
+      </w:r>
+    </w:p>
+    <w:p>
+      <w:pPr>
+        <w:pStyle w:val="BodyText"/>
+      </w:pPr>
+      <w:r>
+        <w:t xml:space="preserve">Diniz-Filho, J. A. F., de Sant’Ana, C. E. R., &amp; Bini, L. M. (1998). An eigenvector method for estimating phylogenetic inertia.</w:t>
+      </w:r>
+      <w:r>
+        <w:t xml:space="preserve"> </w:t>
+      </w:r>
+      <w:r>
+        <w:rPr>
+          <w:i/>
+          <w:iCs/>
+        </w:rPr>
+        <w:t xml:space="preserve">Evolution</w:t>
+      </w:r>
+      <w:r>
+        <w:t xml:space="preserve">, 52, 1247–1262. https://doi.org/10.1111/j.1558-5646.1998.tb02006.x</w:t>
+      </w:r>
+    </w:p>
+    <w:p>
+      <w:pPr>
+        <w:pStyle w:val="BodyText"/>
+      </w:pPr>
+      <w:r>
         <w:t xml:space="preserve">DiRenzo, G. V., Hanks, E., &amp; Miller, D. A. W. (2023). A practical guide to understanding and validating complex models using data simulations.</w:t>
       </w:r>
       <w:r>
@@ -2937,6 +3222,27 @@
         <w:pStyle w:val="BodyText"/>
       </w:pPr>
       <w:r>
+        <w:t xml:space="preserve">Duarte, L. D. S., Debastiani, V. J., Carlucci, M. B., &amp; Diniz-Filho, J. A. F. (2018). Analyzing community-weighted trait means across environmental gradients: should phylogeny stay or should it go?</w:t>
+      </w:r>
+      <w:r>
+        <w:t xml:space="preserve"> </w:t>
+      </w:r>
+      <w:r>
+        <w:rPr>
+          <w:i/>
+          <w:iCs/>
+        </w:rPr>
+        <w:t xml:space="preserve">Ecology</w:t>
+      </w:r>
+      <w:r>
+        <w:t xml:space="preserve">, 99, 385–398. https://doi.org/10.1002/ecy.2081</w:t>
+      </w:r>
+    </w:p>
+    <w:p>
+      <w:pPr>
+        <w:pStyle w:val="BodyText"/>
+      </w:pPr>
+      <w:r>
         <w:t xml:space="preserve">Duarte, L. D. S., Debastiani, V. J., Freitas, A. V. L., &amp; Pillar, V. D. (2016). Dissecting phylogenetic fuzzy weighting: theory and application in metacommunity phylogenetics.</w:t>
       </w:r>
       <w:r>
@@ -2979,6 +3285,27 @@
         <w:pStyle w:val="BodyText"/>
       </w:pPr>
       <w:r>
+        <w:t xml:space="preserve">Feng, Y.-J., Blackburn, D. C., Liang, D., Hillis, D. M., Wake, D. B., Cannatella, D. C., &amp; Zhang, P. (2017). Phylogenomics reveals rapid, simultaneous diversification of three major clades of Gondwanan frogs at the Cretaceous–Paleogene boundary.</w:t>
+      </w:r>
+      <w:r>
+        <w:t xml:space="preserve"> </w:t>
+      </w:r>
+      <w:r>
+        <w:rPr>
+          <w:i/>
+          <w:iCs/>
+        </w:rPr>
+        <w:t xml:space="preserve">Proceedings of the National Academy of Sciences</w:t>
+      </w:r>
+      <w:r>
+        <w:t xml:space="preserve">, 114, E5864–E5870. https://doi.org/10.1073/pnas.1704632114</w:t>
+      </w:r>
+    </w:p>
+    <w:p>
+      <w:pPr>
+        <w:pStyle w:val="BodyText"/>
+      </w:pPr>
+      <w:r>
         <w:t xml:space="preserve">Frost, D. R. (2026).</w:t>
       </w:r>
       <w:r>
@@ -3008,6 +3335,69 @@
         <w:pStyle w:val="BodyText"/>
       </w:pPr>
       <w:r>
+        <w:t xml:space="preserve">Gerhold, P., Cahill, J. F., Winter, M., Bartish, I. V., &amp; Prinzing, A. (2015). Phylogenetic patterns are not proxies of community assembly mechanisms (they are far better).</w:t>
+      </w:r>
+      <w:r>
+        <w:t xml:space="preserve"> </w:t>
+      </w:r>
+      <w:r>
+        <w:rPr>
+          <w:i/>
+          <w:iCs/>
+        </w:rPr>
+        <w:t xml:space="preserve">Functional Ecology</w:t>
+      </w:r>
+      <w:r>
+        <w:t xml:space="preserve">, 29, 600–614. https://doi.org/10.1111/1365-2435.12425</w:t>
+      </w:r>
+    </w:p>
+    <w:p>
+      <w:pPr>
+        <w:pStyle w:val="BodyText"/>
+      </w:pPr>
+      <w:r>
+        <w:t xml:space="preserve">Godoy, O., Kraft, N. J. B., &amp; Levine, J. M. (2014). Phylogenetic relatedness and the determinants of competitive outcomes.</w:t>
+      </w:r>
+      <w:r>
+        <w:t xml:space="preserve"> </w:t>
+      </w:r>
+      <w:r>
+        <w:rPr>
+          <w:i/>
+          <w:iCs/>
+        </w:rPr>
+        <w:t xml:space="preserve">Ecology Letters</w:t>
+      </w:r>
+      <w:r>
+        <w:t xml:space="preserve">, 17, 836–844. https://doi.org/10.1111/ele.12289</w:t>
+      </w:r>
+    </w:p>
+    <w:p>
+      <w:pPr>
+        <w:pStyle w:val="BodyText"/>
+      </w:pPr>
+      <w:r>
+        <w:t xml:space="preserve">Hardy, O. J. (2008). Testing the spatial phylogenetic structure of local communities: statistical performances of different null models and test statistics on a locally neutral community.</w:t>
+      </w:r>
+      <w:r>
+        <w:t xml:space="preserve"> </w:t>
+      </w:r>
+      <w:r>
+        <w:rPr>
+          <w:i/>
+          <w:iCs/>
+        </w:rPr>
+        <w:t xml:space="preserve">Journal of Ecology</w:t>
+      </w:r>
+      <w:r>
+        <w:t xml:space="preserve">, 96, 914–926. https://doi.org/10.1111/j.1365-2745.2008.01421.x</w:t>
+      </w:r>
+    </w:p>
+    <w:p>
+      <w:pPr>
+        <w:pStyle w:val="BodyText"/>
+      </w:pPr>
+      <w:r>
         <w:t xml:space="preserve">Janzen, T., &amp; Etienne, R. S. (2024). Phylogenetic tree statistics: a systematic overview using the new R package treestats.</w:t>
       </w:r>
       <w:r>
@@ -3029,6 +3419,27 @@
         <w:pStyle w:val="BodyText"/>
       </w:pPr>
       <w:r>
+        <w:t xml:space="preserve">Kembel, S. W. (2009). Disentangling niche and neutral influences on community assembly: assessing the performance of community phylogenetic structure tests.</w:t>
+      </w:r>
+      <w:r>
+        <w:t xml:space="preserve"> </w:t>
+      </w:r>
+      <w:r>
+        <w:rPr>
+          <w:i/>
+          <w:iCs/>
+        </w:rPr>
+        <w:t xml:space="preserve">Ecology Letters</w:t>
+      </w:r>
+      <w:r>
+        <w:t xml:space="preserve">, 12, 949–960. https://doi.org/10.1111/j.1461-0248.2009.01354.x</w:t>
+      </w:r>
+    </w:p>
+    <w:p>
+      <w:pPr>
+        <w:pStyle w:val="BodyText"/>
+      </w:pPr>
+      <w:r>
         <w:t xml:space="preserve">Landau, W. M. (2021). The targets R package: a dynamic Make-like function-oriented pipeline toolkit for reproducibility and high-performance computing.</w:t>
       </w:r>
       <w:r>
@@ -3058,6 +3469,27 @@
         <w:pStyle w:val="BodyText"/>
       </w:pPr>
       <w:r>
+        <w:t xml:space="preserve">Li, D., &amp; Ives, A. R. (2017). The statistical need to include phylogeny in trait-based analyses of community composition.</w:t>
+      </w:r>
+      <w:r>
+        <w:t xml:space="preserve"> </w:t>
+      </w:r>
+      <w:r>
+        <w:rPr>
+          <w:i/>
+          <w:iCs/>
+        </w:rPr>
+        <w:t xml:space="preserve">Methods in Ecology and Evolution</w:t>
+      </w:r>
+      <w:r>
+        <w:t xml:space="preserve">, 8, 1192–1199. https://doi.org/10.1111/2041-210X.12767</w:t>
+      </w:r>
+    </w:p>
+    <w:p>
+      <w:pPr>
+        <w:pStyle w:val="BodyText"/>
+      </w:pPr>
+      <w:r>
         <w:t xml:space="preserve">Liedtke, H. C. (2019). AmphiNom: an amphibian systematics tool.</w:t>
       </w:r>
       <w:r>
@@ -3100,6 +3532,153 @@
         <w:pStyle w:val="BodyText"/>
       </w:pPr>
       <w:r>
+        <w:t xml:space="preserve">Mason, N. W. H., &amp; Pavoine, S. (2013). Does trait conservatism guarantee that indicators of phylogenetic community structure will reveal niche-based assembly processes along stress gradients?</w:t>
+      </w:r>
+      <w:r>
+        <w:t xml:space="preserve"> </w:t>
+      </w:r>
+      <w:r>
+        <w:rPr>
+          <w:i/>
+          <w:iCs/>
+        </w:rPr>
+        <w:t xml:space="preserve">Journal of Vegetation Science</w:t>
+      </w:r>
+      <w:r>
+        <w:t xml:space="preserve">, 24, 820–833. https://doi.org/10.1111/jvs.12033</w:t>
+      </w:r>
+    </w:p>
+    <w:p>
+      <w:pPr>
+        <w:pStyle w:val="BodyText"/>
+      </w:pPr>
+      <w:r>
+        <w:t xml:space="preserve">Mayfield, M. M., &amp; Levine, J. M. (2010). Opposing effects of competitive exclusion on the phylogenetic structure of communities.</w:t>
+      </w:r>
+      <w:r>
+        <w:t xml:space="preserve"> </w:t>
+      </w:r>
+      <w:r>
+        <w:rPr>
+          <w:i/>
+          <w:iCs/>
+        </w:rPr>
+        <w:t xml:space="preserve">Ecology Letters</w:t>
+      </w:r>
+      <w:r>
+        <w:t xml:space="preserve">, 13, 1085–1093. https://doi.org/10.1111/j.1461-0248.2010.01509.x</w:t>
+      </w:r>
+    </w:p>
+    <w:p>
+      <w:pPr>
+        <w:pStyle w:val="BodyText"/>
+      </w:pPr>
+      <w:r>
+        <w:t xml:space="preserve">Mazel, F., Davies, T. J., Gallien, L., Renaud, J., Groussin, M., Münkemüller, T., &amp; Thuiller, W. (2016). Influence of tree shape and evolutionary time-scale on phylogenetic diversity metrics.</w:t>
+      </w:r>
+      <w:r>
+        <w:t xml:space="preserve"> </w:t>
+      </w:r>
+      <w:r>
+        <w:rPr>
+          <w:i/>
+          <w:iCs/>
+        </w:rPr>
+        <w:t xml:space="preserve">Ecography</w:t>
+      </w:r>
+      <w:r>
+        <w:t xml:space="preserve">, 39, 913–920. https://doi.org/10.1111/ecog.01694</w:t>
+      </w:r>
+    </w:p>
+    <w:p>
+      <w:pPr>
+        <w:pStyle w:val="BodyText"/>
+      </w:pPr>
+      <w:r>
+        <w:t xml:space="preserve">McPeek, M. A. (2008). The ecological dynamics of clade diversification and community assembly.</w:t>
+      </w:r>
+      <w:r>
+        <w:t xml:space="preserve"> </w:t>
+      </w:r>
+      <w:r>
+        <w:rPr>
+          <w:i/>
+          <w:iCs/>
+        </w:rPr>
+        <w:t xml:space="preserve">The American Naturalist</w:t>
+      </w:r>
+      <w:r>
+        <w:t xml:space="preserve">, 172, E270–E284. https://doi.org/10.1086/593137</w:t>
+      </w:r>
+    </w:p>
+    <w:p>
+      <w:pPr>
+        <w:pStyle w:val="BodyText"/>
+      </w:pPr>
+      <w:r>
+        <w:t xml:space="preserve">Molina-Venegas, R., &amp; Roquet, C. (2014). Directional biases in phylogenetic structure quantification: a Mediterranean case study.</w:t>
+      </w:r>
+      <w:r>
+        <w:t xml:space="preserve"> </w:t>
+      </w:r>
+      <w:r>
+        <w:rPr>
+          <w:i/>
+          <w:iCs/>
+        </w:rPr>
+        <w:t xml:space="preserve">Ecography</w:t>
+      </w:r>
+      <w:r>
+        <w:t xml:space="preserve">, 37, 572–580. https://doi.org/10.1111/j.1600-0587.2013.00442.x</w:t>
+      </w:r>
+    </w:p>
+    <w:p>
+      <w:pPr>
+        <w:pStyle w:val="BodyText"/>
+      </w:pPr>
+      <w:r>
+        <w:t xml:space="preserve">Mouquet, N., &amp; Loreau, M. (2003). Community patterns in source-sink metacommunities.</w:t>
+      </w:r>
+      <w:r>
+        <w:t xml:space="preserve"> </w:t>
+      </w:r>
+      <w:r>
+        <w:rPr>
+          <w:i/>
+          <w:iCs/>
+        </w:rPr>
+        <w:t xml:space="preserve">The American Naturalist</w:t>
+      </w:r>
+      <w:r>
+        <w:t xml:space="preserve">, 162, 544–557. https://doi.org/10.1086/378857</w:t>
+      </w:r>
+    </w:p>
+    <w:p>
+      <w:pPr>
+        <w:pStyle w:val="BodyText"/>
+      </w:pPr>
+      <w:r>
+        <w:t xml:space="preserve">Münkemüller, T., Lavergne, S., Bzeznik, B., Dray, S., Jombart, T., Schiffers, K., &amp; Thuiller, W. (2012). How to measure and test phylogenetic signal.</w:t>
+      </w:r>
+      <w:r>
+        <w:t xml:space="preserve"> </w:t>
+      </w:r>
+      <w:r>
+        <w:rPr>
+          <w:i/>
+          <w:iCs/>
+        </w:rPr>
+        <w:t xml:space="preserve">Methods in Ecology and Evolution</w:t>
+      </w:r>
+      <w:r>
+        <w:t xml:space="preserve">, 3, 743–756. https://doi.org/10.1111/j.2041-210X.2012.00196.x</w:t>
+      </w:r>
+    </w:p>
+    <w:p>
+      <w:pPr>
+        <w:pStyle w:val="BodyText"/>
+      </w:pPr>
+      <w:r>
         <w:t xml:space="preserve">Oksanen, J., Simpson, G. L., Blanchet, F. G., Kindt, R., Legendre, P., Minchin, P. R., et al. (2026). vegan: community ecology package. R package version 2.7-6. doi:10.32614/CRAN.package.vegan.</w:t>
       </w:r>
     </w:p>
@@ -3213,6 +3792,27 @@
         <w:pStyle w:val="BodyText"/>
       </w:pPr>
       <w:r>
+        <w:t xml:space="preserve">Peres-Neto, P. R., Dray, S., &amp; ter Braak, C. J. F. (2017). Linking trait variation to the environment: critical issues with community-weighted mean correlation resolved by the fourth-corner approach.</w:t>
+      </w:r>
+      <w:r>
+        <w:t xml:space="preserve"> </w:t>
+      </w:r>
+      <w:r>
+        <w:rPr>
+          <w:i/>
+          <w:iCs/>
+        </w:rPr>
+        <w:t xml:space="preserve">Ecography</w:t>
+      </w:r>
+      <w:r>
+        <w:t xml:space="preserve">, 40, 806–816. https://doi.org/10.1111/ecog.02302</w:t>
+      </w:r>
+    </w:p>
+    <w:p>
+      <w:pPr>
+        <w:pStyle w:val="BodyText"/>
+      </w:pPr>
+      <w:r>
         <w:t xml:space="preserve">Peres-Neto, P. R., Leibold, M. A., &amp; Dray, S. (2012). Assessing the effects of spatial contingency and environmental filtering on metacommunity phylogenetics.</w:t>
       </w:r>
       <w:r>
@@ -3234,6 +3834,27 @@
         <w:pStyle w:val="BodyText"/>
       </w:pPr>
       <w:r>
+        <w:t xml:space="preserve">Phillimore, A. B., &amp; Price, T. D. (2008). Density-dependent cladogenesis in birds.</w:t>
+      </w:r>
+      <w:r>
+        <w:t xml:space="preserve"> </w:t>
+      </w:r>
+      <w:r>
+        <w:rPr>
+          <w:i/>
+          <w:iCs/>
+        </w:rPr>
+        <w:t xml:space="preserve">PLoS Biology</w:t>
+      </w:r>
+      <w:r>
+        <w:t xml:space="preserve">, 6, e71. https://doi.org/10.1371/journal.pbio.0060071</w:t>
+      </w:r>
+    </w:p>
+    <w:p>
+      <w:pPr>
+        <w:pStyle w:val="BodyText"/>
+      </w:pPr>
+      <w:r>
         <w:t xml:space="preserve">Pillar, V. D., &amp; Duarte, L. D. S. (2010). A framework for metacommunity analysis of phylogenetic structure.</w:t>
       </w:r>
       <w:r>
@@ -3402,6 +4023,27 @@
         <w:pStyle w:val="BodyText"/>
       </w:pPr>
       <w:r>
+        <w:t xml:space="preserve">Tsang, T. P. N., &amp; Cadotte, M. W. (2025). Species overlap and phylogenetic relatedness result in community statistical non-independence (and what to do about it).</w:t>
+      </w:r>
+      <w:r>
+        <w:t xml:space="preserve"> </w:t>
+      </w:r>
+      <w:r>
+        <w:rPr>
+          <w:i/>
+          <w:iCs/>
+        </w:rPr>
+        <w:t xml:space="preserve">Ecology Letters</w:t>
+      </w:r>
+      <w:r>
+        <w:t xml:space="preserve">, 28, e70267. https://doi.org/10.1111/ele.70267</w:t>
+      </w:r>
+    </w:p>
+    <w:p>
+      <w:pPr>
+        <w:pStyle w:val="BodyText"/>
+      </w:pPr>
+      <w:r>
         <w:t xml:space="preserve">Ushey, K., &amp; Wickham, H. (2026). renv: project environments. R package version 1.3.1. doi:10.32614/CRAN.package.renv.</w:t>
       </w:r>
     </w:p>
@@ -3431,6 +4073,27 @@
         <w:pStyle w:val="BodyText"/>
       </w:pPr>
       <w:r>
+        <w:t xml:space="preserve">Washburne, A. D., Silverman, J. D., Morton, J. T., Becker, D. J., Crowley, D., Mukherjee, S., David, L. A., &amp; Plowright, R. K. (2019). Phylofactorization: a graph partitioning algorithm to identify phylogenetic scales of ecological data.</w:t>
+      </w:r>
+      <w:r>
+        <w:t xml:space="preserve"> </w:t>
+      </w:r>
+      <w:r>
+        <w:rPr>
+          <w:i/>
+          <w:iCs/>
+        </w:rPr>
+        <w:t xml:space="preserve">Ecological Monographs</w:t>
+      </w:r>
+      <w:r>
+        <w:t xml:space="preserve">, 89, e01353. https://doi.org/10.1002/ecm.1353</w:t>
+      </w:r>
+    </w:p>
+    <w:p>
+      <w:pPr>
+        <w:pStyle w:val="BodyText"/>
+      </w:pPr>
+      <w:r>
         <w:t xml:space="preserve">Williams, C., Yang, Y., Lagisz, M., Morrison, K., Ricolfi, L., Warton, D. I., &amp; Nakagawa, S. (2024). Transparent reporting items for simulation studies evaluating statistical methods: foundations for reproducibility and reliability.</w:t>
       </w:r>
       <w:r>
@@ -3447,7 +4110,7 @@
         <w:t xml:space="preserve">, 15, 1926–1939. https://doi.org/10.1111/2041-210X.14415</w:t>
       </w:r>
     </w:p>
-    <w:bookmarkEnd w:id="59"/>
+    <w:bookmarkEnd w:id="60"/>
     <w:sectPr>
       <w:footerReference r:id="rId9" w:type="default"/>
       <w:footnotePr>

</xml_diff>

<commit_message>
Discussion: correções da revisão de exatidão (atribuições, ressalvas e recomendações)
Co-Authored-By: Claude Opus 5.5 <noreply@anthropic.com>
</commit_message>
<xml_diff>
--- a/manuscript/methods_results.docx
+++ b/manuscript/methods_results.docx
@@ -2737,40 +2737,15 @@
         <w:pStyle w:val="FirstParagraph"/>
       </w:pPr>
       <w:r>
-        <w:t xml:space="preserve">The shape of the phylogenetic tree and the process that assembles a metacommunity changed the performance of every method we evaluated, but not in the way we expected. The distribution of branching times, rather than the imbalance of the topology, governed both the power of the tests and the recovery of clades, and a phylogenetically conserved niche breadth inflated the type I error of only the two methods that rely on single phylogenetic axes. Mass effects reduced the power of all tests more than any tree shape did. To the best of our knowledge, this is the first simulation study that evaluates tests on phylogeny-weighted species composition across controlled gradients of branching times and imbalance, with both static and process-based metacommunities, and that compares them with branch-wise methods in their ability to locate the clade associated with an environmental gradient. In the following paragraphs, we discuss each of these results and their consequences for empirical studies.</w:t>
-      </w:r>
-    </w:p>
-    <w:p>
-      <w:pPr>
-        <w:pStyle w:val="BodyText"/>
-      </w:pPr>
-      <w:r>
-        <w:t xml:space="preserve">Tree imbalance did not affect the type I error of any test, whereas very negative γ reduced the power of the GLM on the first PCPS axis and of the PCC. This agrees with a general pattern in phylogenetic comparative methods, in which permutation tests keep the nominal level across topologies and the properties of the tree change mainly their power (Blomberg et al., 2003; Münkemüller et al., 2012). Accordingly, in an empirical case study, the bias of the net relatedness index caused by poor phylogenetic resolution depended on tree shape and consisted mostly of type II errors (Molina-Venegas &amp; Roquet, 2014), and metrics such as the mean pairwise distance, which weight deep branches, respond to the stemminess of the tree (Mazel et al., 2016). The loss of power with low γ seems to follow from how phylogenetic eigenvectors summarize trees with long internal branches near the root. The eigenstructure of a phylogenetic matrix is set by the tree (Diniz-Filho et al., 1998), and in such trees a few deep splits probably dominate it, so the first PCPS axis and the leading eigenvectors of the PCC probably capture the deepest dichotomy even when the gradient sorts species along another one. In contrast, PERMANOVA uses the whole matrix</w:t>
-      </w:r>
-      <w:r>
-        <w:t xml:space="preserve"> </w:t>
-      </w:r>
-      <m:oMath>
-        <m:r>
-          <m:rPr>
-            <m:sty m:val="b"/>
-          </m:rPr>
-          <m:t>P</m:t>
-        </m:r>
-      </m:oMath>
-      <w:r>
-        <w:t xml:space="preserve"> </w:t>
-      </w:r>
-      <w:r>
-        <w:t xml:space="preserve">and was much less sensitive to γ. However, we did not record the eigenvalue spectra or the axis loadings of each replicate, so we cannot confirm this mechanism with our data. Taken together, single-axis tests on phylogenetic eigenvectors seem to be fragile whenever the phylogenetic structure is spread over several axes, as already argued for the selection of eigenvectors in comparative analyses (Diniz-Filho et al., 2012).</w:t>
-      </w:r>
-    </w:p>
-    <w:p>
-      <w:pPr>
-        <w:pStyle w:val="BodyText"/>
-      </w:pPr>
-      <w:r>
-        <w:t xml:space="preserve">Phylogenetic signal in niche breadth created false positives that previous evaluations could not detect. The simulations of Duarte et al. (2016, 2018) and Peres-Neto et al. (2017) drew niche breadth and maximum abundance independently of the phylogeny, so their type I errors refer to a null hypothesis in which these nuisance parameters carry no phylogenetic signal. When σ is conserved, clades differ in how widely they spread along the gradient, which is a phylogenetic pattern in composition that is unrelated to the association between optima and environment. Permutation tests become liberal when the randomization breaks down a structure of the data that is unrelated to the null hypothesis (Hardy, 2008), and species-level variation in the response to the environment that is ignored by the test inflates the type I error of trait–environment analyses (ter Braak et al., 2017). This seems to explain why the second PCPS axis, which is orthogonal to the basal contrast captured by the first one, and the PCC were inflated, whereas PERMANOVA and the Mantel test, which average over all axes of</w:t>
+        <w:t xml:space="preserve">The shape of the phylogenetic tree and the process that assembles a metacommunity changed the performance of every method we evaluated, but not in the way we expected. The distribution of branching times, rather than the imbalance of the topology, governed the power of most tests and the clade recovery of PCPS and PCC, and a phylogenetically conserved niche breadth inflated the type I error of only the two methods that rely on the second PCPS axis or on phylogenetic eigenvectors. Mass effects reduced the power of every test except GLM PCPS2 more than any tree shape did. To the best of our knowledge, and based on searches of the literature, this is the first simulation study that evaluates tests on phylogeny-weighted species composition across controlled gradients of branching times and imbalance, with both static and process-based metacommunities, and that compares them with branch-wise methods in their ability to locate the clade associated with an environmental gradient. In the following paragraphs, we discuss each of these results and their consequences for empirical studies.</w:t>
+      </w:r>
+    </w:p>
+    <w:p>
+      <w:pPr>
+        <w:pStyle w:val="BodyText"/>
+      </w:pPr>
+      <w:r>
+        <w:t xml:space="preserve">Tree imbalance did not affect the type I error of any test, whereas very negative γ reduced the power of the GLM on the first PCPS axis and of the PCC. This agrees with comparative methods, in which randomization tests of phylogenetic signal keep the nominal level (Blomberg et al., 2003), whereas the size and topology of the tree change the expected values and the power of the statistics (Münkemüller et al., 2012). Accordingly, in an empirical case study, the bias of the net relatedness index caused by poor phylogenetic resolution depended on tree shape and consisted mostly of type II errors (Molina-Venegas &amp; Roquet, 2014), and metrics such as the mean pairwise distance, which weight deep branches, respond to the stemminess of the tree (Mazel et al., 2016). The loss of power with low γ seems to follow from how phylogenetic eigenvectors summarize trees with long internal branches near the root. The eigenstructure of a phylogenetic matrix is set by the tree (Diniz-Filho et al., 1998), and in such trees a few deep splits probably dominate it, so the first PCPS axis and the leading eigenvectors of the PCC probably capture the deepest dichotomy even when the gradient sorts species along another one. In contrast, PERMANOVA was less sensitive to γ (no change at N = 100 and a loss of 0.03–0.17 at N = 50), although the Mantel test, which also uses the whole matrix</w:t>
       </w:r>
       <w:r>
         <w:t xml:space="preserve"> </w:t>
@@ -2790,53 +2765,67 @@
         </m:sSub>
       </m:oMath>
       <w:r>
-        <w:t xml:space="preserve">, were not. Interestingly, the largest inflation occurred in trees with low γ and at N = 200, which suggests that both the depth of the conserved structure and the number of species determine how much of it reaches a single axis. In addition, the more conservative behaviour of the other tests under signal in σ agrees with the conservative max test already reported for phylogenetic fuzzy weighting (Duarte et al., 2016). Unfortunately, the empirical distribution of phylogenetic signal in niche breadth is unknown for most groups, so we cannot say how often this situation arises in real metacommunities. Constrained randomizations that preserve phylogenetic structure, such as Moran spectral randomization (Braga et al., 2018), and model-based tests with phylogenetic random effects (Li &amp; Ives, 2017; Tsang &amp; Cadotte, 2025) seem to be promising alternatives to the taxa shuffle in this case.</w:t>
-      </w:r>
-    </w:p>
-    <w:p>
-      <w:pPr>
-        <w:pStyle w:val="BodyText"/>
-      </w:pPr>
-      <w:r>
-        <w:t xml:space="preserve">The assembly process mattered more than tree shape. Mass effects reduced the power of every test except GLM PCPS2 and almost abolished that of the PCC. This is expected from the theory of source–sink metacommunities, in which high dispersal homogenizes composition among sites and erodes β-diversity (Mouquet &amp; Loreau, 2003; Thompson et al., 2020), and it agrees with the low power of phylogenetic diversity indices under mass effects even when traits were strongly conserved (Mason &amp; Pavoine, 2013). Our design probably represents the most extreme case, because the dispersal kernel was uniform and the sites had no spatial structure; in spatially explicit landscapes, mass effects allow species to dominate subregions instead of homogenizing the whole metacommunity (Thompson et al., 2020), which would leave more signal for the tests. Surprisingly, phylogenetic competition partly restored the power lost under mass effects. However, competition also pruned close relatives and reduced the Colless index of the analysed tree by about 75% relative to the pool, so the effect of the process cannot be separated from that of the change in the shape of the analysed tree. Moreover, our competition kernel assumed that close relatives compete more strongly, an assumption that is weakly supported empirically (Cahill et al., 2008; Godoy et al., 2014; Gerhold et al., 2015), and competition can also exclude distant relatives when fitness differences are phylogenetically conserved (Mayfield &amp; Levine, 2010). Therefore, this result should be read as an upper bound for a particular competition structure rather than as a general effect of competition. Taken together, a non-significant test in a metacommunity with high dispersal does not seem to indicate the absence of environmental filtering on lineages, in line with the warning that the interpretation of community phylogenetic tests should account for dispersal (Kembel, 2009).</w:t>
-      </w:r>
-    </w:p>
-    <w:p>
-      <w:pPr>
-        <w:pStyle w:val="BodyText"/>
-      </w:pPr>
-      <w:r>
-        <w:t xml:space="preserve">The methods that treat branches as units recovered the planted clade far more often than those based on phylogenetic eigenvectors. evoPCA ordinates the abundances of evolutionary units, so the stem branch of a clade enters the ordination as a variable (Pavoine, 2016), and phylofactorization searches explicitly for the edge that best separates clades with contrasting responses (Washburne et al., 2017, 2019). As a result, both methods evaluate every partition of the tree, and their recovery did not depend on γ. In contrast, PCPS recovers a clade only when its stem node is among those weighted by the leading axes, which depends on the distribution of node depths and seems to explain why low γ improved its recovery of both basal and recent clades. Thus, H3 was only partly supported, since the advantage of basal clades under PCPS seems to be a matter of degree. Empirical applications of PCPS have also found that environmental effects concentrate on a few deep nodes (Duarte et al., 2012), which agrees with this interpretation. The PCC was not designed to locate clades, since it tests a global association between phylogenetic eigenvectors, composition and environment (Peres-Neto &amp; Kembel, 2015), and our results confirm that its leading eigenvectors rarely isolate the clade of interest. Node-based analyses of species distributions (Borregaard et al., 2014) belong to the same family as phylofactorization and could be added to future comparisons.</w:t>
-      </w:r>
-    </w:p>
-    <w:p>
-      <w:pPr>
-        <w:pStyle w:val="BodyText"/>
-      </w:pPr>
-      <w:r>
-        <w:t xml:space="preserve">Our conclusions apply to real metacommunities, at least for anurans. Negative γ is the norm in empirical phylogenies, with slowdowns in diversification in most clades of several groups (McPeek, 2008; Phillimore &amp; Price, 2008), and the major clades of frogs diversified rapidly at the Cretaceous–Paleogene boundary (Feng et al., 2017). The three regional pools of tadpoles fell inside our grid, between its Yule and median levels of γ (Box 1). However, γ is sensitive to incomplete sampling of deep nodes (Cusimano &amp; Renner, 2010), so we used it only as a descriptor of the shape of the analysed tree, not as evidence of a diversification process. Our study also has limitations. First, the grid had no level with γ &gt; 0, which one of the three metacommunities of the case study had. Second, Layer B had no spatial structure and used only incidence data and five cells of the grid. Third, every metacommunity had 100 sites, and we did not vary the length of the gradient or the number of sites, which also change power. Finally, the case study had 13–40 ponds and no significant association, so it illustrates how the methods behave with real data rather than validating them.</w:t>
-      </w:r>
-    </w:p>
-    <w:p>
-      <w:pPr>
-        <w:pStyle w:val="BodyText"/>
-      </w:pPr>
-      <w:r>
-        <w:t xml:space="preserve">In summary, we recommend that empirical studies (i) report γ and the normalized Colless index of the analysed tree, since tree shape changes the power and the ranking of the tests; (ii) prefer tests on the whole matrix</w:t>
+        <w:t xml:space="preserve">, lost up to 0.23, so the use of the whole matrix does not seem to protect a test by itself. However, we did not record the eigenvalue spectra or the axis loadings of each replicate, so we cannot confirm this mechanism with our data. Taken together, single-axis tests on phylogenetic eigenvectors seem to be fragile whenever the phylogenetic structure is spread over several axes, as already argued for the selection of eigenvectors in comparative analyses (Diniz-Filho et al., 2012).</w:t>
+      </w:r>
+    </w:p>
+    <w:p>
+      <w:pPr>
+        <w:pStyle w:val="BodyText"/>
+      </w:pPr>
+      <w:r>
+        <w:t xml:space="preserve">Phylogenetic signal in niche breadth created false positives that previous evaluations could not detect. The simulations of Duarte et al. (2016, 2018) and Peres-Neto et al. (2017) drew niche breadth independently of the phylogeny, and those of Duarte et al. (2016) and Peres-Neto et al. (2017) also drew maximum abundance in this way, so their type I errors refer to a null hypothesis in which these nuisance parameters carry no phylogenetic signal. When σ is conserved, clades differ in how widely they spread along the gradient, which is a phylogenetic pattern in composition that is unrelated to the association between optima and environment. Permutation tests become liberal when the randomization breaks down a structure of the data that is unrelated to the null hypothesis (Hardy, 2008), and species-level variation in the response to the environment that is ignored by the test inflates the type I error of site-based tests of trait–environment association (ter Braak et al., 2017). This seems to explain why the second PCPS axis, which is orthogonal to the basal contrast captured by the first one, and the PCC were inflated, whereas PERMANOVA and the Mantel test, which average over all axes of</w:t>
       </w:r>
       <w:r>
         <w:t xml:space="preserve"> </w:t>
       </w:r>
       <m:oMath>
-        <m:r>
-          <m:rPr>
-            <m:sty m:val="b"/>
-          </m:rPr>
-          <m:t>P</m:t>
-        </m:r>
+        <m:sSub>
+          <m:e>
+            <m:r>
+              <m:t>D</m:t>
+            </m:r>
+          </m:e>
+          <m:sub>
+            <m:r>
+              <m:t>P</m:t>
+            </m:r>
+          </m:sub>
+        </m:sSub>
       </m:oMath>
       <w:r>
-        <w:t xml:space="preserve">, such as PERMANOVA with the max test, to tests on single PCPS axes or phylogenetic eigenvectors, especially in trees with very negative γ; (iii) interpret the second PCPS axis and the PCC with caution when niche breadth may be phylogenetically conserved; (iv) interpret a lack of power under high dispersal as a property of the metacommunity rather than as evidence against niche-based assembly; and (v) use evoPCA or phylofactorization, rather than PCPS axes, to identify the clades associated with a gradient. These recommendations seem to hold across the range of tree shapes found in anuran clades and in the regional pools we examined.</w:t>
+        <w:t xml:space="preserve">, were not. Interestingly, the largest inflation of GLM PCPS2 occurred in trees with low γ and at N = 200, which suggests that both the depth of the conserved structure and the number of species determine how much of it reaches a single axis. In addition, the more conservative behaviour of the other tests under signal in σ agrees with the conservative max test already reported for phylogenetic fuzzy weighting (Duarte et al., 2016). Unfortunately, the empirical distribution of phylogenetic signal in niche breadth is unknown for most groups, so we cannot say how often this situation arises in real metacommunities. Constrained randomizations that preserve phylogenetic structure, such as Moran spectral randomization (Braga et al., 2018), and model-based tests with phylogenetic random effects (Li &amp; Ives, 2017; Tsang &amp; Cadotte, 2025) seem to be promising alternatives to the taxa shuffle in this case.</w:t>
+      </w:r>
+    </w:p>
+    <w:p>
+      <w:pPr>
+        <w:pStyle w:val="BodyText"/>
+      </w:pPr>
+      <w:r>
+        <w:t xml:space="preserve">The assembly process mattered more than tree shape. Mass effects reduced the power of every test except GLM PCPS2 and almost abolished that of the PCC. This is expected from the theory of source–sink metacommunities, in which high dispersal homogenizes composition among sites and erodes β-diversity (Mouquet &amp; Loreau, 2003; Thompson et al., 2020), and it agrees with the low power of phylogenetic diversity indices under mass and priority effects even when traits were strongly conserved (Mason &amp; Pavoine, 2013). Our design probably represents the most extreme case, because the dispersal kernel was uniform and the sites had no spatial structure; in spatially explicit landscapes, mass effects allow species to dominate subregions instead of homogenizing the whole metacommunity (Thompson et al., 2020), which would leave more signal for the tests. Surprisingly, phylogenetic competition partly restored the power lost under mass effects for every test except the PCC. However, competition also pruned close relatives, and under mass effects it reduced the Colless index of the analysed tree by about 75% relative to the pool, so the effect of the process cannot be separated from that of the change in the shape of the analysed tree. Moreover, our competition kernel assumed that close relatives compete more strongly, an assumption that is weakly supported empirically (Cahill et al., 2008; Godoy et al., 2014; Gerhold et al., 2015), and competition can also exclude distant relatives when fitness differences are phylogenetically conserved (Mayfield &amp; Levine, 2010). Therefore, this result should be read as an upper bound for a particular competition structure rather than as a general effect of competition. Taken together, a non-significant test in a metacommunity with high dispersal does not seem to indicate the absence of environmental filtering on lineages, in line with the warning that the interpretation of community phylogenetic tests should account for dispersal (Kembel, 2009).</w:t>
+      </w:r>
+    </w:p>
+    <w:p>
+      <w:pPr>
+        <w:pStyle w:val="BodyText"/>
+      </w:pPr>
+      <w:r>
+        <w:t xml:space="preserve">The methods that treat branches as units recovered the planted clade far more often than those based on phylogenetic eigenvectors. evoPCA ordinates the abundances of evolutionary units, so the stem branch of a clade enters the ordination as a variable (Pavoine, 2016), and phylofactorization searches explicitly for the edge that best separates clades with contrasting responses (Washburne et al., 2017, 2019). As a result, phylofactorization evaluates every edge and evoPCA treats every branch as a variable, and their recovery did not depend on γ. In contrast, PCPS probably recovers a clade only when its stem node is among those weighted by the leading axes, which depends on the distribution of node depths and seems to explain why low γ improved its recovery of both basal and recent clades. Thus, H3 was only partly supported, since the advantage of basal clades under PCPS seems to be a matter of degree. Empirical applications of PCPS have also found that environmental effects concentrate on a few nodes (Duarte et al., 2012), which agrees with this interpretation. The PCC was not designed to locate clades, since it tests a global association between phylogenetic eigenvectors, composition and environment (Peres-Neto &amp; Kembel, 2015), and our results confirm that its leading eigenvectors rarely isolate the clade of interest. Node-based analyses of species distributions (Borregaard et al., 2014) follow a similar node-by-node logic and could be added to future comparisons.</w:t>
+      </w:r>
+    </w:p>
+    <w:p>
+      <w:pPr>
+        <w:pStyle w:val="BodyText"/>
+      </w:pPr>
+      <w:r>
+        <w:t xml:space="preserve">Our grid spans the tree shapes of anuran clades, although real regional pools seem to occupy its moderate levels. Negative γ is the norm in empirical phylogenies, with slowdowns in diversification in most clades of several groups (McPeek, 2008; Phillimore &amp; Price, 2008), and the major clades of frogs diversified rapidly at the Cretaceous–Paleogene boundary (Feng et al., 2017). The three regional pools of anurans fell inside our grid, between its Yule and median levels of γ (Box 1), so the low-γ cells, where the effects of tree shape were largest, are more extreme than these pools. However, γ is sensitive to incomplete and nonrandom sampling of lineages (Cusimano &amp; Renner, 2010; Brock et al., 2011), so we used it only as a descriptor of the shape of the analysed tree, not as evidence of a diversification process. Our study also has limitations. First, the grid had no level with γ &gt; 0, which one of the three metacommunities of the case study had. Second, Layer B had no spatial structure and used only incidence data and five cells of the grid. Third, every metacommunity had 100 sites, and we did not vary the length of the gradient or the number of sites, which also change power. Finally, the case study had 13–40 ponds and no significant association, so it illustrates how the methods behave with real data rather than validating them.</w:t>
+      </w:r>
+    </w:p>
+    <w:p>
+      <w:pPr>
+        <w:pStyle w:val="BodyText"/>
+      </w:pPr>
+      <w:r>
+        <w:t xml:space="preserve">In summary, we recommend that empirical studies (i) report γ and the normalized Colless index of the analysed tree, since tree shape changes the power and the ranking of the tests; (ii) not rely on a single test, since the ranking of the tests changed with tree shape, N and dispersal, and prefer PERMANOVA with the max test to tests on single PCPS axes or phylogenetic eigenvectors when the tree has very negative γ and the pool has 100 or more species; (iii) interpret the second PCPS axis and the PCC with caution when niche breadth may be phylogenetically conserved; (iv) interpret a lack of power under high dispersal as a property of the metacommunity rather than as evidence against niche-based assembly; and (v) use evoPCA or phylofactorization, rather than PCPS axes, to identify the clades associated with a gradient. These recommendations seem to hold across the range of tree shapes found in anuran clades with negative γ, but they remain to be tested in trees with γ &gt; 0 and in spatially structured metacommunities.</w:t>
       </w:r>
     </w:p>
     <w:bookmarkEnd w:id="59"/>
@@ -3039,6 +3028,27 @@
       </w:r>
       <w:r>
         <w:t xml:space="preserve">, 99, 2667–2674. https://doi.org/10.1002/ecy.2530</w:t>
+      </w:r>
+    </w:p>
+    <w:p>
+      <w:pPr>
+        <w:pStyle w:val="BodyText"/>
+      </w:pPr>
+      <w:r>
+        <w:t xml:space="preserve">Brock, C. D., Harmon, L. J., &amp; Alfaro, M. E. (2011). Testing for temporal variation in diversification rates when sampling is incomplete and nonrandom.</w:t>
+      </w:r>
+      <w:r>
+        <w:t xml:space="preserve"> </w:t>
+      </w:r>
+      <w:r>
+        <w:rPr>
+          <w:i/>
+          <w:iCs/>
+        </w:rPr>
+        <w:t xml:space="preserve">Systematic Biology</w:t>
+      </w:r>
+      <w:r>
+        <w:t xml:space="preserve">, 60, 410–419. https://doi.org/10.1093/sysbio/syr007</w:t>
       </w:r>
     </w:p>
     <w:p>

</xml_diff>

<commit_message>
Manuscrito e SI sem autor (revisão duplo-cega); Fig. 1 com 180 mm e PNG a 600 dpi
Co-Authored-By: Claude Opus 5.5 <noreply@anthropic.com>
</commit_message>
<xml_diff>
--- a/manuscript/methods_results.docx
+++ b/manuscript/methods_results.docx
@@ -16,14 +16,6 @@
       </w:pPr>
       <w:r>
         <w:t xml:space="preserve">Abstract, Methods, Results and Discussion (draft)</w:t>
-      </w:r>
-    </w:p>
-    <w:p>
-      <w:pPr>
-        <w:pStyle w:val="Author"/>
-      </w:pPr>
-      <w:r>
-        <w:t xml:space="preserve">Diogo B. Provete</w:t>
       </w:r>
     </w:p>
     <w:p>

</xml_diff>

<commit_message>
DOI do depósito anônimo no Zenodo; Ai & Ellwood 2022 na Discussion
Co-Authored-By: Claude Opus 5.5 <noreply@anthropic.com>
</commit_message>
<xml_diff>
--- a/manuscript/methods_results.docx
+++ b/manuscript/methods_results.docx
@@ -84,7 +84,7 @@
         <w:pStyle w:val="FirstParagraph"/>
       </w:pPr>
       <w:r>
-        <w:t xml:space="preserve">Data and code availability for review: the code, the rates aggregated by condition and the scripts that reproduce every table and figure are provided as an anonymized zip file with this submission; the public repository and its Zenodo archive will be cited after review.</w:t>
+        <w:t xml:space="preserve">Data and code availability for review: the code, the rates aggregated by condition and the scripts that reproduce every table and figure are available in an anonymized archive for review (https://doi.org/10.5281/zenodo.23500661); the public repository and its Zenodo archive will be cited after review.</w:t>
       </w:r>
     </w:p>
     <w:p>
@@ -2139,7 +2139,7 @@
         <w:pStyle w:val="FirstParagraph"/>
       </w:pPr>
       <w:r>
-        <w:t xml:space="preserve">We ran all analyses in R v. 4.6.1 (R Core Team, 2026), with the versions of every package recorded in the lockfile of renv v. 1.3.1 (Ushey &amp; Wickham, 2026); trees were handled with ape v. 5.8-1 (Paradis &amp; Schliep, 2019). We orchestrated the simulations with targets v. 1.12.0 (Landau, 2021) and crew v. 1.3.3 (Landau, 2026) in a Docker image, with seeds derived from a single pipeline seed (Appendix S1). Code is available in the anonymized archive that accompanies this submission (Data Availability Statement), together with the rates aggregated by condition and the scripts that compute the performance measures and the models from them, which reproduce every table and figure without rerunning the simulations.</w:t>
+        <w:t xml:space="preserve">We ran all analyses in R v. 4.6.1 (R Core Team, 2026), with the versions of every package recorded in the lockfile of renv v. 1.3.1 (Ushey &amp; Wickham, 2026); trees were handled with ape v. 5.8-1 (Paradis &amp; Schliep, 2019). We orchestrated the simulations with targets v. 1.12.0 (Landau, 2021) and crew v. 1.3.3 (Landau, 2026) in a Docker image, with seeds derived from a single pipeline seed (Appendix S1). Code is available in an anonymized archive for review (https://doi.org/10.5281/zenodo.23500661), together with the rates aggregated by condition and the scripts that compute the performance measures and the models from them, which reproduce every table and figure without rerunning the simulations.</w:t>
       </w:r>
     </w:p>
     <w:bookmarkEnd w:id="35"/>
@@ -2793,7 +2793,7 @@
         <w:pStyle w:val="BodyText"/>
       </w:pPr>
       <w:r>
-        <w:t xml:space="preserve">The assembly process mattered more than tree shape. Mass effects reduced the power of every test except GLM PCPS2 and almost abolished that of the PCC. This is expected from the theory of source–sink metacommunities, in which high dispersal homogenizes composition among sites and erodes β-diversity (Mouquet &amp; Loreau, 2003; Thompson et al., 2020), and it agrees with the low power of phylogenetic diversity indices under mass and priority effects even when traits were strongly conserved (Mason &amp; Pavoine, 2013). Our design probably represents the most extreme case, because the dispersal kernel was uniform and the sites had no spatial structure; in spatially explicit landscapes, mass effects allow species to dominate subregions instead of homogenizing the whole metacommunity (Thompson et al., 2020), which would leave more signal for the tests. Surprisingly, phylogenetic competition partly restored the power lost under mass effects for every test except the PCC. However, competition also pruned close relatives, and under mass effects it reduced the Colless index of the analysed tree by about 75% relative to the pool, so the effect of the process cannot be separated from that of the change in the shape of the analysed tree. Moreover, our competition kernel assumed that close relatives compete more strongly, an assumption that is weakly supported empirically (Cahill et al., 2008; Godoy et al., 2014; Gerhold et al., 2015), and competition can also exclude distant relatives when fitness differences are phylogenetically conserved (Mayfield &amp; Levine, 2010). Therefore, this result should be read as an upper bound for a particular competition structure rather than as a general effect of competition. Taken together, a non-significant test in a metacommunity with high dispersal does not seem to indicate the absence of environmental filtering on lineages, in line with the warning that the interpretation of community phylogenetic tests should account for dispersal (Kembel, 2009).</w:t>
+        <w:t xml:space="preserve">The assembly process mattered more than tree shape. Mass effects reduced the power of every test except GLM PCPS2 and almost abolished that of the PCC. This is expected from the theory of source–sink metacommunities, in which high dispersal homogenizes composition among sites and erodes β-diversity (Mouquet &amp; Loreau, 2003; Thompson et al., 2020), and it agrees with the low power of phylogenetic diversity indices under mass and priority effects even when traits were strongly conserved (Mason &amp; Pavoine, 2013). Our design probably represents the most extreme case, because the dispersal kernel was uniform and the sites had no spatial structure, and a spatially implicit model failed to predict the composition of spatially explicit metacommunities at high dispersal in a resource-competition model (Ai &amp; Ellwood, 2022); in spatially explicit landscapes, mass effects allow species to dominate subregions instead of homogenizing the whole metacommunity (Thompson et al., 2020), which would leave more signal for the tests. Surprisingly, phylogenetic competition partly restored the power lost under mass effects for every test except the PCC. However, competition also pruned close relatives, and under mass effects it reduced the Colless index of the analysed tree by about 75% relative to the pool, so the effect of the process cannot be separated from that of the change in the shape of the analysed tree. Moreover, our competition kernel assumed that close relatives compete more strongly, an assumption that is weakly supported empirically (Cahill et al., 2008; Godoy et al., 2014; Gerhold et al., 2015), and competition can also exclude distant relatives when fitness differences are phylogenetically conserved (Mayfield &amp; Levine, 2010). Therefore, this result should be read as an upper bound for a particular competition structure rather than as a general effect of competition. Taken together, a non-significant test in a metacommunity with high dispersal does not seem to indicate the absence of environmental filtering on lineages, in line with the warning that the interpretation of community phylogenetic tests should account for dispersal (Kembel, 2009).</w:t>
       </w:r>
     </w:p>
     <w:p>
@@ -2833,6 +2833,27 @@
     <w:p>
       <w:pPr>
         <w:pStyle w:val="FirstParagraph"/>
+      </w:pPr>
+      <w:r>
+        <w:t xml:space="preserve">Ai, D., &amp; Ellwood, M. D. F. (2022). A spatially implicit model fails to predict the structure of spatially explicit metacommunities under high dispersal.</w:t>
+      </w:r>
+      <w:r>
+        <w:t xml:space="preserve"> </w:t>
+      </w:r>
+      <w:r>
+        <w:rPr>
+          <w:i/>
+          <w:iCs/>
+        </w:rPr>
+        <w:t xml:space="preserve">Ecological Modelling</w:t>
+      </w:r>
+      <w:r>
+        <w:t xml:space="preserve">, 474, 110151. https://doi.org/10.1016/j.ecolmodel.2022.110151</w:t>
+      </w:r>
+    </w:p>
+    <w:p>
+      <w:pPr>
+        <w:pStyle w:val="BodyText"/>
       </w:pPr>
       <w:r>
         <w:t xml:space="preserve">Aldous, D. (1996). Probability distributions on cladograms. In D. Aldous &amp; R. Pemantle (Eds.),</w:t>

</xml_diff>

<commit_message>
Introduction redigida (objetivos e hipóteses movidos de Methods); abstract revisado
Co-Authored-By: Claude Opus 5.5 <noreply@anthropic.com>
</commit_message>
<xml_diff>
--- a/manuscript/methods_results.docx
+++ b/manuscript/methods_results.docx
@@ -15,7 +15,7 @@
         <w:pStyle w:val="Subtitle"/>
       </w:pPr>
       <w:r>
-        <w:t xml:space="preserve">Abstract, Methods, Results and Discussion (draft)</w:t>
+        <w:t xml:space="preserve">Full draft</w:t>
       </w:r>
     </w:p>
     <w:p>
@@ -43,7 +43,7 @@
         </w:numPr>
       </w:pPr>
       <w:r>
-        <w:t xml:space="preserve">Methods that relate the phylogenetic structure of metacommunities to environmental gradients, like the principal coordinates of phylogenetic structure (PCPS) and the phylogenetic community composition approach (PCC), were validated with static simulations on trees close to the Yule model. However, real phylogenies vary in topological imbalance and in the distribution of branching times, and dispersal and competition assemble metacommunities, so their published performance may not hold for empirical data.</w:t>
+        <w:t xml:space="preserve">Tests relating the phylogenetic structure of metacommunities to environmental gradients, such as the principal coordinates of phylogenetic structure (PCPS) and the phylogenetic community composition approach (PCC), were validated with static simulations, on trees close to Yule and with niche breadth independent of the phylogeny. However, real phylogenies vary in imbalance and branching times, and dispersal and competition assemble metacommunities, so their published performance may not hold for empirical data.</w:t>
       </w:r>
     </w:p>
     <w:p>
@@ -65,7 +65,7 @@
         </w:numPr>
       </w:pPr>
       <w:r>
-        <w:t xml:space="preserve">Tree imbalance did not affect the type I error of any test. Phylogenetic signal in niche breadth inflated the type I error of the linear model on the second PCPS axis, up to 0.36 in trees with low γ, and of the PCC, up to 0.22. Low γ reduced the power of the linear model on the first PCPS axis by 0.40 and that of the PCC by 0.25, whereas PERMANOVA was almost insensitive to tree shape. Mass effects reduced power more than tree shape and almost abolished that of the PCC. The evoPCA and phylofactorization recovered the planted clade in 0.44–0.88 of the replicates in every tree shape, whereas PCPS depended strongly on γ and PCC rarely found the clade.</w:t>
+        <w:t xml:space="preserve">Tree imbalance did not affect the type I error of any test. Phylogenetic signal in niche breadth inflated the type I error of the linear model on the second PCPS axis, up to 0.36 in trees with low γ, and of the PCC, up to 0.22. Low γ reduced the power of the linear model on the first PCPS axis by 0.40 and that of the PCC by 0.25, whereas PERMANOVA was less sensitive to tree shape. Mass effects reduced the power of almost every test more than tree shape did and almost abolished that of the PCC. The evoPCA and phylofactorization recovered the planted clade in 0.44–0.88 of the replicates regardless of γ, whereas PCPS depended strongly on γ and PCC rarely found the clade.</w:t>
       </w:r>
     </w:p>
     <w:p>
@@ -76,7 +76,7 @@
         </w:numPr>
       </w:pPr>
       <w:r>
-        <w:t xml:space="preserve">The performance of these methods seems to depend on the distribution of branching times and on the assembly process rather than on tree imbalance. Three regional anuran pools fell inside the simulated grid, so these results seem to apply to real metacommunities. We therefore recommend reporting γ of the analysed tree, caution with the second PCPS axis when niche breadth may be phylogenetically conserved, and using evoPCA or phylofactorization to identify the clades associated with a gradient.</w:t>
+        <w:t xml:space="preserve">Performance seems to depend on branching times and on the assembly process rather than on tree imbalance. Three regional anuran pools fell at moderate levels of the simulated grid. We recommend reporting γ of the analysed tree, not relying on a single test, interpreting the second PCPS axis and the PCC with caution when niche breadth may be phylogenetically conserved, and using evoPCA or phylofactorization to identify the clades associated with a gradient.</w:t>
       </w:r>
     </w:p>
     <w:p>
@@ -96,16 +96,97 @@
       </w:r>
     </w:p>
     <w:bookmarkEnd w:id="20"/>
-    <w:bookmarkStart w:id="36" w:name="methods"/>
+    <w:bookmarkStart w:id="21" w:name="introduction"/>
     <w:p>
       <w:pPr>
         <w:pStyle w:val="Heading1"/>
       </w:pPr>
       <w:r>
+        <w:t xml:space="preserve">Introduction</w:t>
+      </w:r>
+    </w:p>
+    <w:p>
+      <w:pPr>
+        <w:pStyle w:val="FirstParagraph"/>
+      </w:pPr>
+      <w:r>
+        <w:t xml:space="preserve">The phylogenetic composition of communities along environmental gradients carries information about how lineages respond to the environment and how metacommunities are assembled (Leibold et al., 2010; Pillar &amp; Duarte, 2010). Several methods relate the phylogenetic structure of a metacommunity to an environmental gradient. Phylogenetic fuzzy weighting summarizes each site by the phylogeny-weighted composition of its species, the matrix</w:t>
+      </w:r>
+      <w:r>
+        <w:t xml:space="preserve"> </w:t>
+      </w:r>
+      <m:oMath>
+        <m:r>
+          <m:rPr>
+            <m:sty m:val="b"/>
+          </m:rPr>
+          <m:t>P</m:t>
+        </m:r>
+      </m:oMath>
+      <w:r>
+        <w:t xml:space="preserve">, whose principal coordinates of phylogenetic structure (PCPS) can then be related to the gradient (Pillar &amp; Duarte, 2010; Duarte, 2011; Duarte et al., 2016). The phylogenetic community composition approach (PCC) relates species composition to phylogenetic eigenvectors and the gradient (Peres-Neto &amp; Kembel, 2015), whereas evolutionary principal component analysis (evoPCA) and phylofactorization treat branches as units and point to the lineages that drive differences among sites (Pavoine, 2016; Washburne et al., 2017, 2019). These methods have been applied to plants and to animals, including the amphibians of the Americas, where the association between climate and phylogenetic composition depended on the depth of the nodes considered (Duarte et al., 2012, 2014). As a result, an empirical study can choose among tests that differ in what they summarize from the tree, and their behaviour under realistic conditions determines whether the inferences drawn from them are sound.</w:t>
+      </w:r>
+    </w:p>
+    <w:p>
+      <w:pPr>
+        <w:pStyle w:val="BodyText"/>
+      </w:pPr>
+      <w:r>
+        <w:t xml:space="preserve">The validation of these methods has focused on the type I error of permutation tests. When either the phylogeny or the environment alone structures species distributions, tests that permute only sites or only species reject the null hypothesis too often, and the largest of the two P-values (max test) is needed to control the type I error (ter Braak et al., 2012; Peres-Neto &amp; Kembel, 2015; Duarte et al., 2016). The same problem affects tests on community-weighted means (Peres-Neto et al., 2017; Zelený, 2018), whose type I error also increases when traits and species distributions carry phylogenetic signal (Duarte et al., 2018). However, the simulations that established these results drew species niches from a static Gaussian response model (Peres-Neto et al., 2012), on trees close to the Yule model or from a pure-birth process (Duarte et al., 2016; Pavoine, 2016), and with niche breadth and maximum abundance independent of the phylogeny (Duarte et al., 2016; Peres-Neto et al., 2017). Real phylogenies and real metacommunities depart from each of these assumptions.</w:t>
+      </w:r>
+    </w:p>
+    <w:p>
+      <w:pPr>
+        <w:pStyle w:val="BodyText"/>
+      </w:pPr>
+      <w:r>
+        <w:t xml:space="preserve">First, real trees are more imbalanced than Yule trees (Heard, 1992; Blum &amp; François, 2006), and a slowdown in diversification towards the present, that is, a negative γ statistic (Pybus &amp; Harvey, 2000), was found in most clades of a large compilation of phylogenies (McPeek, 2008) and in many clades of birds (Phillimore &amp; Price, 2008). Anurans are a clear case, since most living frogs descend from a few lineages that radiated rapidly in the late Cretaceous and early Paleogene (Roelants et al., 2007; Feng et al., 2017). Tree shape changes the expected values and the power of phylogenetic statistics (Münkemüller et al., 2012), the phylogenetic depth that community metrics respond to (Mazel et al., 2016) and the eigenstructure of phylogenetic matrices (Diniz-Filho et al., 1998), which is what PCPS and the PCC summarize. Nonetheless, to our knowledge, no study has evaluated how the distribution of branching times and the imbalance of the tree affect tests on phylogeny-weighted composition. Second, species are not sorted along gradients in isolation. In metacommunities, dispersal and competition interact with environmental filtering (Leibold et al., 2004), and high dispersal homogenizes composition among sites (Mouquet &amp; Loreau, 2003). Dispersal can alter the outcome of community phylogenetic tests (Kembel, 2009; Mason &amp; Pavoine, 2013), and inferring assembly from diversity patterns requires accounting for these processes (Münkemüller et al., 2020). Process-based models now generate species sorting, mass effects and competition from local population dynamics and dispersal (Thompson et al., 2020), which allows these methods to be evaluated under the processes they are meant to detect.</w:t>
+      </w:r>
+    </w:p>
+    <w:p>
+      <w:pPr>
+        <w:pStyle w:val="BodyText"/>
+      </w:pPr>
+      <w:r>
+        <w:t xml:space="preserve">Third, a significant association between phylogenetic composition and the environment does not tell which lineages are responsible for it. Identifying the clades that respond to a gradient is a recurrent aim of metacommunity phylogenetics (Parra et al., 2010; Borregaard et al., 2014), and PCPS has been used for that purpose by examining the nodes associated with its axes (Duarte et al., 2012). However, how often PCPS, PCC and branch-wise methods identify the correct clade, and whether this depends on tree shape, has not been evaluated with a known answer.</w:t>
+      </w:r>
+    </w:p>
+    <w:p>
+      <w:pPr>
+        <w:pStyle w:val="BodyText"/>
+      </w:pPr>
+      <w:r>
+        <w:t xml:space="preserve">Here, we evaluate tests and methods that relate phylogenetic composition to environmental gradients with a simulation study designed following the aims, data-generating mechanisms, estimands, methods and performance measures structure (DiRenzo et al., 2023; Williams et al., 2024). Our aims were (i) to estimate how the distribution of branching times (γ; Pybus &amp; Harvey, 2000) and the imbalance of the topology (the Colless index; Colless, 1982) affect the type I error and power of these tests, including under phylogenetic signal in niche breadth or maximum abundance; (ii) to estimate how the same tests perform under species sorting, mass effects and phylogenetic competition; and (iii) to estimate how well ordination and factorization methods recover a clade associated with the gradient. We expected that (i) tree imbalance would move the type I error of the taxa shuffle away from the nominal level, since the phylogenetic weights of matrix</w:t>
+      </w:r>
+      <w:r>
+        <w:t xml:space="preserve"> </w:t>
+      </w:r>
+      <m:oMath>
+        <m:r>
+          <m:rPr>
+            <m:sty m:val="b"/>
+          </m:rPr>
+          <m:t>P</m:t>
+        </m:r>
+      </m:oMath>
+      <w:r>
+        <w:t xml:space="preserve"> </w:t>
+      </w:r>
+      <w:r>
+        <w:t xml:space="preserve">are heterogeneous among tips in imbalanced trees (H1); (ii) phylogenetic signal in niche breadth or maximum abundance would inflate the type I error of all tests, with a magnitude that depends on tree shape (H2); (iii) very negative γ, that is, long internal branches near the root, would concentrate variation on the first PCPS axis and favour the recovery of basal over recent clades (H3); and (iv) the ranking of the methods in power and in clade recovery would change with tree shape (H4). Finally, we placed real regional pools of anurans on the simulated grid of tree shapes and applied all methods to three tadpole metacommunities (Box 1).</w:t>
+      </w:r>
+    </w:p>
+    <w:bookmarkEnd w:id="21"/>
+    <w:bookmarkStart w:id="37" w:name="methods"/>
+    <w:p>
+      <w:pPr>
+        <w:pStyle w:val="Heading1"/>
+      </w:pPr>
+      <w:r>
         <w:t xml:space="preserve">Methods</w:t>
       </w:r>
     </w:p>
-    <w:bookmarkStart w:id="25" w:name="overview-of-the-simulation-study"/>
+    <w:bookmarkStart w:id="26" w:name="overview-of-the-simulation-study"/>
     <w:p>
       <w:pPr>
         <w:pStyle w:val="Heading2"/>
@@ -119,7 +200,7 @@
         <w:pStyle w:val="FirstParagraph"/>
       </w:pPr>
       <w:r>
-        <w:t xml:space="preserve">We designed the simulation study following the aims, data-generating mechanisms, estimands, methods and performance measures structure recommended for simulation studies that evaluate statistical methods (DiRenzo et al., 2023; Williams et al., 2024). The study had three aims: (i) to estimate how the shape of the phylogenetic tree, measured as the distribution of branching times (the γ statistic; Pybus &amp; Harvey, 2000) and the imbalance of the topology (the Colless index; Colless, 1982), affects the type I error and the power of tests that relate the phylogenetic structure of metacommunities to an environmental gradient; (ii) to estimate how the same tests perform under different processes of metacommunity assembly, which, to the best of our knowledge, neither the articles that proposed these tests nor later evaluations of them have addressed (Peres-Neto &amp; Kembel, 2015; Duarte et al., 2016); and (iii) to estimate how well ordination and factorization methods recover a clade associated with the gradient. We generated metacommunities in two layers (</w:t>
+        <w:t xml:space="preserve">We generated metacommunities in two layers (</w:t>
       </w:r>
       <w:hyperlink w:anchor="fig-design">
         <w:r>
@@ -130,32 +211,7 @@
         </w:r>
       </w:hyperlink>
       <w:r>
-        <w:t xml:space="preserve">). Layer A follows the static protocol of Peres-Neto, Leibold and Dray (2012), which was also used to validate the tests we evaluated, so our results can be compared directly with the published ones. Layer B simulates metacommunity dynamics with the process-based framework of Thompson et al. (2020), in which species sorting, mass effects and competition emerge from local population dynamics and dispersal.</w:t>
-      </w:r>
-    </w:p>
-    <w:p>
-      <w:pPr>
-        <w:pStyle w:val="BodyText"/>
-      </w:pPr>
-      <w:r>
-        <w:t xml:space="preserve">We stated four hypotheses before the main runs. We expected that (i) tree imbalance would move the type I error of the taxa shuffle away from the nominal level, since the phylogenetic weights of matrix</w:t>
-      </w:r>
-      <w:r>
-        <w:t xml:space="preserve"> </w:t>
-      </w:r>
-      <m:oMath>
-        <m:r>
-          <m:rPr>
-            <m:sty m:val="b"/>
-          </m:rPr>
-          <m:t>P</m:t>
-        </m:r>
-      </m:oMath>
-      <w:r>
-        <w:t xml:space="preserve"> </w:t>
-      </w:r>
-      <w:r>
-        <w:t xml:space="preserve">are heterogeneous among tips in imbalanced trees (H1); (ii) phylogenetic signal in niche breadth or maximum abundance would inflate the type I error of all tests, with a magnitude that depends on tree shape (H2); (iii) very negative γ, that is, long internal branches near the root, would concentrate variation on the first PCPS axis and favour the recovery of basal over recent clades (H3); and (iv) the ranking of the methods in power and in clade recovery would change with tree shape (H4). The study was not registered. However, we wrote the design and the hypotheses down before the main runs (docs/PLANO_SIMULACAO.md, first committed on 16 October 2026 as commit 668fa60 of the code repository), and we report the departures from that plan in Appendix S1.</w:t>
+        <w:t xml:space="preserve">). Layer A follows the static protocol of Peres-Neto, Leibold and Dray (2012), which was also used to validate the tests we evaluated, so our results can be compared directly with the published ones. Layer B simulates metacommunity dynamics with the process-based framework of Thompson et al. (2020), in which species sorting, mass effects and competition emerge from local population dynamics and dispersal. In both layers, the trees came from a grid of shapes that crosses the distribution of branching times with the imbalance of the topology. The study was not registered. However, we wrote the design and the hypotheses down before the main runs, in a planning document first committed to the code repository on 16 October 2026, and we report the departures from that plan in Appendix S1.</w:t>
       </w:r>
     </w:p>
     <w:tbl>
@@ -171,7 +227,7 @@
       <w:tr>
         <w:tc>
           <w:tcPr/>
-          <w:bookmarkStart w:id="24" w:name="fig-design"/>
+          <w:bookmarkStart w:id="25" w:name="fig-design"/>
           <w:p>
             <w:pPr>
               <w:pStyle w:val="Compact"/>
@@ -182,18 +238,18 @@
                 <wp:inline>
                   <wp:extent cx="5753100" cy="2622454"/>
                   <wp:effectExtent b="0" l="0" r="0" t="0"/>
-                  <wp:docPr descr="" title="" id="22" name="Picture"/>
+                  <wp:docPr descr="" title="" id="23" name="Picture"/>
                   <a:graphic>
                     <a:graphicData uri="http://schemas.openxmlformats.org/drawingml/2006/picture">
                       <pic:pic>
                         <pic:nvPicPr>
-                          <pic:cNvPr descr="figures/fig1_schematic.png" id="23" name="Picture"/>
+                          <pic:cNvPr descr="figures/fig1_schematic.png" id="24" name="Picture"/>
                           <pic:cNvPicPr>
                             <a:picLocks noChangeArrowheads="1" noChangeAspect="1"/>
                           </pic:cNvPicPr>
                         </pic:nvPicPr>
                         <pic:blipFill>
-                          <a:blip r:embed="rId21"/>
+                          <a:blip r:embed="rId22"/>
                           <a:stretch>
                             <a:fillRect/>
                           </a:stretch>
@@ -247,12 +303,12 @@
               <w:t xml:space="preserve">.</w:t>
             </w:r>
           </w:p>
-          <w:bookmarkEnd w:id="24"/>
+          <w:bookmarkEnd w:id="25"/>
         </w:tc>
       </w:tr>
     </w:tbl>
-    <w:bookmarkEnd w:id="25"/>
-    <w:bookmarkStart w:id="26" w:name="tree-shapes"/>
+    <w:bookmarkEnd w:id="26"/>
+    <w:bookmarkStart w:id="27" w:name="tree-shapes"/>
     <w:p>
       <w:pPr>
         <w:pStyle w:val="Heading2"/>
@@ -400,8 +456,8 @@
         <w:t xml:space="preserve">of its cell, so that the scenarios were paired by tree.</w:t>
       </w:r>
     </w:p>
-    <w:bookmarkEnd w:id="26"/>
-    <w:bookmarkStart w:id="27" w:name="layer-a-static-metacommunities"/>
+    <w:bookmarkEnd w:id="27"/>
+    <w:bookmarkStart w:id="28" w:name="layer-a-static-metacommunities"/>
     <w:p>
       <w:pPr>
         <w:pStyle w:val="Heading2"/>
@@ -760,8 +816,8 @@
         <w:t xml:space="preserve">could carry phylogenetic signal, with the same marginal distribution as without signal, so that the two cases differed only in how the values were arranged on the tree (Appendix S1). We removed empty sites and pruned absent species from the tree before analysis, as one would with real data, and analysed both incidence and abundance data.</w:t>
       </w:r>
     </w:p>
-    <w:bookmarkEnd w:id="27"/>
-    <w:bookmarkStart w:id="28" w:name="layer-b-process-based-metacommunities"/>
+    <w:bookmarkEnd w:id="28"/>
+    <w:bookmarkStart w:id="29" w:name="layer-b-process-based-metacommunities"/>
     <w:p>
       <w:pPr>
         <w:pStyle w:val="Heading2"/>
@@ -943,8 +999,8 @@
         <w:t xml:space="preserve">) in mass effects, and competition was either intraspecific only or also interspecific and structured by phylogeny, so that close relatives competed more strongly. Since competition and dispersal remove species, the cell of the grid defined the tree of the regional pool rather than the tree of the analysed metacommunity, and we calibrated the size of the pool so that the mean number of species left after the dynamics was close to N. Mass effects with phylogenetic competition could not reach N = 200, and we dropped this combination. Layer B used five cells of the grid (the four corners and the centre) and 1,000 replicates per combination.</w:t>
       </w:r>
     </w:p>
-    <w:bookmarkEnd w:id="28"/>
-    <w:bookmarkStart w:id="30" w:name="scenarios-and-estimands"/>
+    <w:bookmarkEnd w:id="29"/>
+    <w:bookmarkStart w:id="31" w:name="scenarios-and-estimands"/>
     <w:p>
       <w:pPr>
         <w:pStyle w:val="Heading2"/>
@@ -985,7 +1041,7 @@
       <w:tr>
         <w:tc>
           <w:tcPr/>
-          <w:bookmarkStart w:id="29" w:name="tbl-scenarios"/>
+          <w:bookmarkStart w:id="30" w:name="tbl-scenarios"/>
           <w:p>
             <w:pPr>
               <w:jc w:val="center"/>
@@ -1575,13 +1631,13 @@
               </w:tc>
             </w:tr>
           </w:tbl>
-          <w:bookmarkEnd w:id="29"/>
+          <w:bookmarkEnd w:id="30"/>
           <w:p/>
         </w:tc>
       </w:tr>
     </w:tbl>
-    <w:bookmarkEnd w:id="30"/>
-    <w:bookmarkStart w:id="31" w:name="methods-compared"/>
+    <w:bookmarkEnd w:id="31"/>
+    <w:bookmarkStart w:id="32" w:name="methods-compared"/>
     <w:p>
       <w:pPr>
         <w:pStyle w:val="Heading2"/>
@@ -1714,8 +1770,8 @@
         <w:t xml:space="preserve">(RDA PCPS). We re-implemented the phylogenetic community composition approach (PCC) of Peres-Neto and Kembel (2015) from the equations in the original article, using the variance of the adjusted R² across phylogenetic eigenvectors as the test statistic. Every test was evaluated with 999 permutations under two null models, the site shuffle, which permutes the sites, and the taxa shuffle, which permutes the tips of the tree while keeping its topology. We report the largest of the two P-values (max test), which controls the type I error when either null hypothesis holds (Peres-Neto &amp; Kembel, 2015; Duarte et al., 2016). The observed statistics of our permutation code equal those of the R packages vegan v. 2.7-6 (Oksanen et al., 2026) and PCPS v. 1.0.9 (Debastiani, 2026), which we checked in unit tests.</w:t>
       </w:r>
     </w:p>
-    <w:bookmarkEnd w:id="31"/>
-    <w:bookmarkStart w:id="32" w:name="recovery-of-a-planted-clade"/>
+    <w:bookmarkEnd w:id="32"/>
+    <w:bookmarkStart w:id="33" w:name="recovery-of-a-planted-clade"/>
     <w:p>
       <w:pPr>
         <w:pStyle w:val="Heading2"/>
@@ -1917,8 +1973,8 @@
         <w:t xml:space="preserve">among the first four, and for phylofactorization the objective of the algorithm (Appendix S1). A method recovered the clade when its best-scoring clade was the planted one or its complement. As complementary measures, which give partial credit to a method that chooses a nested or a slightly larger clade, we recorded the rank of the planted node among all nodes and the Jaccard similarity between the best-scoring and the planted clades.</w:t>
       </w:r>
     </w:p>
-    <w:bookmarkEnd w:id="32"/>
-    <w:bookmarkStart w:id="33" w:name="X53da85fff317b1dec52893db24bd78d79ba735e"/>
+    <w:bookmarkEnd w:id="33"/>
+    <w:bookmarkStart w:id="34" w:name="X53da85fff317b1dec52893db24bd78d79ba735e"/>
     <w:p>
       <w:pPr>
         <w:pStyle w:val="Heading2"/>
@@ -2106,8 +2162,8 @@
         <w:t xml:space="preserve">, the bulk and tail effective sample sizes and the numbers of divergent transitions and of transitions at the maximum tree depth, and model fit with posterior predictive checks. We summarize the results as posterior rates and contrasts between tree shapes or archetypes, with medians and 95% credible intervals (CI), and report the raw rates where they exceed the modelled ones.</w:t>
       </w:r>
     </w:p>
-    <w:bookmarkEnd w:id="33"/>
-    <w:bookmarkStart w:id="34" w:name="empirical-reference-and-case-study"/>
+    <w:bookmarkEnd w:id="34"/>
+    <w:bookmarkStart w:id="35" w:name="empirical-reference-and-case-study"/>
     <w:p>
       <w:pPr>
         <w:pStyle w:val="Heading2"/>
@@ -2124,8 +2180,8 @@
         <w:t xml:space="preserve">To show where real regional species pools fall in the grid of tree shapes, and how the methods behave with real data, we used 14 tadpole metacommunities compiled from the literature and from unpublished data (Box 1). We harmonized species names with the Amphibian Species of the World (Frost, 2026; through the internal dataset of AmphiNom, updated on 16 October 2025) using the R package AmphiNom v. 1.1.0 (Liedtke, 2019), excluded undetermined taxa, and matched the remaining 123 species to the tips of the Portik et al. (2023) tree. We built three nested pools (Atlantic Forest; Atlantic Forest and interior of São Paulo; all South American metacommunities) pruned the tree to each, and computed γ and the normalized Colless index on the point-estimate tree and on its 100 time-calibrated bootstrap trees. For the case study, we used the metacommunities with at least 10 ponds and pond depth measured in every pond, namely two of the 14 and one additional published dataset: Serra da Bocaina (13 ponds; Provete et al., 2014), southern Brazil (32 ponds; Both et al., 2011) and northwestern São Paulo (40 ponds; Prado &amp; Rossa-Feres, 2014). We applied all tests and the four clade-scoring methods to incidence data with pond depth as the gradient, and also with canopy cover in Bocaina, the variable associated with its phylogenetic composition in a previous analysis with PCPS (Provete, 2018).</w:t>
       </w:r>
     </w:p>
-    <w:bookmarkEnd w:id="34"/>
-    <w:bookmarkStart w:id="35" w:name="implementation-and-reproducibility"/>
+    <w:bookmarkEnd w:id="35"/>
+    <w:bookmarkStart w:id="36" w:name="implementation-and-reproducibility"/>
     <w:p>
       <w:pPr>
         <w:pStyle w:val="Heading2"/>
@@ -2142,9 +2198,9 @@
         <w:t xml:space="preserve">We ran all analyses in R v. 4.6.1 (R Core Team, 2026), with the versions of every package recorded in the lockfile of renv v. 1.3.1 (Ushey &amp; Wickham, 2026); trees were handled with ape v. 5.8-1 (Paradis &amp; Schliep, 2019). We orchestrated the simulations with targets v. 1.12.0 (Landau, 2021) and crew v. 1.3.3 (Landau, 2026) in a Docker image, with seeds derived from a single pipeline seed (Appendix S1). Code is available in an anonymized archive for review (https://doi.org/10.5281/zenodo.23500661), together with the rates aggregated by condition and the scripts that compute the performance measures and the models from them, which reproduce every table and figure without rerunning the simulations.</w:t>
       </w:r>
     </w:p>
-    <w:bookmarkEnd w:id="35"/>
     <w:bookmarkEnd w:id="36"/>
-    <w:bookmarkStart w:id="53" w:name="results"/>
+    <w:bookmarkEnd w:id="37"/>
+    <w:bookmarkStart w:id="54" w:name="results"/>
     <w:p>
       <w:pPr>
         <w:pStyle w:val="Heading1"/>
@@ -2230,7 +2286,7 @@
       <w:tr>
         <w:tc>
           <w:tcPr/>
-          <w:bookmarkStart w:id="40" w:name="fig-type1"/>
+          <w:bookmarkStart w:id="41" w:name="fig-type1"/>
           <w:p>
             <w:pPr>
               <w:pStyle w:val="Compact"/>
@@ -2241,18 +2297,18 @@
                 <wp:inline>
                   <wp:extent cx="5753100" cy="4738352"/>
                   <wp:effectExtent b="0" l="0" r="0" t="0"/>
-                  <wp:docPr descr="" title="" id="38" name="Picture"/>
+                  <wp:docPr descr="" title="" id="39" name="Picture"/>
                   <a:graphic>
                     <a:graphicData uri="http://schemas.openxmlformats.org/drawingml/2006/picture">
                       <pic:pic>
                         <pic:nvPicPr>
-                          <pic:cNvPr descr="figures/fig2_type1.png" id="39" name="Picture"/>
+                          <pic:cNvPr descr="figures/fig2_type1.png" id="40" name="Picture"/>
                           <pic:cNvPicPr>
                             <a:picLocks noChangeArrowheads="1" noChangeAspect="1"/>
                           </pic:cNvPicPr>
                         </pic:nvPicPr>
                         <pic:blipFill>
-                          <a:blip r:embed="rId37"/>
+                          <a:blip r:embed="rId38"/>
                           <a:stretch>
                             <a:fillRect/>
                           </a:stretch>
@@ -2292,7 +2348,7 @@
               <w:t xml:space="preserve">Figure 2: Type I error of each test over the γ × Colless grid at N = 100 with incidence data (posterior medians of the beta-binomial model). Notice that rows S0 to S2h are almost uniform across the grid, whereas GLM PCPS2 doubles its rejection rate in the low-γ cells of S2σ.</w:t>
             </w:r>
           </w:p>
-          <w:bookmarkEnd w:id="40"/>
+          <w:bookmarkEnd w:id="41"/>
         </w:tc>
       </w:tr>
     </w:tbl>
@@ -2328,7 +2384,7 @@
       <w:tr>
         <w:tc>
           <w:tcPr/>
-          <w:bookmarkStart w:id="44" w:name="fig-power"/>
+          <w:bookmarkStart w:id="45" w:name="fig-power"/>
           <w:p>
             <w:pPr>
               <w:pStyle w:val="Compact"/>
@@ -2339,18 +2395,18 @@
                 <wp:inline>
                   <wp:extent cx="5753100" cy="3044241"/>
                   <wp:effectExtent b="0" l="0" r="0" t="0"/>
-                  <wp:docPr descr="" title="" id="42" name="Picture"/>
+                  <wp:docPr descr="" title="" id="43" name="Picture"/>
                   <a:graphic>
                     <a:graphicData uri="http://schemas.openxmlformats.org/drawingml/2006/picture">
                       <pic:pic>
                         <pic:nvPicPr>
-                          <pic:cNvPr descr="figures/fig3_power.png" id="43" name="Picture"/>
+                          <pic:cNvPr descr="figures/fig3_power.png" id="44" name="Picture"/>
                           <pic:cNvPicPr>
                             <a:picLocks noChangeArrowheads="1" noChangeAspect="1"/>
                           </pic:cNvPicPr>
                         </pic:nvPicPr>
                         <pic:blipFill>
-                          <a:blip r:embed="rId41"/>
+                          <a:blip r:embed="rId42"/>
                           <a:stretch>
                             <a:fillRect/>
                           </a:stretch>
@@ -2390,7 +2446,7 @@
               <w:t xml:space="preserve">Figure 3: Power of each test over the γ × Colless grid at N = 100 with incidence data (posterior medians). Notice that the low-γ rows lose power in GLM PCPS1 and PCC, whereas PERMANOVA keeps a similar power in every cell.</w:t>
             </w:r>
           </w:p>
-          <w:bookmarkEnd w:id="44"/>
+          <w:bookmarkEnd w:id="45"/>
         </w:tc>
       </w:tr>
     </w:tbl>
@@ -2426,7 +2482,7 @@
       <w:tr>
         <w:tc>
           <w:tcPr/>
-          <w:bookmarkStart w:id="48" w:name="fig-layerB"/>
+          <w:bookmarkStart w:id="49" w:name="fig-layerB"/>
           <w:p>
             <w:pPr>
               <w:pStyle w:val="Compact"/>
@@ -2437,18 +2493,18 @@
                 <wp:inline>
                   <wp:extent cx="5753100" cy="3723605"/>
                   <wp:effectExtent b="0" l="0" r="0" t="0"/>
-                  <wp:docPr descr="" title="" id="46" name="Picture"/>
+                  <wp:docPr descr="" title="" id="47" name="Picture"/>
                   <a:graphic>
                     <a:graphicData uri="http://schemas.openxmlformats.org/drawingml/2006/picture">
                       <pic:pic>
                         <pic:nvPicPr>
-                          <pic:cNvPr descr="figures/fig4_layerB_power.png" id="47" name="Picture"/>
+                          <pic:cNvPr descr="figures/fig4_layerB_power.png" id="48" name="Picture"/>
                           <pic:cNvPicPr>
                             <a:picLocks noChangeArrowheads="1" noChangeAspect="1"/>
                           </pic:cNvPicPr>
                         </pic:nvPicPr>
                         <pic:blipFill>
-                          <a:blip r:embed="rId45"/>
+                          <a:blip r:embed="rId46"/>
                           <a:stretch>
                             <a:fillRect/>
                           </a:stretch>
@@ -2488,7 +2544,7 @@
               <w:t xml:space="preserve">Figure 4: Power in Layer B by assembly archetype and pool tree cell at N = 100 (posterior medians and 95% credible intervals). Notice that mass effects (orange) lower the power of every test except GLM PCPS2 and almost abolish that of the PCC, and that phylogenetic competition under mass effects (pink) recovers part of the power lost.</w:t>
             </w:r>
           </w:p>
-          <w:bookmarkEnd w:id="48"/>
+          <w:bookmarkEnd w:id="49"/>
         </w:tc>
       </w:tr>
     </w:tbl>
@@ -2532,7 +2588,7 @@
       <w:tr>
         <w:tc>
           <w:tcPr/>
-          <w:bookmarkStart w:id="52" w:name="fig-clade"/>
+          <w:bookmarkStart w:id="53" w:name="fig-clade"/>
           <w:p>
             <w:pPr>
               <w:pStyle w:val="Compact"/>
@@ -2543,18 +2599,18 @@
                 <wp:inline>
                   <wp:extent cx="5416061" cy="2886935"/>
                   <wp:effectExtent b="0" l="0" r="0" t="0"/>
-                  <wp:docPr descr="" title="" id="50" name="Picture"/>
+                  <wp:docPr descr="" title="" id="51" name="Picture"/>
                   <a:graphic>
                     <a:graphicData uri="http://schemas.openxmlformats.org/drawingml/2006/picture">
                       <pic:pic>
                         <pic:nvPicPr>
-                          <pic:cNvPr descr="figures/fig5_clade.png" id="51" name="Picture"/>
+                          <pic:cNvPr descr="figures/fig5_clade.png" id="52" name="Picture"/>
                           <pic:cNvPicPr>
                             <a:picLocks noChangeArrowheads="1" noChangeAspect="1"/>
                           </pic:cNvPicPr>
                         </pic:nvPicPr>
                         <pic:blipFill>
-                          <a:blip r:embed="rId49"/>
+                          <a:blip r:embed="rId50"/>
                           <a:stretch>
                             <a:fillRect/>
                           </a:stretch>
@@ -2594,12 +2650,12 @@
               <w:t xml:space="preserve">Figure 5: Probability of recovering the planted clade over the γ × Colless grid at N = 100, incidence data and a shift of 2 (posterior medians), for basal (old) and recent (young) clades. Notice that PCPS gains markedly with low γ and PCC changes in opposite directions for basal and recent clades, whereas evoPCA and phylofactorization recover the clade at a similar rate in every cell.</w:t>
             </w:r>
           </w:p>
-          <w:bookmarkEnd w:id="52"/>
+          <w:bookmarkEnd w:id="53"/>
         </w:tc>
       </w:tr>
     </w:tbl>
-    <w:bookmarkEnd w:id="53"/>
-    <w:bookmarkStart w:id="58" w:name="Xada27c83b7f8db009b1df1795077522469ebf9f"/>
+    <w:bookmarkEnd w:id="54"/>
+    <w:bookmarkStart w:id="59" w:name="Xada27c83b7f8db009b1df1795077522469ebf9f"/>
     <w:p>
       <w:pPr>
         <w:pStyle w:val="Heading1"/>
@@ -2648,7 +2704,7 @@
       <w:tr>
         <w:tc>
           <w:tcPr/>
-          <w:bookmarkStart w:id="57" w:name="fig-box1"/>
+          <w:bookmarkStart w:id="58" w:name="fig-box1"/>
           <w:p>
             <w:pPr>
               <w:pStyle w:val="Compact"/>
@@ -2659,18 +2715,18 @@
                 <wp:inline>
                   <wp:extent cx="4890135" cy="3261010"/>
                   <wp:effectExtent b="0" l="0" r="0" t="0"/>
-                  <wp:docPr descr="" title="" id="55" name="Picture"/>
+                  <wp:docPr descr="" title="" id="56" name="Picture"/>
                   <a:graphic>
                     <a:graphicData uri="http://schemas.openxmlformats.org/drawingml/2006/picture">
                       <pic:pic>
                         <pic:nvPicPr>
-                          <pic:cNvPr descr="figures/box1_pools.png" id="56" name="Picture"/>
+                          <pic:cNvPr descr="figures/box1_pools.png" id="57" name="Picture"/>
                           <pic:cNvPicPr>
                             <a:picLocks noChangeArrowheads="1" noChangeAspect="1"/>
                           </pic:cNvPicPr>
                         </pic:nvPicPr>
                         <pic:blipFill>
-                          <a:blip r:embed="rId54"/>
+                          <a:blip r:embed="rId55"/>
                           <a:stretch>
                             <a:fillRect/>
                           </a:stretch>
@@ -2710,12 +2766,12 @@
               <w:t xml:space="preserve">Figure 6: Tree shape of three nested regional pools of anurans (filled points and bars, median and 2.5–97.5% quantiles across 100 bootstrap trees; open diamonds, point-estimate tree) against the targets of the simulation grid (open symbols, by N) and the anuran clades with 40–250 tips of Portik et al. (2023) (grey points). Notice that the pools fall inside the grid and close to its Yule and median levels, and that the point-estimate tree has a lower γ than most bootstrap trees.</w:t>
             </w:r>
           </w:p>
-          <w:bookmarkEnd w:id="57"/>
+          <w:bookmarkEnd w:id="58"/>
         </w:tc>
       </w:tr>
     </w:tbl>
-    <w:bookmarkEnd w:id="58"/>
-    <w:bookmarkStart w:id="59" w:name="discussion"/>
+    <w:bookmarkEnd w:id="59"/>
+    <w:bookmarkStart w:id="60" w:name="discussion"/>
     <w:p>
       <w:pPr>
         <w:pStyle w:val="Heading1"/>
@@ -2820,8 +2876,8 @@
         <w:t xml:space="preserve">In summary, we recommend that empirical studies (i) report γ and the normalized Colless index of the analysed tree, since tree shape changes the power and the ranking of the tests; (ii) not rely on a single test, since the ranking of the tests changed with tree shape, N and dispersal, and prefer PERMANOVA with the max test to tests on single PCPS axes or phylogenetic eigenvectors when the tree has very negative γ and the pool has 100 or more species; (iii) interpret the second PCPS axis and the PCC with caution when niche breadth may be phylogenetically conserved; (iv) interpret a lack of power under high dispersal as a property of the metacommunity rather than as evidence against niche-based assembly; and (v) use evoPCA or phylofactorization, rather than PCPS axes, to identify the clades associated with a gradient. These recommendations seem to hold across the range of tree shapes found in anuran clades with negative γ, but they remain to be tested in trees with γ &gt; 0 and in spatially structured metacommunities.</w:t>
       </w:r>
     </w:p>
-    <w:bookmarkEnd w:id="59"/>
-    <w:bookmarkStart w:id="60" w:name="references-verified"/>
+    <w:bookmarkEnd w:id="60"/>
+    <w:bookmarkStart w:id="61" w:name="references-verified"/>
     <w:p>
       <w:pPr>
         <w:pStyle w:val="Heading1"/>
@@ -2943,6 +2999,27 @@
         <w:pStyle w:val="BodyText"/>
       </w:pPr>
       <w:r>
+        <w:t xml:space="preserve">Blum, M. G. B., &amp; François, O. (2006). Which random processes describe the tree of life? A large-scale study of phylogenetic tree imbalance.</w:t>
+      </w:r>
+      <w:r>
+        <w:t xml:space="preserve"> </w:t>
+      </w:r>
+      <w:r>
+        <w:rPr>
+          <w:i/>
+          <w:iCs/>
+        </w:rPr>
+        <w:t xml:space="preserve">Systematic Biology</w:t>
+      </w:r>
+      <w:r>
+        <w:t xml:space="preserve">, 55, 685–691. https://doi.org/10.1080/10635150600889625</w:t>
+      </w:r>
+    </w:p>
+    <w:p>
+      <w:pPr>
+        <w:pStyle w:val="BodyText"/>
+      </w:pPr>
+      <w:r>
         <w:t xml:space="preserve">Borregaard, M. K., Rahbek, C., Fjeldså, J., Parra, J. L., Whittaker, R. J., &amp; Graham, C. H. (2014). Node-based analysis of species distributions.</w:t>
       </w:r>
       <w:r>
@@ -2985,6 +3062,27 @@
         <w:pStyle w:val="BodyText"/>
       </w:pPr>
       <w:r>
+        <w:t xml:space="preserve">ter Braak, C. J. F., Cormont, A., &amp; Dray, S. (2012). Improved testing of species traits–environment relationships in the fourth-corner problem.</w:t>
+      </w:r>
+      <w:r>
+        <w:t xml:space="preserve"> </w:t>
+      </w:r>
+      <w:r>
+        <w:rPr>
+          <w:i/>
+          <w:iCs/>
+        </w:rPr>
+        <w:t xml:space="preserve">Ecology</w:t>
+      </w:r>
+      <w:r>
+        <w:t xml:space="preserve">, 93, 1525–1526. https://doi.org/10.1890/12-0126.1</w:t>
+      </w:r>
+    </w:p>
+    <w:p>
+      <w:pPr>
+        <w:pStyle w:val="BodyText"/>
+      </w:pPr>
+      <w:r>
         <w:t xml:space="preserve">ter Braak, C. J. F., Peres-Neto, P. R., &amp; Dray, S. (2017). A critical issue in model-based inference for studying trait-based community assembly and a solution.</w:t>
       </w:r>
       <w:r>
@@ -3245,6 +3343,27 @@
         <w:pStyle w:val="BodyText"/>
       </w:pPr>
       <w:r>
+        <w:t xml:space="preserve">Duarte, L. D. S., Both, C., Debastiani, V. J., Carlucci, M. B., Gonçalves, L. O., Cappelatti, L., Seger, G. D. S., Bastazini, V. A. G., Brum, F. T., Salengue, E. V., &amp; Bernardo-Silva, J. S. (2014). Climate effects on amphibian distributions depend on phylogenetic resolution and the biogeographical history of taxa.</w:t>
+      </w:r>
+      <w:r>
+        <w:t xml:space="preserve"> </w:t>
+      </w:r>
+      <w:r>
+        <w:rPr>
+          <w:i/>
+          <w:iCs/>
+        </w:rPr>
+        <w:t xml:space="preserve">Global Ecology and Biogeography</w:t>
+      </w:r>
+      <w:r>
+        <w:t xml:space="preserve">, 23, 213–222. https://doi.org/10.1111/geb.12089</w:t>
+      </w:r>
+    </w:p>
+    <w:p>
+      <w:pPr>
+        <w:pStyle w:val="BodyText"/>
+      </w:pPr>
+      <w:r>
         <w:t xml:space="preserve">Duarte, L. D. S., Debastiani, V. J., Carlucci, M. B., &amp; Diniz-Filho, J. A. F. (2018). Analyzing community-weighted trait means across environmental gradients: should phylogeny stay or should it go?</w:t>
       </w:r>
       <w:r>
@@ -3421,6 +3540,27 @@
         <w:pStyle w:val="BodyText"/>
       </w:pPr>
       <w:r>
+        <w:t xml:space="preserve">Heard, S. B. (1992). Patterns in tree balance among cladistic, phenetic, and randomly generated phylogenetic trees.</w:t>
+      </w:r>
+      <w:r>
+        <w:t xml:space="preserve"> </w:t>
+      </w:r>
+      <w:r>
+        <w:rPr>
+          <w:i/>
+          <w:iCs/>
+        </w:rPr>
+        <w:t xml:space="preserve">Evolution</w:t>
+      </w:r>
+      <w:r>
+        <w:t xml:space="preserve">, 46, 1818–1826. https://doi.org/10.1111/j.1558-5646.1992.tb01171.x</w:t>
+      </w:r>
+    </w:p>
+    <w:p>
+      <w:pPr>
+        <w:pStyle w:val="BodyText"/>
+      </w:pPr>
+      <w:r>
         <w:t xml:space="preserve">Janzen, T., &amp; Etienne, R. S. (2024). Phylogenetic tree statistics: a systematic overview using the new R package treestats.</w:t>
       </w:r>
       <w:r>
@@ -3492,6 +3632,48 @@
         <w:pStyle w:val="BodyText"/>
       </w:pPr>
       <w:r>
+        <w:t xml:space="preserve">Leibold, M. A., Economo, E. P., &amp; Peres-Neto, P. (2010). Metacommunity phylogenetics: separating the roles of environmental filters and historical biogeography.</w:t>
+      </w:r>
+      <w:r>
+        <w:t xml:space="preserve"> </w:t>
+      </w:r>
+      <w:r>
+        <w:rPr>
+          <w:i/>
+          <w:iCs/>
+        </w:rPr>
+        <w:t xml:space="preserve">Ecology Letters</w:t>
+      </w:r>
+      <w:r>
+        <w:t xml:space="preserve">, 13, 1290–1299. https://doi.org/10.1111/j.1461-0248.2010.01523.x</w:t>
+      </w:r>
+    </w:p>
+    <w:p>
+      <w:pPr>
+        <w:pStyle w:val="BodyText"/>
+      </w:pPr>
+      <w:r>
+        <w:t xml:space="preserve">Leibold, M. A., Holyoak, M., Mouquet, N., Amarasekare, P., Chase, J. M., Hoopes, M. F., Holt, R. D., Shurin, J. B., Law, R., Tilman, D., Loreau, M., &amp; Gonzalez, A. (2004). The metacommunity concept: a framework for multi-scale community ecology.</w:t>
+      </w:r>
+      <w:r>
+        <w:t xml:space="preserve"> </w:t>
+      </w:r>
+      <w:r>
+        <w:rPr>
+          <w:i/>
+          <w:iCs/>
+        </w:rPr>
+        <w:t xml:space="preserve">Ecology Letters</w:t>
+      </w:r>
+      <w:r>
+        <w:t xml:space="preserve">, 7, 601–613. https://doi.org/10.1111/j.1461-0248.2004.00608.x</w:t>
+      </w:r>
+    </w:p>
+    <w:p>
+      <w:pPr>
+        <w:pStyle w:val="BodyText"/>
+      </w:pPr>
+      <w:r>
         <w:t xml:space="preserve">Li, D., &amp; Ives, A. R. (2017). The statistical need to include phylogeny in trait-based analyses of community composition.</w:t>
       </w:r>
       <w:r>
@@ -3681,6 +3863,27 @@
         <w:pStyle w:val="BodyText"/>
       </w:pPr>
       <w:r>
+        <w:t xml:space="preserve">Münkemüller, T., Gallien, L., Pollock, L. J., Barros, C., Carboni, M., Chalmandrier, L., Mazel, F., Mokany, K., Roquet, C., Smyčka, J., Talluto, M. V., &amp; Thuiller, W. (2020). Dos and don’ts when inferring assembly rules from diversity patterns.</w:t>
+      </w:r>
+      <w:r>
+        <w:t xml:space="preserve"> </w:t>
+      </w:r>
+      <w:r>
+        <w:rPr>
+          <w:i/>
+          <w:iCs/>
+        </w:rPr>
+        <w:t xml:space="preserve">Global Ecology and Biogeography</w:t>
+      </w:r>
+      <w:r>
+        <w:t xml:space="preserve">, 29, 1212–1229. https://doi.org/10.1111/geb.13098</w:t>
+      </w:r>
+    </w:p>
+    <w:p>
+      <w:pPr>
+        <w:pStyle w:val="BodyText"/>
+      </w:pPr>
+      <w:r>
         <w:t xml:space="preserve">Münkemüller, T., Lavergne, S., Bzeznik, B., Dray, S., Jombart, T., Schiffers, K., &amp; Thuiller, W. (2012). How to measure and test phylogenetic signal.</w:t>
       </w:r>
       <w:r>
@@ -3752,6 +3955,27 @@
         <w:pStyle w:val="BodyText"/>
       </w:pPr>
       <w:r>
+        <w:t xml:space="preserve">Parra, J. L., McGuire, J. A., &amp; Graham, C. H. (2010). Incorporating clade identity in analyses of phylogenetic community structure: an example with hummingbirds.</w:t>
+      </w:r>
+      <w:r>
+        <w:t xml:space="preserve"> </w:t>
+      </w:r>
+      <w:r>
+        <w:rPr>
+          <w:i/>
+          <w:iCs/>
+        </w:rPr>
+        <w:t xml:space="preserve">The American Naturalist</w:t>
+      </w:r>
+      <w:r>
+        <w:t xml:space="preserve">, 176, 573–587. https://doi.org/10.1086/656619</w:t>
+      </w:r>
+    </w:p>
+    <w:p>
+      <w:pPr>
+        <w:pStyle w:val="BodyText"/>
+      </w:pPr>
+      <w:r>
         <w:t xml:space="preserve">Pavoine, S. (2016). A guide through a family of phylogenetic dissimilarity measures among sites.</w:t>
       </w:r>
       <w:r>
@@ -4025,6 +4249,27 @@
         <w:pStyle w:val="BodyText"/>
       </w:pPr>
       <w:r>
+        <w:t xml:space="preserve">Roelants, K., Gower, D. J., Wilkinson, M., Loader, S. P., Biju, S. D., Guillaume, K., Moriau, L., &amp; Bossuyt, F. (2007). Global patterns of diversification in the history of modern amphibians.</w:t>
+      </w:r>
+      <w:r>
+        <w:t xml:space="preserve"> </w:t>
+      </w:r>
+      <w:r>
+        <w:rPr>
+          <w:i/>
+          <w:iCs/>
+        </w:rPr>
+        <w:t xml:space="preserve">Proceedings of the National Academy of Sciences</w:t>
+      </w:r>
+      <w:r>
+        <w:t xml:space="preserve">, 104, 887–892. https://doi.org/10.1073/pnas.0608378104</w:t>
+      </w:r>
+    </w:p>
+    <w:p>
+      <w:pPr>
+        <w:pStyle w:val="BodyText"/>
+      </w:pPr>
+      <w:r>
         <w:t xml:space="preserve">Thompson, P. L., Guzman, L. M., De Meester, L., Horváth, Z., Ptacnik, R., Vanschoenwinkel, B., Viana, D. S., &amp; Chase, J. M. (2020). A process-based metacommunity framework linking local and regional scale community ecology.</w:t>
       </w:r>
       <w:r>
@@ -4133,7 +4378,28 @@
         <w:t xml:space="preserve">, 15, 1926–1939. https://doi.org/10.1111/2041-210X.14415</w:t>
       </w:r>
     </w:p>
-    <w:bookmarkEnd w:id="60"/>
+    <w:p>
+      <w:pPr>
+        <w:pStyle w:val="BodyText"/>
+      </w:pPr>
+      <w:r>
+        <w:t xml:space="preserve">Zelený, D. (2018). Which results of the standard test for community-weighted mean approach are too optimistic?</w:t>
+      </w:r>
+      <w:r>
+        <w:t xml:space="preserve"> </w:t>
+      </w:r>
+      <w:r>
+        <w:rPr>
+          <w:i/>
+          <w:iCs/>
+        </w:rPr>
+        <w:t xml:space="preserve">Journal of Vegetation Science</w:t>
+      </w:r>
+      <w:r>
+        <w:t xml:space="preserve">, 29, 953–966. https://doi.org/10.1111/jvs.12688</w:t>
+      </w:r>
+    </w:p>
+    <w:bookmarkEnd w:id="61"/>
     <w:sectPr>
       <w:footerReference r:id="rId9" w:type="default"/>
       <w:footnotePr>

</xml_diff>

<commit_message>
Introduction e abstract: correções da revisão de exatidão
Co-Authored-By: Claude Opus 5.5 <noreply@anthropic.com>
</commit_message>
<xml_diff>
--- a/manuscript/methods_results.docx
+++ b/manuscript/methods_results.docx
@@ -54,7 +54,7 @@
         </w:numPr>
       </w:pPr>
       <w:r>
-        <w:t xml:space="preserve">We simulated metacommunities on a grid of tree shapes that crossed the distribution of branching times (γ) with topological imbalance (Colless index), with levels from anuran clades, in a static layer that reproduces the original validations and in a process-based layer with species sorting, mass effects and phylogenetic competition. We estimated the type I error and power of six tests, and how often four ordination and factorization methods recovered a clade planted along the gradient, with beta-binomial models of these rates.</w:t>
+        <w:t xml:space="preserve">We simulated metacommunities on a grid of tree shapes that crossed the distribution of branching times (γ) with topological imbalance (Colless index), with levels from anuran clades, in a static layer reproducing the original validations and a process-based layer with species sorting, mass effects and phylogenetic competition. We modelled the type I error and power of six tests, and clade recovery by four ordination and factorization methods, with beta-binomial models.</w:t>
       </w:r>
     </w:p>
     <w:p>
@@ -65,7 +65,7 @@
         </w:numPr>
       </w:pPr>
       <w:r>
-        <w:t xml:space="preserve">Tree imbalance did not affect the type I error of any test. Phylogenetic signal in niche breadth inflated the type I error of the linear model on the second PCPS axis, up to 0.36 in trees with low γ, and of the PCC, up to 0.22. Low γ reduced the power of the linear model on the first PCPS axis by 0.40 and that of the PCC by 0.25, whereas PERMANOVA was less sensitive to tree shape. Mass effects reduced the power of almost every test more than tree shape did and almost abolished that of the PCC. The evoPCA and phylofactorization recovered the planted clade in 0.44–0.88 of the replicates regardless of γ, whereas PCPS depended strongly on γ and PCC rarely found the clade.</w:t>
+        <w:t xml:space="preserve">Tree imbalance did not affect the type I error of any test. Phylogenetic signal in niche breadth inflated the type I error of the linear model on the second PCPS axis, up to 0.36 with low γ and 200 species, and of the PCC, up to 0.22. With 100 species, low γ reduced the power of the linear model on the first PCPS axis by 0.40 and that of the PCC by 0.25, whereas PERMANOVA was less sensitive to tree shape. Mass effects reduced the power of every test except the second PCPS axis, by 0.55–0.93 in Yule trees, and almost abolished that of the PCC. With the largest shift, evoPCA and phylofactorization recovered a planted clade in 0.44–0.88 of the replicates regardless of γ, whereas PCPS depended strongly on γ and PCC rarely found the clade.</w:t>
       </w:r>
     </w:p>
     <w:p>
@@ -110,7 +110,7 @@
         <w:pStyle w:val="FirstParagraph"/>
       </w:pPr>
       <w:r>
-        <w:t xml:space="preserve">The phylogenetic composition of communities along environmental gradients carries information about how lineages respond to the environment and how metacommunities are assembled (Leibold et al., 2010; Pillar &amp; Duarte, 2010). Several methods relate the phylogenetic structure of a metacommunity to an environmental gradient. Phylogenetic fuzzy weighting summarizes each site by the phylogeny-weighted composition of its species, the matrix</w:t>
+        <w:t xml:space="preserve">The phylogenetic composition of communities along environmental gradients carries information about how lineages respond to the environment and how metacommunities are assembled (Leibold et al., 2010). Several methods relate the phylogenetic structure of a metacommunity to an environmental gradient. Phylogenetic fuzzy weighting summarizes each site by the phylogeny-weighted composition of its species, the matrix</w:t>
       </w:r>
       <w:r>
         <w:t xml:space="preserve"> </w:t>
@@ -132,23 +132,23 @@
         <w:pStyle w:val="BodyText"/>
       </w:pPr>
       <w:r>
-        <w:t xml:space="preserve">The validation of these methods has focused on the type I error of permutation tests. When either the phylogeny or the environment alone structures species distributions, tests that permute only sites or only species reject the null hypothesis too often, and the largest of the two P-values (max test) is needed to control the type I error (ter Braak et al., 2012; Peres-Neto &amp; Kembel, 2015; Duarte et al., 2016). The same problem affects tests on community-weighted means (Peres-Neto et al., 2017; Zelený, 2018), whose type I error also increases when traits and species distributions carry phylogenetic signal (Duarte et al., 2018). However, the simulations that established these results drew species niches from a static Gaussian response model (Peres-Neto et al., 2012), on trees close to the Yule model or from a pure-birth process (Duarte et al., 2016; Pavoine, 2016), and with niche breadth and maximum abundance independent of the phylogeny (Duarte et al., 2016; Peres-Neto et al., 2017). Real phylogenies and real metacommunities depart from each of these assumptions.</w:t>
-      </w:r>
-    </w:p>
-    <w:p>
-      <w:pPr>
-        <w:pStyle w:val="BodyText"/>
-      </w:pPr>
-      <w:r>
-        <w:t xml:space="preserve">First, real trees are more imbalanced than Yule trees (Heard, 1992; Blum &amp; François, 2006), and a slowdown in diversification towards the present, that is, a negative γ statistic (Pybus &amp; Harvey, 2000), was found in most clades of a large compilation of phylogenies (McPeek, 2008) and in many clades of birds (Phillimore &amp; Price, 2008). Anurans are a clear case, since most living frogs descend from a few lineages that radiated rapidly in the late Cretaceous and early Paleogene (Roelants et al., 2007; Feng et al., 2017). Tree shape changes the expected values and the power of phylogenetic statistics (Münkemüller et al., 2012), the phylogenetic depth that community metrics respond to (Mazel et al., 2016) and the eigenstructure of phylogenetic matrices (Diniz-Filho et al., 1998), which is what PCPS and the PCC summarize. Nonetheless, to our knowledge, no study has evaluated how the distribution of branching times and the imbalance of the tree affect tests on phylogeny-weighted composition. Second, species are not sorted along gradients in isolation. In metacommunities, dispersal and competition interact with environmental filtering (Leibold et al., 2004), and high dispersal homogenizes composition among sites (Mouquet &amp; Loreau, 2003). Dispersal can alter the outcome of community phylogenetic tests (Kembel, 2009; Mason &amp; Pavoine, 2013), and inferring assembly from diversity patterns requires accounting for these processes (Münkemüller et al., 2020). Process-based models now generate species sorting, mass effects and competition from local population dynamics and dispersal (Thompson et al., 2020), which allows these methods to be evaluated under the processes they are meant to detect.</w:t>
-      </w:r>
-    </w:p>
-    <w:p>
-      <w:pPr>
-        <w:pStyle w:val="BodyText"/>
-      </w:pPr>
-      <w:r>
-        <w:t xml:space="preserve">Third, a significant association between phylogenetic composition and the environment does not tell which lineages are responsible for it. Identifying the clades that respond to a gradient is a recurrent aim of metacommunity phylogenetics (Parra et al., 2010; Borregaard et al., 2014), and PCPS has been used for that purpose by examining the nodes associated with its axes (Duarte et al., 2012). However, how often PCPS, PCC and branch-wise methods identify the correct clade, and whether this depends on tree shape, has not been evaluated with a known answer.</w:t>
+        <w:t xml:space="preserve">The validation of these methods has focused on the type I error of permutation tests. When either the phylogeny or the environment alone structures species distributions, tests that permute only sites or only species reject the null hypothesis too often, and the largest of the two P-values (max test) is needed to control the type I error (ter Braak et al., 2012; Peres-Neto &amp; Kembel, 2015; Duarte et al., 2016). The same problem affects tests on community-weighted means (Peres-Neto et al., 2017; Zelený, 2018), whose type I error also increases when traits and species distributions carry phylogenetic signal (Duarte et al., 2018). However, the simulations that validated phylogenetic fuzzy weighting, the PCC and phylogenetic dissimilarity tests drew species niches from a static Gaussian response model (Peres-Neto et al., 2012), on trees from a pure-birth process (Peres-Neto &amp; Kembel, 2015; Duarte et al., 2016; Pavoine, 2016), and with niche breadth independent of the phylogeny (Peres-Neto &amp; Kembel, 2015; Duarte et al., 2016; Peres-Neto et al., 2017). Real phylogenies and real metacommunities depart from each of these assumptions.</w:t>
+      </w:r>
+    </w:p>
+    <w:p>
+      <w:pPr>
+        <w:pStyle w:val="BodyText"/>
+      </w:pPr>
+      <w:r>
+        <w:t xml:space="preserve">First, the topology of real trees departs from the Yule model (Heard, 1992; Blum &amp; François, 2006), and a slowdown in diversification towards the present, that is, a negative γ statistic (Pybus &amp; Harvey, 2000), was found in most clades of a large compilation of phylogenies (McPeek, 2008) and in many clades of birds (Phillimore &amp; Price, 2008). Anurans are a likely case, since most living frogs descend from a few lineages that radiated rapidly in the late Cretaceous and early Paleogene (Roelants et al., 2007; Feng et al., 2017). The size and topology of the tree change the expected values of phylogenetic signal indices (Münkemüller et al., 2012), the distribution of branch lengths changes whether community metrics, which weight different phylogenetic depths, detect clustering (Mazel et al., 2016), and topology sets the eigenstructure of phylogenetic matrices (Diniz-Filho et al., 1998), which is what PCPS and the PCC summarize. Nonetheless, to our knowledge, no study has evaluated how the distribution of branching times and the imbalance of the tree affect tests on phylogeny-weighted composition. Second, species are not sorted along gradients in isolation. In metacommunities, dispersal and competition interact with environmental filtering (Leibold et al., 2004), and high dispersal homogenizes composition among sites (Mouquet &amp; Loreau, 2003). Dispersal can alter the outcome of community phylogenetic tests (Kembel, 2009; Mason &amp; Pavoine, 2013), and inferring assembly from diversity patterns requires accounting for these processes (Münkemüller et al., 2020). Process-based models now generate species sorting, mass effects and competition from local population dynamics and dispersal (Thompson et al., 2020), which allows these methods to be evaluated under the processes they are meant to detect.</w:t>
+      </w:r>
+    </w:p>
+    <w:p>
+      <w:pPr>
+        <w:pStyle w:val="BodyText"/>
+      </w:pPr>
+      <w:r>
+        <w:t xml:space="preserve">Third, a significant association between phylogenetic composition and the environment does not tell which lineages are responsible for it. Identifying the clades that respond to a gradient is a recurrent aim of metacommunity phylogenetics (Parra et al., 2010; Borregaard et al., 2014), and PCPS has been used for that purpose by examining the nodes associated with its axes (Duarte et al., 2012). However, to our knowledge, how often PCPS, PCC and branch-wise methods identify the correct clade, and whether this depends on tree shape, has not been evaluated with a known answer.</w:t>
       </w:r>
     </w:p>
     <w:p>
@@ -2793,7 +2793,7 @@
         <w:pStyle w:val="BodyText"/>
       </w:pPr>
       <w:r>
-        <w:t xml:space="preserve">Tree imbalance did not affect the type I error of any test, whereas very negative γ reduced the power of the GLM on the first PCPS axis and of the PCC. This agrees with comparative methods, in which randomization tests of phylogenetic signal keep the nominal level (Blomberg et al., 2003), whereas the size and topology of the tree change the expected values and the power of the statistics (Münkemüller et al., 2012). Accordingly, in an empirical case study, the bias of the net relatedness index caused by poor phylogenetic resolution depended on tree shape and consisted mostly of type II errors (Molina-Venegas &amp; Roquet, 2014), and metrics such as the mean pairwise distance, which weight deep branches, respond to the stemminess of the tree (Mazel et al., 2016). The loss of power with low γ seems to follow from how phylogenetic eigenvectors summarize trees with long internal branches near the root. The eigenstructure of a phylogenetic matrix is set by the tree (Diniz-Filho et al., 1998), and in such trees a few deep splits probably dominate it, so the first PCPS axis and the leading eigenvectors of the PCC probably capture the deepest dichotomy even when the gradient sorts species along another one. In contrast, PERMANOVA was less sensitive to γ (no change at N = 100 and a loss of 0.03–0.17 at N = 50), although the Mantel test, which also uses the whole matrix</w:t>
+        <w:t xml:space="preserve">Tree imbalance did not affect the type I error of any test, whereas very negative γ reduced the power of the GLM on the first PCPS axis and of the PCC. This agrees with comparative methods, in which randomization tests of phylogenetic signal keep the nominal level (Blomberg et al., 2003), whereas the size and topology of the tree change the expected values of the statistics (Münkemüller et al., 2012). Accordingly, in an empirical case study, the bias of the net relatedness index caused by poor phylogenetic resolution depended on tree shape and consisted mostly of type II errors (Molina-Venegas &amp; Roquet, 2014), and metrics such as the mean pairwise distance, which weight deep branches, respond to the stemminess of the tree (Mazel et al., 2016). The loss of power with low γ seems to follow from how phylogenetic eigenvectors summarize trees with long internal branches near the root. The eigenstructure of a phylogenetic matrix is set by the tree (Diniz-Filho et al., 1998), and in such trees a few deep splits probably dominate it, so the first PCPS axis and the leading eigenvectors of the PCC probably capture the deepest dichotomy even when the gradient sorts species along another one. In contrast, PERMANOVA was less sensitive to γ (no change at N = 100 and a loss of 0.03–0.17 at N = 50), although the Mantel test, which also uses the whole matrix</w:t>
       </w:r>
       <w:r>
         <w:t xml:space="preserve"> </w:t>

</xml_diff>

<commit_message>
Box 1 e métodos do estudo de caso para o Appendix S3 (Fig. S1); Discussion enxuta; mais detalhes de Methods no Appendix S1
Co-Authored-By: Claude Opus 5.5 <noreply@anthropic.com>
</commit_message>
<xml_diff>
--- a/manuscript/methods_results.docx
+++ b/manuscript/methods_results.docx
@@ -173,7 +173,7 @@
         <w:t xml:space="preserve"> </w:t>
       </w:r>
       <w:r>
-        <w:t xml:space="preserve">are heterogeneous among tips in imbalanced trees (H1); (ii) phylogenetic signal in niche breadth or maximum abundance would inflate the type I error of all tests, with a magnitude that depends on tree shape (H2); (iii) very negative γ, that is, long internal branches near the root, would concentrate variation on the first PCPS axis and favour the recovery of basal over recent clades (H3); and (iv) the ranking of the methods in power and in clade recovery would change with tree shape (H4). Finally, we placed real regional pools of anurans on the simulated grid of tree shapes and applied all methods to three tadpole metacommunities (Box 1).</w:t>
+        <w:t xml:space="preserve">are heterogeneous among tips in imbalanced trees (H1); (ii) phylogenetic signal in niche breadth or maximum abundance would inflate the type I error of all tests, with a magnitude that depends on tree shape (H2); (iii) very negative γ, that is, long internal branches near the root, would concentrate variation on the first PCPS axis and favour the recovery of basal over recent clades (H3); and (iv) the ranking of the methods in power and in clade recovery would change with tree shape (H4). Finally, we placed real regional pools of anurans on the simulated grid of tree shapes and applied all methods to three tadpole metacommunities (Appendix S3).</w:t>
       </w:r>
     </w:p>
     <w:bookmarkEnd w:id="21"/>
@@ -425,7 +425,7 @@
         <w:t xml:space="preserve"> </w:t>
       </w:r>
       <w:r>
-        <w:t xml:space="preserve">to a slowdown in diversification, which produces negative γ. Because γ depends only on the intervals between nodes and the Colless index only on the topology, this construction controls the two axes separately (Appendix S1). We took the levels of the grid from the anuran clades with 40–250 tips of the time-calibrated species-level tree of Portik et al. (2023), with the Colless index normalized against its Yule expectation and both statistics computed with the R package treestats v. 1.71.13 (Janzen &amp; Etienne, 2024). For each pool size N (50, 100 and 200 species, as in Duarte et al., 2016), γ took three levels, namely zero (as in a Yule tree), the median of the empirical clades and their 10% quantile, and the Colless index took three levels, zero, the median and the 90% quantile (Table S1). Thus, the 3 × 3 grid spans the empirical range of anuran tree shapes between the 10% and 90% quantiles, although it has no level with γ &gt; 0, and its Yule × Yule cell approximates the trees used in previous validations (Peres-Neto &amp; Kembel, 2015; Duarte et al., 2016). We drew 1,000 trees per cell and N, and replicate</w:t>
+        <w:t xml:space="preserve">to a slowdown in diversification, which produces negative γ. Because γ depends only on the intervals between nodes and the Colless index only on the topology, this construction controls the two axes separately (Appendix S1). We took the levels of the grid from the anuran clades with 40–250 tips of the time-calibrated species-level tree of Portik et al. (2023), with the Colless index normalized against its Yule expectation and both statistics computed with the R package treestats v. 1.71.13 (Janzen &amp; Etienne, 2024). For each pool size N (50, 100 and 200 species, as in Duarte et al., 2016), γ took three levels, namely zero (as in a Yule tree), the median of the empirical clades and their 10% quantile, and the Colless index took three levels, zero, the median and the 90% quantile (Table S1). Thus, the 3 × 3 grid spans the anuran tree shapes between the 10% and 90% quantiles, although it has no level with γ &gt; 0. We drew 1,000 trees per cell and N, and replicate</w:t>
       </w:r>
       <w:r>
         <w:t xml:space="preserve"> </w:t>
@@ -996,7 +996,7 @@
         </m:r>
       </m:oMath>
       <w:r>
-        <w:t xml:space="preserve">) in mass effects, and competition was either intraspecific only or also interspecific and structured by phylogeny, so that close relatives competed more strongly. Since competition and dispersal remove species, the cell of the grid defined the tree of the regional pool rather than the tree of the analysed metacommunity, and we calibrated the size of the pool so that the mean number of species left after the dynamics was close to N. Mass effects with phylogenetic competition could not reach N = 200, and we dropped this combination. Layer B used five cells of the grid (the four corners and the centre) and 1,000 replicates per combination.</w:t>
+        <w:t xml:space="preserve">) in mass effects, and competition was either intraspecific only or also interspecific and structured by phylogeny, so that close relatives competed more strongly. Since competition and dispersal remove species, the cell of the grid defined the tree of the regional pool, whose size we calibrated so that about N species were left after the dynamics (Appendix S1); mass effects with phylogenetic competition could not reach N = 200, and we dropped this combination. Layer B used five cells of the grid (the four corners and the centre) and 1,000 replicates per combination.</w:t>
       </w:r>
     </w:p>
     <w:bookmarkEnd w:id="29"/>
@@ -1025,7 +1025,7 @@
         </w:r>
       </w:hyperlink>
       <w:r>
-        <w:t xml:space="preserve">). In S0 and S1, we analysed a gradient independent of the one that generated the data, with species optima without (S0) or with (S1) phylogenetic signal, so any association between phylogenetic structure and the analysed gradient arises by chance. Scenarios S2, S2σ and S2h used the gradient that generated the data with optima without phylogenetic signal, so they estimate the type I error of the phylogenetic component of each test. S2σ and S2h add phylogenetic signal in niche breadth or in maximum abundance, which creates a nuisance structure, that is, a phylogenetic pattern in the data that is not an association between phylogeny and the gradient. The scenarios under the alternative hypothesis had optima with intermediate (S3a, λ = 0.5) or full (S3b, λ = 1) phylogenetic signal, and S3σ added signal in niche breadth. Accordingly, the estimand of every test was its rejection rate at α = 0.05, which is the type I error in S0–S2h and the power in S3a–S3σ. For aim (iii), the estimand was the probability that a method identifies a planted clade.</w:t>
+        <w:t xml:space="preserve">). S0 and S1 used a gradient independent of the one that generated the data, so any association arises by chance. S2, S2σ and S2h used the generating gradient with optima without phylogenetic signal, so they estimate the type I error of the phylogenetic component of each test; S2σ and S2h add phylogenetic signal in niche breadth or in maximum abundance, which creates a nuisance structure, that is, a phylogenetic pattern in the data that is not an association between phylogeny and the gradient. The estimand of every test was its rejection rate at α = 0.05, which is the type I error in S0–S2h and the power in S3a–S3σ. For aim (iii), the estimand was the probability that a method identifies a planted clade.</w:t>
       </w:r>
     </w:p>
     <w:tbl>
@@ -1767,7 +1767,7 @@
         <w:t xml:space="preserve"> </w:t>
       </w:r>
       <w:r>
-        <w:t xml:space="preserve">(RDA PCPS). We re-implemented the phylogenetic community composition approach (PCC) of Peres-Neto and Kembel (2015) from the equations in the original article, using the variance of the adjusted R² across phylogenetic eigenvectors as the test statistic. Every test was evaluated with 999 permutations under two null models, the site shuffle, which permutes the sites, and the taxa shuffle, which permutes the tips of the tree while keeping its topology. We report the largest of the two P-values (max test), which controls the type I error when either null hypothesis holds (Peres-Neto &amp; Kembel, 2015; Duarte et al., 2016). The observed statistics of our permutation code equal those of the R packages vegan v. 2.7-6 (Oksanen et al., 2026) and PCPS v. 1.0.9 (Debastiani, 2026), which we checked in unit tests.</w:t>
+        <w:t xml:space="preserve">(RDA PCPS). We re-implemented the phylogenetic community composition approach (PCC) of Peres-Neto and Kembel (2015) from the equations in the original article, using the variance of the adjusted R² across phylogenetic eigenvectors as the test statistic. Every test was evaluated with 999 permutations under two null models, the site shuffle, which permutes the sites, and the taxa shuffle, which permutes the tips of the tree while keeping its topology. We report the largest of the two P-values (max test), which controls the type I error when either null hypothesis holds (Peres-Neto &amp; Kembel, 2015; Duarte et al., 2016). We checked our permutation code against the R packages vegan and PCPS (Appendix S1).</w:t>
       </w:r>
     </w:p>
     <w:bookmarkEnd w:id="32"/>
@@ -1956,7 +1956,7 @@
         <w:t xml:space="preserve"> </w:t>
       </w:r>
       <w:r>
-        <w:t xml:space="preserve">is the shift and Φ is the standard normal distribution function; the other species therefore had no phylogenetic signal in their optima, and the shift has the same meaning for every tree size. We used shifts of 0.5, 1 and 2, all nine cells of the grid, N = 50, 100 and 200 with incidence data, and N = 100 with abundance data, with 1,000 replicates per combination, and the planted clade, the optima and the gradient of a replicate were the same across shifts and data types. We compared PCPS, PCC, the evolutionary principal component analysis (evoPCA; Pavoine, 2016), computed with the R package adiv v. 2.2.1 (Pavoine, 2020), and phylofactorization (Washburne et al., 2017). Each method gave a score to every internal node: for the three ordinations, the absolute correlation between membership of its clade and the species scores on the axis most correlated with</w:t>
+        <w:t xml:space="preserve">is the shift and Φ is the standard normal distribution function; the other species therefore had no phylogenetic signal in their optima, and the shift has the same meaning for every tree size. We used shifts of 0.5, 1 and 2, all nine cells of the grid, N = 50, 100 and 200 with incidence data, and N = 100 with abundance data, with 1,000 replicates per combination (Appendix S1). We compared PCPS, PCC, the evolutionary principal component analysis (evoPCA; Pavoine, 2016), computed with the R package adiv v. 2.2.1 (Pavoine, 2020), and phylofactorization (Washburne et al., 2017). Each method gave a score to every internal node: for the three ordinations, the absolute correlation between membership of its clade and the species scores on the axis most correlated with</w:t>
       </w:r>
       <w:r>
         <w:t xml:space="preserve"> </w:t>
@@ -2104,44 +2104,7 @@
         </m:r>
       </m:oMath>
       <w:r>
-        <w:t xml:space="preserve"> </w:t>
-      </w:r>
-      <w:r>
-        <w:t xml:space="preserve">and at most 0.016 at</w:t>
-      </w:r>
-      <w:r>
-        <w:t xml:space="preserve"> </w:t>
-      </w:r>
-      <m:oMath>
-        <m:r>
-          <m:t>p</m:t>
-        </m:r>
-        <m:r>
-          <m:rPr>
-            <m:sty m:val="p"/>
-          </m:rPr>
-          <m:t>=</m:t>
-        </m:r>
-        <m:r>
-          <m:t>0.5</m:t>
-        </m:r>
-      </m:oMath>
-      <w:r>
-        <w:t xml:space="preserve">, so a 95% Monte Carlo interval around the nominal level spans about ±0.014. We chose</w:t>
-      </w:r>
-      <w:r>
-        <w:t xml:space="preserve"> </w:t>
-      </w:r>
-      <m:oMath>
-        <m:r>
-          <m:t>K</m:t>
-        </m:r>
-      </m:oMath>
-      <w:r>
-        <w:t xml:space="preserve"> </w:t>
-      </w:r>
-      <w:r>
-        <w:t xml:space="preserve">so that this interval falls within Bradley’s liberal criterion for acceptable type I error, [0.025, 0.075] (Bradley, 1978). We report every rate with its Monte Carlo standard error in Table S2, and the credible intervals of the formal models below include the binomial variation among replicates. We then modelled the rates aggregated by condition with beta-binomial models fitted in the R package brms v. 2.23.0 (Bürkner, 2017) with CmdStan v. 2.39.0 through cmdstanr v. 0.9.0 (Gabry et al., 2025), with one model for the type I error and one for the power in each layer, and one for clade recovery. We entered the levels of γ and of the Colless index as factors, with their interaction, which estimates the full γ × imbalance surface without assuming its form, and let the shape effects differ among tests (or methods), scenarios, N and data type (Appendix S1). The beta-binomial accounts for the dispersion of the rates, which was 2.1–8.5 times larger than binomial in quasibinomial models with the same structure. Priors were declared explicitly on the logit scale, normal(0, 1.5) for the coefficients, normal(−2.9, 1.5) for the intercept of the type I models, centred on logit(0.05), and gamma(2, 0.01) for the precision φ. We checked convergence with the rank-normalized</w:t>
+        <w:t xml:space="preserve">, so a 95% Monte Carlo interval around the nominal level falls within Bradley’s liberal criterion for acceptable type I error, [0.025, 0.075] (Bradley, 1978); every rate and its Monte Carlo standard error are in Table S2. We then modelled the rates aggregated by condition with beta-binomial models fitted in the R package brms v. 2.23.0 (Bürkner, 2017) with CmdStan v. 2.39.0 through cmdstanr v. 0.9.0 (Gabry et al., 2025), with one model for the type I error and one for the power in each layer, and one for clade recovery. We entered the levels of γ and of the Colless index as factors, with their interaction, which estimates the full γ × imbalance surface without assuming its form, and let the shape effects differ among tests (or methods), scenarios, N and data type (Appendix S1). The beta-binomial accounts for the dispersion of the rates, which was 2.1–8.5 times larger than binomial in quasibinomial models with the same structure. Priors were declared explicitly on the logit scale, normal(0, 1.5) for the coefficients, normal(−2.9, 1.5) for the intercept of the type I models, centred on logit(0.05), and gamma(2, 0.01) for the precision φ. We checked convergence with the rank-normalized</w:t>
       </w:r>
       <w:r>
         <w:t xml:space="preserve"> </w:t>
@@ -2177,7 +2140,7 @@
         <w:pStyle w:val="FirstParagraph"/>
       </w:pPr>
       <w:r>
-        <w:t xml:space="preserve">To show where real regional species pools fall in the grid of tree shapes, and how the methods behave with real data, we used 14 tadpole metacommunities compiled from the literature and from unpublished data (Box 1). We harmonized species names with the Amphibian Species of the World (Frost, 2026; through the internal dataset of AmphiNom, updated on 16 October 2025) using the R package AmphiNom v. 1.1.0 (Liedtke, 2019), excluded undetermined taxa, and matched the remaining 123 species to the tips of the Portik et al. (2023) tree. We built three nested pools (Atlantic Forest; Atlantic Forest and interior of São Paulo; all South American metacommunities) pruned the tree to each, and computed γ and the normalized Colless index on the point-estimate tree and on its 100 time-calibrated bootstrap trees. For the case study, we used the metacommunities with at least 10 ponds and pond depth measured in every pond, namely two of the 14 and one additional published dataset: Serra da Bocaina (13 ponds; Provete et al., 2014), southern Brazil (32 ponds; Both et al., 2011) and northwestern São Paulo (40 ponds; Prado &amp; Rossa-Feres, 2014). We applied all tests and the four clade-scoring methods to incidence data with pond depth as the gradient, and also with canopy cover in Bocaina, the variable associated with its phylogenetic composition in a previous analysis with PCPS (Provete, 2018).</w:t>
+        <w:t xml:space="preserve">To place real regional species pools on the grid of tree shapes and to illustrate the methods with real data, we computed γ and the normalized Colless index of three nested regional pools of anurans built from 14 tadpole metacommunities, and applied all tests and clade-scoring methods to three published tadpole metacommunities (Appendix S3).</w:t>
       </w:r>
     </w:p>
     <w:bookmarkEnd w:id="35"/>
@@ -2195,7 +2158,7 @@
         <w:pStyle w:val="FirstParagraph"/>
       </w:pPr>
       <w:r>
-        <w:t xml:space="preserve">We ran all analyses in R v. 4.6.1 (R Core Team, 2026), with the versions of every package recorded in the lockfile of renv v. 1.3.1 (Ushey &amp; Wickham, 2026); trees were handled with ape v. 5.8-1 (Paradis &amp; Schliep, 2019). We orchestrated the simulations with targets v. 1.12.0 (Landau, 2021) and crew v. 1.3.3 (Landau, 2026) in a Docker image, with seeds derived from a single pipeline seed (Appendix S1). Code is available in an anonymized archive for review (https://doi.org/10.5281/zenodo.23500661), together with the rates aggregated by condition and the scripts that compute the performance measures and the models from them, which reproduce every table and figure without rerunning the simulations.</w:t>
+        <w:t xml:space="preserve">We ran all analyses in R v. 4.6.1 (R Core Team, 2026), with the versions of every package recorded in the lockfile of renv v. 1.3.1 (Ushey &amp; Wickham, 2026); trees were handled with ape v. 5.8-1 (Paradis &amp; Schliep, 2019). The simulation pipeline, its computing environment and its seeds are described in Appendix S1. Code is available in an anonymized archive for review (https://doi.org/10.5281/zenodo.23500661), together with the rates aggregated by condition and the scripts that compute the performance measures and the models from them, which reproduce every table and figure without rerunning the simulations.</w:t>
       </w:r>
     </w:p>
     <w:bookmarkEnd w:id="36"/>
@@ -2655,13 +2618,13 @@
       </w:tr>
     </w:tbl>
     <w:bookmarkEnd w:id="54"/>
-    <w:bookmarkStart w:id="59" w:name="Xada27c83b7f8db009b1df1795077522469ebf9f"/>
+    <w:bookmarkStart w:id="55" w:name="discussion"/>
     <w:p>
       <w:pPr>
         <w:pStyle w:val="Heading1"/>
       </w:pPr>
       <w:r>
-        <w:t xml:space="preserve">Box 1. Real pools and real metacommunities</w:t>
+        <w:t xml:space="preserve">Discussion</w:t>
       </w:r>
     </w:p>
     <w:p>
@@ -2669,131 +2632,15 @@
         <w:pStyle w:val="FirstParagraph"/>
       </w:pPr>
       <w:r>
-        <w:t xml:space="preserve">The three regional pools of anurans fell inside the grid of tree shapes (</w:t>
-      </w:r>
-      <w:hyperlink w:anchor="fig-box1">
-        <w:r>
-          <w:rPr>
-            <w:rStyle w:val="Hyperlink"/>
-          </w:rPr>
-          <w:t xml:space="preserve">Fig. 6</w:t>
-        </w:r>
-      </w:hyperlink>
-      <w:r>
-        <w:t xml:space="preserve">). The Atlantic Forest pool (60 species) had γ = −2.51 and a normalized Colless index of 0.67; adding the metacommunities of the interior of São Paulo (81 species) lowered γ to −3.16 with the same Colless index (0.67), and the South American pool (123 species) had γ = −3.90 and a Colless index of 1.99. Thus, γ of the three pools lies between the Yule and the median levels of the grid, and imbalance between the Yule and the median levels except in the largest pool, which lies between the median and the 90% quantile. Across the 100 bootstrap trees of Portik et al. (2023), γ varied by about one unit and the Colless index by up to 1.1 units, and the point-estimate tree sat at the lower edge of the distribution of γ, probably because the bootstrap trees differ in topology and have deeper roots. As a consequence, the low-γ cells, where we found the largest effects of tree shape, are more extreme than these pools, but within the range of the anuran clades used to define the grid.</w:t>
-      </w:r>
-    </w:p>
-    <w:p>
-      <w:pPr>
-        <w:pStyle w:val="BodyText"/>
-      </w:pPr>
-      <w:r>
-        <w:t xml:space="preserve">The three metacommunities of the case study had small trees with contrasting shapes. Bocaina (Provete et al., 2014; 15 species in 13 ponds) and southern Brazil (Both et al., 2011; 21 species in 32 ponds) had negative γ (−1.59 and −1.53), whereas northwestern São Paulo (Prado &amp; Rossa-Feres, 2014; 26 species in 40 ponds) had positive γ (1.39), outside the range of the grid. No test rejected the null hypothesis of no association between phylogenetic structure and pond depth with the max test (all P ≥ 0.107). In Bocaina, canopy cover was marginally associated with phylogenetic composition under the site shuffle (P = 0.048 for PERMANOVA and 0.050–0.053 for GLM PCPS1, RDA PCPS and PCC), but not under the taxa shuffle (P = 0.23–0.56). This seems to indicate that canopy cover is related to the composition of these ponds, in line with the analysis with PCPS of Provete (2018), but that the phylogenetic arrangement of the species adds no detectable signal once the tips are permuted, which is the inference the max test protects. The clade-scoring methods partly agreed: in Bocaina, PCC, evoPCA and phylofactorization chose the same clade of five Dendropsophus and Scinax species along the depth gradient, and in northwestern São Paulo PCC and evoPCA chose the three microhylids; the agreement of the PCC is unexpected, given its poor recovery in the simulations. However, with 13–40 ponds and without a significant test, these clades describe the strongest phylogenetic contrast along the gradient rather than a demonstrated association.</w:t>
-      </w:r>
-    </w:p>
-    <w:tbl>
-      <w:tblPr>
-        <w:tblStyle w:val="Table"/>
-        <w:tblW w:type="pct" w:w="5000"/>
-        <w:tblLayout w:type="fixed"/>
-        <w:tblLook w:firstRow="0" w:lastRow="0" w:firstColumn="0" w:lastColumn="0" w:noHBand="0" w:noVBand="0" w:val="0000"/>
-      </w:tblPr>
-      <w:tblGrid>
-        <w:gridCol w:w="7920"/>
-      </w:tblGrid>
-      <w:tr>
-        <w:tc>
-          <w:tcPr/>
-          <w:bookmarkStart w:id="58" w:name="fig-box1"/>
-          <w:p>
-            <w:pPr>
-              <w:pStyle w:val="Compact"/>
-              <w:jc w:val="center"/>
-            </w:pPr>
-            <w:r>
-              <w:drawing>
-                <wp:inline>
-                  <wp:extent cx="4890135" cy="3261010"/>
-                  <wp:effectExtent b="0" l="0" r="0" t="0"/>
-                  <wp:docPr descr="" title="" id="56" name="Picture"/>
-                  <a:graphic>
-                    <a:graphicData uri="http://schemas.openxmlformats.org/drawingml/2006/picture">
-                      <pic:pic>
-                        <pic:nvPicPr>
-                          <pic:cNvPr descr="figures/box1_pools.png" id="57" name="Picture"/>
-                          <pic:cNvPicPr>
-                            <a:picLocks noChangeArrowheads="1" noChangeAspect="1"/>
-                          </pic:cNvPicPr>
-                        </pic:nvPicPr>
-                        <pic:blipFill>
-                          <a:blip r:embed="rId55"/>
-                          <a:stretch>
-                            <a:fillRect/>
-                          </a:stretch>
-                        </pic:blipFill>
-                        <pic:spPr bwMode="auto">
-                          <a:xfrm>
-                            <a:off x="0" y="0"/>
-                            <a:ext cx="4890135" cy="3261010"/>
-                          </a:xfrm>
-                          <a:prstGeom prst="rect">
-                            <a:avLst/>
-                          </a:prstGeom>
-                          <a:noFill/>
-                          <a:ln w="9525">
-                            <a:noFill/>
-                            <a:headEnd/>
-                            <a:tailEnd/>
-                          </a:ln>
-                        </pic:spPr>
-                      </pic:pic>
-                    </a:graphicData>
-                  </a:graphic>
-                </wp:inline>
-              </w:drawing>
-            </w:r>
-          </w:p>
-          <w:p>
-            <w:pPr>
-              <w:jc w:val="center"/>
-            </w:pPr>
-            <w:pPr>
-              <w:jc w:val="left"/>
-              <w:spacing w:before="200"/>
-              <w:pStyle w:val="ImageCaption"/>
-            </w:pPr>
-            <w:r>
-              <w:t xml:space="preserve">Figure 6: Tree shape of three nested regional pools of anurans (filled points and bars, median and 2.5–97.5% quantiles across 100 bootstrap trees; open diamonds, point-estimate tree) against the targets of the simulation grid (open symbols, by N) and the anuran clades with 40–250 tips of Portik et al. (2023) (grey points). Notice that the pools fall inside the grid and close to its Yule and median levels, and that the point-estimate tree has a lower γ than most bootstrap trees.</w:t>
-            </w:r>
-          </w:p>
-          <w:bookmarkEnd w:id="58"/>
-        </w:tc>
-      </w:tr>
-    </w:tbl>
-    <w:bookmarkEnd w:id="59"/>
-    <w:bookmarkStart w:id="60" w:name="discussion"/>
-    <w:p>
-      <w:pPr>
-        <w:pStyle w:val="Heading1"/>
-      </w:pPr>
-      <w:r>
-        <w:t xml:space="preserve">Discussion</w:t>
-      </w:r>
-    </w:p>
-    <w:p>
-      <w:pPr>
-        <w:pStyle w:val="FirstParagraph"/>
-      </w:pPr>
-      <w:r>
-        <w:t xml:space="preserve">The shape of the phylogenetic tree and the process that assembles a metacommunity changed the performance of every method we evaluated, but not in the way we expected. The distribution of branching times, rather than the imbalance of the topology, governed the power of most tests and the clade recovery of PCPS and PCC, and a phylogenetically conserved niche breadth inflated the type I error of only the two methods that rely on the second PCPS axis or on phylogenetic eigenvectors. Mass effects reduced the power of every test except GLM PCPS2 more than any tree shape did. To the best of our knowledge, and based on searches of the literature, this is the first simulation study that evaluates tests on phylogeny-weighted species composition across controlled gradients of branching times and imbalance, with both static and process-based metacommunities, and that compares them with branch-wise methods in their ability to locate the clade associated with an environmental gradient. In the following paragraphs, we discuss each of these results and their consequences for empirical studies.</w:t>
-      </w:r>
-    </w:p>
-    <w:p>
-      <w:pPr>
-        <w:pStyle w:val="BodyText"/>
-      </w:pPr>
-      <w:r>
-        <w:t xml:space="preserve">Tree imbalance did not affect the type I error of any test, whereas very negative γ reduced the power of the GLM on the first PCPS axis and of the PCC. This agrees with comparative methods, in which randomization tests of phylogenetic signal keep the nominal level (Blomberg et al., 2003), whereas the size and topology of the tree change the expected values of the statistics (Münkemüller et al., 2012). Accordingly, in an empirical case study, the bias of the net relatedness index caused by poor phylogenetic resolution depended on tree shape and consisted mostly of type II errors (Molina-Venegas &amp; Roquet, 2014), and metrics such as the mean pairwise distance, which weight deep branches, respond to the stemminess of the tree (Mazel et al., 2016). The loss of power with low γ seems to follow from how phylogenetic eigenvectors summarize trees with long internal branches near the root. The eigenstructure of a phylogenetic matrix is set by the tree (Diniz-Filho et al., 1998), and in such trees a few deep splits probably dominate it, so the first PCPS axis and the leading eigenvectors of the PCC probably capture the deepest dichotomy even when the gradient sorts species along another one. In contrast, PERMANOVA was less sensitive to γ (no change at N = 100 and a loss of 0.03–0.17 at N = 50), although the Mantel test, which also uses the whole matrix</w:t>
+        <w:t xml:space="preserve">The distribution of branching times, rather than the imbalance of the topology, governed the power of most tests and the clade recovery of PCPS and PCC, a phylogenetically conserved niche breadth inflated the type I error of only the two methods that rely on the second PCPS axis or on phylogenetic eigenvectors, and mass effects reduced the power of every test except GLM PCPS2 more than any tree shape did. To the best of our knowledge, and based on searches of the literature, this is the first simulation study that evaluates tests on phylogeny-weighted species composition across controlled gradients of branching times and imbalance, with both static and process-based metacommunities, and that compares them with branch-wise methods in their ability to locate the clade associated with a gradient.</w:t>
+      </w:r>
+    </w:p>
+    <w:p>
+      <w:pPr>
+        <w:pStyle w:val="BodyText"/>
+      </w:pPr>
+      <w:r>
+        <w:t xml:space="preserve">Tree imbalance did not affect the type I error of any test, whereas very negative γ reduced the power of the GLM on the first PCPS axis and of the PCC. This agrees with comparative methods, in which randomization tests of phylogenetic signal keep the nominal level (Blomberg et al., 2003), whereas the size and topology of the tree change the expected values of the statistics (Münkemüller et al., 2012); similarly, the bias of the net relatedness index depended on tree shape and consisted mostly of type II errors in an empirical case study (Molina-Venegas &amp; Roquet, 2014). The loss of power with low γ seems to follow from how phylogenetic eigenvectors summarize trees with long internal branches near the root. The eigenstructure of a phylogenetic matrix is set by the tree (Diniz-Filho et al., 1998), and in such trees a few deep splits probably dominate it, so the first PCPS axis and the leading eigenvectors of the PCC probably capture the deepest dichotomy even when the gradient sorts species along another one. PERMANOVA was less sensitive to γ, but the Mantel test, which also uses the whole matrix</w:t>
       </w:r>
       <w:r>
         <w:t xml:space="preserve"> </w:t>
@@ -2813,15 +2660,15 @@
         </m:sSub>
       </m:oMath>
       <w:r>
-        <w:t xml:space="preserve">, lost up to 0.23, so the use of the whole matrix does not seem to protect a test by itself. However, we did not record the eigenvalue spectra or the axis loadings of each replicate, so we cannot confirm this mechanism with our data. Taken together, single-axis tests on phylogenetic eigenvectors seem to be fragile whenever the phylogenetic structure is spread over several axes, as already argued for the selection of eigenvectors in comparative analyses (Diniz-Filho et al., 2012).</w:t>
-      </w:r>
-    </w:p>
-    <w:p>
-      <w:pPr>
-        <w:pStyle w:val="BodyText"/>
-      </w:pPr>
-      <w:r>
-        <w:t xml:space="preserve">Phylogenetic signal in niche breadth created false positives that previous evaluations could not detect. The simulations of Duarte et al. (2016, 2018) and Peres-Neto et al. (2017) drew niche breadth independently of the phylogeny, and those of Duarte et al. (2016) and Peres-Neto et al. (2017) also drew maximum abundance in this way, so their type I errors refer to a null hypothesis in which these nuisance parameters carry no phylogenetic signal. When σ is conserved, clades differ in how widely they spread along the gradient, which is a phylogenetic pattern in composition that is unrelated to the association between optima and environment. Permutation tests become liberal when the randomization breaks down a structure of the data that is unrelated to the null hypothesis (Hardy, 2008), and species-level variation in the response to the environment that is ignored by the test inflates the type I error of site-based tests of trait–environment association (ter Braak et al., 2017). This seems to explain why the second PCPS axis, which is orthogonal to the basal contrast captured by the first one, and the PCC were inflated, whereas PERMANOVA and the Mantel test, which average over all axes of</w:t>
+        <w:t xml:space="preserve">, lost up to 0.23, so using the whole matrix does not seem to protect a test by itself. However, we did not record the eigenvalue spectra of each replicate, so we cannot confirm this mechanism with our data.</w:t>
+      </w:r>
+    </w:p>
+    <w:p>
+      <w:pPr>
+        <w:pStyle w:val="BodyText"/>
+      </w:pPr>
+      <w:r>
+        <w:t xml:space="preserve">Phylogenetic signal in niche breadth created false positives that previous evaluations could not detect, because their simulations drew niche breadth independently of the phylogeny (Duarte et al., 2016, 2018; Peres-Neto et al., 2017). When σ is conserved, clades differ in how widely they spread along the gradient, which is a phylogenetic pattern in composition that is unrelated to the association between optima and environment. Permutation tests become liberal when the randomization breaks down a structure of the data that is unrelated to the null hypothesis (Hardy, 2008), and ignored species-level variation in the response to the environment inflates the type I error of site-based tests of trait–environment association (ter Braak et al., 2017). This seems to explain why the second PCPS axis, which is orthogonal to the basal contrast of the first one, and the PCC were inflated, whereas PERMANOVA and the Mantel test, which average over all axes of</w:t>
       </w:r>
       <w:r>
         <w:t xml:space="preserve"> </w:t>
@@ -2841,43 +2688,43 @@
         </m:sSub>
       </m:oMath>
       <w:r>
-        <w:t xml:space="preserve">, were not. Interestingly, the largest inflation of GLM PCPS2 occurred in trees with low γ and at N = 200, which suggests that both the depth of the conserved structure and the number of species determine how much of it reaches a single axis. In addition, the more conservative behaviour of the other tests under signal in σ agrees with the conservative max test already reported for phylogenetic fuzzy weighting (Duarte et al., 2016). Unfortunately, the empirical distribution of phylogenetic signal in niche breadth is unknown for most groups, so we cannot say how often this situation arises in real metacommunities. Constrained randomizations that preserve phylogenetic structure, such as Moran spectral randomization (Braga et al., 2018), and model-based tests with phylogenetic random effects (Li &amp; Ives, 2017; Tsang &amp; Cadotte, 2025) seem to be promising alternatives to the taxa shuffle in this case.</w:t>
-      </w:r>
-    </w:p>
-    <w:p>
-      <w:pPr>
-        <w:pStyle w:val="BodyText"/>
-      </w:pPr>
-      <w:r>
-        <w:t xml:space="preserve">The assembly process mattered more than tree shape. Mass effects reduced the power of every test except GLM PCPS2 and almost abolished that of the PCC. This is expected from the theory of source–sink metacommunities, in which high dispersal homogenizes composition among sites and erodes β-diversity (Mouquet &amp; Loreau, 2003; Thompson et al., 2020), and it agrees with the low power of phylogenetic diversity indices under mass and priority effects even when traits were strongly conserved (Mason &amp; Pavoine, 2013). Our design probably represents the most extreme case, because the dispersal kernel was uniform and the sites had no spatial structure, and a spatially implicit model failed to predict the composition of spatially explicit metacommunities at high dispersal in a resource-competition model (Ai &amp; Ellwood, 2022); in spatially explicit landscapes, mass effects allow species to dominate subregions instead of homogenizing the whole metacommunity (Thompson et al., 2020), which would leave more signal for the tests. Surprisingly, phylogenetic competition partly restored the power lost under mass effects for every test except the PCC. However, competition also pruned close relatives, and under mass effects it reduced the Colless index of the analysed tree by about 75% relative to the pool, so the effect of the process cannot be separated from that of the change in the shape of the analysed tree. Moreover, our competition kernel assumed that close relatives compete more strongly, an assumption that is weakly supported empirically (Cahill et al., 2008; Godoy et al., 2014; Gerhold et al., 2015), and competition can also exclude distant relatives when fitness differences are phylogenetically conserved (Mayfield &amp; Levine, 2010). Therefore, this result should be read as an upper bound for a particular competition structure rather than as a general effect of competition. Taken together, a non-significant test in a metacommunity with high dispersal does not seem to indicate the absence of environmental filtering on lineages, in line with the warning that the interpretation of community phylogenetic tests should account for dispersal (Kembel, 2009).</w:t>
-      </w:r>
-    </w:p>
-    <w:p>
-      <w:pPr>
-        <w:pStyle w:val="BodyText"/>
-      </w:pPr>
-      <w:r>
-        <w:t xml:space="preserve">The methods that treat branches as units recovered the planted clade far more often than those based on phylogenetic eigenvectors. evoPCA ordinates the abundances of evolutionary units, so the stem branch of a clade enters the ordination as a variable (Pavoine, 2016), and phylofactorization searches explicitly for the edge that best separates clades with contrasting responses (Washburne et al., 2017, 2019). As a result, phylofactorization evaluates every edge and evoPCA treats every branch as a variable, and their recovery did not depend on γ. In contrast, PCPS probably recovers a clade only when its stem node is among those weighted by the leading axes, which depends on the distribution of node depths and seems to explain why low γ improved its recovery of both basal and recent clades. Thus, H3 was only partly supported, since the advantage of basal clades under PCPS seems to be a matter of degree. Empirical applications of PCPS have also found that environmental effects concentrate on a few nodes (Duarte et al., 2012), which agrees with this interpretation. The PCC was not designed to locate clades, since it tests a global association between phylogenetic eigenvectors, composition and environment (Peres-Neto &amp; Kembel, 2015), and our results confirm that its leading eigenvectors rarely isolate the clade of interest. Node-based analyses of species distributions (Borregaard et al., 2014) follow a similar node-by-node logic and could be added to future comparisons.</w:t>
-      </w:r>
-    </w:p>
-    <w:p>
-      <w:pPr>
-        <w:pStyle w:val="BodyText"/>
-      </w:pPr>
-      <w:r>
-        <w:t xml:space="preserve">Our grid spans the tree shapes of anuran clades, although real regional pools seem to occupy its moderate levels. Negative γ is the norm in empirical phylogenies, with slowdowns in diversification in most clades of several groups (McPeek, 2008; Phillimore &amp; Price, 2008), and the major clades of frogs diversified rapidly at the Cretaceous–Paleogene boundary (Feng et al., 2017). The three regional pools of anurans fell inside our grid, between its Yule and median levels of γ (Box 1), so the low-γ cells, where the effects of tree shape were largest, are more extreme than these pools. However, γ is sensitive to incomplete and nonrandom sampling of lineages (Cusimano &amp; Renner, 2010; Brock et al., 2011), so we used it only as a descriptor of the shape of the analysed tree, not as evidence of a diversification process. Our study also has limitations. First, the grid had no level with γ &gt; 0, which one of the three metacommunities of the case study had. Second, Layer B had no spatial structure and used only incidence data and five cells of the grid. Third, every metacommunity had 100 sites, and we did not vary the length of the gradient or the number of sites, which also change power. Finally, the case study had 13–40 ponds and no significant association, so it illustrates how the methods behave with real data rather than validating them.</w:t>
-      </w:r>
-    </w:p>
-    <w:p>
-      <w:pPr>
-        <w:pStyle w:val="BodyText"/>
-      </w:pPr>
-      <w:r>
-        <w:t xml:space="preserve">In summary, we recommend that empirical studies (i) report γ and the normalized Colless index of the analysed tree, since tree shape changes the power and the ranking of the tests; (ii) not rely on a single test, since the ranking of the tests changed with tree shape, N and dispersal, and prefer PERMANOVA with the max test to tests on single PCPS axes or phylogenetic eigenvectors when the tree has very negative γ and the pool has 100 or more species; (iii) interpret the second PCPS axis and the PCC with caution when niche breadth may be phylogenetically conserved; (iv) interpret a lack of power under high dispersal as a property of the metacommunity rather than as evidence against niche-based assembly; and (v) use evoPCA or phylofactorization, rather than PCPS axes, to identify the clades associated with a gradient. These recommendations seem to hold across the range of tree shapes found in anuran clades with negative γ, but they remain to be tested in trees with γ &gt; 0 and in spatially structured metacommunities.</w:t>
-      </w:r>
-    </w:p>
-    <w:bookmarkEnd w:id="60"/>
-    <w:bookmarkStart w:id="61" w:name="references-verified"/>
+        <w:t xml:space="preserve">, were not. Interestingly, the inflation of GLM PCPS2 was largest in trees with low γ and with 200 species, which suggests that the depth of the conserved structure and the number of species determine how much of it reaches a single axis. Unfortunately, the empirical distribution of phylogenetic signal in niche breadth is unknown for most groups. Constrained randomizations that preserve phylogenetic structure (Braga et al., 2018) and model-based tests with phylogenetic random effects (Li &amp; Ives, 2017; Tsang &amp; Cadotte, 2025) seem to be promising alternatives to the taxa shuffle in this case.</w:t>
+      </w:r>
+    </w:p>
+    <w:p>
+      <w:pPr>
+        <w:pStyle w:val="BodyText"/>
+      </w:pPr>
+      <w:r>
+        <w:t xml:space="preserve">The assembly process mattered more than tree shape. This is expected from the theory of source–sink metacommunities, in which high dispersal homogenizes composition among sites (Mouquet &amp; Loreau, 2003; Thompson et al., 2020), and it agrees with the low power of phylogenetic diversity indices under mass and priority effects even with strongly conserved traits (Mason &amp; Pavoine, 2013). Our design probably represents the most extreme case, because the sites had no spatial structure: a spatially implicit model failed to predict spatially explicit metacommunities at high dispersal (Ai &amp; Ellwood, 2022), and in spatially explicit landscapes mass effects let species dominate subregions instead of homogenizing the whole metacommunity (Thompson et al., 2020). Surprisingly, phylogenetic competition partly restored the power lost under mass effects for every test except the PCC. However, under mass effects competition also pruned close relatives and reduced the Colless index of the analysed tree by about 75% relative to the pool, so the effect of the process cannot be separated from that of the change in tree shape. Moreover, the assumption that close relatives compete more strongly is weakly supported empirically (Cahill et al., 2008; Godoy et al., 2014), and competition can also exclude distant relatives (Mayfield &amp; Levine, 2010), so this result is an upper bound for a particular competition structure. Taken together, a non-significant test in a metacommunity with high dispersal does not seem to indicate the absence of environmental filtering on lineages (Kembel, 2009).</w:t>
+      </w:r>
+    </w:p>
+    <w:p>
+      <w:pPr>
+        <w:pStyle w:val="BodyText"/>
+      </w:pPr>
+      <w:r>
+        <w:t xml:space="preserve">The methods that treat branches as units recovered the planted clade far more often than those based on phylogenetic eigenvectors. Phylofactorization evaluates every edge of the tree (Washburne et al., 2017, 2019) and evoPCA treats every branch as a variable (Pavoine, 2016), so their recovery did not depend on γ. In contrast, PCPS probably recovers a clade only when its stem node is among those weighted by the leading axes, which depends on the distribution of node depths and seems to explain why low γ improved its recovery of both basal and recent clades; thus, H3 was only partly supported. The PCC was not designed to locate clades, since it tests a global association between phylogenetic eigenvectors, composition and environment (Peres-Neto &amp; Kembel, 2015), and its leading eigenvectors rarely isolated the clade of interest. Node-based analyses (Borregaard et al., 2014) follow a similar node-by-node logic to that of phylofactorization and could be added to future comparisons.</w:t>
+      </w:r>
+    </w:p>
+    <w:p>
+      <w:pPr>
+        <w:pStyle w:val="BodyText"/>
+      </w:pPr>
+      <w:r>
+        <w:t xml:space="preserve">Our grid spans the tree shapes of anuran clades, in which rapid early radiations are common (Feng et al., 2017), but real regional pools seem to occupy its moderate levels. The three regional pools fell between the Yule and median levels of γ (Appendix S3), so the low-γ cells, where the effects of tree shape were largest, are more extreme than these pools; in addition, γ is sensitive to incomplete and nonrandom sampling of lineages (Cusimano &amp; Renner, 2010; Brock et al., 2011), so we used it only as a descriptor of tree shape. Our study also has limitations. First, the grid had no level with γ &gt; 0. Second, Layer B had no spatial structure and used only incidence data and five cells of the grid. Third, we did not vary the number of sites or the length of the gradient, which also change power.</w:t>
+      </w:r>
+    </w:p>
+    <w:p>
+      <w:pPr>
+        <w:pStyle w:val="BodyText"/>
+      </w:pPr>
+      <w:r>
+        <w:t xml:space="preserve">In summary, we recommend that empirical studies (i) report γ and the normalized Colless index of the analysed tree; (ii) not rely on a single test, since the ranking of the tests changed with tree shape, N and dispersal, and prefer PERMANOVA with the max test to tests on single PCPS axes or phylogenetic eigenvectors when the tree has very negative γ and the pool has 100 or more species; (iii) interpret the second PCPS axis and the PCC with caution when niche breadth may be phylogenetically conserved; (iv) interpret a lack of power under high dispersal as a property of the metacommunity rather than as evidence against niche-based assembly; and (v) use evoPCA or phylofactorization, rather than PCPS axes, to identify the clades associated with a gradient. These recommendations remain to be tested in trees with γ &gt; 0 and in spatially structured metacommunities.</w:t>
+      </w:r>
+    </w:p>
+    <w:bookmarkEnd w:id="55"/>
+    <w:bookmarkStart w:id="56" w:name="references-verified"/>
     <w:p>
       <w:pPr>
         <w:pStyle w:val="Heading1"/>
@@ -3041,27 +2888,6 @@
         <w:pStyle w:val="BodyText"/>
       </w:pPr>
       <w:r>
-        <w:t xml:space="preserve">Both, C., Melo, A. S., Cechin, S. Z., &amp; Hartz, S. M. (2011). Tadpole co-occurrence in ponds: when do guilds and time matter?</w:t>
-      </w:r>
-      <w:r>
-        <w:t xml:space="preserve"> </w:t>
-      </w:r>
-      <w:r>
-        <w:rPr>
-          <w:i/>
-          <w:iCs/>
-        </w:rPr>
-        <w:t xml:space="preserve">Acta Oecologica</w:t>
-      </w:r>
-      <w:r>
-        <w:t xml:space="preserve">, 37, 140–145. https://doi.org/10.1016/j.actao.2011.01.008</w:t>
-      </w:r>
-    </w:p>
-    <w:p>
-      <w:pPr>
-        <w:pStyle w:val="BodyText"/>
-      </w:pPr>
-      <w:r>
         <w:t xml:space="preserve">ter Braak, C. J. F., Cormont, A., &amp; Dray, S. (2012). Improved testing of species traits–environment relationships in the fourth-corner problem.</w:t>
       </w:r>
       <w:r>
@@ -3251,15 +3077,133 @@
         <w:pStyle w:val="BodyText"/>
       </w:pPr>
       <w:r>
-        <w:t xml:space="preserve">Debastiani, V. J. (2026). PCPS: principal coordinates of phylogenetic structure. R package version 1.0.9. doi:10.32614/CRAN.package.PCPS.</w:t>
-      </w:r>
-    </w:p>
-    <w:p>
-      <w:pPr>
-        <w:pStyle w:val="BodyText"/>
-      </w:pPr>
-      <w:r>
-        <w:t xml:space="preserve">Diniz-Filho, J. A. F., Bini, L. M., Rangel, T. F., Morales-Castilla, I., Olalla-Tárraga, M. Á., Rodríguez, M. Á., &amp; Hawkins, B. A. (2012). On the selection of phylogenetic eigenvectors for ecological analyses.</w:t>
+        <w:t xml:space="preserve">Diniz-Filho, J. A. F., de Sant’Ana, C. E. R., &amp; Bini, L. M. (1998). An eigenvector method for estimating phylogenetic inertia.</w:t>
+      </w:r>
+      <w:r>
+        <w:t xml:space="preserve"> </w:t>
+      </w:r>
+      <w:r>
+        <w:rPr>
+          <w:i/>
+          <w:iCs/>
+        </w:rPr>
+        <w:t xml:space="preserve">Evolution</w:t>
+      </w:r>
+      <w:r>
+        <w:t xml:space="preserve">, 52, 1247–1262. https://doi.org/10.1111/j.1558-5646.1998.tb02006.x</w:t>
+      </w:r>
+    </w:p>
+    <w:p>
+      <w:pPr>
+        <w:pStyle w:val="BodyText"/>
+      </w:pPr>
+      <w:r>
+        <w:t xml:space="preserve">DiRenzo, G. V., Hanks, E., &amp; Miller, D. A. W. (2023). A practical guide to understanding and validating complex models using data simulations.</w:t>
+      </w:r>
+      <w:r>
+        <w:t xml:space="preserve"> </w:t>
+      </w:r>
+      <w:r>
+        <w:rPr>
+          <w:i/>
+          <w:iCs/>
+        </w:rPr>
+        <w:t xml:space="preserve">Methods in Ecology and Evolution</w:t>
+      </w:r>
+      <w:r>
+        <w:t xml:space="preserve">, 14, 203–217. https://doi.org/10.1111/2041-210X.14030</w:t>
+      </w:r>
+    </w:p>
+    <w:p>
+      <w:pPr>
+        <w:pStyle w:val="BodyText"/>
+      </w:pPr>
+      <w:r>
+        <w:t xml:space="preserve">Duarte, L. D. S. (2011). Phylogenetic habitat filtering influences forest nucleation in grasslands.</w:t>
+      </w:r>
+      <w:r>
+        <w:t xml:space="preserve"> </w:t>
+      </w:r>
+      <w:r>
+        <w:rPr>
+          <w:i/>
+          <w:iCs/>
+        </w:rPr>
+        <w:t xml:space="preserve">Oikos</w:t>
+      </w:r>
+      <w:r>
+        <w:t xml:space="preserve">, 120, 208–215. https://doi.org/10.1111/j.1600-0706.2010.18898.x</w:t>
+      </w:r>
+    </w:p>
+    <w:p>
+      <w:pPr>
+        <w:pStyle w:val="BodyText"/>
+      </w:pPr>
+      <w:r>
+        <w:t xml:space="preserve">Duarte, L. D. S., Both, C., Debastiani, V. J., Carlucci, M. B., Gonçalves, L. O., Cappelatti, L., Seger, G. D. S., Bastazini, V. A. G., Brum, F. T., Salengue, E. V., &amp; Bernardo-Silva, J. S. (2014). Climate effects on amphibian distributions depend on phylogenetic resolution and the biogeographical history of taxa.</w:t>
+      </w:r>
+      <w:r>
+        <w:t xml:space="preserve"> </w:t>
+      </w:r>
+      <w:r>
+        <w:rPr>
+          <w:i/>
+          <w:iCs/>
+        </w:rPr>
+        <w:t xml:space="preserve">Global Ecology and Biogeography</w:t>
+      </w:r>
+      <w:r>
+        <w:t xml:space="preserve">, 23, 213–222. https://doi.org/10.1111/geb.12089</w:t>
+      </w:r>
+    </w:p>
+    <w:p>
+      <w:pPr>
+        <w:pStyle w:val="BodyText"/>
+      </w:pPr>
+      <w:r>
+        <w:t xml:space="preserve">Duarte, L. D. S., Debastiani, V. J., Carlucci, M. B., &amp; Diniz-Filho, J. A. F. (2018). Analyzing community-weighted trait means across environmental gradients: should phylogeny stay or should it go?</w:t>
+      </w:r>
+      <w:r>
+        <w:t xml:space="preserve"> </w:t>
+      </w:r>
+      <w:r>
+        <w:rPr>
+          <w:i/>
+          <w:iCs/>
+        </w:rPr>
+        <w:t xml:space="preserve">Ecology</w:t>
+      </w:r>
+      <w:r>
+        <w:t xml:space="preserve">, 99, 385–398. https://doi.org/10.1002/ecy.2081</w:t>
+      </w:r>
+    </w:p>
+    <w:p>
+      <w:pPr>
+        <w:pStyle w:val="BodyText"/>
+      </w:pPr>
+      <w:r>
+        <w:t xml:space="preserve">Duarte, L. D. S., Debastiani, V. J., Freitas, A. V. L., &amp; Pillar, V. D. (2016). Dissecting phylogenetic fuzzy weighting: theory and application in metacommunity phylogenetics.</w:t>
+      </w:r>
+      <w:r>
+        <w:t xml:space="preserve"> </w:t>
+      </w:r>
+      <w:r>
+        <w:rPr>
+          <w:i/>
+          <w:iCs/>
+        </w:rPr>
+        <w:t xml:space="preserve">Methods in Ecology and Evolution</w:t>
+      </w:r>
+      <w:r>
+        <w:t xml:space="preserve">, 7, 937–946. https://doi.org/10.1111/2041-210X.12547</w:t>
+      </w:r>
+    </w:p>
+    <w:p>
+      <w:pPr>
+        <w:pStyle w:val="BodyText"/>
+      </w:pPr>
+      <w:r>
+        <w:t xml:space="preserve">Duarte, L. D. S., Prieto, P. V., &amp; Pillar, V. D. (2012). Assessing spatial and environmental drivers of phylogenetic structure in Brazilian Araucaria forests.</w:t>
       </w:r>
       <w:r>
         <w:t xml:space="preserve"> </w:t>
@@ -3272,15 +3216,86 @@
         <w:t xml:space="preserve">Ecography</w:t>
       </w:r>
       <w:r>
-        <w:t xml:space="preserve">, 35, 239–249. https://doi.org/10.1111/j.1600-0587.2011.06949.x</w:t>
-      </w:r>
-    </w:p>
-    <w:p>
-      <w:pPr>
-        <w:pStyle w:val="BodyText"/>
-      </w:pPr>
-      <w:r>
-        <w:t xml:space="preserve">Diniz-Filho, J. A. F., de Sant’Ana, C. E. R., &amp; Bini, L. M. (1998). An eigenvector method for estimating phylogenetic inertia.</w:t>
+        <w:t xml:space="preserve">, 35, 952–960. https://doi.org/10.1111/j.1600-0587.2011.07193.x</w:t>
+      </w:r>
+    </w:p>
+    <w:p>
+      <w:pPr>
+        <w:pStyle w:val="BodyText"/>
+      </w:pPr>
+      <w:r>
+        <w:t xml:space="preserve">Feng, Y.-J., Blackburn, D. C., Liang, D., Hillis, D. M., Wake, D. B., Cannatella, D. C., &amp; Zhang, P. (2017). Phylogenomics reveals rapid, simultaneous diversification of three major clades of Gondwanan frogs at the Cretaceous–Paleogene boundary.</w:t>
+      </w:r>
+      <w:r>
+        <w:t xml:space="preserve"> </w:t>
+      </w:r>
+      <w:r>
+        <w:rPr>
+          <w:i/>
+          <w:iCs/>
+        </w:rPr>
+        <w:t xml:space="preserve">Proceedings of the National Academy of Sciences</w:t>
+      </w:r>
+      <w:r>
+        <w:t xml:space="preserve">, 114, E5864–E5870. https://doi.org/10.1073/pnas.1704632114</w:t>
+      </w:r>
+    </w:p>
+    <w:p>
+      <w:pPr>
+        <w:pStyle w:val="BodyText"/>
+      </w:pPr>
+      <w:r>
+        <w:t xml:space="preserve">Gabry, J., Češnovar, R., Johnson, A., &amp; Bronder, S. (2025). cmdstanr: R interface to CmdStan. R package version 0.9.0. https://github.com/stan-dev/cmdstanr.</w:t>
+      </w:r>
+    </w:p>
+    <w:p>
+      <w:pPr>
+        <w:pStyle w:val="BodyText"/>
+      </w:pPr>
+      <w:r>
+        <w:t xml:space="preserve">Godoy, O., Kraft, N. J. B., &amp; Levine, J. M. (2014). Phylogenetic relatedness and the determinants of competitive outcomes.</w:t>
+      </w:r>
+      <w:r>
+        <w:t xml:space="preserve"> </w:t>
+      </w:r>
+      <w:r>
+        <w:rPr>
+          <w:i/>
+          <w:iCs/>
+        </w:rPr>
+        <w:t xml:space="preserve">Ecology Letters</w:t>
+      </w:r>
+      <w:r>
+        <w:t xml:space="preserve">, 17, 836–844. https://doi.org/10.1111/ele.12289</w:t>
+      </w:r>
+    </w:p>
+    <w:p>
+      <w:pPr>
+        <w:pStyle w:val="BodyText"/>
+      </w:pPr>
+      <w:r>
+        <w:t xml:space="preserve">Hardy, O. J. (2008). Testing the spatial phylogenetic structure of local communities: statistical performances of different null models and test statistics on a locally neutral community.</w:t>
+      </w:r>
+      <w:r>
+        <w:t xml:space="preserve"> </w:t>
+      </w:r>
+      <w:r>
+        <w:rPr>
+          <w:i/>
+          <w:iCs/>
+        </w:rPr>
+        <w:t xml:space="preserve">Journal of Ecology</w:t>
+      </w:r>
+      <w:r>
+        <w:t xml:space="preserve">, 96, 914–926. https://doi.org/10.1111/j.1365-2745.2008.01421.x</w:t>
+      </w:r>
+    </w:p>
+    <w:p>
+      <w:pPr>
+        <w:pStyle w:val="BodyText"/>
+      </w:pPr>
+      <w:r>
+        <w:t xml:space="preserve">Heard, S. B. (1992). Patterns in tree balance among cladistic, phenetic, and randomly generated phylogenetic trees.</w:t>
       </w:r>
       <w:r>
         <w:t xml:space="preserve"> </w:t>
@@ -3293,15 +3308,99 @@
         <w:t xml:space="preserve">Evolution</w:t>
       </w:r>
       <w:r>
-        <w:t xml:space="preserve">, 52, 1247–1262. https://doi.org/10.1111/j.1558-5646.1998.tb02006.x</w:t>
-      </w:r>
-    </w:p>
-    <w:p>
-      <w:pPr>
-        <w:pStyle w:val="BodyText"/>
-      </w:pPr>
-      <w:r>
-        <w:t xml:space="preserve">DiRenzo, G. V., Hanks, E., &amp; Miller, D. A. W. (2023). A practical guide to understanding and validating complex models using data simulations.</w:t>
+        <w:t xml:space="preserve">, 46, 1818–1826. https://doi.org/10.1111/j.1558-5646.1992.tb01171.x</w:t>
+      </w:r>
+    </w:p>
+    <w:p>
+      <w:pPr>
+        <w:pStyle w:val="BodyText"/>
+      </w:pPr>
+      <w:r>
+        <w:t xml:space="preserve">Janzen, T., &amp; Etienne, R. S. (2024). Phylogenetic tree statistics: a systematic overview using the new R package treestats.</w:t>
+      </w:r>
+      <w:r>
+        <w:t xml:space="preserve"> </w:t>
+      </w:r>
+      <w:r>
+        <w:rPr>
+          <w:i/>
+          <w:iCs/>
+        </w:rPr>
+        <w:t xml:space="preserve">Molecular Phylogenetics and Evolution</w:t>
+      </w:r>
+      <w:r>
+        <w:t xml:space="preserve">, 200, 108168. https://doi.org/10.1016/j.ympev.2024.108168</w:t>
+      </w:r>
+    </w:p>
+    <w:p>
+      <w:pPr>
+        <w:pStyle w:val="BodyText"/>
+      </w:pPr>
+      <w:r>
+        <w:t xml:space="preserve">Kembel, S. W. (2009). Disentangling niche and neutral influences on community assembly: assessing the performance of community phylogenetic structure tests.</w:t>
+      </w:r>
+      <w:r>
+        <w:t xml:space="preserve"> </w:t>
+      </w:r>
+      <w:r>
+        <w:rPr>
+          <w:i/>
+          <w:iCs/>
+        </w:rPr>
+        <w:t xml:space="preserve">Ecology Letters</w:t>
+      </w:r>
+      <w:r>
+        <w:t xml:space="preserve">, 12, 949–960. https://doi.org/10.1111/j.1461-0248.2009.01354.x</w:t>
+      </w:r>
+    </w:p>
+    <w:p>
+      <w:pPr>
+        <w:pStyle w:val="BodyText"/>
+      </w:pPr>
+      <w:r>
+        <w:t xml:space="preserve">Leibold, M. A., Economo, E. P., &amp; Peres-Neto, P. (2010). Metacommunity phylogenetics: separating the roles of environmental filters and historical biogeography.</w:t>
+      </w:r>
+      <w:r>
+        <w:t xml:space="preserve"> </w:t>
+      </w:r>
+      <w:r>
+        <w:rPr>
+          <w:i/>
+          <w:iCs/>
+        </w:rPr>
+        <w:t xml:space="preserve">Ecology Letters</w:t>
+      </w:r>
+      <w:r>
+        <w:t xml:space="preserve">, 13, 1290–1299. https://doi.org/10.1111/j.1461-0248.2010.01523.x</w:t>
+      </w:r>
+    </w:p>
+    <w:p>
+      <w:pPr>
+        <w:pStyle w:val="BodyText"/>
+      </w:pPr>
+      <w:r>
+        <w:t xml:space="preserve">Leibold, M. A., Holyoak, M., Mouquet, N., Amarasekare, P., Chase, J. M., Hoopes, M. F., Holt, R. D., Shurin, J. B., Law, R., Tilman, D., Loreau, M., &amp; Gonzalez, A. (2004). The metacommunity concept: a framework for multi-scale community ecology.</w:t>
+      </w:r>
+      <w:r>
+        <w:t xml:space="preserve"> </w:t>
+      </w:r>
+      <w:r>
+        <w:rPr>
+          <w:i/>
+          <w:iCs/>
+        </w:rPr>
+        <w:t xml:space="preserve">Ecology Letters</w:t>
+      </w:r>
+      <w:r>
+        <w:t xml:space="preserve">, 7, 601–613. https://doi.org/10.1111/j.1461-0248.2004.00608.x</w:t>
+      </w:r>
+    </w:p>
+    <w:p>
+      <w:pPr>
+        <w:pStyle w:val="BodyText"/>
+      </w:pPr>
+      <w:r>
+        <w:t xml:space="preserve">Li, D., &amp; Ives, A. R. (2017). The statistical need to include phylogeny in trait-based analyses of community composition.</w:t>
       </w:r>
       <w:r>
         <w:t xml:space="preserve"> </w:t>
@@ -3314,15 +3413,267 @@
         <w:t xml:space="preserve">Methods in Ecology and Evolution</w:t>
       </w:r>
       <w:r>
-        <w:t xml:space="preserve">, 14, 203–217. https://doi.org/10.1111/2041-210X.14030</w:t>
-      </w:r>
-    </w:p>
-    <w:p>
-      <w:pPr>
-        <w:pStyle w:val="BodyText"/>
-      </w:pPr>
-      <w:r>
-        <w:t xml:space="preserve">Duarte, L. D. S. (2011). Phylogenetic habitat filtering influences forest nucleation in grasslands.</w:t>
+        <w:t xml:space="preserve">, 8, 1192–1199. https://doi.org/10.1111/2041-210X.12767</w:t>
+      </w:r>
+    </w:p>
+    <w:p>
+      <w:pPr>
+        <w:pStyle w:val="BodyText"/>
+      </w:pPr>
+      <w:r>
+        <w:t xml:space="preserve">Mantel, N. (1967). The detection of disease clustering and a generalized regression approach.</w:t>
+      </w:r>
+      <w:r>
+        <w:t xml:space="preserve"> </w:t>
+      </w:r>
+      <w:r>
+        <w:rPr>
+          <w:i/>
+          <w:iCs/>
+        </w:rPr>
+        <w:t xml:space="preserve">Cancer Research</w:t>
+      </w:r>
+      <w:r>
+        <w:t xml:space="preserve">, 27, 209–220.</w:t>
+      </w:r>
+    </w:p>
+    <w:p>
+      <w:pPr>
+        <w:pStyle w:val="BodyText"/>
+      </w:pPr>
+      <w:r>
+        <w:t xml:space="preserve">Mason, N. W. H., &amp; Pavoine, S. (2013). Does trait conservatism guarantee that indicators of phylogenetic community structure will reveal niche-based assembly processes along stress gradients?</w:t>
+      </w:r>
+      <w:r>
+        <w:t xml:space="preserve"> </w:t>
+      </w:r>
+      <w:r>
+        <w:rPr>
+          <w:i/>
+          <w:iCs/>
+        </w:rPr>
+        <w:t xml:space="preserve">Journal of Vegetation Science</w:t>
+      </w:r>
+      <w:r>
+        <w:t xml:space="preserve">, 24, 820–833. https://doi.org/10.1111/jvs.12033</w:t>
+      </w:r>
+    </w:p>
+    <w:p>
+      <w:pPr>
+        <w:pStyle w:val="BodyText"/>
+      </w:pPr>
+      <w:r>
+        <w:t xml:space="preserve">Mayfield, M. M., &amp; Levine, J. M. (2010). Opposing effects of competitive exclusion on the phylogenetic structure of communities.</w:t>
+      </w:r>
+      <w:r>
+        <w:t xml:space="preserve"> </w:t>
+      </w:r>
+      <w:r>
+        <w:rPr>
+          <w:i/>
+          <w:iCs/>
+        </w:rPr>
+        <w:t xml:space="preserve">Ecology Letters</w:t>
+      </w:r>
+      <w:r>
+        <w:t xml:space="preserve">, 13, 1085–1093. https://doi.org/10.1111/j.1461-0248.2010.01509.x</w:t>
+      </w:r>
+    </w:p>
+    <w:p>
+      <w:pPr>
+        <w:pStyle w:val="BodyText"/>
+      </w:pPr>
+      <w:r>
+        <w:t xml:space="preserve">Mazel, F., Davies, T. J., Gallien, L., Renaud, J., Groussin, M., Münkemüller, T., &amp; Thuiller, W. (2016). Influence of tree shape and evolutionary time-scale on phylogenetic diversity metrics.</w:t>
+      </w:r>
+      <w:r>
+        <w:t xml:space="preserve"> </w:t>
+      </w:r>
+      <w:r>
+        <w:rPr>
+          <w:i/>
+          <w:iCs/>
+        </w:rPr>
+        <w:t xml:space="preserve">Ecography</w:t>
+      </w:r>
+      <w:r>
+        <w:t xml:space="preserve">, 39, 913–920. https://doi.org/10.1111/ecog.01694</w:t>
+      </w:r>
+    </w:p>
+    <w:p>
+      <w:pPr>
+        <w:pStyle w:val="BodyText"/>
+      </w:pPr>
+      <w:r>
+        <w:t xml:space="preserve">McPeek, M. A. (2008). The ecological dynamics of clade diversification and community assembly.</w:t>
+      </w:r>
+      <w:r>
+        <w:t xml:space="preserve"> </w:t>
+      </w:r>
+      <w:r>
+        <w:rPr>
+          <w:i/>
+          <w:iCs/>
+        </w:rPr>
+        <w:t xml:space="preserve">The American Naturalist</w:t>
+      </w:r>
+      <w:r>
+        <w:t xml:space="preserve">, 172, E270–E284. https://doi.org/10.1086/593137</w:t>
+      </w:r>
+    </w:p>
+    <w:p>
+      <w:pPr>
+        <w:pStyle w:val="BodyText"/>
+      </w:pPr>
+      <w:r>
+        <w:t xml:space="preserve">Molina-Venegas, R., &amp; Roquet, C. (2014). Directional biases in phylogenetic structure quantification: a Mediterranean case study.</w:t>
+      </w:r>
+      <w:r>
+        <w:t xml:space="preserve"> </w:t>
+      </w:r>
+      <w:r>
+        <w:rPr>
+          <w:i/>
+          <w:iCs/>
+        </w:rPr>
+        <w:t xml:space="preserve">Ecography</w:t>
+      </w:r>
+      <w:r>
+        <w:t xml:space="preserve">, 37, 572–580. https://doi.org/10.1111/j.1600-0587.2013.00442.x</w:t>
+      </w:r>
+    </w:p>
+    <w:p>
+      <w:pPr>
+        <w:pStyle w:val="BodyText"/>
+      </w:pPr>
+      <w:r>
+        <w:t xml:space="preserve">Mouquet, N., &amp; Loreau, M. (2003). Community patterns in source-sink metacommunities.</w:t>
+      </w:r>
+      <w:r>
+        <w:t xml:space="preserve"> </w:t>
+      </w:r>
+      <w:r>
+        <w:rPr>
+          <w:i/>
+          <w:iCs/>
+        </w:rPr>
+        <w:t xml:space="preserve">The American Naturalist</w:t>
+      </w:r>
+      <w:r>
+        <w:t xml:space="preserve">, 162, 544–557. https://doi.org/10.1086/378857</w:t>
+      </w:r>
+    </w:p>
+    <w:p>
+      <w:pPr>
+        <w:pStyle w:val="BodyText"/>
+      </w:pPr>
+      <w:r>
+        <w:t xml:space="preserve">Münkemüller, T., Gallien, L., Pollock, L. J., Barros, C., Carboni, M., Chalmandrier, L., Mazel, F., Mokany, K., Roquet, C., Smyčka, J., Talluto, M. V., &amp; Thuiller, W. (2020). Dos and don’ts when inferring assembly rules from diversity patterns.</w:t>
+      </w:r>
+      <w:r>
+        <w:t xml:space="preserve"> </w:t>
+      </w:r>
+      <w:r>
+        <w:rPr>
+          <w:i/>
+          <w:iCs/>
+        </w:rPr>
+        <w:t xml:space="preserve">Global Ecology and Biogeography</w:t>
+      </w:r>
+      <w:r>
+        <w:t xml:space="preserve">, 29, 1212–1229. https://doi.org/10.1111/geb.13098</w:t>
+      </w:r>
+    </w:p>
+    <w:p>
+      <w:pPr>
+        <w:pStyle w:val="BodyText"/>
+      </w:pPr>
+      <w:r>
+        <w:t xml:space="preserve">Münkemüller, T., Lavergne, S., Bzeznik, B., Dray, S., Jombart, T., Schiffers, K., &amp; Thuiller, W. (2012). How to measure and test phylogenetic signal.</w:t>
+      </w:r>
+      <w:r>
+        <w:t xml:space="preserve"> </w:t>
+      </w:r>
+      <w:r>
+        <w:rPr>
+          <w:i/>
+          <w:iCs/>
+        </w:rPr>
+        <w:t xml:space="preserve">Methods in Ecology and Evolution</w:t>
+      </w:r>
+      <w:r>
+        <w:t xml:space="preserve">, 3, 743–756. https://doi.org/10.1111/j.2041-210X.2012.00196.x</w:t>
+      </w:r>
+    </w:p>
+    <w:p>
+      <w:pPr>
+        <w:pStyle w:val="BodyText"/>
+      </w:pPr>
+      <w:r>
+        <w:t xml:space="preserve">Pagel, M. (1999). Inferring the historical patterns of biological evolution.</w:t>
+      </w:r>
+      <w:r>
+        <w:t xml:space="preserve"> </w:t>
+      </w:r>
+      <w:r>
+        <w:rPr>
+          <w:i/>
+          <w:iCs/>
+        </w:rPr>
+        <w:t xml:space="preserve">Nature</w:t>
+      </w:r>
+      <w:r>
+        <w:t xml:space="preserve">, 401, 877–884. https://doi.org/10.1038/44766</w:t>
+      </w:r>
+    </w:p>
+    <w:p>
+      <w:pPr>
+        <w:pStyle w:val="BodyText"/>
+      </w:pPr>
+      <w:r>
+        <w:t xml:space="preserve">Paradis, E., &amp; Schliep, K. (2019). ape 5.0: an environment for modern phylogenetics and evolutionary analyses in R.</w:t>
+      </w:r>
+      <w:r>
+        <w:t xml:space="preserve"> </w:t>
+      </w:r>
+      <w:r>
+        <w:rPr>
+          <w:i/>
+          <w:iCs/>
+        </w:rPr>
+        <w:t xml:space="preserve">Bioinformatics</w:t>
+      </w:r>
+      <w:r>
+        <w:t xml:space="preserve">, 35, 526–528. https://doi.org/10.1093/bioinformatics/bty633</w:t>
+      </w:r>
+    </w:p>
+    <w:p>
+      <w:pPr>
+        <w:pStyle w:val="BodyText"/>
+      </w:pPr>
+      <w:r>
+        <w:t xml:space="preserve">Parra, J. L., McGuire, J. A., &amp; Graham, C. H. (2010). Incorporating clade identity in analyses of phylogenetic community structure: an example with hummingbirds.</w:t>
+      </w:r>
+      <w:r>
+        <w:t xml:space="preserve"> </w:t>
+      </w:r>
+      <w:r>
+        <w:rPr>
+          <w:i/>
+          <w:iCs/>
+        </w:rPr>
+        <w:t xml:space="preserve">The American Naturalist</w:t>
+      </w:r>
+      <w:r>
+        <w:t xml:space="preserve">, 176, 573–587. https://doi.org/10.1086/656619</w:t>
+      </w:r>
+    </w:p>
+    <w:p>
+      <w:pPr>
+        <w:pStyle w:val="BodyText"/>
+      </w:pPr>
+      <w:r>
+        <w:t xml:space="preserve">Pavoine, S. (2016). A guide through a family of phylogenetic dissimilarity measures among sites.</w:t>
       </w:r>
       <w:r>
         <w:t xml:space="preserve"> </w:t>
@@ -3335,36 +3686,78 @@
         <w:t xml:space="preserve">Oikos</w:t>
       </w:r>
       <w:r>
-        <w:t xml:space="preserve">, 120, 208–215. https://doi.org/10.1111/j.1600-0706.2010.18898.x</w:t>
-      </w:r>
-    </w:p>
-    <w:p>
-      <w:pPr>
-        <w:pStyle w:val="BodyText"/>
-      </w:pPr>
-      <w:r>
-        <w:t xml:space="preserve">Duarte, L. D. S., Both, C., Debastiani, V. J., Carlucci, M. B., Gonçalves, L. O., Cappelatti, L., Seger, G. D. S., Bastazini, V. A. G., Brum, F. T., Salengue, E. V., &amp; Bernardo-Silva, J. S. (2014). Climate effects on amphibian distributions depend on phylogenetic resolution and the biogeographical history of taxa.</w:t>
-      </w:r>
-      <w:r>
-        <w:t xml:space="preserve"> </w:t>
-      </w:r>
-      <w:r>
-        <w:rPr>
-          <w:i/>
-          <w:iCs/>
-        </w:rPr>
-        <w:t xml:space="preserve">Global Ecology and Biogeography</w:t>
-      </w:r>
-      <w:r>
-        <w:t xml:space="preserve">, 23, 213–222. https://doi.org/10.1111/geb.12089</w:t>
-      </w:r>
-    </w:p>
-    <w:p>
-      <w:pPr>
-        <w:pStyle w:val="BodyText"/>
-      </w:pPr>
-      <w:r>
-        <w:t xml:space="preserve">Duarte, L. D. S., Debastiani, V. J., Carlucci, M. B., &amp; Diniz-Filho, J. A. F. (2018). Analyzing community-weighted trait means across environmental gradients: should phylogeny stay or should it go?</w:t>
+        <w:t xml:space="preserve">, 125, 1719–1732. https://doi.org/10.1111/oik.03262</w:t>
+      </w:r>
+    </w:p>
+    <w:p>
+      <w:pPr>
+        <w:pStyle w:val="BodyText"/>
+      </w:pPr>
+      <w:r>
+        <w:t xml:space="preserve">Pavoine, S. (2020). adiv: an R package to analyse biodiversity in ecology.</w:t>
+      </w:r>
+      <w:r>
+        <w:t xml:space="preserve"> </w:t>
+      </w:r>
+      <w:r>
+        <w:rPr>
+          <w:i/>
+          <w:iCs/>
+        </w:rPr>
+        <w:t xml:space="preserve">Methods in Ecology and Evolution</w:t>
+      </w:r>
+      <w:r>
+        <w:t xml:space="preserve">, 11, 1106–1112. https://doi.org/10.1111/2041-210X.13430</w:t>
+      </w:r>
+    </w:p>
+    <w:p>
+      <w:pPr>
+        <w:pStyle w:val="BodyText"/>
+      </w:pPr>
+      <w:r>
+        <w:t xml:space="preserve">Peres-Neto, P. R., &amp; Kembel, S. W. (2015). Phylogenetic gradient analysis: environmental drivers of phylogenetic variation across ecological communities.</w:t>
+      </w:r>
+      <w:r>
+        <w:t xml:space="preserve"> </w:t>
+      </w:r>
+      <w:r>
+        <w:rPr>
+          <w:i/>
+          <w:iCs/>
+        </w:rPr>
+        <w:t xml:space="preserve">Plant Ecology</w:t>
+      </w:r>
+      <w:r>
+        <w:t xml:space="preserve">, 216, 709–724. https://doi.org/10.1007/s11258-014-0405-0</w:t>
+      </w:r>
+    </w:p>
+    <w:p>
+      <w:pPr>
+        <w:pStyle w:val="BodyText"/>
+      </w:pPr>
+      <w:r>
+        <w:t xml:space="preserve">Peres-Neto, P. R., Dray, S., &amp; ter Braak, C. J. F. (2017). Linking trait variation to the environment: critical issues with community-weighted mean correlation resolved by the fourth-corner approach.</w:t>
+      </w:r>
+      <w:r>
+        <w:t xml:space="preserve"> </w:t>
+      </w:r>
+      <w:r>
+        <w:rPr>
+          <w:i/>
+          <w:iCs/>
+        </w:rPr>
+        <w:t xml:space="preserve">Ecography</w:t>
+      </w:r>
+      <w:r>
+        <w:t xml:space="preserve">, 40, 806–816. https://doi.org/10.1111/ecog.02302</w:t>
+      </w:r>
+    </w:p>
+    <w:p>
+      <w:pPr>
+        <w:pStyle w:val="BodyText"/>
+      </w:pPr>
+      <w:r>
+        <w:t xml:space="preserve">Peres-Neto, P. R., Leibold, M. A., &amp; Dray, S. (2012). Assessing the effects of spatial contingency and environmental filtering on metacommunity phylogenetics.</w:t>
       </w:r>
       <w:r>
         <w:t xml:space="preserve"> </w:t>
@@ -3377,15 +3770,233 @@
         <w:t xml:space="preserve">Ecology</w:t>
       </w:r>
       <w:r>
-        <w:t xml:space="preserve">, 99, 385–398. https://doi.org/10.1002/ecy.2081</w:t>
-      </w:r>
-    </w:p>
-    <w:p>
-      <w:pPr>
-        <w:pStyle w:val="BodyText"/>
-      </w:pPr>
-      <w:r>
-        <w:t xml:space="preserve">Duarte, L. D. S., Debastiani, V. J., Freitas, A. V. L., &amp; Pillar, V. D. (2016). Dissecting phylogenetic fuzzy weighting: theory and application in metacommunity phylogenetics.</w:t>
+        <w:t xml:space="preserve">, 93, S14–S30. https://doi.org/10.1890/11-0494.1</w:t>
+      </w:r>
+    </w:p>
+    <w:p>
+      <w:pPr>
+        <w:pStyle w:val="BodyText"/>
+      </w:pPr>
+      <w:r>
+        <w:t xml:space="preserve">Phillimore, A. B., &amp; Price, T. D. (2008). Density-dependent cladogenesis in birds.</w:t>
+      </w:r>
+      <w:r>
+        <w:t xml:space="preserve"> </w:t>
+      </w:r>
+      <w:r>
+        <w:rPr>
+          <w:i/>
+          <w:iCs/>
+        </w:rPr>
+        <w:t xml:space="preserve">PLoS Biology</w:t>
+      </w:r>
+      <w:r>
+        <w:t xml:space="preserve">, 6, e71. https://doi.org/10.1371/journal.pbio.0060071</w:t>
+      </w:r>
+    </w:p>
+    <w:p>
+      <w:pPr>
+        <w:pStyle w:val="BodyText"/>
+      </w:pPr>
+      <w:r>
+        <w:t xml:space="preserve">Pillar, V. D., &amp; Duarte, L. D. S. (2010). A framework for metacommunity analysis of phylogenetic structure.</w:t>
+      </w:r>
+      <w:r>
+        <w:t xml:space="preserve"> </w:t>
+      </w:r>
+      <w:r>
+        <w:rPr>
+          <w:i/>
+          <w:iCs/>
+        </w:rPr>
+        <w:t xml:space="preserve">Ecology Letters</w:t>
+      </w:r>
+      <w:r>
+        <w:t xml:space="preserve">, 13, 587–596. https://doi.org/10.1111/j.1461-0248.2010.01456.x</w:t>
+      </w:r>
+    </w:p>
+    <w:p>
+      <w:pPr>
+        <w:pStyle w:val="BodyText"/>
+      </w:pPr>
+      <w:r>
+        <w:t xml:space="preserve">Portik, D. M., Streicher, J. W., &amp; Wiens, J. J. (2023). Frog phylogeny: a time-calibrated, species-level tree based on hundreds of loci and 5,242 species.</w:t>
+      </w:r>
+      <w:r>
+        <w:t xml:space="preserve"> </w:t>
+      </w:r>
+      <w:r>
+        <w:rPr>
+          <w:i/>
+          <w:iCs/>
+        </w:rPr>
+        <w:t xml:space="preserve">Molecular Phylogenetics and Evolution</w:t>
+      </w:r>
+      <w:r>
+        <w:t xml:space="preserve">, 188, 107907. https://doi.org/10.1016/j.ympev.2023.107907</w:t>
+      </w:r>
+    </w:p>
+    <w:p>
+      <w:pPr>
+        <w:pStyle w:val="BodyText"/>
+      </w:pPr>
+      <w:r>
+        <w:t xml:space="preserve">Pybus, O. G., &amp; Harvey, P. H. (2000). Testing macro-evolutionary models using incomplete molecular phylogenies.</w:t>
+      </w:r>
+      <w:r>
+        <w:t xml:space="preserve"> </w:t>
+      </w:r>
+      <w:r>
+        <w:rPr>
+          <w:i/>
+          <w:iCs/>
+        </w:rPr>
+        <w:t xml:space="preserve">Proceedings of the Royal Society B</w:t>
+      </w:r>
+      <w:r>
+        <w:t xml:space="preserve">, 267, 2267–2272. https://doi.org/10.1098/rspb.2000.1278</w:t>
+      </w:r>
+    </w:p>
+    <w:p>
+      <w:pPr>
+        <w:pStyle w:val="BodyText"/>
+      </w:pPr>
+      <w:r>
+        <w:t xml:space="preserve">R Core Team (2026).</w:t>
+      </w:r>
+      <w:r>
+        <w:t xml:space="preserve"> </w:t>
+      </w:r>
+      <w:r>
+        <w:rPr>
+          <w:i/>
+          <w:iCs/>
+        </w:rPr>
+        <w:t xml:space="preserve">R: a language and environment for statistical computing</w:t>
+      </w:r>
+      <w:r>
+        <w:t xml:space="preserve">. Vienna: R Foundation for Statistical Computing. doi:10.32614/R.manuals.</w:t>
+      </w:r>
+    </w:p>
+    <w:p>
+      <w:pPr>
+        <w:pStyle w:val="BodyText"/>
+      </w:pPr>
+      <w:r>
+        <w:t xml:space="preserve">Roelants, K., Gower, D. J., Wilkinson, M., Loader, S. P., Biju, S. D., Guillaume, K., Moriau, L., &amp; Bossuyt, F. (2007). Global patterns of diversification in the history of modern amphibians.</w:t>
+      </w:r>
+      <w:r>
+        <w:t xml:space="preserve"> </w:t>
+      </w:r>
+      <w:r>
+        <w:rPr>
+          <w:i/>
+          <w:iCs/>
+        </w:rPr>
+        <w:t xml:space="preserve">Proceedings of the National Academy of Sciences</w:t>
+      </w:r>
+      <w:r>
+        <w:t xml:space="preserve">, 104, 887–892. https://doi.org/10.1073/pnas.0608378104</w:t>
+      </w:r>
+    </w:p>
+    <w:p>
+      <w:pPr>
+        <w:pStyle w:val="BodyText"/>
+      </w:pPr>
+      <w:r>
+        <w:t xml:space="preserve">Thompson, P. L., Guzman, L. M., De Meester, L., Horváth, Z., Ptacnik, R., Vanschoenwinkel, B., Viana, D. S., &amp; Chase, J. M. (2020). A process-based metacommunity framework linking local and regional scale community ecology.</w:t>
+      </w:r>
+      <w:r>
+        <w:t xml:space="preserve"> </w:t>
+      </w:r>
+      <w:r>
+        <w:rPr>
+          <w:i/>
+          <w:iCs/>
+        </w:rPr>
+        <w:t xml:space="preserve">Ecology Letters</w:t>
+      </w:r>
+      <w:r>
+        <w:t xml:space="preserve">, 23, 1314–1329. https://doi.org/10.1111/ele.13568</w:t>
+      </w:r>
+    </w:p>
+    <w:p>
+      <w:pPr>
+        <w:pStyle w:val="BodyText"/>
+      </w:pPr>
+      <w:r>
+        <w:t xml:space="preserve">Tsang, T. P. N., &amp; Cadotte, M. W. (2025). Species overlap and phylogenetic relatedness result in community statistical non-independence (and what to do about it).</w:t>
+      </w:r>
+      <w:r>
+        <w:t xml:space="preserve"> </w:t>
+      </w:r>
+      <w:r>
+        <w:rPr>
+          <w:i/>
+          <w:iCs/>
+        </w:rPr>
+        <w:t xml:space="preserve">Ecology Letters</w:t>
+      </w:r>
+      <w:r>
+        <w:t xml:space="preserve">, 28, e70267. https://doi.org/10.1111/ele.70267</w:t>
+      </w:r>
+    </w:p>
+    <w:p>
+      <w:pPr>
+        <w:pStyle w:val="BodyText"/>
+      </w:pPr>
+      <w:r>
+        <w:t xml:space="preserve">Ushey, K., &amp; Wickham, H. (2026). renv: project environments. R package version 1.3.1. doi:10.32614/CRAN.package.renv.</w:t>
+      </w:r>
+    </w:p>
+    <w:p>
+      <w:pPr>
+        <w:pStyle w:val="BodyText"/>
+      </w:pPr>
+      <w:r>
+        <w:t xml:space="preserve">Washburne, A. D., Silverman, J. D., Leff, J. W., Bennett, D. J., Darcy, J. L., Mukherjee, S., Fierer, N., &amp; David, L. A. (2017). Phylogenetic factorization of compositional data yields lineage-level associations in microbiome datasets.</w:t>
+      </w:r>
+      <w:r>
+        <w:t xml:space="preserve"> </w:t>
+      </w:r>
+      <w:r>
+        <w:rPr>
+          <w:i/>
+          <w:iCs/>
+        </w:rPr>
+        <w:t xml:space="preserve">PeerJ</w:t>
+      </w:r>
+      <w:r>
+        <w:t xml:space="preserve">, 5, e2969. https://doi.org/10.7717/peerj.2969</w:t>
+      </w:r>
+    </w:p>
+    <w:p>
+      <w:pPr>
+        <w:pStyle w:val="BodyText"/>
+      </w:pPr>
+      <w:r>
+        <w:t xml:space="preserve">Washburne, A. D., Silverman, J. D., Morton, J. T., Becker, D. J., Crowley, D., Mukherjee, S., David, L. A., &amp; Plowright, R. K. (2019). Phylofactorization: a graph partitioning algorithm to identify phylogenetic scales of ecological data.</w:t>
+      </w:r>
+      <w:r>
+        <w:t xml:space="preserve"> </w:t>
+      </w:r>
+      <w:r>
+        <w:rPr>
+          <w:i/>
+          <w:iCs/>
+        </w:rPr>
+        <w:t xml:space="preserve">Ecological Monographs</w:t>
+      </w:r>
+      <w:r>
+        <w:t xml:space="preserve">, 89, e01353. https://doi.org/10.1002/ecm.1353</w:t>
+      </w:r>
+    </w:p>
+    <w:p>
+      <w:pPr>
+        <w:pStyle w:val="BodyText"/>
+      </w:pPr>
+      <w:r>
+        <w:t xml:space="preserve">Williams, C., Yang, Y., Lagisz, M., Morrison, K., Ricolfi, L., Warton, D. I., &amp; Nakagawa, S. (2024). Transparent reporting items for simulation studies evaluating statistical methods: foundations for reproducibility and reliability.</w:t>
       </w:r>
       <w:r>
         <w:t xml:space="preserve"> </w:t>
@@ -3398,346 +4009,15 @@
         <w:t xml:space="preserve">Methods in Ecology and Evolution</w:t>
       </w:r>
       <w:r>
-        <w:t xml:space="preserve">, 7, 937–946. https://doi.org/10.1111/2041-210X.12547</w:t>
-      </w:r>
-    </w:p>
-    <w:p>
-      <w:pPr>
-        <w:pStyle w:val="BodyText"/>
-      </w:pPr>
-      <w:r>
-        <w:t xml:space="preserve">Duarte, L. D. S., Prieto, P. V., &amp; Pillar, V. D. (2012). Assessing spatial and environmental drivers of phylogenetic structure in Brazilian Araucaria forests.</w:t>
-      </w:r>
-      <w:r>
-        <w:t xml:space="preserve"> </w:t>
-      </w:r>
-      <w:r>
-        <w:rPr>
-          <w:i/>
-          <w:iCs/>
-        </w:rPr>
-        <w:t xml:space="preserve">Ecography</w:t>
-      </w:r>
-      <w:r>
-        <w:t xml:space="preserve">, 35, 952–960. https://doi.org/10.1111/j.1600-0587.2011.07193.x</w:t>
-      </w:r>
-    </w:p>
-    <w:p>
-      <w:pPr>
-        <w:pStyle w:val="BodyText"/>
-      </w:pPr>
-      <w:r>
-        <w:t xml:space="preserve">Feng, Y.-J., Blackburn, D. C., Liang, D., Hillis, D. M., Wake, D. B., Cannatella, D. C., &amp; Zhang, P. (2017). Phylogenomics reveals rapid, simultaneous diversification of three major clades of Gondwanan frogs at the Cretaceous–Paleogene boundary.</w:t>
-      </w:r>
-      <w:r>
-        <w:t xml:space="preserve"> </w:t>
-      </w:r>
-      <w:r>
-        <w:rPr>
-          <w:i/>
-          <w:iCs/>
-        </w:rPr>
-        <w:t xml:space="preserve">Proceedings of the National Academy of Sciences</w:t>
-      </w:r>
-      <w:r>
-        <w:t xml:space="preserve">, 114, E5864–E5870. https://doi.org/10.1073/pnas.1704632114</w:t>
-      </w:r>
-    </w:p>
-    <w:p>
-      <w:pPr>
-        <w:pStyle w:val="BodyText"/>
-      </w:pPr>
-      <w:r>
-        <w:t xml:space="preserve">Frost, D. R. (2026).</w:t>
-      </w:r>
-      <w:r>
-        <w:t xml:space="preserve"> </w:t>
-      </w:r>
-      <w:r>
-        <w:rPr>
-          <w:i/>
-          <w:iCs/>
-        </w:rPr>
-        <w:t xml:space="preserve">Amphibian Species of the World: an online reference</w:t>
-      </w:r>
-      <w:r>
-        <w:t xml:space="preserve">. Version 6.2. American Museum of Natural History. https://amphibiansoftheworld.amnh.org/index.php https://doi.org/10.5531/db.vz.0001</w:t>
-      </w:r>
-    </w:p>
-    <w:p>
-      <w:pPr>
-        <w:pStyle w:val="BodyText"/>
-      </w:pPr>
-      <w:r>
-        <w:t xml:space="preserve">Gabry, J., Češnovar, R., Johnson, A., &amp; Bronder, S. (2025). cmdstanr: R interface to CmdStan. R package version 0.9.0. https://github.com/stan-dev/cmdstanr.</w:t>
-      </w:r>
-    </w:p>
-    <w:p>
-      <w:pPr>
-        <w:pStyle w:val="BodyText"/>
-      </w:pPr>
-      <w:r>
-        <w:t xml:space="preserve">Gerhold, P., Cahill, J. F., Winter, M., Bartish, I. V., &amp; Prinzing, A. (2015). Phylogenetic patterns are not proxies of community assembly mechanisms (they are far better).</w:t>
-      </w:r>
-      <w:r>
-        <w:t xml:space="preserve"> </w:t>
-      </w:r>
-      <w:r>
-        <w:rPr>
-          <w:i/>
-          <w:iCs/>
-        </w:rPr>
-        <w:t xml:space="preserve">Functional Ecology</w:t>
-      </w:r>
-      <w:r>
-        <w:t xml:space="preserve">, 29, 600–614. https://doi.org/10.1111/1365-2435.12425</w:t>
-      </w:r>
-    </w:p>
-    <w:p>
-      <w:pPr>
-        <w:pStyle w:val="BodyText"/>
-      </w:pPr>
-      <w:r>
-        <w:t xml:space="preserve">Godoy, O., Kraft, N. J. B., &amp; Levine, J. M. (2014). Phylogenetic relatedness and the determinants of competitive outcomes.</w:t>
-      </w:r>
-      <w:r>
-        <w:t xml:space="preserve"> </w:t>
-      </w:r>
-      <w:r>
-        <w:rPr>
-          <w:i/>
-          <w:iCs/>
-        </w:rPr>
-        <w:t xml:space="preserve">Ecology Letters</w:t>
-      </w:r>
-      <w:r>
-        <w:t xml:space="preserve">, 17, 836–844. https://doi.org/10.1111/ele.12289</w:t>
-      </w:r>
-    </w:p>
-    <w:p>
-      <w:pPr>
-        <w:pStyle w:val="BodyText"/>
-      </w:pPr>
-      <w:r>
-        <w:t xml:space="preserve">Hardy, O. J. (2008). Testing the spatial phylogenetic structure of local communities: statistical performances of different null models and test statistics on a locally neutral community.</w:t>
-      </w:r>
-      <w:r>
-        <w:t xml:space="preserve"> </w:t>
-      </w:r>
-      <w:r>
-        <w:rPr>
-          <w:i/>
-          <w:iCs/>
-        </w:rPr>
-        <w:t xml:space="preserve">Journal of Ecology</w:t>
-      </w:r>
-      <w:r>
-        <w:t xml:space="preserve">, 96, 914–926. https://doi.org/10.1111/j.1365-2745.2008.01421.x</w:t>
-      </w:r>
-    </w:p>
-    <w:p>
-      <w:pPr>
-        <w:pStyle w:val="BodyText"/>
-      </w:pPr>
-      <w:r>
-        <w:t xml:space="preserve">Heard, S. B. (1992). Patterns in tree balance among cladistic, phenetic, and randomly generated phylogenetic trees.</w:t>
-      </w:r>
-      <w:r>
-        <w:t xml:space="preserve"> </w:t>
-      </w:r>
-      <w:r>
-        <w:rPr>
-          <w:i/>
-          <w:iCs/>
-        </w:rPr>
-        <w:t xml:space="preserve">Evolution</w:t>
-      </w:r>
-      <w:r>
-        <w:t xml:space="preserve">, 46, 1818–1826. https://doi.org/10.1111/j.1558-5646.1992.tb01171.x</w:t>
-      </w:r>
-    </w:p>
-    <w:p>
-      <w:pPr>
-        <w:pStyle w:val="BodyText"/>
-      </w:pPr>
-      <w:r>
-        <w:t xml:space="preserve">Janzen, T., &amp; Etienne, R. S. (2024). Phylogenetic tree statistics: a systematic overview using the new R package treestats.</w:t>
-      </w:r>
-      <w:r>
-        <w:t xml:space="preserve"> </w:t>
-      </w:r>
-      <w:r>
-        <w:rPr>
-          <w:i/>
-          <w:iCs/>
-        </w:rPr>
-        <w:t xml:space="preserve">Molecular Phylogenetics and Evolution</w:t>
-      </w:r>
-      <w:r>
-        <w:t xml:space="preserve">, 200, 108168. https://doi.org/10.1016/j.ympev.2024.108168</w:t>
-      </w:r>
-    </w:p>
-    <w:p>
-      <w:pPr>
-        <w:pStyle w:val="BodyText"/>
-      </w:pPr>
-      <w:r>
-        <w:t xml:space="preserve">Kembel, S. W. (2009). Disentangling niche and neutral influences on community assembly: assessing the performance of community phylogenetic structure tests.</w:t>
-      </w:r>
-      <w:r>
-        <w:t xml:space="preserve"> </w:t>
-      </w:r>
-      <w:r>
-        <w:rPr>
-          <w:i/>
-          <w:iCs/>
-        </w:rPr>
-        <w:t xml:space="preserve">Ecology Letters</w:t>
-      </w:r>
-      <w:r>
-        <w:t xml:space="preserve">, 12, 949–960. https://doi.org/10.1111/j.1461-0248.2009.01354.x</w:t>
-      </w:r>
-    </w:p>
-    <w:p>
-      <w:pPr>
-        <w:pStyle w:val="BodyText"/>
-      </w:pPr>
-      <w:r>
-        <w:t xml:space="preserve">Landau, W. M. (2021). The targets R package: a dynamic Make-like function-oriented pipeline toolkit for reproducibility and high-performance computing.</w:t>
-      </w:r>
-      <w:r>
-        <w:t xml:space="preserve"> </w:t>
-      </w:r>
-      <w:r>
-        <w:rPr>
-          <w:i/>
-          <w:iCs/>
-        </w:rPr>
-        <w:t xml:space="preserve">Journal of Open Source Software</w:t>
-      </w:r>
-      <w:r>
-        <w:t xml:space="preserve">, 6(57), 2959. https://doi.org/10.21105/joss.02959</w:t>
-      </w:r>
-    </w:p>
-    <w:p>
-      <w:pPr>
-        <w:pStyle w:val="BodyText"/>
-      </w:pPr>
-      <w:r>
-        <w:t xml:space="preserve">Landau, W. M. (2026). crew: a distributed worker launcher framework. R package version 1.3.3. doi:10.32614/CRAN.package.crew.</w:t>
-      </w:r>
-    </w:p>
-    <w:p>
-      <w:pPr>
-        <w:pStyle w:val="BodyText"/>
-      </w:pPr>
-      <w:r>
-        <w:t xml:space="preserve">Leibold, M. A., Economo, E. P., &amp; Peres-Neto, P. (2010). Metacommunity phylogenetics: separating the roles of environmental filters and historical biogeography.</w:t>
-      </w:r>
-      <w:r>
-        <w:t xml:space="preserve"> </w:t>
-      </w:r>
-      <w:r>
-        <w:rPr>
-          <w:i/>
-          <w:iCs/>
-        </w:rPr>
-        <w:t xml:space="preserve">Ecology Letters</w:t>
-      </w:r>
-      <w:r>
-        <w:t xml:space="preserve">, 13, 1290–1299. https://doi.org/10.1111/j.1461-0248.2010.01523.x</w:t>
-      </w:r>
-    </w:p>
-    <w:p>
-      <w:pPr>
-        <w:pStyle w:val="BodyText"/>
-      </w:pPr>
-      <w:r>
-        <w:t xml:space="preserve">Leibold, M. A., Holyoak, M., Mouquet, N., Amarasekare, P., Chase, J. M., Hoopes, M. F., Holt, R. D., Shurin, J. B., Law, R., Tilman, D., Loreau, M., &amp; Gonzalez, A. (2004). The metacommunity concept: a framework for multi-scale community ecology.</w:t>
-      </w:r>
-      <w:r>
-        <w:t xml:space="preserve"> </w:t>
-      </w:r>
-      <w:r>
-        <w:rPr>
-          <w:i/>
-          <w:iCs/>
-        </w:rPr>
-        <w:t xml:space="preserve">Ecology Letters</w:t>
-      </w:r>
-      <w:r>
-        <w:t xml:space="preserve">, 7, 601–613. https://doi.org/10.1111/j.1461-0248.2004.00608.x</w:t>
-      </w:r>
-    </w:p>
-    <w:p>
-      <w:pPr>
-        <w:pStyle w:val="BodyText"/>
-      </w:pPr>
-      <w:r>
-        <w:t xml:space="preserve">Li, D., &amp; Ives, A. R. (2017). The statistical need to include phylogeny in trait-based analyses of community composition.</w:t>
-      </w:r>
-      <w:r>
-        <w:t xml:space="preserve"> </w:t>
-      </w:r>
-      <w:r>
-        <w:rPr>
-          <w:i/>
-          <w:iCs/>
-        </w:rPr>
-        <w:t xml:space="preserve">Methods in Ecology and Evolution</w:t>
-      </w:r>
-      <w:r>
-        <w:t xml:space="preserve">, 8, 1192–1199. https://doi.org/10.1111/2041-210X.12767</w:t>
-      </w:r>
-    </w:p>
-    <w:p>
-      <w:pPr>
-        <w:pStyle w:val="BodyText"/>
-      </w:pPr>
-      <w:r>
-        <w:t xml:space="preserve">Liedtke, H. C. (2019). AmphiNom: an amphibian systematics tool.</w:t>
-      </w:r>
-      <w:r>
-        <w:t xml:space="preserve"> </w:t>
-      </w:r>
-      <w:r>
-        <w:rPr>
-          <w:i/>
-          <w:iCs/>
-        </w:rPr>
-        <w:t xml:space="preserve">Systematics and Biodiversity</w:t>
-      </w:r>
-      <w:r>
-        <w:t xml:space="preserve">, 17, 1–6. https://doi.org/10.1080/14772000.2018.1518935</w:t>
-      </w:r>
-    </w:p>
-    <w:p>
-      <w:pPr>
-        <w:pStyle w:val="BodyText"/>
-      </w:pPr>
-      <w:r>
-        <w:t xml:space="preserve">Mantel, N. (1967). The detection of disease clustering and a generalized regression approach.</w:t>
-      </w:r>
-      <w:r>
-        <w:t xml:space="preserve"> </w:t>
-      </w:r>
-      <w:r>
-        <w:rPr>
-          <w:i/>
-          <w:iCs/>
-        </w:rPr>
-        <w:t xml:space="preserve">Cancer Research</w:t>
-      </w:r>
-      <w:r>
-        <w:t xml:space="preserve">, 27, 209–220.</w:t>
-      </w:r>
-    </w:p>
-    <w:p>
-      <w:pPr>
-        <w:pStyle w:val="BodyText"/>
-      </w:pPr>
-      <w:r>
-        <w:t xml:space="preserve">Mason, N. W. H., &amp; Pavoine, S. (2013). Does trait conservatism guarantee that indicators of phylogenetic community structure will reveal niche-based assembly processes along stress gradients?</w:t>
+        <w:t xml:space="preserve">, 15, 1926–1939. https://doi.org/10.1111/2041-210X.14415</w:t>
+      </w:r>
+    </w:p>
+    <w:p>
+      <w:pPr>
+        <w:pStyle w:val="BodyText"/>
+      </w:pPr>
+      <w:r>
+        <w:t xml:space="preserve">Zelený, D. (2018). Which results of the standard test for community-weighted mean approach are too optimistic?</w:t>
       </w:r>
       <w:r>
         <w:t xml:space="preserve"> </w:t>
@@ -3750,656 +4030,10 @@
         <w:t xml:space="preserve">Journal of Vegetation Science</w:t>
       </w:r>
       <w:r>
-        <w:t xml:space="preserve">, 24, 820–833. https://doi.org/10.1111/jvs.12033</w:t>
-      </w:r>
-    </w:p>
-    <w:p>
-      <w:pPr>
-        <w:pStyle w:val="BodyText"/>
-      </w:pPr>
-      <w:r>
-        <w:t xml:space="preserve">Mayfield, M. M., &amp; Levine, J. M. (2010). Opposing effects of competitive exclusion on the phylogenetic structure of communities.</w:t>
-      </w:r>
-      <w:r>
-        <w:t xml:space="preserve"> </w:t>
-      </w:r>
-      <w:r>
-        <w:rPr>
-          <w:i/>
-          <w:iCs/>
-        </w:rPr>
-        <w:t xml:space="preserve">Ecology Letters</w:t>
-      </w:r>
-      <w:r>
-        <w:t xml:space="preserve">, 13, 1085–1093. https://doi.org/10.1111/j.1461-0248.2010.01509.x</w:t>
-      </w:r>
-    </w:p>
-    <w:p>
-      <w:pPr>
-        <w:pStyle w:val="BodyText"/>
-      </w:pPr>
-      <w:r>
-        <w:t xml:space="preserve">Mazel, F., Davies, T. J., Gallien, L., Renaud, J., Groussin, M., Münkemüller, T., &amp; Thuiller, W. (2016). Influence of tree shape and evolutionary time-scale on phylogenetic diversity metrics.</w:t>
-      </w:r>
-      <w:r>
-        <w:t xml:space="preserve"> </w:t>
-      </w:r>
-      <w:r>
-        <w:rPr>
-          <w:i/>
-          <w:iCs/>
-        </w:rPr>
-        <w:t xml:space="preserve">Ecography</w:t>
-      </w:r>
-      <w:r>
-        <w:t xml:space="preserve">, 39, 913–920. https://doi.org/10.1111/ecog.01694</w:t>
-      </w:r>
-    </w:p>
-    <w:p>
-      <w:pPr>
-        <w:pStyle w:val="BodyText"/>
-      </w:pPr>
-      <w:r>
-        <w:t xml:space="preserve">McPeek, M. A. (2008). The ecological dynamics of clade diversification and community assembly.</w:t>
-      </w:r>
-      <w:r>
-        <w:t xml:space="preserve"> </w:t>
-      </w:r>
-      <w:r>
-        <w:rPr>
-          <w:i/>
-          <w:iCs/>
-        </w:rPr>
-        <w:t xml:space="preserve">The American Naturalist</w:t>
-      </w:r>
-      <w:r>
-        <w:t xml:space="preserve">, 172, E270–E284. https://doi.org/10.1086/593137</w:t>
-      </w:r>
-    </w:p>
-    <w:p>
-      <w:pPr>
-        <w:pStyle w:val="BodyText"/>
-      </w:pPr>
-      <w:r>
-        <w:t xml:space="preserve">Molina-Venegas, R., &amp; Roquet, C. (2014). Directional biases in phylogenetic structure quantification: a Mediterranean case study.</w:t>
-      </w:r>
-      <w:r>
-        <w:t xml:space="preserve"> </w:t>
-      </w:r>
-      <w:r>
-        <w:rPr>
-          <w:i/>
-          <w:iCs/>
-        </w:rPr>
-        <w:t xml:space="preserve">Ecography</w:t>
-      </w:r>
-      <w:r>
-        <w:t xml:space="preserve">, 37, 572–580. https://doi.org/10.1111/j.1600-0587.2013.00442.x</w:t>
-      </w:r>
-    </w:p>
-    <w:p>
-      <w:pPr>
-        <w:pStyle w:val="BodyText"/>
-      </w:pPr>
-      <w:r>
-        <w:t xml:space="preserve">Mouquet, N., &amp; Loreau, M. (2003). Community patterns in source-sink metacommunities.</w:t>
-      </w:r>
-      <w:r>
-        <w:t xml:space="preserve"> </w:t>
-      </w:r>
-      <w:r>
-        <w:rPr>
-          <w:i/>
-          <w:iCs/>
-        </w:rPr>
-        <w:t xml:space="preserve">The American Naturalist</w:t>
-      </w:r>
-      <w:r>
-        <w:t xml:space="preserve">, 162, 544–557. https://doi.org/10.1086/378857</w:t>
-      </w:r>
-    </w:p>
-    <w:p>
-      <w:pPr>
-        <w:pStyle w:val="BodyText"/>
-      </w:pPr>
-      <w:r>
-        <w:t xml:space="preserve">Münkemüller, T., Gallien, L., Pollock, L. J., Barros, C., Carboni, M., Chalmandrier, L., Mazel, F., Mokany, K., Roquet, C., Smyčka, J., Talluto, M. V., &amp; Thuiller, W. (2020). Dos and don’ts when inferring assembly rules from diversity patterns.</w:t>
-      </w:r>
-      <w:r>
-        <w:t xml:space="preserve"> </w:t>
-      </w:r>
-      <w:r>
-        <w:rPr>
-          <w:i/>
-          <w:iCs/>
-        </w:rPr>
-        <w:t xml:space="preserve">Global Ecology and Biogeography</w:t>
-      </w:r>
-      <w:r>
-        <w:t xml:space="preserve">, 29, 1212–1229. https://doi.org/10.1111/geb.13098</w:t>
-      </w:r>
-    </w:p>
-    <w:p>
-      <w:pPr>
-        <w:pStyle w:val="BodyText"/>
-      </w:pPr>
-      <w:r>
-        <w:t xml:space="preserve">Münkemüller, T., Lavergne, S., Bzeznik, B., Dray, S., Jombart, T., Schiffers, K., &amp; Thuiller, W. (2012). How to measure and test phylogenetic signal.</w:t>
-      </w:r>
-      <w:r>
-        <w:t xml:space="preserve"> </w:t>
-      </w:r>
-      <w:r>
-        <w:rPr>
-          <w:i/>
-          <w:iCs/>
-        </w:rPr>
-        <w:t xml:space="preserve">Methods in Ecology and Evolution</w:t>
-      </w:r>
-      <w:r>
-        <w:t xml:space="preserve">, 3, 743–756. https://doi.org/10.1111/j.2041-210X.2012.00196.x</w:t>
-      </w:r>
-    </w:p>
-    <w:p>
-      <w:pPr>
-        <w:pStyle w:val="BodyText"/>
-      </w:pPr>
-      <w:r>
-        <w:t xml:space="preserve">Oksanen, J., Simpson, G. L., Blanchet, F. G., Kindt, R., Legendre, P., Minchin, P. R., et al. (2026). vegan: community ecology package. R package version 2.7-6. doi:10.32614/CRAN.package.vegan.</w:t>
-      </w:r>
-    </w:p>
-    <w:p>
-      <w:pPr>
-        <w:pStyle w:val="BodyText"/>
-      </w:pPr>
-      <w:r>
-        <w:t xml:space="preserve">Pagel, M. (1999). Inferring the historical patterns of biological evolution.</w:t>
-      </w:r>
-      <w:r>
-        <w:t xml:space="preserve"> </w:t>
-      </w:r>
-      <w:r>
-        <w:rPr>
-          <w:i/>
-          <w:iCs/>
-        </w:rPr>
-        <w:t xml:space="preserve">Nature</w:t>
-      </w:r>
-      <w:r>
-        <w:t xml:space="preserve">, 401, 877–884. https://doi.org/10.1038/44766</w:t>
-      </w:r>
-    </w:p>
-    <w:p>
-      <w:pPr>
-        <w:pStyle w:val="BodyText"/>
-      </w:pPr>
-      <w:r>
-        <w:t xml:space="preserve">Paradis, E., &amp; Schliep, K. (2019). ape 5.0: an environment for modern phylogenetics and evolutionary analyses in R.</w:t>
-      </w:r>
-      <w:r>
-        <w:t xml:space="preserve"> </w:t>
-      </w:r>
-      <w:r>
-        <w:rPr>
-          <w:i/>
-          <w:iCs/>
-        </w:rPr>
-        <w:t xml:space="preserve">Bioinformatics</w:t>
-      </w:r>
-      <w:r>
-        <w:t xml:space="preserve">, 35, 526–528. https://doi.org/10.1093/bioinformatics/bty633</w:t>
-      </w:r>
-    </w:p>
-    <w:p>
-      <w:pPr>
-        <w:pStyle w:val="BodyText"/>
-      </w:pPr>
-      <w:r>
-        <w:t xml:space="preserve">Parra, J. L., McGuire, J. A., &amp; Graham, C. H. (2010). Incorporating clade identity in analyses of phylogenetic community structure: an example with hummingbirds.</w:t>
-      </w:r>
-      <w:r>
-        <w:t xml:space="preserve"> </w:t>
-      </w:r>
-      <w:r>
-        <w:rPr>
-          <w:i/>
-          <w:iCs/>
-        </w:rPr>
-        <w:t xml:space="preserve">The American Naturalist</w:t>
-      </w:r>
-      <w:r>
-        <w:t xml:space="preserve">, 176, 573–587. https://doi.org/10.1086/656619</w:t>
-      </w:r>
-    </w:p>
-    <w:p>
-      <w:pPr>
-        <w:pStyle w:val="BodyText"/>
-      </w:pPr>
-      <w:r>
-        <w:t xml:space="preserve">Pavoine, S. (2016). A guide through a family of phylogenetic dissimilarity measures among sites.</w:t>
-      </w:r>
-      <w:r>
-        <w:t xml:space="preserve"> </w:t>
-      </w:r>
-      <w:r>
-        <w:rPr>
-          <w:i/>
-          <w:iCs/>
-        </w:rPr>
-        <w:t xml:space="preserve">Oikos</w:t>
-      </w:r>
-      <w:r>
-        <w:t xml:space="preserve">, 125, 1719–1732. https://doi.org/10.1111/oik.03262</w:t>
-      </w:r>
-    </w:p>
-    <w:p>
-      <w:pPr>
-        <w:pStyle w:val="BodyText"/>
-      </w:pPr>
-      <w:r>
-        <w:t xml:space="preserve">Pavoine, S. (2020). adiv: an R package to analyse biodiversity in ecology.</w:t>
-      </w:r>
-      <w:r>
-        <w:t xml:space="preserve"> </w:t>
-      </w:r>
-      <w:r>
-        <w:rPr>
-          <w:i/>
-          <w:iCs/>
-        </w:rPr>
-        <w:t xml:space="preserve">Methods in Ecology and Evolution</w:t>
-      </w:r>
-      <w:r>
-        <w:t xml:space="preserve">, 11, 1106–1112. https://doi.org/10.1111/2041-210X.13430</w:t>
-      </w:r>
-    </w:p>
-    <w:p>
-      <w:pPr>
-        <w:pStyle w:val="BodyText"/>
-      </w:pPr>
-      <w:r>
-        <w:t xml:space="preserve">Peres-Neto, P. R., &amp; Kembel, S. W. (2015). Phylogenetic gradient analysis: environmental drivers of phylogenetic variation across ecological communities.</w:t>
-      </w:r>
-      <w:r>
-        <w:t xml:space="preserve"> </w:t>
-      </w:r>
-      <w:r>
-        <w:rPr>
-          <w:i/>
-          <w:iCs/>
-        </w:rPr>
-        <w:t xml:space="preserve">Plant Ecology</w:t>
-      </w:r>
-      <w:r>
-        <w:t xml:space="preserve">, 216, 709–724. https://doi.org/10.1007/s11258-014-0405-0</w:t>
-      </w:r>
-    </w:p>
-    <w:p>
-      <w:pPr>
-        <w:pStyle w:val="BodyText"/>
-      </w:pPr>
-      <w:r>
-        <w:t xml:space="preserve">Peres-Neto, P. R., Dray, S., &amp; ter Braak, C. J. F. (2017). Linking trait variation to the environment: critical issues with community-weighted mean correlation resolved by the fourth-corner approach.</w:t>
-      </w:r>
-      <w:r>
-        <w:t xml:space="preserve"> </w:t>
-      </w:r>
-      <w:r>
-        <w:rPr>
-          <w:i/>
-          <w:iCs/>
-        </w:rPr>
-        <w:t xml:space="preserve">Ecography</w:t>
-      </w:r>
-      <w:r>
-        <w:t xml:space="preserve">, 40, 806–816. https://doi.org/10.1111/ecog.02302</w:t>
-      </w:r>
-    </w:p>
-    <w:p>
-      <w:pPr>
-        <w:pStyle w:val="BodyText"/>
-      </w:pPr>
-      <w:r>
-        <w:t xml:space="preserve">Peres-Neto, P. R., Leibold, M. A., &amp; Dray, S. (2012). Assessing the effects of spatial contingency and environmental filtering on metacommunity phylogenetics.</w:t>
-      </w:r>
-      <w:r>
-        <w:t xml:space="preserve"> </w:t>
-      </w:r>
-      <w:r>
-        <w:rPr>
-          <w:i/>
-          <w:iCs/>
-        </w:rPr>
-        <w:t xml:space="preserve">Ecology</w:t>
-      </w:r>
-      <w:r>
-        <w:t xml:space="preserve">, 93, S14–S30. https://doi.org/10.1890/11-0494.1</w:t>
-      </w:r>
-    </w:p>
-    <w:p>
-      <w:pPr>
-        <w:pStyle w:val="BodyText"/>
-      </w:pPr>
-      <w:r>
-        <w:t xml:space="preserve">Phillimore, A. B., &amp; Price, T. D. (2008). Density-dependent cladogenesis in birds.</w:t>
-      </w:r>
-      <w:r>
-        <w:t xml:space="preserve"> </w:t>
-      </w:r>
-      <w:r>
-        <w:rPr>
-          <w:i/>
-          <w:iCs/>
-        </w:rPr>
-        <w:t xml:space="preserve">PLoS Biology</w:t>
-      </w:r>
-      <w:r>
-        <w:t xml:space="preserve">, 6, e71. https://doi.org/10.1371/journal.pbio.0060071</w:t>
-      </w:r>
-    </w:p>
-    <w:p>
-      <w:pPr>
-        <w:pStyle w:val="BodyText"/>
-      </w:pPr>
-      <w:r>
-        <w:t xml:space="preserve">Pillar, V. D., &amp; Duarte, L. D. S. (2010). A framework for metacommunity analysis of phylogenetic structure.</w:t>
-      </w:r>
-      <w:r>
-        <w:t xml:space="preserve"> </w:t>
-      </w:r>
-      <w:r>
-        <w:rPr>
-          <w:i/>
-          <w:iCs/>
-        </w:rPr>
-        <w:t xml:space="preserve">Ecology Letters</w:t>
-      </w:r>
-      <w:r>
-        <w:t xml:space="preserve">, 13, 587–596. https://doi.org/10.1111/j.1461-0248.2010.01456.x</w:t>
-      </w:r>
-    </w:p>
-    <w:p>
-      <w:pPr>
-        <w:pStyle w:val="BodyText"/>
-      </w:pPr>
-      <w:r>
-        <w:t xml:space="preserve">Portik, D. M., Streicher, J. W., &amp; Wiens, J. J. (2023). Frog phylogeny: a time-calibrated, species-level tree based on hundreds of loci and 5,242 species.</w:t>
-      </w:r>
-      <w:r>
-        <w:t xml:space="preserve"> </w:t>
-      </w:r>
-      <w:r>
-        <w:rPr>
-          <w:i/>
-          <w:iCs/>
-        </w:rPr>
-        <w:t xml:space="preserve">Molecular Phylogenetics and Evolution</w:t>
-      </w:r>
-      <w:r>
-        <w:t xml:space="preserve">, 188, 107907. https://doi.org/10.1016/j.ympev.2023.107907</w:t>
-      </w:r>
-    </w:p>
-    <w:p>
-      <w:pPr>
-        <w:pStyle w:val="BodyText"/>
-      </w:pPr>
-      <w:r>
-        <w:t xml:space="preserve">Prado, V. H. M., &amp; Rossa-Feres, D. C. (2014). The influence of niche and neutral processes on a neotropical anuran metacommunity.</w:t>
-      </w:r>
-      <w:r>
-        <w:t xml:space="preserve"> </w:t>
-      </w:r>
-      <w:r>
-        <w:rPr>
-          <w:i/>
-          <w:iCs/>
-        </w:rPr>
-        <w:t xml:space="preserve">Austral Ecology</w:t>
-      </w:r>
-      <w:r>
-        <w:t xml:space="preserve">, 39, 540–547. https://doi.org/10.1111/aec.12114</w:t>
-      </w:r>
-    </w:p>
-    <w:p>
-      <w:pPr>
-        <w:pStyle w:val="BodyText"/>
-      </w:pPr>
-      <w:r>
-        <w:t xml:space="preserve">Provete, D. B. (2018). Canopy cover and structural complexity affect the phylogenetic composition of a pond-dwelling Neotropical anuran metacommunity.</w:t>
-      </w:r>
-      <w:r>
-        <w:t xml:space="preserve"> </w:t>
-      </w:r>
-      <w:r>
-        <w:rPr>
-          <w:i/>
-          <w:iCs/>
-        </w:rPr>
-        <w:t xml:space="preserve">bioRxiv</w:t>
-      </w:r>
-      <w:r>
-        <w:t xml:space="preserve">, doi:10.1101/252478.</w:t>
-      </w:r>
-    </w:p>
-    <w:p>
-      <w:pPr>
-        <w:pStyle w:val="BodyText"/>
-      </w:pPr>
-      <w:r>
-        <w:t xml:space="preserve">Provete, D. B., Gonçalves-Souza, T., Garey, M. V., Martins, I. A., &amp; Rossa-Feres, D. C. (2014). Broad-scale spatial patterns of canopy cover and pond morphology affect the structure of a Neotropical amphibian metacommunity.</w:t>
-      </w:r>
-      <w:r>
-        <w:t xml:space="preserve"> </w:t>
-      </w:r>
-      <w:r>
-        <w:rPr>
-          <w:i/>
-          <w:iCs/>
-        </w:rPr>
-        <w:t xml:space="preserve">Hydrobiologia</w:t>
-      </w:r>
-      <w:r>
-        <w:t xml:space="preserve">, 734, 69–79. https://doi.org/10.1007/s10750-014-1870-0</w:t>
-      </w:r>
-    </w:p>
-    <w:p>
-      <w:pPr>
-        <w:pStyle w:val="BodyText"/>
-      </w:pPr>
-      <w:r>
-        <w:t xml:space="preserve">Pybus, O. G., &amp; Harvey, P. H. (2000). Testing macro-evolutionary models using incomplete molecular phylogenies.</w:t>
-      </w:r>
-      <w:r>
-        <w:t xml:space="preserve"> </w:t>
-      </w:r>
-      <w:r>
-        <w:rPr>
-          <w:i/>
-          <w:iCs/>
-        </w:rPr>
-        <w:t xml:space="preserve">Proceedings of the Royal Society B</w:t>
-      </w:r>
-      <w:r>
-        <w:t xml:space="preserve">, 267, 2267–2272. https://doi.org/10.1098/rspb.2000.1278</w:t>
-      </w:r>
-    </w:p>
-    <w:p>
-      <w:pPr>
-        <w:pStyle w:val="BodyText"/>
-      </w:pPr>
-      <w:r>
-        <w:t xml:space="preserve">R Core Team (2026).</w:t>
-      </w:r>
-      <w:r>
-        <w:t xml:space="preserve"> </w:t>
-      </w:r>
-      <w:r>
-        <w:rPr>
-          <w:i/>
-          <w:iCs/>
-        </w:rPr>
-        <w:t xml:space="preserve">R: a language and environment for statistical computing</w:t>
-      </w:r>
-      <w:r>
-        <w:t xml:space="preserve">. Vienna: R Foundation for Statistical Computing. doi:10.32614/R.manuals.</w:t>
-      </w:r>
-    </w:p>
-    <w:p>
-      <w:pPr>
-        <w:pStyle w:val="BodyText"/>
-      </w:pPr>
-      <w:r>
-        <w:t xml:space="preserve">Roelants, K., Gower, D. J., Wilkinson, M., Loader, S. P., Biju, S. D., Guillaume, K., Moriau, L., &amp; Bossuyt, F. (2007). Global patterns of diversification in the history of modern amphibians.</w:t>
-      </w:r>
-      <w:r>
-        <w:t xml:space="preserve"> </w:t>
-      </w:r>
-      <w:r>
-        <w:rPr>
-          <w:i/>
-          <w:iCs/>
-        </w:rPr>
-        <w:t xml:space="preserve">Proceedings of the National Academy of Sciences</w:t>
-      </w:r>
-      <w:r>
-        <w:t xml:space="preserve">, 104, 887–892. https://doi.org/10.1073/pnas.0608378104</w:t>
-      </w:r>
-    </w:p>
-    <w:p>
-      <w:pPr>
-        <w:pStyle w:val="BodyText"/>
-      </w:pPr>
-      <w:r>
-        <w:t xml:space="preserve">Thompson, P. L., Guzman, L. M., De Meester, L., Horváth, Z., Ptacnik, R., Vanschoenwinkel, B., Viana, D. S., &amp; Chase, J. M. (2020). A process-based metacommunity framework linking local and regional scale community ecology.</w:t>
-      </w:r>
-      <w:r>
-        <w:t xml:space="preserve"> </w:t>
-      </w:r>
-      <w:r>
-        <w:rPr>
-          <w:i/>
-          <w:iCs/>
-        </w:rPr>
-        <w:t xml:space="preserve">Ecology Letters</w:t>
-      </w:r>
-      <w:r>
-        <w:t xml:space="preserve">, 23, 1314–1329. https://doi.org/10.1111/ele.13568</w:t>
-      </w:r>
-    </w:p>
-    <w:p>
-      <w:pPr>
-        <w:pStyle w:val="BodyText"/>
-      </w:pPr>
-      <w:r>
-        <w:t xml:space="preserve">Tsang, T. P. N., &amp; Cadotte, M. W. (2025). Species overlap and phylogenetic relatedness result in community statistical non-independence (and what to do about it).</w:t>
-      </w:r>
-      <w:r>
-        <w:t xml:space="preserve"> </w:t>
-      </w:r>
-      <w:r>
-        <w:rPr>
-          <w:i/>
-          <w:iCs/>
-        </w:rPr>
-        <w:t xml:space="preserve">Ecology Letters</w:t>
-      </w:r>
-      <w:r>
-        <w:t xml:space="preserve">, 28, e70267. https://doi.org/10.1111/ele.70267</w:t>
-      </w:r>
-    </w:p>
-    <w:p>
-      <w:pPr>
-        <w:pStyle w:val="BodyText"/>
-      </w:pPr>
-      <w:r>
-        <w:t xml:space="preserve">Ushey, K., &amp; Wickham, H. (2026). renv: project environments. R package version 1.3.1. doi:10.32614/CRAN.package.renv.</w:t>
-      </w:r>
-    </w:p>
-    <w:p>
-      <w:pPr>
-        <w:pStyle w:val="BodyText"/>
-      </w:pPr>
-      <w:r>
-        <w:t xml:space="preserve">Washburne, A. D., Silverman, J. D., Leff, J. W., Bennett, D. J., Darcy, J. L., Mukherjee, S., Fierer, N., &amp; David, L. A. (2017). Phylogenetic factorization of compositional data yields lineage-level associations in microbiome datasets.</w:t>
-      </w:r>
-      <w:r>
-        <w:t xml:space="preserve"> </w:t>
-      </w:r>
-      <w:r>
-        <w:rPr>
-          <w:i/>
-          <w:iCs/>
-        </w:rPr>
-        <w:t xml:space="preserve">PeerJ</w:t>
-      </w:r>
-      <w:r>
-        <w:t xml:space="preserve">, 5, e2969. https://doi.org/10.7717/peerj.2969</w:t>
-      </w:r>
-    </w:p>
-    <w:p>
-      <w:pPr>
-        <w:pStyle w:val="BodyText"/>
-      </w:pPr>
-      <w:r>
-        <w:t xml:space="preserve">Washburne, A. D., Silverman, J. D., Morton, J. T., Becker, D. J., Crowley, D., Mukherjee, S., David, L. A., &amp; Plowright, R. K. (2019). Phylofactorization: a graph partitioning algorithm to identify phylogenetic scales of ecological data.</w:t>
-      </w:r>
-      <w:r>
-        <w:t xml:space="preserve"> </w:t>
-      </w:r>
-      <w:r>
-        <w:rPr>
-          <w:i/>
-          <w:iCs/>
-        </w:rPr>
-        <w:t xml:space="preserve">Ecological Monographs</w:t>
-      </w:r>
-      <w:r>
-        <w:t xml:space="preserve">, 89, e01353. https://doi.org/10.1002/ecm.1353</w:t>
-      </w:r>
-    </w:p>
-    <w:p>
-      <w:pPr>
-        <w:pStyle w:val="BodyText"/>
-      </w:pPr>
-      <w:r>
-        <w:t xml:space="preserve">Williams, C., Yang, Y., Lagisz, M., Morrison, K., Ricolfi, L., Warton, D. I., &amp; Nakagawa, S. (2024). Transparent reporting items for simulation studies evaluating statistical methods: foundations for reproducibility and reliability.</w:t>
-      </w:r>
-      <w:r>
-        <w:t xml:space="preserve"> </w:t>
-      </w:r>
-      <w:r>
-        <w:rPr>
-          <w:i/>
-          <w:iCs/>
-        </w:rPr>
-        <w:t xml:space="preserve">Methods in Ecology and Evolution</w:t>
-      </w:r>
-      <w:r>
-        <w:t xml:space="preserve">, 15, 1926–1939. https://doi.org/10.1111/2041-210X.14415</w:t>
-      </w:r>
-    </w:p>
-    <w:p>
-      <w:pPr>
-        <w:pStyle w:val="BodyText"/>
-      </w:pPr>
-      <w:r>
-        <w:t xml:space="preserve">Zelený, D. (2018). Which results of the standard test for community-weighted mean approach are too optimistic?</w:t>
-      </w:r>
-      <w:r>
-        <w:t xml:space="preserve"> </w:t>
-      </w:r>
-      <w:r>
-        <w:rPr>
-          <w:i/>
-          <w:iCs/>
-        </w:rPr>
-        <w:t xml:space="preserve">Journal of Vegetation Science</w:t>
-      </w:r>
-      <w:r>
         <w:t xml:space="preserve">, 29, 953–966. https://doi.org/10.1111/jvs.12688</w:t>
       </w:r>
     </w:p>
-    <w:bookmarkEnd w:id="61"/>
+    <w:bookmarkEnd w:id="56"/>
     <w:sectPr>
       <w:footerReference r:id="rId9" w:type="default"/>
       <w:footnotePr>

</xml_diff>

<commit_message>
Ressalvas restauradas na Discussion; SI sem duplicata e com Bradley; folha de rosto aponta para o Appendix S3
Co-Authored-By: Claude Opus 5.5 <noreply@anthropic.com>
</commit_message>
<xml_diff>
--- a/manuscript/methods_results.docx
+++ b/manuscript/methods_results.docx
@@ -996,7 +996,7 @@
         </m:r>
       </m:oMath>
       <w:r>
-        <w:t xml:space="preserve">) in mass effects, and competition was either intraspecific only or also interspecific and structured by phylogeny, so that close relatives competed more strongly. Since competition and dispersal remove species, the cell of the grid defined the tree of the regional pool, whose size we calibrated so that about N species were left after the dynamics (Appendix S1); mass effects with phylogenetic competition could not reach N = 200, and we dropped this combination. Layer B used five cells of the grid (the four corners and the centre) and 1,000 replicates per combination.</w:t>
+        <w:t xml:space="preserve">) in mass effects, and competition was either intraspecific only or also interspecific and structured by phylogeny, so that close relatives competed more strongly. Since competition and dispersal remove species, the cell of the grid defined the tree of the regional pool rather than that of the analysed metacommunity, and we calibrated the pool size so that about N species were left after the dynamics (Appendix S1); mass effects with phylogenetic competition could not reach N = 200, and we dropped this combination. Layer B used five cells of the grid (the four corners and the centre) and 1,000 replicates per combination.</w:t>
       </w:r>
     </w:p>
     <w:bookmarkEnd w:id="29"/>
@@ -2696,23 +2696,23 @@
         <w:pStyle w:val="BodyText"/>
       </w:pPr>
       <w:r>
-        <w:t xml:space="preserve">The assembly process mattered more than tree shape. This is expected from the theory of source–sink metacommunities, in which high dispersal homogenizes composition among sites (Mouquet &amp; Loreau, 2003; Thompson et al., 2020), and it agrees with the low power of phylogenetic diversity indices under mass and priority effects even with strongly conserved traits (Mason &amp; Pavoine, 2013). Our design probably represents the most extreme case, because the sites had no spatial structure: a spatially implicit model failed to predict spatially explicit metacommunities at high dispersal (Ai &amp; Ellwood, 2022), and in spatially explicit landscapes mass effects let species dominate subregions instead of homogenizing the whole metacommunity (Thompson et al., 2020). Surprisingly, phylogenetic competition partly restored the power lost under mass effects for every test except the PCC. However, under mass effects competition also pruned close relatives and reduced the Colless index of the analysed tree by about 75% relative to the pool, so the effect of the process cannot be separated from that of the change in tree shape. Moreover, the assumption that close relatives compete more strongly is weakly supported empirically (Cahill et al., 2008; Godoy et al., 2014), and competition can also exclude distant relatives (Mayfield &amp; Levine, 2010), so this result is an upper bound for a particular competition structure. Taken together, a non-significant test in a metacommunity with high dispersal does not seem to indicate the absence of environmental filtering on lineages (Kembel, 2009).</w:t>
-      </w:r>
-    </w:p>
-    <w:p>
-      <w:pPr>
-        <w:pStyle w:val="BodyText"/>
-      </w:pPr>
-      <w:r>
-        <w:t xml:space="preserve">The methods that treat branches as units recovered the planted clade far more often than those based on phylogenetic eigenvectors. Phylofactorization evaluates every edge of the tree (Washburne et al., 2017, 2019) and evoPCA treats every branch as a variable (Pavoine, 2016), so their recovery did not depend on γ. In contrast, PCPS probably recovers a clade only when its stem node is among those weighted by the leading axes, which depends on the distribution of node depths and seems to explain why low γ improved its recovery of both basal and recent clades; thus, H3 was only partly supported. The PCC was not designed to locate clades, since it tests a global association between phylogenetic eigenvectors, composition and environment (Peres-Neto &amp; Kembel, 2015), and its leading eigenvectors rarely isolated the clade of interest. Node-based analyses (Borregaard et al., 2014) follow a similar node-by-node logic to that of phylofactorization and could be added to future comparisons.</w:t>
-      </w:r>
-    </w:p>
-    <w:p>
-      <w:pPr>
-        <w:pStyle w:val="BodyText"/>
-      </w:pPr>
-      <w:r>
-        <w:t xml:space="preserve">Our grid spans the tree shapes of anuran clades, in which rapid early radiations are common (Feng et al., 2017), but real regional pools seem to occupy its moderate levels. The three regional pools fell between the Yule and median levels of γ (Appendix S3), so the low-γ cells, where the effects of tree shape were largest, are more extreme than these pools; in addition, γ is sensitive to incomplete and nonrandom sampling of lineages (Cusimano &amp; Renner, 2010; Brock et al., 2011), so we used it only as a descriptor of tree shape. Our study also has limitations. First, the grid had no level with γ &gt; 0. Second, Layer B had no spatial structure and used only incidence data and five cells of the grid. Third, we did not vary the number of sites or the length of the gradient, which also change power.</w:t>
+        <w:t xml:space="preserve">The assembly process mattered more than tree shape. This is expected from the theory of source–sink metacommunities, in which high dispersal homogenizes composition among sites (Mouquet &amp; Loreau, 2003; Thompson et al., 2020), and it agrees with the low power of phylogenetic diversity indices under mass and priority effects even with strongly conserved traits (Mason &amp; Pavoine, 2013). Our design probably represents the most extreme case, because the dispersal kernel was uniform and the sites had no spatial structure; a spatially implicit resource-competition model failed to predict spatially explicit metacommunities at high dispersal (Ai &amp; Ellwood, 2022), and in spatially explicit landscapes mass effects let species dominate subregions instead of homogenizing the whole metacommunity (Thompson et al., 2020). Surprisingly, phylogenetic competition partly restored the power lost under mass effects for every test except the PCC. However, competition also pruned close relatives, and under mass effects it reduced the Colless index of the analysed tree by about 75% relative to the pool, so the effect of the process cannot be separated from that of the change in tree shape. Moreover, the assumption that close relatives compete more strongly is weakly supported empirically (Cahill et al., 2008; Godoy et al., 2014), and competition can also exclude distant relatives when fitness differences are phylogenetically conserved (Mayfield &amp; Levine, 2010), so this result should be read as an upper bound for a particular competition structure rather than as a general effect of competition. Taken together, a non-significant test in a metacommunity with high dispersal does not seem to indicate the absence of environmental filtering on lineages, in line with the warning that the interpretation of community phylogenetic tests should account for dispersal (Kembel, 2009).</w:t>
+      </w:r>
+    </w:p>
+    <w:p>
+      <w:pPr>
+        <w:pStyle w:val="BodyText"/>
+      </w:pPr>
+      <w:r>
+        <w:t xml:space="preserve">The methods that treat branches as units recovered the planted clade far more often than those based on phylogenetic eigenvectors. Phylofactorization evaluates every edge of the tree (Washburne et al., 2017, 2019) and evoPCA treats every branch as a variable (Pavoine, 2016), so their recovery did not depend on γ. In contrast, PCPS probably recovers a clade only when its stem node is among those weighted by the leading axes, which depends on the distribution of node depths and seems to explain why low γ improved its recovery of both basal and recent clades; thus, H3 was only partly supported. The PCC was not designed to locate clades, since it tests a global association between phylogenetic eigenvectors, composition and environment (Peres-Neto &amp; Kembel, 2015), and its leading eigenvectors rarely isolated the clade of interest. Node-based analyses of species distributions (Borregaard et al., 2014) follow a similar node-by-node logic and could be added to future comparisons.</w:t>
+      </w:r>
+    </w:p>
+    <w:p>
+      <w:pPr>
+        <w:pStyle w:val="BodyText"/>
+      </w:pPr>
+      <w:r>
+        <w:t xml:space="preserve">Our grid spans the tree shapes of anuran clades, whose major lineages diversified rapidly at the Cretaceous–Paleogene boundary (Feng et al., 2017), but real regional pools seem to occupy its moderate levels. The three regional pools fell between the Yule and median levels of γ (Appendix S3), so the low-γ cells, where the effects of tree shape were largest, are more extreme than these pools; in addition, γ is sensitive to incomplete and nonrandom sampling of lineages (Cusimano &amp; Renner, 2010; Brock et al., 2011), so we used it only as a descriptor of tree shape, not as evidence of a diversification process. Our study also has limitations. First, the grid had no level with γ &gt; 0. Second, Layer B had no spatial structure and used only incidence data and five cells of the grid. Third, we did not vary the number of sites or the length of the gradient, which also change power. Finally, the case study had 13–40 ponds and no significant association, so it illustrates how the methods behave with real data rather than validating them.</w:t>
       </w:r>
     </w:p>
     <w:p>

</xml_diff>

<commit_message>
Discussion reestruturada (um resultado por parágrafo; Diniz-Filho 2012 e Gerhold 2015); H1 testada também para o taxa shuffle
Co-Authored-By: Claude Opus 5.5 <noreply@anthropic.com>
</commit_message>
<xml_diff>
--- a/manuscript/methods_results.docx
+++ b/manuscript/methods_results.docx
@@ -2214,7 +2214,7 @@
         </w:r>
       </w:hyperlink>
       <w:r>
-        <w:t xml:space="preserve">). In S0, where optima had no phylogenetic signal and the gradient was independent, all tests were conservative, and four of them became more conservative in trees with low γ (by 0.008–0.020). Therefore, H1 was not supported at the resolution of our design, although we did not test the medium level of imbalance separately from the high one.</w:t>
+        <w:t xml:space="preserve">). In S0, where optima had no phylogenetic signal and the gradient was independent, all tests were conservative, and four of them became more conservative in trees with low γ (by 0.008–0.020). The taxa shuffle alone, which H1 addressed, was not affected either: in S0 and S2, its rejection rate was 0.039–0.062 in Yule and 0.043–0.060 in highly imbalanced trees (pooled over the levels of γ), and the difference exceeded its 95% Monte Carlo interval in 4 of 60 combinations of test, scenario, N and data type, in both directions, about as many as expected by chance. Therefore, H1 was not supported at the resolution of our design, although we did not test the medium level of imbalance separately from the high one.</w:t>
       </w:r>
     </w:p>
     <w:p>
@@ -2632,15 +2632,15 @@
         <w:pStyle w:val="FirstParagraph"/>
       </w:pPr>
       <w:r>
-        <w:t xml:space="preserve">The distribution of branching times, rather than the imbalance of the topology, governed the power of most tests and the clade recovery of PCPS and PCC, a phylogenetically conserved niche breadth inflated the type I error of only the two methods that rely on the second PCPS axis or on phylogenetic eigenvectors, and mass effects reduced the power of every test except GLM PCPS2 more than any tree shape did. To the best of our knowledge, and based on searches of the literature, this is the first simulation study that evaluates tests on phylogeny-weighted species composition across controlled gradients of branching times and imbalance, with both static and process-based metacommunities, and that compares them with branch-wise methods in their ability to locate the clade associated with a gradient.</w:t>
-      </w:r>
-    </w:p>
-    <w:p>
-      <w:pPr>
-        <w:pStyle w:val="BodyText"/>
-      </w:pPr>
-      <w:r>
-        <w:t xml:space="preserve">Tree imbalance did not affect the type I error of any test, whereas very negative γ reduced the power of the GLM on the first PCPS axis and of the PCC. This agrees with comparative methods, in which randomization tests of phylogenetic signal keep the nominal level (Blomberg et al., 2003), whereas the size and topology of the tree change the expected values of the statistics (Münkemüller et al., 2012); similarly, the bias of the net relatedness index depended on tree shape and consisted mostly of type II errors in an empirical case study (Molina-Venegas &amp; Roquet, 2014). The loss of power with low γ seems to follow from how phylogenetic eigenvectors summarize trees with long internal branches near the root. The eigenstructure of a phylogenetic matrix is set by the tree (Diniz-Filho et al., 1998), and in such trees a few deep splits probably dominate it, so the first PCPS axis and the leading eigenvectors of the PCC probably capture the deepest dichotomy even when the gradient sorts species along another one. PERMANOVA was less sensitive to γ, but the Mantel test, which also uses the whole matrix</w:t>
+        <w:t xml:space="preserve">Tree imbalance did not affect the type I error of any test, nor that of the taxa shuffle alone. This agrees with comparative methods, in which randomization tests of phylogenetic signal keep the nominal level (Blomberg et al., 2003), whereas the size and topology of the tree change the expected values of the statistics (Münkemüller et al., 2012). Similarly, the imbalance of the pool tree did not change how much community phylogenetic metrics disagreed (Mazel et al., 2016), and the bias of the net relatedness index caused by poor phylogenetic resolution depended on tree shape and consisted mostly of type II errors (Molina-Venegas &amp; Roquet, 2014). Contrary to H1, the heterogeneous weights of imbalanced trees therefore seem not to bias the permutation null distributions. As a result, imbalance alone does not seem to be a reason to distrust the type I error of tests on phylogeny-weighted composition.</w:t>
+      </w:r>
+    </w:p>
+    <w:p>
+      <w:pPr>
+        <w:pStyle w:val="BodyText"/>
+      </w:pPr>
+      <w:r>
+        <w:t xml:space="preserve">Very negative γ reduced the power of the GLM on the first PCPS axis and of the PCC, whereas PERMANOVA was less sensitive to it. The eigenstructure of a phylogenetic matrix is set by the tree (Diniz-Filho et al., 1998), and in trees with long internal branches near the root a few deep splits probably dominate it, so the first PCPS axis and the leading eigenvectors of the PCC probably capture the deepest dichotomy even when the gradient sorts species along another one. This parallels the finding that a small number of phylogenetic eigenvectors may be insufficient to control phylogenetic autocorrelation in ecological analyses (Diniz-Filho et al., 2012). However, the Mantel test, which also uses the whole matrix</w:t>
       </w:r>
       <w:r>
         <w:t xml:space="preserve"> </w:t>
@@ -2660,67 +2660,63 @@
         </m:sSub>
       </m:oMath>
       <w:r>
-        <w:t xml:space="preserve">, lost up to 0.23, so using the whole matrix does not seem to protect a test by itself. However, we did not record the eigenvalue spectra of each replicate, so we cannot confirm this mechanism with our data.</w:t>
-      </w:r>
-    </w:p>
-    <w:p>
-      <w:pPr>
-        <w:pStyle w:val="BodyText"/>
-      </w:pPr>
-      <w:r>
-        <w:t xml:space="preserve">Phylogenetic signal in niche breadth created false positives that previous evaluations could not detect, because their simulations drew niche breadth independently of the phylogeny (Duarte et al., 2016, 2018; Peres-Neto et al., 2017). When σ is conserved, clades differ in how widely they spread along the gradient, which is a phylogenetic pattern in composition that is unrelated to the association between optima and environment. Permutation tests become liberal when the randomization breaks down a structure of the data that is unrelated to the null hypothesis (Hardy, 2008), and ignored species-level variation in the response to the environment inflates the type I error of site-based tests of trait–environment association (ter Braak et al., 2017). This seems to explain why the second PCPS axis, which is orthogonal to the basal contrast of the first one, and the PCC were inflated, whereas PERMANOVA and the Mantel test, which average over all axes of</w:t>
-      </w:r>
-      <w:r>
-        <w:t xml:space="preserve"> </w:t>
-      </w:r>
-      <m:oMath>
-        <m:sSub>
-          <m:e>
-            <m:r>
-              <m:t>D</m:t>
-            </m:r>
-          </m:e>
-          <m:sub>
-            <m:r>
-              <m:t>P</m:t>
-            </m:r>
-          </m:sub>
-        </m:sSub>
-      </m:oMath>
-      <w:r>
-        <w:t xml:space="preserve">, were not. Interestingly, the inflation of GLM PCPS2 was largest in trees with low γ and with 200 species, which suggests that the depth of the conserved structure and the number of species determine how much of it reaches a single axis. Unfortunately, the empirical distribution of phylogenetic signal in niche breadth is unknown for most groups. Constrained randomizations that preserve phylogenetic structure (Braga et al., 2018) and model-based tests with phylogenetic random effects (Li &amp; Ives, 2017; Tsang &amp; Cadotte, 2025) seem to be promising alternatives to the taxa shuffle in this case.</w:t>
-      </w:r>
-    </w:p>
-    <w:p>
-      <w:pPr>
-        <w:pStyle w:val="BodyText"/>
-      </w:pPr>
-      <w:r>
-        <w:t xml:space="preserve">The assembly process mattered more than tree shape. This is expected from the theory of source–sink metacommunities, in which high dispersal homogenizes composition among sites (Mouquet &amp; Loreau, 2003; Thompson et al., 2020), and it agrees with the low power of phylogenetic diversity indices under mass and priority effects even with strongly conserved traits (Mason &amp; Pavoine, 2013). Our design probably represents the most extreme case, because the dispersal kernel was uniform and the sites had no spatial structure; a spatially implicit resource-competition model failed to predict spatially explicit metacommunities at high dispersal (Ai &amp; Ellwood, 2022), and in spatially explicit landscapes mass effects let species dominate subregions instead of homogenizing the whole metacommunity (Thompson et al., 2020). Surprisingly, phylogenetic competition partly restored the power lost under mass effects for every test except the PCC. However, competition also pruned close relatives, and under mass effects it reduced the Colless index of the analysed tree by about 75% relative to the pool, so the effect of the process cannot be separated from that of the change in tree shape. Moreover, the assumption that close relatives compete more strongly is weakly supported empirically (Cahill et al., 2008; Godoy et al., 2014), and competition can also exclude distant relatives when fitness differences are phylogenetically conserved (Mayfield &amp; Levine, 2010), so this result should be read as an upper bound for a particular competition structure rather than as a general effect of competition. Taken together, a non-significant test in a metacommunity with high dispersal does not seem to indicate the absence of environmental filtering on lineages, in line with the warning that the interpretation of community phylogenetic tests should account for dispersal (Kembel, 2009).</w:t>
-      </w:r>
-    </w:p>
-    <w:p>
-      <w:pPr>
-        <w:pStyle w:val="BodyText"/>
-      </w:pPr>
-      <w:r>
-        <w:t xml:space="preserve">The methods that treat branches as units recovered the planted clade far more often than those based on phylogenetic eigenvectors. Phylofactorization evaluates every edge of the tree (Washburne et al., 2017, 2019) and evoPCA treats every branch as a variable (Pavoine, 2016), so their recovery did not depend on γ. In contrast, PCPS probably recovers a clade only when its stem node is among those weighted by the leading axes, which depends on the distribution of node depths and seems to explain why low γ improved its recovery of both basal and recent clades; thus, H3 was only partly supported. The PCC was not designed to locate clades, since it tests a global association between phylogenetic eigenvectors, composition and environment (Peres-Neto &amp; Kembel, 2015), and its leading eigenvectors rarely isolated the clade of interest. Node-based analyses of species distributions (Borregaard et al., 2014) follow a similar node-by-node logic and could be added to future comparisons.</w:t>
-      </w:r>
-    </w:p>
-    <w:p>
-      <w:pPr>
-        <w:pStyle w:val="BodyText"/>
-      </w:pPr>
-      <w:r>
-        <w:t xml:space="preserve">Our grid spans the tree shapes of anuran clades, whose major lineages diversified rapidly at the Cretaceous–Paleogene boundary (Feng et al., 2017), but real regional pools seem to occupy its moderate levels. The three regional pools fell between the Yule and median levels of γ (Appendix S3), so the low-γ cells, where the effects of tree shape were largest, are more extreme than these pools; in addition, γ is sensitive to incomplete and nonrandom sampling of lineages (Cusimano &amp; Renner, 2010; Brock et al., 2011), so we used it only as a descriptor of tree shape, not as evidence of a diversification process. Our study also has limitations. First, the grid had no level with γ &gt; 0. Second, Layer B had no spatial structure and used only incidence data and five cells of the grid. Third, we did not vary the number of sites or the length of the gradient, which also change power. Finally, the case study had 13–40 ponds and no significant association, so it illustrates how the methods behave with real data rather than validating them.</w:t>
-      </w:r>
-    </w:p>
-    <w:p>
-      <w:pPr>
-        <w:pStyle w:val="BodyText"/>
-      </w:pPr>
-      <w:r>
-        <w:t xml:space="preserve">In summary, we recommend that empirical studies (i) report γ and the normalized Colless index of the analysed tree; (ii) not rely on a single test, since the ranking of the tests changed with tree shape, N and dispersal, and prefer PERMANOVA with the max test to tests on single PCPS axes or phylogenetic eigenvectors when the tree has very negative γ and the pool has 100 or more species; (iii) interpret the second PCPS axis and the PCC with caution when niche breadth may be phylogenetically conserved; (iv) interpret a lack of power under high dispersal as a property of the metacommunity rather than as evidence against niche-based assembly; and (v) use evoPCA or phylofactorization, rather than PCPS axes, to identify the clades associated with a gradient. These recommendations remain to be tested in trees with γ &gt; 0 and in spatially structured metacommunities.</w:t>
+        <w:t xml:space="preserve">, lost up to 0.23, and we did not record the eigenvalue spectra of each replicate, so we cannot confirm this mechanism with our data. Taken together, tests on single phylogenetic axes seem to be fragile when the tree has very negative γ.</w:t>
+      </w:r>
+    </w:p>
+    <w:p>
+      <w:pPr>
+        <w:pStyle w:val="BodyText"/>
+      </w:pPr>
+      <w:r>
+        <w:t xml:space="preserve">Phylogenetic signal in niche breadth inflated the type I error of only the second PCPS axis and the PCC. Previous evaluations could not detect this, because their simulations drew niche breadth independently of the phylogeny (Duarte et al., 2016, 2018; Peres-Neto et al., 2017). Permutation tests become liberal when the randomization breaks down a structure of the data that is unrelated to the null hypothesis (Hardy, 2008), and ignored species-level variation in the response to the environment inflates the type I error of site-based tests of trait–environment association (ter Braak et al., 2017). When σ is conserved, clades differ in how widely they spread along the gradient, and this pattern seems to load on the axis orthogonal to the basal contrast of the first PCPS axis, which would explain why its inflation was largest in trees with low γ and with 200 species. Unfortunately, the empirical distribution of phylogenetic signal in niche breadth is unknown for most groups. Thus, the second PCPS axis and the PCC should be interpreted with caution when niche breadth may be phylogenetically conserved, and constrained randomizations that preserve phylogenetic structure (Braga et al., 2018) or model-based tests with phylogenetic random effects (Li &amp; Ives, 2017; Tsang &amp; Cadotte, 2025) seem to be promising alternatives.</w:t>
+      </w:r>
+    </w:p>
+    <w:p>
+      <w:pPr>
+        <w:pStyle w:val="BodyText"/>
+      </w:pPr>
+      <w:r>
+        <w:t xml:space="preserve">Mass effects reduced the power of every test except GLM PCPS2 and almost abolished that of the PCC. This is expected from source–sink theory, in which high dispersal homogenizes composition among sites (Mouquet &amp; Loreau, 2003), and it agrees with the low power of phylogenetic diversity indices under mass and priority effects even with strongly conserved traits (Mason &amp; Pavoine, 2013). In contrast, in spatially explicit landscapes mass effects let species dominate subregions instead of homogenizing the whole metacommunity (Thompson et al., 2020), and a spatially implicit resource-competition model failed to predict spatially explicit metacommunities at high dispersal (Ai &amp; Ellwood, 2022). Our uniform dispersal kernel therefore probably represents the most extreme case. Consequently, a non-significant test in a metacommunity with high dispersal does not seem to indicate the absence of environmental filtering on lineages, in line with the warning that the interpretation of community phylogenetic tests should account for dispersal (Kembel, 2009).</w:t>
+      </w:r>
+    </w:p>
+    <w:p>
+      <w:pPr>
+        <w:pStyle w:val="BodyText"/>
+      </w:pPr>
+      <w:r>
+        <w:t xml:space="preserve">Phylogenetic competition partly restored the power lost under mass effects for every test except the PCC, but it also changed the shape of the analysed tree. Under mass effects, competition pruned close relatives and reduced the Colless index of the analysed tree by about 75% relative to the pool, so the effect of the process cannot be separated from that of the change in tree shape. Moreover, our competition kernel imposed the assumptions that trait similarity causes stronger competition and that competition causes exclusion, which are weakly supported as general rules (Gerhold et al., 2015). Accordingly, the competition–relatedness relationship was weak in vascular plants (Cahill et al., 2008), average fitness, but not stabilizing niche differences, showed phylogenetic structure in annual plants (Godoy et al., 2014), and competition can exclude distant relatives when fitness differences are phylogenetically conserved (Mayfield &amp; Levine, 2010). Therefore, this result should be read as an upper bound for a particular competition structure rather than as a general effect of competition.</w:t>
+      </w:r>
+    </w:p>
+    <w:p>
+      <w:pPr>
+        <w:pStyle w:val="BodyText"/>
+      </w:pPr>
+      <w:r>
+        <w:t xml:space="preserve">The evoPCA and phylofactorization recovered the planted clade far more often than PCPS and PCC, and independently of γ. Phylofactorization evaluates every edge of the tree (Washburne et al., 2017, 2019) and evoPCA treats every branch as a variable whose abundances enter the ordination (Pavoine, 2016), so the stem branch of the planted clade is always a candidate, whatever the distribution of node depths. In contrast, the PCC tests a global association between phylogenetic eigenvectors, composition and environment (Peres-Neto &amp; Kembel, 2015), and its leading eigenvectors rarely isolated the clade of interest. Node-based analyses of species distributions (Borregaard et al., 2014) follow a similar node-by-node logic and could be added to future comparisons. Thus, branch-wise methods seem to be the appropriate choice when the aim is to identify which clades respond to a gradient.</w:t>
+      </w:r>
+    </w:p>
+    <w:p>
+      <w:pPr>
+        <w:pStyle w:val="BodyText"/>
+      </w:pPr>
+      <w:r>
+        <w:t xml:space="preserve">Low γ improved the recovery of both basal and recent clades by PCPS, so H3 was only partly supported. Empirical applications of PCPS found that environmental effects concentrate on a few nodes (Duarte et al., 2012) and that deep and shallow nodes respond to different drivers in amphibians (Duarte et al., 2014). Our results suggest that which of these nodes PCPS can detect depends on the distribution of node depths, since PCPS probably recovers a clade only when its stem node is among those weighted by the leading axes. In addition, the share of variation on the first PCPS axis decreased rather than increased with low γ, which contradicts the mechanism behind H3. As a consequence, the advantage of basal clades under PCPS seems to be a matter of degree, and the nodes highlighted by PCPS axes in empirical studies should be interpreted in light of the shape of the tree.</w:t>
+      </w:r>
+    </w:p>
+    <w:p>
+      <w:pPr>
+        <w:pStyle w:val="BodyText"/>
+      </w:pPr>
+      <w:r>
+        <w:t xml:space="preserve">The three regional pools of anurans fell between the Yule and median levels of γ of our grid (Appendix S3). Negative γ is common in empirical phylogenies (McPeek, 2008; Phillimore &amp; Price, 2008), and the major lineages of frogs diversified rapidly at the Cretaceous–Paleogene boundary (Feng et al., 2017), but γ is also sensitive to incomplete and nonrandom sampling of lineages (Cusimano &amp; Renner, 2010; Brock et al., 2011), so we used it only as a descriptor of tree shape, not as evidence of a diversification process. Therefore, the low-γ cells, where the effects of tree shape were largest, are more extreme than these pools, although they lie within the range of anuran clades.</w:t>
+      </w:r>
+    </w:p>
+    <w:p>
+      <w:pPr>
+        <w:pStyle w:val="BodyText"/>
+      </w:pPr>
+      <w:r>
+        <w:t xml:space="preserve">Our study also has limitations. First, the grid had no level with γ &gt; 0. Second, Layer B had no spatial structure and used only incidence data and five cells of the grid. Third, we did not vary the number of sites or the length of the gradient, which also change power. Finally, the case study had 13–40 ponds and no significant association, so it illustrates how the methods behave with real data rather than validating them. To the best of our knowledge, and based on searches of the literature, this is the first simulation study that evaluates tests on phylogeny-weighted species composition across controlled gradients of branching times and imbalance, with both static and process-based metacommunities, and that compares them with branch-wise methods in locating the clade associated with a gradient. In summary, we recommend that empirical studies (i) report γ and the normalized Colless index of the analysed tree; (ii) not rely on a single test, since the ranking of the tests changed with tree shape, N and dispersal, and prefer PERMANOVA with the max test to tests on single PCPS axes or phylogenetic eigenvectors when the tree has very negative γ and the pool has 100 or more species; (iii) interpret the second PCPS axis and the PCC with caution when niche breadth may be phylogenetically conserved; (iv) interpret a lack of power under high dispersal as a property of the metacommunity rather than as evidence against niche-based assembly; and (v) use evoPCA or phylofactorization, rather than PCPS axes, to identify the clades associated with a gradient.</w:t>
       </w:r>
     </w:p>
     <w:bookmarkEnd w:id="55"/>
@@ -3077,6 +3073,27 @@
         <w:pStyle w:val="BodyText"/>
       </w:pPr>
       <w:r>
+        <w:t xml:space="preserve">Diniz-Filho, J. A. F., Bini, L. M., Rangel, T. F., Morales-Castilla, I., Olalla-Tárraga, M. Á., Rodríguez, M. Á., &amp; Hawkins, B. A. (2012). On the selection of phylogenetic eigenvectors for ecological analyses.</w:t>
+      </w:r>
+      <w:r>
+        <w:t xml:space="preserve"> </w:t>
+      </w:r>
+      <w:r>
+        <w:rPr>
+          <w:i/>
+          <w:iCs/>
+        </w:rPr>
+        <w:t xml:space="preserve">Ecography</w:t>
+      </w:r>
+      <w:r>
+        <w:t xml:space="preserve">, 35, 239–249. https://doi.org/10.1111/j.1600-0587.2011.06949.x</w:t>
+      </w:r>
+    </w:p>
+    <w:p>
+      <w:pPr>
+        <w:pStyle w:val="BodyText"/>
+      </w:pPr>
+      <w:r>
         <w:t xml:space="preserve">Diniz-Filho, J. A. F., de Sant’Ana, C. E. R., &amp; Bini, L. M. (1998). An eigenvector method for estimating phylogenetic inertia.</w:t>
       </w:r>
       <w:r>
@@ -3246,6 +3263,27 @@
       </w:pPr>
       <w:r>
         <w:t xml:space="preserve">Gabry, J., Češnovar, R., Johnson, A., &amp; Bronder, S. (2025). cmdstanr: R interface to CmdStan. R package version 0.9.0. https://github.com/stan-dev/cmdstanr.</w:t>
+      </w:r>
+    </w:p>
+    <w:p>
+      <w:pPr>
+        <w:pStyle w:val="BodyText"/>
+      </w:pPr>
+      <w:r>
+        <w:t xml:space="preserve">Gerhold, P., Cahill, J. F., Winter, M., Bartish, I. V., &amp; Prinzing, A. (2015). Phylogenetic patterns are not proxies of community assembly mechanisms (they are far better).</w:t>
+      </w:r>
+      <w:r>
+        <w:t xml:space="preserve"> </w:t>
+      </w:r>
+      <w:r>
+        <w:rPr>
+          <w:i/>
+          <w:iCs/>
+        </w:rPr>
+        <w:t xml:space="preserve">Functional Ecology</w:t>
+      </w:r>
+      <w:r>
+        <w:t xml:space="preserve">, 29, 600–614. https://doi.org/10.1111/1365-2435.12425</w:t>
       </w:r>
     </w:p>
     <w:p>

</xml_diff>

<commit_message>
Gerhold et al. 2018 (Annual Review) na Introduction
Co-Authored-By: Claude Opus 5.5 <noreply@anthropic.com>
</commit_message>
<xml_diff>
--- a/manuscript/methods_results.docx
+++ b/manuscript/methods_results.docx
@@ -140,7 +140,7 @@
         <w:pStyle w:val="BodyText"/>
       </w:pPr>
       <w:r>
-        <w:t xml:space="preserve">First, the topology of real trees departs from the Yule model (Heard, 1992; Blum &amp; François, 2006), and a slowdown in diversification towards the present, that is, a negative γ statistic (Pybus &amp; Harvey, 2000), was found in most clades of a large compilation of phylogenies (McPeek, 2008) and in many clades of birds (Phillimore &amp; Price, 2008). Anurans are a likely case, since most living frogs descend from a few lineages that radiated rapidly in the late Cretaceous and early Paleogene (Roelants et al., 2007; Feng et al., 2017). The size and topology of the tree change the expected values of phylogenetic signal indices (Münkemüller et al., 2012), the distribution of branch lengths changes whether community metrics, which weight different phylogenetic depths, detect clustering (Mazel et al., 2016), and topology sets the eigenstructure of phylogenetic matrices (Diniz-Filho et al., 1998), which is what PCPS and the PCC summarize. Nonetheless, to our knowledge, no study has evaluated how the distribution of branching times and the imbalance of the tree affect tests on phylogeny-weighted composition. Second, species are not sorted along gradients in isolation. In metacommunities, dispersal and competition interact with environmental filtering (Leibold et al., 2004), and high dispersal homogenizes composition among sites (Mouquet &amp; Loreau, 2003). Dispersal can alter the outcome of community phylogenetic tests (Kembel, 2009; Mason &amp; Pavoine, 2013), and inferring assembly from diversity patterns requires accounting for these processes (Münkemüller et al., 2020). Process-based models now generate species sorting, mass effects and competition from local population dynamics and dispersal (Thompson et al., 2020), which allows these methods to be evaluated under the processes they are meant to detect.</w:t>
+        <w:t xml:space="preserve">First, the topology of real trees departs from the Yule model (Heard, 1992; Blum &amp; François, 2006), and a slowdown in diversification towards the present, that is, a negative γ statistic (Pybus &amp; Harvey, 2000), was found in most clades of a large compilation of phylogenies (McPeek, 2008) and in many clades of birds (Phillimore &amp; Price, 2008). Anurans are a likely case, since most living frogs descend from a few lineages that radiated rapidly in the late Cretaceous and early Paleogene (Roelants et al., 2007; Feng et al., 2017). These macroevolutionary processes, such as differences in diversification rate among lineages, also shape the phylogenetic structure of the species pools from which local communities are assembled, and through them that of the communities themselves (Gerhold et al., 2018). The size and topology of the tree change the expected values of phylogenetic signal indices (Münkemüller et al., 2012), the distribution of branch lengths changes whether community metrics, which weight different phylogenetic depths, detect clustering (Mazel et al., 2016), and topology sets the eigenstructure of phylogenetic matrices (Diniz-Filho et al., 1998), which is what PCPS and the PCC summarize. Nonetheless, to our knowledge, no study has evaluated how the distribution of branching times and the imbalance of the tree affect tests on phylogeny-weighted composition. Second, species are not sorted along gradients in isolation. In metacommunities, dispersal and competition interact with environmental filtering (Leibold et al., 2004), and high dispersal homogenizes composition among sites (Mouquet &amp; Loreau, 2003). Dispersal can alter the outcome of community phylogenetic tests (Kembel, 2009; Mason &amp; Pavoine, 2013), and inferring assembly from diversity patterns requires accounting for these processes (Münkemüller et al., 2020). Process-based models now generate species sorting, mass effects and competition from local population dynamics and dispersal (Thompson et al., 2020), which allows these methods to be evaluated under the processes they are meant to detect.</w:t>
       </w:r>
     </w:p>
     <w:p>
@@ -3291,6 +3291,27 @@
         <w:pStyle w:val="BodyText"/>
       </w:pPr>
       <w:r>
+        <w:t xml:space="preserve">Gerhold, P., Carlucci, M. B., Procheş, Ş., &amp; Prinzing, A. (2018). The deep past controls the phylogenetic structure of present, local communities.</w:t>
+      </w:r>
+      <w:r>
+        <w:t xml:space="preserve"> </w:t>
+      </w:r>
+      <w:r>
+        <w:rPr>
+          <w:i/>
+          <w:iCs/>
+        </w:rPr>
+        <w:t xml:space="preserve">Annual Review of Ecology, Evolution, and Systematics</w:t>
+      </w:r>
+      <w:r>
+        <w:t xml:space="preserve">, 49, 477–497. https://doi.org/10.1146/annurev-ecolsys-110617-062348</w:t>
+      </w:r>
+    </w:p>
+    <w:p>
+      <w:pPr>
+        <w:pStyle w:val="BodyText"/>
+      </w:pPr>
+      <w:r>
         <w:t xml:space="preserve">Godoy, O., Kraft, N. J. B., &amp; Levine, J. M. (2014). Phylogenetic relatedness and the determinants of competitive outcomes.</w:t>
       </w:r>
       <w:r>

</xml_diff>

<commit_message>
Fig. 1 em duas linhas com fontes ≥ 6 pt no tamanho impresso; frase sobre pools aninhados na Discussion (Gerhold et al. 2018)
Co-Authored-By: Claude Opus 5.5 <noreply@anthropic.com>
</commit_message>
<xml_diff>
--- a/manuscript/methods_results.docx
+++ b/manuscript/methods_results.docx
@@ -236,7 +236,7 @@
             <w:r>
               <w:drawing>
                 <wp:inline>
-                  <wp:extent cx="5753100" cy="2622454"/>
+                  <wp:extent cx="4890135" cy="7013268"/>
                   <wp:effectExtent b="0" l="0" r="0" t="0"/>
                   <wp:docPr descr="" title="" id="23" name="Picture"/>
                   <a:graphic>
@@ -257,7 +257,7 @@
                         <pic:spPr bwMode="auto">
                           <a:xfrm>
                             <a:off x="0" y="0"/>
-                            <a:ext cx="5753100" cy="2622454"/>
+                            <a:ext cx="4890135" cy="7013268"/>
                           </a:xfrm>
                           <a:prstGeom prst="rect">
                             <a:avLst/>
@@ -2708,7 +2708,7 @@
         <w:pStyle w:val="BodyText"/>
       </w:pPr>
       <w:r>
-        <w:t xml:space="preserve">The three regional pools of anurans fell between the Yule and median levels of γ of our grid (Appendix S3). Negative γ is common in empirical phylogenies (McPeek, 2008; Phillimore &amp; Price, 2008), and the major lineages of frogs diversified rapidly at the Cretaceous–Paleogene boundary (Feng et al., 2017), but γ is also sensitive to incomplete and nonrandom sampling of lineages (Cusimano &amp; Renner, 2010; Brock et al., 2011), so we used it only as a descriptor of tree shape, not as evidence of a diversification process. Therefore, the low-γ cells, where the effects of tree shape were largest, are more extreme than these pools, although they lie within the range of anuran clades.</w:t>
+        <w:t xml:space="preserve">The three regional pools of anurans fell between the Yule and median levels of γ of our grid (Appendix S3). Negative γ is common in empirical phylogenies (McPeek, 2008; Phillimore &amp; Price, 2008), and the major lineages of frogs diversified rapidly at the Cretaceous–Paleogene boundary (Feng et al., 2017), but γ is also sensitive to incomplete and nonrandom sampling of lineages (Cusimano &amp; Renner, 2010; Brock et al., 2011), so we used it only as a descriptor of tree shape, not as evidence of a diversification process. Interestingly, γ became more negative as the pool widened from the Atlantic Forest to South America. Comparing phylogenetic structure across nested species pools has been proposed as a way to detect the imprint of deep-past processes on local communities (Gerhold et al., 2018), but γ also tends to decrease with the number of species (Phillimore &amp; Price, 2008), so this trend may partly reflect pool size. Therefore, the low-γ cells, where the effects of tree shape were largest, are more extreme than these pools, although they lie within the range of anuran clades.</w:t>
       </w:r>
     </w:p>
     <w:p>

</xml_diff>

<commit_message>
Results enxutos (detalhes no Appendix S2; total < 8.000 palavras); folha de rosto preenchida, com cópia de submissão fora do git
Co-Authored-By: Claude Opus 5.5 <noreply@anthropic.com>
</commit_message>
<xml_diff>
--- a/manuscript/methods_results.docx
+++ b/manuscript/methods_results.docx
@@ -2203,7 +2203,7 @@
         <w:pStyle w:val="BodyText"/>
       </w:pPr>
       <w:r>
-        <w:t xml:space="preserve">Tree imbalance did not affect the type I error of any test. In all 75 combinations of test, null scenario and N, the difference in the distance of the type I error from the nominal level between highly imbalanced and Yule trees was within ±0.012, and no 95% CI excluded zero, with incidence or abundance data (</w:t>
+        <w:t xml:space="preserve">Tree imbalance did not affect the type I error of any test (</w:t>
       </w:r>
       <w:hyperlink w:anchor="fig-type1">
         <w:r>
@@ -2214,15 +2214,15 @@
         </w:r>
       </w:hyperlink>
       <w:r>
-        <w:t xml:space="preserve">). In S0, where optima had no phylogenetic signal and the gradient was independent, all tests were conservative, and four of them became more conservative in trees with low γ (by 0.008–0.020). The taxa shuffle alone, which H1 addressed, was not affected either: in S0 and S2, its rejection rate was 0.039–0.062 in Yule and 0.043–0.060 in highly imbalanced trees (pooled over the levels of γ), and the difference exceeded its 95% Monte Carlo interval in 4 of 60 combinations of test, scenario, N and data type, in both directions, about as many as expected by chance. Therefore, H1 was not supported at the resolution of our design, although we did not test the medium level of imbalance separately from the high one.</w:t>
-      </w:r>
-    </w:p>
-    <w:p>
-      <w:pPr>
-        <w:pStyle w:val="BodyText"/>
-      </w:pPr>
-      <w:r>
-        <w:t xml:space="preserve">Phylogenetic signal in niche breadth inflated the type I error of only two tests. Compared with the same scenario without signal (S2), signal in σ (S2σ) increased the rejection rate of GLM PCPS2 by 0.02 (95% CI 0.01–0.03) in Yule trees at N = 100, and by 0.05 (0.04–0.06), 0.10 (0.08–0.12) and 0.21 (0.19–0.23) with low γ at N = 50, 100 and 200 (</w:t>
+        <w:t xml:space="preserve">). In all 75 combinations of test, null scenario and N, the difference in the distance of the type I error from the nominal level between highly imbalanced and Yule trees was within ±0.012, and no 95% CI excluded zero, with incidence or abundance data; the same held for the taxa shuffle alone (Appendix S2). Therefore, H1 was not supported at the resolution of our design, although we did not test the medium level of imbalance separately from the high one.</w:t>
+      </w:r>
+    </w:p>
+    <w:p>
+      <w:pPr>
+        <w:pStyle w:val="BodyText"/>
+      </w:pPr>
+      <w:r>
+        <w:t xml:space="preserve">Phylogenetic signal in niche breadth inflated the type I error of only two tests (</w:t>
       </w:r>
       <w:hyperlink w:anchor="fig-type1">
         <w:r>
@@ -2233,7 +2233,7 @@
         </w:r>
       </w:hyperlink>
       <w:r>
-        <w:t xml:space="preserve">). The raw rates reached 0.36 at N = 200 in low-γ trees. The PCC was also inflated, by 0.05 (0.03–0.06) in Yule trees and by 0.02 (0.01–0.03) with low γ at N = 100, with raw rates of up to 0.22 at N = 200 in Yule trees. Interestingly, PERMANOVA, GLM PCPS1 and the Mantel test became more conservative under signal in σ (by 0.005–0.030), and signal in maximum abundance (S2h) did not change the rejection rate of any test. With abundance data, the inflation of GLM PCPS2 was smaller (0.08, 0.06–0.09, with low γ at N = 100). As a result, H2 was rejected as stated: the nuisance structure created by a phylogenetically conserved niche breadth seems to affect only the methods that rely on the second PCPS axis or on phylogenetic eigenvectors, and its effect on GLM PCPS2 depends strongly on the distribution of branching times.</w:t>
+        <w:t xml:space="preserve">). Compared with the same scenario without signal (S2), signal in σ (S2σ) increased the rejection rate of GLM PCPS2 by 0.02 (95% CI 0.01–0.03) in Yule trees at N = 100, and by 0.05 (0.04–0.06), 0.10 (0.08–0.12) and 0.21 (0.19–0.23) with low γ at N = 50, 100 and 200, with raw rates of up to 0.36. The PCC was inflated by 0.05 (0.03–0.06) in Yule trees and by 0.02 (0.01–0.03) with low γ at N = 100, with raw rates of up to 0.22. In contrast, PERMANOVA, GLM PCPS1 and the Mantel test became more conservative under signal in σ (by 0.005–0.030), and signal in maximum abundance (S2h) did not change the rejection rate of any test. As a result, H2 was rejected as stated.</w:t>
       </w:r>
     </w:p>
     <w:tbl>
@@ -2331,7 +2331,7 @@
         </w:r>
       </w:hyperlink>
       <w:r>
-        <w:t xml:space="preserve">). At N = 100 with incidence data, low γ reduced the power of GLM PCPS1 from 0.74 to 0.34 in S3b (contrast −0.40, 95% CI −0.45 to −0.34), with similar losses in S3a and S3σ, and that of the PCC from 0.98 to 0.73 (−0.25, −0.30 to −0.21). The Mantel test lost 0.05–0.14 at N = 100 and up to 0.23 at N = 50. In contrast, the power of PERMANOVA did not change with γ at N = 100 in S3b (0.01, −0.02 to 0.05), was lower with low γ at N = 50 (−0.03 to −0.17 across scenarios) and higher at N = 200 (+0.04 to +0.08). High imbalance reduced power by at most 0.09. Consequently, the ranking of the tests changed with tree shape: in S3b, the PCC was the most powerful test in Yule trees and the third with low γ, and in S3a GLM PCPS1 fell from third to fourth. The effect of γ also changed with N in opposite directions among tests, since the loss of GLM PCPS1 increased with N (−0.38 at N = 50 and −0.46 at N = 200 in S3b), whereas that of the PCC decreased (−0.48 at N = 50 and −0.06 at N = 200). Thus, H4 was supported for power.</w:t>
+        <w:t xml:space="preserve">). At N = 100 in S3b, low γ reduced the power of GLM PCPS1 from 0.74 to 0.34 (contrast −0.40, 95% CI −0.45 to −0.34) and that of the PCC from 0.98 to 0.73 (−0.25, −0.30 to −0.21), whereas the power of PERMANOVA did not change (0.01, −0.02 to 0.05), and high imbalance reduced power by at most 0.09. Consequently, the ranking of the tests changed with tree shape, since in S3b the PCC was the most powerful test in Yule trees and the third with low γ. Thus, H4 was supported for power.</w:t>
       </w:r>
     </w:p>
     <w:tbl>
@@ -2429,7 +2429,7 @@
         </w:r>
       </w:hyperlink>
       <w:r>
-        <w:t xml:space="preserve">). Under species sorting without competition, power at N = 100 in S3b in Yule pool trees ranged from 0.78 (GLM PCPS1) and 0.83 (RDA PCPS) to 0.87 (PERMANOVA), 0.92 (Mantel) and 0.96 (PCC), whereas GLM PCPS2 had almost no power (0.03), as in Layer A. Mass effects reduced the power of every test except GLM PCPS2, which gained 0.08 (0.06–0.11) from its low baseline. Relative to species sorting, PERMANOVA lost 0.62 (0.58–0.65) in Yule pool trees and 0.72 (0.69–0.75) with low γ, the Mantel test 0.75 and 0.79, RDA PCPS 0.58 and 0.55, GLM PCPS1 0.55 and 0.27, and the PCC 0.93 (0.92–0.94) and 0.76, so that the PCC detected the phylogenetic signal in almost no replicates. Surprisingly, adding phylogenetic competition to mass effects partly restored the power of every test except the PCC; for instance, PERMANOVA lost 0.46 (0.42–0.50) instead of 0.62 in Yule pool trees. Under species sorting, phylogenetic competition changed power by −0.12 to +0.11. These two contrasts should be read with care, because competition prunes close relatives and changes the shape of the analysed tree relative to the pool tree, so the effect of the process cannot be separated from that of a change in tree shape; this pruning is strongest under mass effects, where the Colless index of the analysed tree was about 75% lower than that of the pool. Under the null hypothesis, no lower CI bound exceeded 0.075 at N = 100, although some raw rates of GLM PCPS2 in S2σ and of the PCC in S2h exceeded that limit at N = 100 and, more often, at N = 200 (Appendix S2).</w:t>
+        <w:t xml:space="preserve">). Under species sorting without competition, power at N = 100 in S3b in Yule pool trees ranged from 0.78 (GLM PCPS1) to 0.96 (PCC), whereas GLM PCPS2 had almost no power (0.03), as in Layer A. Mass effects reduced the power of every test except GLM PCPS2, by 0.55 (GLM PCPS1) to 0.93 (PCC; 95% CI 0.92–0.94) in Yule pool trees, so that the PCC detected the phylogenetic signal in almost no replicates. Surprisingly, adding phylogenetic competition to mass effects partly restored the power of every test except the PCC; for instance, PERMANOVA lost 0.46 (0.42–0.50) instead of 0.62 (0.58–0.65). However, competition pruned close relatives, and under mass effects the Colless index of the analysed tree was about 75% lower than that of the pool, so the effect of the process cannot be separated from that of a change in tree shape. Under the null hypothesis, no lower CI bound exceeded 0.075 at N = 100 (Appendix S2).</w:t>
       </w:r>
     </w:p>
     <w:tbl>
@@ -2527,15 +2527,15 @@
         </w:r>
       </w:hyperlink>
       <w:r>
-        <w:t xml:space="preserve">). With a shift of 2 and incidence data, evoPCA and phylofactorization identified the planted node in 0.44–0.88 of the replicates, depending on N and depth, and recovered basal clades more often than recent ones (0.79 against 0.66 at N = 100). PCPS recovered the clade in 0.12–0.42 of the replicates and PCC in only 0.08–0.12. The complementary measures agree with this ranking: at N = 100, the median rank of the planted node was 1 for evoPCA and phylofactorization, 2 (basal clades) and 6 (recent clades) for PCPS, and 7 and 9 for PCC, and the mean Jaccard similarity between the chosen and the planted clades was 0.89–0.94, 0.60–0.75 and 0.45–0.50, respectively. Hence, PCPS often chose a clade that overlapped the planted one, whereas PCC usually chose a different part of the tree, which seems to reflect that its four leading eigenvectors follow the deepest splits. With a shift of 0.5, no method exceeded 0.21.</w:t>
-      </w:r>
-    </w:p>
-    <w:p>
-      <w:pPr>
-        <w:pStyle w:val="BodyText"/>
-      </w:pPr>
-      <w:r>
-        <w:t xml:space="preserve">Tree shape changed recovery only for PCPS and PCC. With low γ, PCPS recovered basal clades in 0.58 of the replicates against 0.21 in Yule trees, and recent clades in 0.35 against 0.04 (N = 100), and this advantage grew with N (+0.23 to +0.45 across N and depths). The PCC lost 0.10–0.14 in basal clades with low γ and gained 0.07–0.09 in recent ones, whereas the recovery of evoPCA and phylofactorization did not change with γ (all 95% CI included zero), and high imbalance reduced recovery by 0.01–0.10 in all methods. Interestingly, low γ improved PCPS for recent as well as for basal clades, so H3 was only partly supported: the advantage of basal clades seems to be a matter of degree rather than a different behaviour of the method, and the share of variation on the first PCPS axis decreased rather than increased with low γ in the descriptive summaries of Layer A. With abundance data, the patterns were the same (Appendix S2). Taken together, H4 was also supported for clade recovery, but only through the change in rank between PCPS and PCC.</w:t>
+        <w:t xml:space="preserve">). With a shift of 2 and incidence data, evoPCA and phylofactorization identified the planted node in 0.44–0.88 of the replicates, depending on N and depth, PCPS in 0.12–0.42 and PCC in only 0.08–0.12, and the rank of the planted node and the Jaccard similarity between the chosen and the planted clades agreed with this ranking (Appendix S2). With a shift of 0.5, no method exceeded 0.21.</w:t>
+      </w:r>
+    </w:p>
+    <w:p>
+      <w:pPr>
+        <w:pStyle w:val="BodyText"/>
+      </w:pPr>
+      <w:r>
+        <w:t xml:space="preserve">Tree shape changed recovery only for PCPS and PCC. With low γ, PCPS recovered basal clades in 0.58 of the replicates against 0.21 in Yule trees, and recent clades in 0.35 against 0.04 (N = 100), whereas the recovery of evoPCA and phylofactorization did not change with γ (all 95% CI included zero), and high imbalance reduced recovery by 0.01–0.10 in all methods. Since low γ improved PCPS for recent as well as for basal clades, H3 was only partly supported, and H4 was supported for clade recovery through the change in rank between PCPS and PCC.</w:t>
       </w:r>
     </w:p>
     <w:tbl>
@@ -2660,7 +2660,7 @@
         </m:sSub>
       </m:oMath>
       <w:r>
-        <w:t xml:space="preserve">, lost up to 0.23, and we did not record the eigenvalue spectra of each replicate, so we cannot confirm this mechanism with our data. Taken together, tests on single phylogenetic axes seem to be fragile when the tree has very negative γ.</w:t>
+        <w:t xml:space="preserve">, lost up to 0.23 (Appendix S2), and we did not record the eigenvalue spectra of each replicate, so we cannot confirm this mechanism with our data. Taken together, tests on single phylogenetic axes seem to be fragile when the tree has very negative γ.</w:t>
       </w:r>
     </w:p>
     <w:p>
@@ -2700,7 +2700,7 @@
         <w:pStyle w:val="BodyText"/>
       </w:pPr>
       <w:r>
-        <w:t xml:space="preserve">Low γ improved the recovery of both basal and recent clades by PCPS, so H3 was only partly supported. Empirical applications of PCPS found that environmental effects concentrate on a few nodes (Duarte et al., 2012) and that deep and shallow nodes respond to different drivers in amphibians (Duarte et al., 2014). Our results suggest that which of these nodes PCPS can detect depends on the distribution of node depths, since PCPS probably recovers a clade only when its stem node is among those weighted by the leading axes. In addition, the share of variation on the first PCPS axis decreased rather than increased with low γ, which contradicts the mechanism behind H3. As a consequence, the advantage of basal clades under PCPS seems to be a matter of degree, and the nodes highlighted by PCPS axes in empirical studies should be interpreted in light of the shape of the tree.</w:t>
+        <w:t xml:space="preserve">Low γ improved the recovery of both basal and recent clades by PCPS, so H3 was only partly supported. Empirical applications of PCPS found that environmental effects concentrate on a few nodes (Duarte et al., 2012) and that deep and shallow nodes respond to different drivers in amphibians (Duarte et al., 2014). Our results suggest that which of these nodes PCPS can detect depends on the distribution of node depths, since PCPS probably recovers a clade only when its stem node is among those weighted by the leading axes. In addition, the share of variation on the first PCPS axis decreased rather than increased with low γ (Appendix S2), which contradicts the mechanism behind H3. As a consequence, the advantage of basal clades under PCPS seems to be a matter of degree, and the nodes highlighted by PCPS axes in empirical studies should be interpreted in light of the shape of the tree.</w:t>
       </w:r>
     </w:p>
     <w:p>

</xml_diff>

<commit_message>
Respostas à revisão simulada (texto): título, γ × N, forma da árvore analisada na camada B, faixas de recuperação de clados, variante com Procrustes e sensibilidade aos priors (priorsense)
Co-Authored-By: Claude Opus 5.5 <noreply@anthropic.com>
</commit_message>
<xml_diff>
--- a/manuscript/methods_results.docx
+++ b/manuscript/methods_results.docx
@@ -7,7 +7,7 @@
         <w:pStyle w:val="Title"/>
       </w:pPr>
       <w:r>
-        <w:t xml:space="preserve">Tree shape and metacommunity assembly govern the performance of phylogenetic community–environment methods</w:t>
+        <w:t xml:space="preserve">Branching times and dispersal, not tree imbalance, govern the performance of phylogenetic community–environment methods</w:t>
       </w:r>
     </w:p>
     <w:p>
@@ -65,7 +65,7 @@
         </w:numPr>
       </w:pPr>
       <w:r>
-        <w:t xml:space="preserve">Tree imbalance did not affect the type I error of any test. Phylogenetic signal in niche breadth inflated the type I error of the linear model on the second PCPS axis, up to 0.36 with low γ and 200 species, and of the PCC, up to 0.22. With 100 species, low γ reduced the power of the linear model on the first PCPS axis by 0.40 and that of the PCC by 0.25, whereas PERMANOVA was less sensitive to tree shape. Mass effects reduced the power of every test except the second PCPS axis, by 0.55–0.93 in Yule trees, and almost abolished that of the PCC. With the largest shift, evoPCA and phylofactorization recovered a planted clade in 0.44–0.88 of the replicates regardless of γ, whereas PCPS depended strongly on γ and PCC rarely found the clade.</w:t>
+        <w:t xml:space="preserve">Tree imbalance did not affect the type I error of any test. Phylogenetic signal in niche breadth inflated the type I error of the linear model on the second PCPS axis, up to 0.36 with low γ and 200 species, and of the PCC, up to 0.22. With 100 species, low γ reduced the power of the linear model on the first PCPS axis by 0.40 and that of the PCC by 0.25, whereas PERMANOVA was less sensitive to tree shape. Mass effects reduced the power of every test except the second PCPS axis, by 0.55–0.93 in Yule trees, and almost abolished that of the PCC. With the largest shift, evoPCA and phylofactorization recovered a planted clade in 0.44–0.88 of the replicates on average, regardless of γ, whereas PCPS depended strongly on γ and PCC rarely found the clade.</w:t>
       </w:r>
     </w:p>
     <w:p>
@@ -425,7 +425,7 @@
         <w:t xml:space="preserve"> </w:t>
       </w:r>
       <w:r>
-        <w:t xml:space="preserve">to a slowdown in diversification, which produces negative γ. Because γ depends only on the intervals between nodes and the Colless index only on the topology, this construction controls the two axes separately (Appendix S1). We took the levels of the grid from the anuran clades with 40–250 tips of the time-calibrated species-level tree of Portik et al. (2023), with the Colless index normalized against its Yule expectation and both statistics computed with the R package treestats v. 1.71.13 (Janzen &amp; Etienne, 2024). For each pool size N (50, 100 and 200 species, as in Duarte et al., 2016), γ took three levels, namely zero (as in a Yule tree), the median of the empirical clades and their 10% quantile, and the Colless index took three levels, zero, the median and the 90% quantile (Table S1). Thus, the 3 × 3 grid spans the anuran tree shapes between the 10% and 90% quantiles, although it has no level with γ &gt; 0. We drew 1,000 trees per cell and N, and replicate</w:t>
+        <w:t xml:space="preserve">to a slowdown in diversification, which produces negative γ. Because γ depends only on the intervals between nodes and the Colless index only on the topology, this construction controls the two axes separately (Appendix S1). We took the levels of the grid from the anuran clades with 40–250 tips of the time-calibrated species-level tree of Portik et al. (2023), with the Colless index normalized against its Yule expectation and both statistics computed with the R package treestats v. 1.71.13 (Janzen &amp; Etienne, 2024). For each pool size N (50, 100 and 200 species, as in Duarte et al., 2016), γ took three levels, namely zero (as in a Yule tree), the median of the empirical clades and their 10% quantile, and the Colless index took three levels, zero, the median and the 90% quantile (Table S1). Thus, the 3 × 3 grid spans the anuran tree shapes between the 10% and 90% quantiles, although it has no level with γ &gt; 0. Because γ scales with the number of tips, the low level of γ became more negative with N (Table S1), so part of any change with N may reflect a more extreme low level. We drew 1,000 trees per cell and N, and replicate</w:t>
       </w:r>
       <w:r>
         <w:t xml:space="preserve"> </w:t>
@@ -1767,7 +1767,7 @@
         <w:t xml:space="preserve"> </w:t>
       </w:r>
       <w:r>
-        <w:t xml:space="preserve">(RDA PCPS). We re-implemented the phylogenetic community composition approach (PCC) of Peres-Neto and Kembel (2015) from the equations in the original article, using the variance of the adjusted R² across phylogenetic eigenvectors as the test statistic. Every test was evaluated with 999 permutations under two null models, the site shuffle, which permutes the sites, and the taxa shuffle, which permutes the tips of the tree while keeping its topology. We report the largest of the two P-values (max test), which controls the type I error when either null hypothesis holds (Peres-Neto &amp; Kembel, 2015; Duarte et al., 2016). We checked our permutation code against the R packages vegan and PCPS (Appendix S1).</w:t>
+        <w:t xml:space="preserve">(RDA PCPS). We re-implemented the phylogenetic community composition approach (PCC) of Peres-Neto and Kembel (2015) from the equations in the original article, using the variance of the adjusted R² across phylogenetic eigenvectors as the test statistic. Every test was evaluated with 999 permutations under two null models, the site shuffle, which permutes the sites, and the taxa shuffle, which permutes the tips of the tree while keeping its topology. We report the largest of the two P-values (max test), which controls the type I error when either null hypothesis holds (Peres-Neto &amp; Kembel, 2015; Duarte et al., 2016). We checked our permutation code against the R packages vegan and PCPS (Appendix S1). We also evaluated a variant of the GLM on PCPS axes with symmetric Procrustes of the null axes onto the observed ones, as in the R package PCPS (Appendix S2).</w:t>
       </w:r>
     </w:p>
     <w:bookmarkEnd w:id="32"/>
@@ -1970,7 +1970,7 @@
         <w:t xml:space="preserve"> </w:t>
       </w:r>
       <w:r>
-        <w:t xml:space="preserve">among the first four, and for phylofactorization the objective of the algorithm (Appendix S1). A method recovered the clade when its best-scoring clade was the planted one or its complement. As complementary measures, which give partial credit to a method that chooses a nested or a slightly larger clade, we recorded the rank of the planted node among all nodes and the Jaccard similarity between the best-scoring and the planted clades.</w:t>
+        <w:t xml:space="preserve">among the first four, and for phylofactorization the objective of the algorithm (Appendix S1). A method recovered the clade when its best-scoring clade was the planted one or its complement. We also recorded the rank of the planted node among all nodes and the Jaccard similarity between the best-scoring and the planted clades, which give partial credit to nested or slightly larger clades.</w:t>
       </w:r>
     </w:p>
     <w:bookmarkEnd w:id="33"/>
@@ -2104,7 +2104,7 @@
         </m:r>
       </m:oMath>
       <w:r>
-        <w:t xml:space="preserve">, so a 95% Monte Carlo interval around the nominal level falls within Bradley’s liberal criterion for acceptable type I error, [0.025, 0.075] (Bradley, 1978); every rate and its Monte Carlo standard error are in Table S2. We then modelled the rates aggregated by condition with beta-binomial models fitted in the R package brms v. 2.23.0 (Bürkner, 2017) with CmdStan v. 2.39.0 through cmdstanr v. 0.9.0 (Gabry et al., 2025), with one model for the type I error and one for the power in each layer, and one for clade recovery. We entered the levels of γ and of the Colless index as factors, with their interaction, which estimates the full γ × imbalance surface without assuming its form, and let the shape effects differ among tests (or methods), scenarios, N and data type (Appendix S1). The beta-binomial accounts for the dispersion of the rates, which was 2.1–8.5 times larger than binomial in quasibinomial models with the same structure. Priors were declared explicitly on the logit scale, normal(0, 1.5) for the coefficients, normal(−2.9, 1.5) for the intercept of the type I models, centred on logit(0.05), and gamma(2, 0.01) for the precision φ. We checked convergence with the rank-normalized</w:t>
+        <w:t xml:space="preserve">, so a 95% Monte Carlo interval around the nominal level falls within Bradley’s liberal criterion for acceptable type I error, [0.025, 0.075] (Bradley, 1978); every rate and its Monte Carlo standard error are in Table S2. We then modelled the rates aggregated by condition with beta-binomial models fitted in the R package brms v. 2.23.0 (Bürkner, 2017) with CmdStan v. 2.39.0 through cmdstanr v. 0.9.0 (Gabry et al., 2025), with one model for the type I error and one for the power in each layer, and one for clade recovery. We entered the levels of γ and of the Colless index as factors, with their interaction, which estimates the full γ × imbalance surface without assuming its form, and let the shape effects differ among tests (or methods), scenarios, N and data type (Appendix S1). The beta-binomial accounts for the dispersion of the rates, which was 2.1–8.5 times larger than binomial in quasibinomial models with the same structure. Priors were declared explicitly on the logit scale, weakly informative and centred on a rate of 0.05 for the intercepts of the type I models (Appendix S1). We assessed the sensitivity of the posteriors to the priors by power-scaling with the R package priorsense v. 1.4.0 (Kallioinen et al., 2024), for the coefficients and for the predicted rate of every condition. We checked convergence with the rank-normalized</w:t>
       </w:r>
       <w:r>
         <w:t xml:space="preserve"> </w:t>
@@ -2177,7 +2177,7 @@
         <w:pStyle w:val="FirstParagraph"/>
       </w:pPr>
       <w:r>
-        <w:t xml:space="preserve">The static layer reproduced the published validations (Appendix S2): in the Yule trees of Duarte et al. (2016), 66 of 72 published rejection rates fell within the 95% binomial interval of our estimates, and the PCC matched the rates of Peres-Neto and Kembel (2015) in the scenarios that do not depend on the tree. All formal models converged (</w:t>
+        <w:t xml:space="preserve">The static layer reproduced the published validations, since 66 of 72 rejection rates of Duarte et al. (2016) fell within the 95% binomial interval of our estimates and the PCC matched the rates of Peres-Neto and Kembel (2015) where they do not depend on the tree (Appendix S2). All formal models converged (</w:t>
       </w:r>
       <m:oMath>
         <m:acc>
@@ -2195,7 +2195,7 @@
         <w:t xml:space="preserve"> </w:t>
       </w:r>
       <w:r>
-        <w:t xml:space="preserve">≤ 1.01, no divergent transitions), and their posterior predictive intervals covered the observed rates (Appendix S2, Table S3).</w:t>
+        <w:t xml:space="preserve">≤ 1.01, no divergent transitions), and their posterior predictive intervals covered the observed rates (Appendix S2, Table S3). The predicted rates were insensitive to the priors (Appendix S2).</w:t>
       </w:r>
     </w:p>
     <w:p>
@@ -2233,7 +2233,7 @@
         </w:r>
       </w:hyperlink>
       <w:r>
-        <w:t xml:space="preserve">). Compared with the same scenario without signal (S2), signal in σ (S2σ) increased the rejection rate of GLM PCPS2 by 0.02 (95% CI 0.01–0.03) in Yule trees at N = 100, and by 0.05 (0.04–0.06), 0.10 (0.08–0.12) and 0.21 (0.19–0.23) with low γ at N = 50, 100 and 200, with raw rates of up to 0.36. The PCC was inflated by 0.05 (0.03–0.06) in Yule trees and by 0.02 (0.01–0.03) with low γ at N = 100, with raw rates of up to 0.22. In contrast, PERMANOVA, GLM PCPS1 and the Mantel test became more conservative under signal in σ (by 0.005–0.030), and signal in maximum abundance (S2h) did not change the rejection rate of any test. As a result, H2 was rejected as stated.</w:t>
+        <w:t xml:space="preserve">). Compared with the same scenario without signal (S2), signal in σ (S2σ) increased the rejection rate of GLM PCPS2 by 0.02 (95% CI 0.01–0.03) in Yule trees at N = 100, and by 0.05 (0.04–0.06), 0.10 (0.08–0.12) and 0.21 (0.19–0.23) with low γ at N = 50, 100 and 200, with raw rates of up to 0.36, although the low level of γ was also more extreme at N = 200. The PCC was inflated by 0.05 (0.03–0.06) in Yule trees and by 0.02 (0.01–0.03) with low γ at N = 100, with raw rates of up to 0.22. In contrast, PERMANOVA, GLM PCPS1 and the Mantel test became more conservative under signal in σ (by 0.005–0.030), and signal in maximum abundance (S2h) did not change the rejection rate of any test. With symmetric Procrustes of the null axes, the inflation of GLM PCPS2 disappeared, but this variant was conservative even without nuisance structure (Appendix S2). As a result, H2 was rejected as stated.</w:t>
       </w:r>
     </w:p>
     <w:tbl>
@@ -2429,7 +2429,7 @@
         </w:r>
       </w:hyperlink>
       <w:r>
-        <w:t xml:space="preserve">). Under species sorting without competition, power at N = 100 in S3b in Yule pool trees ranged from 0.78 (GLM PCPS1) to 0.96 (PCC), whereas GLM PCPS2 had almost no power (0.03), as in Layer A. Mass effects reduced the power of every test except GLM PCPS2, by 0.55 (GLM PCPS1) to 0.93 (PCC; 95% CI 0.92–0.94) in Yule pool trees, so that the PCC detected the phylogenetic signal in almost no replicates. Surprisingly, adding phylogenetic competition to mass effects partly restored the power of every test except the PCC; for instance, PERMANOVA lost 0.46 (0.42–0.50) instead of 0.62 (0.58–0.65). However, competition pruned close relatives, and under mass effects the Colless index of the analysed tree was about 75% lower than that of the pool, so the effect of the process cannot be separated from that of a change in tree shape. Under the null hypothesis, no lower CI bound exceeded 0.075 at N = 100 (Appendix S2).</w:t>
+        <w:t xml:space="preserve">). Mass effects reduced the power of every test except GLM PCPS2, by 0.55 (GLM PCPS1) to 0.93 (PCC; 95% CI 0.92–0.94) in Yule pool trees, so that the PCC detected the phylogenetic signal in almost no replicates. Surprisingly, adding phylogenetic competition to mass effects partly restored the power of every test except the PCC; for instance, PERMANOVA lost 0.46 (0.42–0.50) instead of 0.62 (0.58–0.65). However, competition pruned close relatives, which made the γ of the analysed tree more negative and its Colless index lower than those of the pool, especially under mass effects (Appendix S2). Under the null hypothesis, no lower CI bound exceeded 0.075 at N = 100 (Appendix S2).</w:t>
       </w:r>
     </w:p>
     <w:tbl>
@@ -2527,7 +2527,7 @@
         </w:r>
       </w:hyperlink>
       <w:r>
-        <w:t xml:space="preserve">). With a shift of 2 and incidence data, evoPCA and phylofactorization identified the planted node in 0.44–0.88 of the replicates, depending on N and depth, PCPS in 0.12–0.42 and PCC in only 0.08–0.12, and the rank of the planted node and the Jaccard similarity between the chosen and the planted clades agreed with this ranking (Appendix S2). With a shift of 0.5, no method exceeded 0.21.</w:t>
+        <w:t xml:space="preserve">). With a shift of 2 and incidence data, and averaged over the cells of the grid, evoPCA and phylofactorization identified the planted node in 0.44–0.88 of the replicates, depending on N and depth, PCPS in 0.12–0.42 (0.02–0.71 in single cells) and PCC in only 0.08–0.12, and the rank of the planted node and the Jaccard similarity between the chosen and the planted clades agreed with this ranking (Appendix S2). With a shift of 0.5, mean recovery was 0.07–0.11 across methods and did not exceed 0.30 in any condition.</w:t>
       </w:r>
     </w:p>
     <w:p>
@@ -2668,7 +2668,7 @@
         <w:pStyle w:val="BodyText"/>
       </w:pPr>
       <w:r>
-        <w:t xml:space="preserve">Phylogenetic signal in niche breadth inflated the type I error of only the second PCPS axis and the PCC. Previous evaluations could not detect this, because their simulations drew niche breadth independently of the phylogeny (Duarte et al., 2016, 2018; Peres-Neto et al., 2017). Permutation tests become liberal when the randomization breaks down a structure of the data that is unrelated to the null hypothesis (Hardy, 2008), and ignored species-level variation in the response to the environment inflates the type I error of site-based tests of trait–environment association (ter Braak et al., 2017). When σ is conserved, clades differ in how widely they spread along the gradient, and this pattern seems to load on the axis orthogonal to the basal contrast of the first PCPS axis, which would explain why its inflation was largest in trees with low γ and with 200 species. Unfortunately, the empirical distribution of phylogenetic signal in niche breadth is unknown for most groups. Thus, the second PCPS axis and the PCC should be interpreted with caution when niche breadth may be phylogenetically conserved, and constrained randomizations that preserve phylogenetic structure (Braga et al., 2018) or model-based tests with phylogenetic random effects (Li &amp; Ives, 2017; Tsang &amp; Cadotte, 2025) seem to be promising alternatives.</w:t>
+        <w:t xml:space="preserve">Phylogenetic signal in niche breadth inflated the type I error of only the second PCPS axis and the PCC. Previous evaluations could not detect this, because their simulations drew niche breadth independently of the phylogeny (Duarte et al., 2016, 2018; Peres-Neto et al., 2017). Permutation tests become liberal when the randomization breaks down a structure of the data that is unrelated to the null hypothesis (Hardy, 2008), and ignored species-level variation in the response to the environment inflates the type I error of site-based tests of trait–environment association (ter Braak et al., 2017). When σ is conserved, clades differ in how widely they spread along the gradient, and this pattern seems to load on the axis orthogonal to the basal contrast of the first PCPS axis, which would explain why its inflation was largest in trees with low γ and with 200 species, although the low level of γ was also more extreme at N = 200. Rotating the null axes by Procrustes removed this inflation but made the test conservative and less powerful (Appendix S2). Unfortunately, the empirical distribution of phylogenetic signal in niche breadth is unknown for most groups. Thus, the second PCPS axis and the PCC should be interpreted with caution when niche breadth may be phylogenetically conserved, and constrained randomizations that preserve phylogenetic structure (Braga et al., 2018) or model-based tests with phylogenetic random effects (Li &amp; Ives, 2017; Tsang &amp; Cadotte, 2025) seem to be promising alternatives.</w:t>
       </w:r>
     </w:p>
     <w:p>
@@ -2684,7 +2684,7 @@
         <w:pStyle w:val="BodyText"/>
       </w:pPr>
       <w:r>
-        <w:t xml:space="preserve">Phylogenetic competition partly restored the power lost under mass effects for every test except the PCC, but it also changed the shape of the analysed tree. Under mass effects, competition pruned close relatives and reduced the Colless index of the analysed tree by about 75% relative to the pool, so the effect of the process cannot be separated from that of the change in tree shape. Moreover, our competition kernel imposed the assumptions that trait similarity causes stronger competition and that competition causes exclusion, which are weakly supported as general rules (Gerhold et al., 2015). Accordingly, the competition–relatedness relationship was weak in vascular plants (Cahill et al., 2008), average fitness, but not stabilizing niche differences, showed phylogenetic structure in annual plants (Godoy et al., 2014), and competition can exclude distant relatives when fitness differences are phylogenetically conserved (Mayfield &amp; Levine, 2010). Therefore, this result should be read as an upper bound for a particular competition structure rather than as a general effect of competition.</w:t>
+        <w:t xml:space="preserve">Phylogenetic competition partly restored the power lost under mass effects for every test except the PCC, but it also changed the shape of the analysed tree. Competition pruned close relatives, so that the analysed tree had a more negative γ and a lower Colless index than the pool, especially under mass effects, and the effect of the process cannot be separated from that of the change in tree shape. Moreover, our competition kernel imposed the assumptions that trait similarity causes stronger competition and that competition causes exclusion, which are weakly supported as general rules (Gerhold et al., 2015). Accordingly, the competition–relatedness relationship was weak in vascular plants (Cahill et al., 2008), average fitness, but not stabilizing niche differences, showed phylogenetic structure in annual plants (Godoy et al., 2014), and competition can exclude distant relatives when fitness differences are phylogenetically conserved (Mayfield &amp; Levine, 2010). Therefore, this result should be read as an upper bound for a particular competition structure rather than as a general effect of competition.</w:t>
       </w:r>
     </w:p>
     <w:p>
@@ -2716,7 +2716,7 @@
         <w:pStyle w:val="BodyText"/>
       </w:pPr>
       <w:r>
-        <w:t xml:space="preserve">Our study also has limitations. First, the grid had no level with γ &gt; 0. Second, Layer B had no spatial structure and used only incidence data and five cells of the grid. Third, we did not vary the number of sites or the length of the gradient, which also change power. Finally, the case study had 13–40 ponds and no significant association, so it illustrates how the methods behave with real data rather than validating them. To the best of our knowledge, and based on searches of the literature, this is the first simulation study that evaluates tests on phylogeny-weighted species composition across controlled gradients of branching times and imbalance, with both static and process-based metacommunities, and that compares them with branch-wise methods in locating the clade associated with a gradient. In summary, we recommend that empirical studies (i) report γ and the normalized Colless index of the analysed tree; (ii) not rely on a single test, since the ranking of the tests changed with tree shape, N and dispersal, and prefer PERMANOVA with the max test to tests on single PCPS axes or phylogenetic eigenvectors when the tree has very negative γ and the pool has 100 or more species; (iii) interpret the second PCPS axis and the PCC with caution when niche breadth may be phylogenetically conserved; (iv) interpret a lack of power under high dispersal as a property of the metacommunity rather than as evidence against niche-based assembly; and (v) use evoPCA or phylofactorization, rather than PCPS axes, to identify the clades associated with a gradient.</w:t>
+        <w:t xml:space="preserve">Our study also has limitations. First, the grid had no level with γ &gt; 0. Second, Layer B had no spatial structure and used only incidence data and five cells of the grid. Third, we did not vary the number of sites or the length of the gradient, which also change power. Fourth, because optima evolved on the tree, tree shape changed both the distribution of the optima and the tree used in the analysis, and the ages of basal and recent clades also depend on γ, so these effects cannot be separated in our design. Finally, the case study had 13–40 ponds and no significant association, so it illustrates how the methods behave with real data rather than validating them. To the best of our knowledge, and based on searches of the literature, this is the first simulation study to evaluate tests on phylogeny-weighted composition across controlled gradients of tree shape and under process-based metacommunity assembly. In summary, we recommend that empirical studies (i) report γ and the normalized Colless index of the analysed tree; (ii) not rely on a single test, and prefer PERMANOVA with the max test to tests on single PCPS axes or phylogenetic eigenvectors when the tree has very negative γ and the pool has 100 or more species; (iii) interpret the second PCPS axis and the PCC with caution when niche breadth may be phylogenetically conserved; (iv) interpret a lack of power under high dispersal as a property of the metacommunity rather than as evidence against niche-based assembly; and (v) use evoPCA or phylofactorization, rather than PCPS axes, to identify the clades associated with a gradient.</w:t>
       </w:r>
     </w:p>
     <w:bookmarkEnd w:id="55"/>
@@ -3389,6 +3389,27 @@
       </w:r>
       <w:r>
         <w:t xml:space="preserve">, 200, 108168. https://doi.org/10.1016/j.ympev.2024.108168</w:t>
+      </w:r>
+    </w:p>
+    <w:p>
+      <w:pPr>
+        <w:pStyle w:val="BodyText"/>
+      </w:pPr>
+      <w:r>
+        <w:t xml:space="preserve">Kallioinen, N., Paananen, T., Bürkner, P.-C., &amp; Vehtari, A. (2024). Detecting and diagnosing prior and likelihood sensitivity with power-scaling.</w:t>
+      </w:r>
+      <w:r>
+        <w:t xml:space="preserve"> </w:t>
+      </w:r>
+      <w:r>
+        <w:rPr>
+          <w:i/>
+          <w:iCs/>
+        </w:rPr>
+        <w:t xml:space="preserve">Statistics and Computing</w:t>
+      </w:r>
+      <w:r>
+        <w:t xml:space="preserve">, 34, 57. https://doi.org/10.1007/s11222-023-10366-5</w:t>
       </w:r>
     </w:p>
     <w:p>

</xml_diff>

<commit_message>
Recuperação de clados com δ = 0 (nível do acaso): rodada, resumo e texto; modelo formal exclui δ = 0
Co-Authored-By: Claude Opus 5.5 <noreply@anthropic.com>
</commit_message>
<xml_diff>
--- a/manuscript/methods_results.docx
+++ b/manuscript/methods_results.docx
@@ -1956,7 +1956,7 @@
         <w:t xml:space="preserve"> </w:t>
       </w:r>
       <w:r>
-        <w:t xml:space="preserve">is the shift and Φ is the standard normal distribution function; the other species therefore had no phylogenetic signal in their optima, and the shift has the same meaning for every tree size. We used shifts of 0.5, 1 and 2, all nine cells of the grid, N = 50, 100 and 200 with incidence data, and N = 100 with abundance data, with 1,000 replicates per combination (Appendix S1). We compared PCPS, PCC, the evolutionary principal component analysis (evoPCA; Pavoine, 2016), computed with the R package adiv v. 2.2.1 (Pavoine, 2020), and phylofactorization (Washburne et al., 2017). Each method gave a score to every internal node: for the three ordinations, the absolute correlation between membership of its clade and the species scores on the axis most correlated with</w:t>
+        <w:t xml:space="preserve">is the shift and Φ is the standard normal distribution function; the other species therefore had no phylogenetic signal in their optima, and the shift has the same meaning for every tree size. We used shifts of 0 (no planted effect, which gives the chance level of each method), 0.5, 1 and 2, all nine cells of the grid, N = 50, 100 and 200 with incidence data, and N = 100 with abundance data, with 1,000 replicates per combination (Appendix S1). We compared PCPS, PCC, the evolutionary principal component analysis (evoPCA; Pavoine, 2016), computed with the R package adiv v. 2.2.1 (Pavoine, 2020), and phylofactorization (Washburne et al., 2017). Each method gave a score to every internal node: for the three ordinations, the absolute correlation between membership of its clade and the species scores on the axis most correlated with</w:t>
       </w:r>
       <w:r>
         <w:t xml:space="preserve"> </w:t>
@@ -2527,7 +2527,7 @@
         </w:r>
       </w:hyperlink>
       <w:r>
-        <w:t xml:space="preserve">). With a shift of 2 and incidence data, and averaged over the cells of the grid, evoPCA and phylofactorization identified the planted node in 0.44–0.88 of the replicates, depending on N and depth, PCPS in 0.12–0.42 (0.02–0.71 in single cells) and PCC in only 0.08–0.12, and the rank of the planted node and the Jaccard similarity between the chosen and the planted clades agreed with this ranking (Appendix S2). With a shift of 0.5, mean recovery was 0.07–0.11 across methods and did not exceed 0.30 in any condition.</w:t>
+        <w:t xml:space="preserve">). With a shift of 2 and incidence data, and averaged over the cells of the grid, evoPCA and phylofactorization identified the planted node in 0.44–0.88 of the replicates, depending on N and depth, PCPS in 0.12–0.42 (0.02–0.71 in single cells) and PCC in only 0.08–0.12, and the rank of the planted node and the Jaccard similarity between the chosen and the planted clades agreed with this ranking (Appendix S2). Without a planted effect, recovery was 0.003–0.021 for evoPCA and phylofactorization and 0.018–0.050 for PCPS and PCC, so the PCC recovered the planted clade only two to three times more often than by chance even with the largest shift; with a shift of 0.5, mean recovery was 0.07–0.11 and did not exceed 0.30 in any condition (Appendix S2).</w:t>
       </w:r>
     </w:p>
     <w:p>

</xml_diff>

<commit_message>
Itens fáceis e moderados da revisão: equivalência da H1, contrastes pareados, prior predictive, efeito arco do PCPS2, RDA PCPS na camada A, idade do clado, PCC em S2h
Co-Authored-By: Claude Opus 5.5 <noreply@anthropic.com>
</commit_message>
<xml_diff>
--- a/manuscript/methods_results.docx
+++ b/manuscript/methods_results.docx
@@ -831,35 +831,7 @@
         <w:pStyle w:val="FirstParagraph"/>
       </w:pPr>
       <w:r>
-        <w:t xml:space="preserve">Layer B followed the equations of Thompson et al. (2020), which we implemented in R. At each time step, the expected abundance of species</w:t>
-      </w:r>
-      <w:r>
-        <w:t xml:space="preserve"> </w:t>
-      </w:r>
-      <m:oMath>
-        <m:r>
-          <m:t>j</m:t>
-        </m:r>
-      </m:oMath>
-      <w:r>
-        <w:t xml:space="preserve"> </w:t>
-      </w:r>
-      <w:r>
-        <w:t xml:space="preserve">at site</w:t>
-      </w:r>
-      <w:r>
-        <w:t xml:space="preserve"> </w:t>
-      </w:r>
-      <m:oMath>
-        <m:r>
-          <m:t>i</m:t>
-        </m:r>
-      </m:oMath>
-      <w:r>
-        <w:t xml:space="preserve"> </w:t>
-      </w:r>
-      <w:r>
-        <w:t xml:space="preserve">was its density-independent growth rate, a Gaussian function of the mismatch between</w:t>
+        <w:t xml:space="preserve">Layer B followed the equations of Thompson et al. (2020), which we implemented in R. Growth was a Gaussian function of the mismatch between</w:t>
       </w:r>
       <w:r>
         <w:t xml:space="preserve"> </w:t>
@@ -902,10 +874,7 @@
         </m:sSub>
       </m:oMath>
       <w:r>
-        <w:t xml:space="preserve"> </w:t>
-      </w:r>
-      <w:r>
-        <w:t xml:space="preserve">with breadth</w:t>
+        <w:t xml:space="preserve">, with breadth</w:t>
       </w:r>
       <w:r>
         <w:t xml:space="preserve"> </w:t>
@@ -948,7 +917,7 @@
         </m:sSub>
       </m:oMath>
       <w:r>
-        <w:t xml:space="preserve">, multiplied by its abundance and divided by one plus the summed competitive effects of all species at the site, following a Beverton–Holt model (Beverton &amp; Holt, 1957). Abundances were then drawn from a Poisson distribution, and a proportion</w:t>
+        <w:t xml:space="preserve">, and competition followed a Beverton–Holt model (Beverton &amp; Holt, 1957; Appendix S1). Abundances were then drawn from a Poisson distribution, and a proportion</w:t>
       </w:r>
       <w:r>
         <w:t xml:space="preserve"> </w:t>
@@ -1767,7 +1736,7 @@
         <w:t xml:space="preserve"> </w:t>
       </w:r>
       <w:r>
-        <w:t xml:space="preserve">(RDA PCPS). We re-implemented the phylogenetic community composition approach (PCC) of Peres-Neto and Kembel (2015) from the equations in the original article, using the variance of the adjusted R² across phylogenetic eigenvectors as the test statistic. Every test was evaluated with 999 permutations under two null models, the site shuffle, which permutes the sites, and the taxa shuffle, which permutes the tips of the tree while keeping its topology. We report the largest of the two P-values (max test), which controls the type I error when either null hypothesis holds (Peres-Neto &amp; Kembel, 2015; Duarte et al., 2016). We checked our permutation code against the R packages vegan and PCPS (Appendix S1). We also evaluated a variant of the GLM on PCPS axes with symmetric Procrustes of the null axes onto the observed ones, as in the R package PCPS (Appendix S2).</w:t>
+        <w:t xml:space="preserve">(RDA PCPS). We re-implemented the phylogenetic community composition approach (PCC) of Peres-Neto and Kembel (2015) from the equations in the original article, using the variance of the adjusted R² across phylogenetic eigenvectors as the test statistic. Every test was evaluated with 999 permutations under two null models, the site shuffle, which permutes the sites, and the taxa shuffle, which permutes the tips of the tree while keeping its topology. We report the largest of the two P-values (max test), which controls the type I error when either null hypothesis holds (Peres-Neto &amp; Kembel, 2015; Duarte et al., 2016). We checked our permutation code against the R packages vegan and PCPS (Appendix S1). In a second run of Layer A, we also evaluated the RDA PCPS and a variant of the GLM on PCPS axes with symmetric Procrustes of the null axes onto the observed ones, as in the R package PCPS (Appendix S2).</w:t>
       </w:r>
     </w:p>
     <w:bookmarkEnd w:id="32"/>
@@ -2104,7 +2073,7 @@
         </m:r>
       </m:oMath>
       <w:r>
-        <w:t xml:space="preserve">, so a 95% Monte Carlo interval around the nominal level falls within Bradley’s liberal criterion for acceptable type I error, [0.025, 0.075] (Bradley, 1978); every rate and its Monte Carlo standard error are in Table S2. We then modelled the rates aggregated by condition with beta-binomial models fitted in the R package brms v. 2.23.0 (Bürkner, 2017) with CmdStan v. 2.39.0 through cmdstanr v. 0.9.0 (Gabry et al., 2025), with one model for the type I error and one for the power in each layer, and one for clade recovery. We entered the levels of γ and of the Colless index as factors, with their interaction, which estimates the full γ × imbalance surface without assuming its form, and let the shape effects differ among tests (or methods), scenarios, N and data type (Appendix S1). The beta-binomial accounts for the dispersion of the rates, which was 2.1–8.5 times larger than binomial in quasibinomial models with the same structure. Priors were declared explicitly on the logit scale, weakly informative and centred on a rate of 0.05 for the intercepts of the type I models (Appendix S1). We assessed the sensitivity of the posteriors to the priors by power-scaling with the R package priorsense v. 1.4.0 (Kallioinen et al., 2024), for the coefficients and for the predicted rate of every condition. We checked convergence with the rank-normalized</w:t>
+        <w:t xml:space="preserve">, so a 95% Monte Carlo interval around the nominal level falls within Bradley’s liberal criterion for acceptable type I error, [0.025, 0.075] (Bradley, 1978); every rate and its Monte Carlo standard error are in Table S2. We then modelled the rates aggregated by condition with beta-binomial models fitted in the R package brms v. 2.23.0 (Bürkner, 2017) with CmdStan v. 2.39.0 through cmdstanr v. 0.9.0 (Gabry et al., 2025), with one model for the type I error and one for the power in each layer, and one for clade recovery. We entered the levels of γ and of the Colless index as factors, with their interaction, which estimates the full γ × imbalance surface without assuming its form, and let the shape effects differ among tests (or methods), scenarios, N and data type (Appendix S1). The beta-binomial accounts for the dispersion of the rates, which was 2.1–8.5 times larger than binomial in quasibinomial models with the same structure. Priors were declared explicitly on the logit scale, weakly informative and centred on a rate of 0.05 for the intercepts of the type I models (Appendix S1). We checked the priors with prior predictive simulations and assessed the sensitivity of the posteriors to them by power-scaling with the R package priorsense v. 1.4.0 (Kallioinen et al., 2024), for the coefficients and for the predicted rate of every condition. We checked convergence with the rank-normalized</w:t>
       </w:r>
       <w:r>
         <w:t xml:space="preserve"> </w:t>
@@ -2214,7 +2183,7 @@
         </w:r>
       </w:hyperlink>
       <w:r>
-        <w:t xml:space="preserve">). In all 75 combinations of test, null scenario and N, the difference in the distance of the type I error from the nominal level between highly imbalanced and Yule trees was within ±0.012, and no 95% CI excluded zero, with incidence or abundance data; the same held for the taxa shuffle alone (Appendix S2). Therefore, H1 was not supported at the resolution of our design, although we did not test the medium level of imbalance separately from the high one.</w:t>
+        <w:t xml:space="preserve">). In all 75 combinations of test, null scenario and N, the difference in the distance of the type I error from the nominal level between highly imbalanced and Yule trees was within ±0.012, and no 95% CI excluded zero, with incidence or abundance data. The posterior probability of a change smaller than 0.025 exceeded 0.95 in 297 of 300 conditions, and the taxa shuffle alone was not affected either (Appendix S2). Therefore, H1 was not supported at the resolution of our design, although we did not test the medium level of imbalance separately from the high one.</w:t>
       </w:r>
     </w:p>
     <w:p>
@@ -2233,7 +2202,7 @@
         </w:r>
       </w:hyperlink>
       <w:r>
-        <w:t xml:space="preserve">). Compared with the same scenario without signal (S2), signal in σ (S2σ) increased the rejection rate of GLM PCPS2 by 0.02 (95% CI 0.01–0.03) in Yule trees at N = 100, and by 0.05 (0.04–0.06), 0.10 (0.08–0.12) and 0.21 (0.19–0.23) with low γ at N = 50, 100 and 200, with raw rates of up to 0.36, although the low level of γ was also more extreme at N = 200. The PCC was inflated by 0.05 (0.03–0.06) in Yule trees and by 0.02 (0.01–0.03) with low γ at N = 100, with raw rates of up to 0.22. In contrast, PERMANOVA, GLM PCPS1 and the Mantel test became more conservative under signal in σ (by 0.005–0.030), and signal in maximum abundance (S2h) did not change the rejection rate of any test. With symmetric Procrustes of the null axes, the inflation of GLM PCPS2 disappeared, but this variant was conservative even without nuisance structure (Appendix S2). As a result, H2 was rejected as stated.</w:t>
+        <w:t xml:space="preserve">). Compared with the same scenario without signal (S2), signal in σ (S2σ) increased the rejection rate of GLM PCPS2 by 0.02 (95% CI 0.01–0.03) in Yule trees at N = 100, and by 0.05 (0.04–0.06), 0.10 (0.08–0.12) and 0.21 (0.19–0.23) with low γ at N = 50, 100 and 200, with raw rates of up to 0.36. The PCC was inflated by 0.05 (0.03–0.06) in Yule trees and by 0.02 (0.01–0.03) with low γ at N = 100, with raw rates of up to 0.22. In contrast, PERMANOVA, GLM PCPS1 and the Mantel test became more conservative under signal in σ (by 0.005–0.030), and signal in maximum abundance (S2h) did not change the rejection rate of any test. With symmetric Procrustes of the null axes, the inflation of GLM PCPS2 disappeared, but this variant was conservative even without nuisance structure, whereas the RDA PCPS was not inflated (0.004–0.021 in S2σ) and lost little power with low γ (0.70 against 0.78 at N = 100 in S3b; Appendix S2). As a result, H2 was rejected as stated.</w:t>
       </w:r>
     </w:p>
     <w:tbl>
@@ -2429,7 +2398,7 @@
         </w:r>
       </w:hyperlink>
       <w:r>
-        <w:t xml:space="preserve">). Mass effects reduced the power of every test except GLM PCPS2, by 0.55 (GLM PCPS1) to 0.93 (PCC; 95% CI 0.92–0.94) in Yule pool trees, so that the PCC detected the phylogenetic signal in almost no replicates. Surprisingly, adding phylogenetic competition to mass effects partly restored the power of every test except the PCC; for instance, PERMANOVA lost 0.46 (0.42–0.50) instead of 0.62 (0.58–0.65). However, competition pruned close relatives, which made the γ of the analysed tree more negative and its Colless index lower than those of the pool, especially under mass effects (Appendix S2). Under the null hypothesis, no lower CI bound exceeded 0.075 at N = 100 (Appendix S2).</w:t>
+        <w:t xml:space="preserve">). Mass effects reduced the power of every test except GLM PCPS2, by 0.55 (GLM PCPS1) to 0.93 (PCC; 95% CI 0.92–0.94) in Yule pool trees, so that the PCC detected the phylogenetic signal in almost no replicates. Surprisingly, adding phylogenetic competition to mass effects partly restored the power of every test except the PCC; for instance, PERMANOVA lost 0.46 (0.42–0.50) instead of 0.62 (0.58–0.65). However, competition pruned close relatives, which made the γ of the analysed tree more negative and its Colless index lower than those of the pool, especially under mass effects (Appendix S2). Under the null hypothesis, no lower CI bound exceeded 0.075 at N = 100, but raw rates of GLM PCPS2 in S2σ and of the PCC in S2h did at N = 200 (Appendix S2).</w:t>
       </w:r>
     </w:p>
     <w:tbl>
@@ -2640,7 +2609,7 @@
         <w:pStyle w:val="BodyText"/>
       </w:pPr>
       <w:r>
-        <w:t xml:space="preserve">Very negative γ reduced the power of the GLM on the first PCPS axis and of the PCC, whereas PERMANOVA was less sensitive to it. The eigenstructure of a phylogenetic matrix is set by the tree (Diniz-Filho et al., 1998), and in trees with long internal branches near the root a few deep splits probably dominate it, so the first PCPS axis and the leading eigenvectors of the PCC probably capture the deepest dichotomy even when the gradient sorts species along another one. This parallels the finding that a small number of phylogenetic eigenvectors may be insufficient to control phylogenetic autocorrelation in ecological analyses (Diniz-Filho et al., 2012). However, the Mantel test, which also uses the whole matrix</w:t>
+        <w:t xml:space="preserve">Very negative γ reduced the power of the GLM on the first PCPS axis and of the PCC, whereas PERMANOVA was less sensitive to it. The eigenstructure of a phylogenetic matrix is set by the tree (Diniz-Filho et al., 1998), and in trees with long internal branches near the root a few deep splits probably dominate it, so the first PCPS axis and the leading eigenvectors of the PCC probably capture the deepest dichotomy even when the gradient sorts species along another one. This parallels the finding that a small number of phylogenetic eigenvectors may be insufficient to control phylogenetic autocorrelation in ecological analyses (Diniz-Filho et al., 2012). In addition, the RDA on the first two PCPS axes lost little power with low γ, which agrees with this mechanism. However, the Mantel test, which also uses the whole matrix</w:t>
       </w:r>
       <w:r>
         <w:t xml:space="preserve"> </w:t>
@@ -2692,15 +2661,15 @@
         <w:pStyle w:val="BodyText"/>
       </w:pPr>
       <w:r>
-        <w:t xml:space="preserve">The evoPCA and phylofactorization recovered the planted clade far more often than PCPS and PCC, and independently of γ. Phylofactorization evaluates every edge of the tree (Washburne et al., 2017, 2019) and evoPCA treats every branch as a variable whose abundances enter the ordination (Pavoine, 2016), so the stem branch of the planted clade is always a candidate, whatever the distribution of node depths. In contrast, the PCC tests a global association between phylogenetic eigenvectors, composition and environment (Peres-Neto &amp; Kembel, 2015), and its leading eigenvectors rarely isolated the clade of interest. Node-based analyses of species distributions (Borregaard et al., 2014) follow a similar node-by-node logic and could be added to future comparisons. Thus, branch-wise methods seem to be the appropriate choice when the aim is to identify which clades respond to a gradient.</w:t>
-      </w:r>
-    </w:p>
-    <w:p>
-      <w:pPr>
-        <w:pStyle w:val="BodyText"/>
-      </w:pPr>
-      <w:r>
-        <w:t xml:space="preserve">Low γ improved the recovery of both basal and recent clades by PCPS, so H3 was only partly supported. Empirical applications of PCPS found that environmental effects concentrate on a few nodes (Duarte et al., 2012) and that deep and shallow nodes respond to different drivers in amphibians (Duarte et al., 2014). Our results suggest that which of these nodes PCPS can detect depends on the distribution of node depths, since PCPS probably recovers a clade only when its stem node is among those weighted by the leading axes. In addition, the share of variation on the first PCPS axis decreased rather than increased with low γ (Appendix S2), which contradicts the mechanism behind H3. As a consequence, the advantage of basal clades under PCPS seems to be a matter of degree, and the nodes highlighted by PCPS axes in empirical studies should be interpreted in light of the shape of the tree.</w:t>
+        <w:t xml:space="preserve">The evoPCA and phylofactorization recovered the planted clade far more often than PCPS and PCC, and independently of γ. Phylofactorization evaluates every edge of the tree (Washburne et al., 2017, 2019) and evoPCA treats every branch as a variable whose abundances enter the ordination (Pavoine, 2016), so the stem branch of the planted clade is always a candidate, whatever the distribution of node depths. In contrast, the PCC tests a global association between phylogenetic eigenvectors, composition and environment (Peres-Neto &amp; Kembel, 2015), and its leading eigenvectors rarely isolated the clade of interest. Node-based analyses of species distributions (Borregaard et al., 2014) follow a similar node-by-node logic and could be added to future comparisons. Thus, branch-wise methods seem to be the appropriate choice to identify which clades respond to a gradient.</w:t>
+      </w:r>
+    </w:p>
+    <w:p>
+      <w:pPr>
+        <w:pStyle w:val="BodyText"/>
+      </w:pPr>
+      <w:r>
+        <w:t xml:space="preserve">Low γ improved the recovery of both basal and recent clades by PCPS, so H3 was only partly supported. Empirical applications of PCPS found that environmental effects concentrate on a few nodes (Duarte et al., 2012) and that deep and shallow nodes respond to different drivers in amphibians (Duarte et al., 2014). Our results suggest that which of these nodes PCPS can detect depends on the distribution of node depths, since PCPS probably recovers a clade only when its stem node is among those weighted by the leading axes. Older clades were also recovered more often by PCPS within each level of γ, so the effect of clade age is not only an effect of γ, but the share of variation on the first PCPS axis decreased rather than increased with low γ (Appendix S2), which contradicts the mechanism behind H3. As a consequence, the advantage of basal clades under PCPS seems to be a matter of degree, and the nodes highlighted by PCPS axes in empirical studies should be interpreted in light of the shape of the tree.</w:t>
       </w:r>
     </w:p>
     <w:p>
@@ -2716,7 +2685,7 @@
         <w:pStyle w:val="BodyText"/>
       </w:pPr>
       <w:r>
-        <w:t xml:space="preserve">Our study also has limitations. First, the grid had no level with γ &gt; 0. Second, Layer B had no spatial structure and used only incidence data and five cells of the grid. Third, we did not vary the number of sites or the length of the gradient, which also change power. Fourth, because optima evolved on the tree, tree shape changed both the distribution of the optima and the tree used in the analysis, and the ages of basal and recent clades also depend on γ, so these effects cannot be separated in our design. Finally, the case study had 13–40 ponds and no significant association, so it illustrates how the methods behave with real data rather than validating them. To the best of our knowledge, and based on searches of the literature, this is the first simulation study to evaluate tests on phylogeny-weighted composition across controlled gradients of tree shape and under process-based metacommunity assembly. In summary, we recommend that empirical studies (i) report γ and the normalized Colless index of the analysed tree; (ii) not rely on a single test, and prefer PERMANOVA with the max test to tests on single PCPS axes or phylogenetic eigenvectors when the tree has very negative γ and the pool has 100 or more species; (iii) interpret the second PCPS axis and the PCC with caution when niche breadth may be phylogenetically conserved; (iv) interpret a lack of power under high dispersal as a property of the metacommunity rather than as evidence against niche-based assembly; and (v) use evoPCA or phylofactorization, rather than PCPS axes, to identify the clades associated with a gradient.</w:t>
+        <w:t xml:space="preserve">Our study also has limitations. First, the grid had no level with γ &gt; 0. Second, Layer B had no spatial structure and used only incidence data and five cells of the grid. Third, we did not vary the number of sites or the length of the gradient, which also change power. Fourth, because optima evolved on the tree, tree shape changed both the distribution of the optima and the tree used in the analysis, and the ages of basal and recent clades also depend on γ, so these effects cannot be separated in our design. Finally, the case study had 13–40 ponds and no significant association, so it illustrates how the methods behave with real data rather than validating them. To the best of our knowledge, and based on searches of the literature, this is the first simulation study to evaluate tests on phylogeny-weighted composition across controlled gradients of tree shape and under process-based metacommunity assembly. In summary, we recommend that empirical studies (i) report γ and the normalized Colless index of the analysed tree; (ii) not rely on a single test, and prefer PERMANOVA or the RDA on the first two PCPS axes, with the max test, to tests on single PCPS axes or phylogenetic eigenvectors when the tree has very negative γ and the pool has 100 or more species; (iii) interpret the second PCPS axis and the PCC with caution when niche breadth may be phylogenetically conserved; (iv) interpret a lack of power under high dispersal as a property of the metacommunity rather than as evidence against niche-based assembly; and (v) use evoPCA or phylofactorization, rather than PCPS axes, to identify the clades associated with a gradient.</w:t>
       </w:r>
     </w:p>
     <w:bookmarkEnd w:id="55"/>

</xml_diff>

<commit_message>
Modelos formais da rodada com RDA e Procrustes (camada A): convergência e taxas no texto e no S2
Co-Authored-By: Claude Opus 5.5 <noreply@anthropic.com>
</commit_message>
<xml_diff>
--- a/manuscript/methods_results.docx
+++ b/manuscript/methods_results.docx
@@ -2202,7 +2202,7 @@
         </w:r>
       </w:hyperlink>
       <w:r>
-        <w:t xml:space="preserve">). Compared with the same scenario without signal (S2), signal in σ (S2σ) increased the rejection rate of GLM PCPS2 by 0.02 (95% CI 0.01–0.03) in Yule trees at N = 100, and by 0.05 (0.04–0.06), 0.10 (0.08–0.12) and 0.21 (0.19–0.23) with low γ at N = 50, 100 and 200, with raw rates of up to 0.36. The PCC was inflated by 0.05 (0.03–0.06) in Yule trees and by 0.02 (0.01–0.03) with low γ at N = 100, with raw rates of up to 0.22. In contrast, PERMANOVA, GLM PCPS1 and the Mantel test became more conservative under signal in σ (by 0.005–0.030), and signal in maximum abundance (S2h) did not change the rejection rate of any test. With symmetric Procrustes of the null axes, the inflation of GLM PCPS2 disappeared, but this variant was conservative even without nuisance structure, whereas the RDA PCPS was not inflated (0.004–0.021 in S2σ) and lost little power with low γ (0.70 against 0.78 at N = 100 in S3b; Appendix S2). As a result, H2 was rejected as stated.</w:t>
+        <w:t xml:space="preserve">). Compared with the same scenario without signal (S2), signal in σ (S2σ) increased the rejection rate of GLM PCPS2 by 0.02 (95% CI 0.01–0.03) in Yule trees at N = 100, and by 0.05 (0.04–0.06), 0.10 (0.08–0.12) and 0.21 (0.19–0.23) with low γ at N = 50, 100 and 200, with raw rates of up to 0.36. The PCC was inflated by 0.05 (0.03–0.06) in Yule trees and by 0.02 (0.01–0.03) with low γ at N = 100, with raw rates of up to 0.22. In contrast, PERMANOVA, GLM PCPS1 and the Mantel test became more conservative under signal in σ (by 0.005–0.030), and signal in maximum abundance (S2h) did not change the rejection rate of any test. With symmetric Procrustes of the null axes, the inflation of GLM PCPS2 disappeared, but this variant was conservative even without nuisance structure, whereas the RDA PCPS was not inflated (0.004–0.021 in S2σ) and lost much less power with low γ than GLM PCPS1 (posterior medians 0.65 against 0.76 at N = 100 in S3b; Appendix S2). As a result, H2 was rejected as stated.</w:t>
       </w:r>
     </w:p>
     <w:tbl>
@@ -2609,7 +2609,7 @@
         <w:pStyle w:val="BodyText"/>
       </w:pPr>
       <w:r>
-        <w:t xml:space="preserve">Very negative γ reduced the power of the GLM on the first PCPS axis and of the PCC, whereas PERMANOVA was less sensitive to it. The eigenstructure of a phylogenetic matrix is set by the tree (Diniz-Filho et al., 1998), and in trees with long internal branches near the root a few deep splits probably dominate it, so the first PCPS axis and the leading eigenvectors of the PCC probably capture the deepest dichotomy even when the gradient sorts species along another one. This parallels the finding that a small number of phylogenetic eigenvectors may be insufficient to control phylogenetic autocorrelation in ecological analyses (Diniz-Filho et al., 2012). In addition, the RDA on the first two PCPS axes lost little power with low γ, which agrees with this mechanism. However, the Mantel test, which also uses the whole matrix</w:t>
+        <w:t xml:space="preserve">Very negative γ reduced the power of the GLM on the first PCPS axis and of the PCC, whereas PERMANOVA was less sensitive to it. The eigenstructure of a phylogenetic matrix is set by the tree (Diniz-Filho et al., 1998), and in trees with long internal branches near the root a few deep splits probably dominate it, so the first PCPS axis and the leading eigenvectors of the PCC probably capture the deepest dichotomy even when the gradient sorts species along another one. This parallels the finding that a small number of phylogenetic eigenvectors may be insufficient to control phylogenetic autocorrelation in ecological analyses (Diniz-Filho et al., 2012). In addition, the RDA on the first two PCPS axes lost much less power with low γ, which agrees with this mechanism. However, the Mantel test, which also uses the whole matrix</w:t>
       </w:r>
       <w:r>
         <w:t xml:space="preserve"> </w:t>

</xml_diff>

<commit_message>
Terminologia: 'Layer A/B' substituído por simulações estáticas e baseadas em processos (texto, SI, Fig. 1, README)
Co-Authored-By: Claude Opus 5.5 <noreply@anthropic.com>
</commit_message>
<xml_diff>
--- a/manuscript/methods_results.docx
+++ b/manuscript/methods_results.docx
@@ -54,7 +54,7 @@
         </w:numPr>
       </w:pPr>
       <w:r>
-        <w:t xml:space="preserve">We simulated metacommunities on a grid of tree shapes that crossed the distribution of branching times (γ) with topological imbalance (Colless index), with levels from anuran clades, in a static layer reproducing the original validations and a process-based layer with species sorting, mass effects and phylogenetic competition. We modelled the type I error and power of six tests, and clade recovery by four ordination and factorization methods, with beta-binomial models.</w:t>
+        <w:t xml:space="preserve">We simulated metacommunities on a grid of tree shapes that crossed the distribution of branching times (γ) with topological imbalance (Colless index), with levels from anuran clades, in static simulations reproducing the original validations and process-based simulations with species sorting, mass effects and phylogenetic competition. We modelled the type I error and power of six tests, and clade recovery by four ordination and factorization methods, with beta-binomial models.</w:t>
       </w:r>
     </w:p>
     <w:p>
@@ -200,7 +200,7 @@
         <w:pStyle w:val="FirstParagraph"/>
       </w:pPr>
       <w:r>
-        <w:t xml:space="preserve">We generated metacommunities in two layers (</w:t>
+        <w:t xml:space="preserve">We generated metacommunities with two kinds of simulations (</w:t>
       </w:r>
       <w:hyperlink w:anchor="fig-design">
         <w:r>
@@ -211,7 +211,7 @@
         </w:r>
       </w:hyperlink>
       <w:r>
-        <w:t xml:space="preserve">). Layer A follows the static protocol of Peres-Neto, Leibold and Dray (2012), which was also used to validate the tests we evaluated, so our results can be compared directly with the published ones. Layer B simulates metacommunity dynamics with the process-based framework of Thompson et al. (2020), in which species sorting, mass effects and competition emerge from local population dynamics and dispersal. In both layers, the trees came from a grid of shapes that crosses the distribution of branching times with the imbalance of the topology. The study was not registered. However, we wrote the design and the hypotheses down before the main runs, in a planning document first committed to the code repository on 16 October 2026, and we report the departures from that plan in Appendix S1.</w:t>
+        <w:t xml:space="preserve">). The static simulations follow the protocol of Peres-Neto, Leibold and Dray (2012), which was also used to validate the tests we evaluated, so our results can be compared directly with the published ones. The process-based simulations reproduce metacommunity dynamics with the framework of Thompson et al. (2020), in which species sorting, mass effects and competition emerge from local population dynamics and dispersal. In both, the trees came from a grid of shapes that crosses the distribution of branching times with the imbalance of the topology. The study was not registered. However, we wrote the design and the hypotheses down before the main runs, in a planning document first committed to the code repository on 16 October 2026, and we report the departures from that plan in Appendix S1.</w:t>
       </w:r>
     </w:p>
     <w:tbl>
@@ -457,13 +457,13 @@
       </w:r>
     </w:p>
     <w:bookmarkEnd w:id="27"/>
-    <w:bookmarkStart w:id="28" w:name="layer-a-static-metacommunities"/>
+    <w:bookmarkStart w:id="28" w:name="static-simulations"/>
     <w:p>
       <w:pPr>
         <w:pStyle w:val="Heading2"/>
       </w:pPr>
       <w:r>
-        <w:t xml:space="preserve">Layer A: static metacommunities</w:t>
+        <w:t xml:space="preserve">Static simulations</w:t>
       </w:r>
     </w:p>
     <w:p>
@@ -817,13 +817,13 @@
       </w:r>
     </w:p>
     <w:bookmarkEnd w:id="28"/>
-    <w:bookmarkStart w:id="29" w:name="layer-b-process-based-metacommunities"/>
+    <w:bookmarkStart w:id="29" w:name="process-based-simulations"/>
     <w:p>
       <w:pPr>
         <w:pStyle w:val="Heading2"/>
       </w:pPr>
       <w:r>
-        <w:t xml:space="preserve">Layer B: process-based metacommunities</w:t>
+        <w:t xml:space="preserve">Process-based simulations</w:t>
       </w:r>
     </w:p>
     <w:p>
@@ -831,7 +831,7 @@
         <w:pStyle w:val="FirstParagraph"/>
       </w:pPr>
       <w:r>
-        <w:t xml:space="preserve">Layer B followed the equations of Thompson et al. (2020), which we implemented in R. Growth was a Gaussian function of the mismatch between</w:t>
+        <w:t xml:space="preserve">The process-based simulations followed the equations of Thompson et al. (2020), which we implemented in R. Growth was a Gaussian function of the mismatch between</w:t>
       </w:r>
       <w:r>
         <w:t xml:space="preserve"> </w:t>
@@ -965,7 +965,7 @@
         </m:r>
       </m:oMath>
       <w:r>
-        <w:t xml:space="preserve">) in mass effects, and competition was either intraspecific only or also interspecific and structured by phylogeny, so that close relatives competed more strongly. Since competition and dispersal remove species, the cell of the grid defined the tree of the regional pool rather than that of the analysed metacommunity, and we calibrated the pool size so that about N species were left after the dynamics (Appendix S1); mass effects with phylogenetic competition could not reach N = 200, and we dropped this combination. Layer B used five cells of the grid (the four corners and the centre) and 1,000 replicates per combination.</w:t>
+        <w:t xml:space="preserve">) in mass effects, and competition was either intraspecific only or also interspecific and structured by phylogeny, so that close relatives competed more strongly. Since competition and dispersal remove species, the cell of the grid defined the tree of the regional pool rather than that of the analysed metacommunity, and we calibrated the pool size so that about N species were left after the dynamics (Appendix S1); mass effects with phylogenetic competition could not reach N = 200, and we dropped this combination. These simulations used five cells of the grid (the four corners and the centre) and 1,000 replicates per combination.</w:t>
       </w:r>
     </w:p>
     <w:bookmarkEnd w:id="29"/>
@@ -983,7 +983,7 @@
         <w:pStyle w:val="FirstParagraph"/>
       </w:pPr>
       <w:r>
-        <w:t xml:space="preserve">The eight trait scenarios were the same in both layers (</w:t>
+        <w:t xml:space="preserve">The eight trait scenarios were the same in both kinds of simulation (</w:t>
       </w:r>
       <w:hyperlink w:anchor="tbl-scenarios">
         <w:r>
@@ -1021,7 +1021,7 @@
               <w:pStyle w:val="ImageCaption"/>
             </w:pPr>
             <w:r>
-              <w:t xml:space="preserve">Table 1: Trait scenarios of both layers. λ is Pagel’s λ of the species optima.</w:t>
+              <w:t xml:space="preserve">Table 1: Trait scenarios of the static and process-based simulations. λ is Pagel’s λ of the species optima.</w:t>
             </w:r>
           </w:p>
           <w:tbl>
@@ -1722,7 +1722,7 @@
         <w:t xml:space="preserve"> </w:t>
       </w:r>
       <w:r>
-        <w:t xml:space="preserve">(GLM PCPS1 and GLM PCPS2); in Layer B, we also fitted a redundancy analysis of both axes on</w:t>
+        <w:t xml:space="preserve">(GLM PCPS1 and GLM PCPS2); in the process-based simulations, we also fitted a redundancy analysis of both axes on</w:t>
       </w:r>
       <w:r>
         <w:t xml:space="preserve"> </w:t>
@@ -1736,7 +1736,7 @@
         <w:t xml:space="preserve"> </w:t>
       </w:r>
       <w:r>
-        <w:t xml:space="preserve">(RDA PCPS). We re-implemented the phylogenetic community composition approach (PCC) of Peres-Neto and Kembel (2015) from the equations in the original article, using the variance of the adjusted R² across phylogenetic eigenvectors as the test statistic. Every test was evaluated with 999 permutations under two null models, the site shuffle, which permutes the sites, and the taxa shuffle, which permutes the tips of the tree while keeping its topology. We report the largest of the two P-values (max test), which controls the type I error when either null hypothesis holds (Peres-Neto &amp; Kembel, 2015; Duarte et al., 2016). We checked our permutation code against the R packages vegan and PCPS (Appendix S1). In a second run of Layer A, we also evaluated the RDA PCPS and a variant of the GLM on PCPS axes with symmetric Procrustes of the null axes onto the observed ones, as in the R package PCPS (Appendix S2).</w:t>
+        <w:t xml:space="preserve">(RDA PCPS). We re-implemented the phylogenetic community composition approach (PCC) of Peres-Neto and Kembel (2015) from the equations in the original article, using the variance of the adjusted R² across phylogenetic eigenvectors as the test statistic. Every test was evaluated with 999 permutations under two null models, the site shuffle, which permutes the sites, and the taxa shuffle, which permutes the tips of the tree while keeping its topology. We report the largest of the two P-values (max test), which controls the type I error when either null hypothesis holds (Peres-Neto &amp; Kembel, 2015; Duarte et al., 2016). We checked our permutation code against the R packages vegan and PCPS (Appendix S1). In a second run of the static simulations, we also evaluated the RDA PCPS and a variant of the GLM on PCPS axes with symmetric Procrustes of the null axes onto the observed ones, as in the R package PCPS (Appendix S2).</w:t>
       </w:r>
     </w:p>
     <w:bookmarkEnd w:id="32"/>
@@ -1754,7 +1754,7 @@
         <w:pStyle w:val="FirstParagraph"/>
       </w:pPr>
       <w:r>
-        <w:t xml:space="preserve">To evaluate aim (iii), we planted a clade associated with the gradient in each replicate of Layer A. We drew one internal node whose clade held 10–30% of the tips, either among the older or among the younger half of the eligible nodes, so that basal and recent clades of similar size could be compared. The optima of all species were</w:t>
+        <w:t xml:space="preserve">To evaluate aim (iii), we planted a clade associated with the gradient in each replicate of the static simulations. We drew one internal node whose clade held 10–30% of the tips, either among the older or among the younger half of the eligible nodes, so that basal and recent clades of similar size could be compared. The optima of all species were</w:t>
       </w:r>
     </w:p>
     <w:p>
@@ -2073,7 +2073,7 @@
         </m:r>
       </m:oMath>
       <w:r>
-        <w:t xml:space="preserve">, so a 95% Monte Carlo interval around the nominal level falls within Bradley’s liberal criterion for acceptable type I error, [0.025, 0.075] (Bradley, 1978); every rate and its Monte Carlo standard error are in Table S2. We then modelled the rates aggregated by condition with beta-binomial models fitted in the R package brms v. 2.23.0 (Bürkner, 2017) with CmdStan v. 2.39.0 through cmdstanr v. 0.9.0 (Gabry et al., 2025), with one model for the type I error and one for the power in each layer, and one for clade recovery. We entered the levels of γ and of the Colless index as factors, with their interaction, which estimates the full γ × imbalance surface without assuming its form, and let the shape effects differ among tests (or methods), scenarios, N and data type (Appendix S1). The beta-binomial accounts for the dispersion of the rates, which was 2.1–8.5 times larger than binomial in quasibinomial models with the same structure. Priors were declared explicitly on the logit scale, weakly informative and centred on a rate of 0.05 for the intercepts of the type I models (Appendix S1). We checked the priors with prior predictive simulations and assessed the sensitivity of the posteriors to them by power-scaling with the R package priorsense v. 1.4.0 (Kallioinen et al., 2024), for the coefficients and for the predicted rate of every condition. We checked convergence with the rank-normalized</w:t>
+        <w:t xml:space="preserve">, so a 95% Monte Carlo interval around the nominal level falls within Bradley’s liberal criterion for acceptable type I error, [0.025, 0.075] (Bradley, 1978); every rate and its Monte Carlo standard error are in Table S2. We then modelled the rates aggregated by condition with beta-binomial models fitted in the R package brms v. 2.23.0 (Bürkner, 2017) with CmdStan v. 2.39.0 through cmdstanr v. 0.9.0 (Gabry et al., 2025), with one model for the type I error and one for the power in each kind of simulation, and one for clade recovery. We entered the levels of γ and of the Colless index as factors, with their interaction, which estimates the full γ × imbalance surface without assuming its form, and let the shape effects differ among tests (or methods), scenarios, N and data type (Appendix S1). The beta-binomial accounts for the dispersion of the rates, which was 2.1–8.5 times larger than binomial in quasibinomial models with the same structure. Priors were declared explicitly on the logit scale, weakly informative and centred on a rate of 0.05 for the intercepts of the type I models (Appendix S1). We checked the priors with prior predictive simulations and assessed the sensitivity of the posteriors to them by power-scaling with the R package priorsense v. 1.4.0 (Kallioinen et al., 2024), for the coefficients and for the predicted rate of every condition. We checked convergence with the rank-normalized</w:t>
       </w:r>
       <w:r>
         <w:t xml:space="preserve"> </w:t>
@@ -2146,7 +2146,7 @@
         <w:pStyle w:val="FirstParagraph"/>
       </w:pPr>
       <w:r>
-        <w:t xml:space="preserve">The static layer reproduced the published validations, since 66 of 72 rejection rates of Duarte et al. (2016) fell within the 95% binomial interval of our estimates and the PCC matched the rates of Peres-Neto and Kembel (2015) where they do not depend on the tree (Appendix S2). All formal models converged (</w:t>
+        <w:t xml:space="preserve">The static simulations reproduced the published validations, since 66 of 72 rejection rates of Duarte et al. (2016) fell within the 95% binomial interval of our estimates and the PCC matched the rates of Peres-Neto and Kembel (2015) where they do not depend on the tree (Appendix S2). All formal models converged (</w:t>
       </w:r>
       <m:oMath>
         <m:acc>
@@ -2473,7 +2473,7 @@
               <w:pStyle w:val="ImageCaption"/>
             </w:pPr>
             <w:r>
-              <w:t xml:space="preserve">Figure 4: Power in Layer B by assembly archetype and pool tree cell at N = 100 (posterior medians and 95% credible intervals). Notice that mass effects (orange) lower the power of every test except GLM PCPS2 and almost abolish that of the PCC, and that phylogenetic competition under mass effects (pink) recovers part of the power lost.</w:t>
+              <w:t xml:space="preserve">Figure 4: Power in the process-based simulations by assembly archetype and pool tree cell at N = 100 (posterior medians and 95% credible intervals). Notice that mass effects (orange) lower the power of every test except GLM PCPS2 and almost abolish that of the PCC, and that phylogenetic competition under mass effects (pink) recovers part of the power lost.</w:t>
             </w:r>
           </w:p>
           <w:bookmarkEnd w:id="49"/>
@@ -2685,7 +2685,7 @@
         <w:pStyle w:val="BodyText"/>
       </w:pPr>
       <w:r>
-        <w:t xml:space="preserve">Our study also has limitations. First, the grid had no level with γ &gt; 0. Second, Layer B had no spatial structure and used only incidence data and five cells of the grid. Third, we did not vary the number of sites or the length of the gradient, which also change power. Fourth, because optima evolved on the tree, tree shape changed both the distribution of the optima and the tree used in the analysis, and the ages of basal and recent clades also depend on γ, so these effects cannot be separated in our design. Finally, the case study had 13–40 ponds and no significant association, so it illustrates how the methods behave with real data rather than validating them. To the best of our knowledge, and based on searches of the literature, this is the first simulation study to evaluate tests on phylogeny-weighted composition across controlled gradients of tree shape and under process-based metacommunity assembly. In summary, we recommend that empirical studies (i) report γ and the normalized Colless index of the analysed tree; (ii) not rely on a single test, and prefer PERMANOVA or the RDA on the first two PCPS axes, with the max test, to tests on single PCPS axes or phylogenetic eigenvectors when the tree has very negative γ and the pool has 100 or more species; (iii) interpret the second PCPS axis and the PCC with caution when niche breadth may be phylogenetically conserved; (iv) interpret a lack of power under high dispersal as a property of the metacommunity rather than as evidence against niche-based assembly; and (v) use evoPCA or phylofactorization, rather than PCPS axes, to identify the clades associated with a gradient.</w:t>
+        <w:t xml:space="preserve">Our study also has limitations. First, the grid had no level with γ &gt; 0. Second, the process-based simulations had no spatial structure and used only incidence data and five cells of the grid. Third, we did not vary the number of sites or the length of the gradient, which also change power. Fourth, because optima evolved on the tree, tree shape changed both the distribution of the optima and the tree used in the analysis, and the ages of basal and recent clades also depend on γ, so these effects cannot be separated in our design. Finally, the case study had 13–40 ponds and no significant association, so it illustrates how the methods behave with real data rather than validating them. To the best of our knowledge, and based on searches of the literature, this is the first simulation study to evaluate tests on phylogeny-weighted composition across controlled gradients of tree shape and under process-based metacommunity assembly. In summary, we recommend that empirical studies (i) report γ and the normalized Colless index of the analysed tree; (ii) not rely on a single test, and prefer PERMANOVA or the RDA on the first two PCPS axes, with the max test, to tests on single PCPS axes or phylogenetic eigenvectors when the tree has very negative γ and the pool has 100 or more species; (iii) interpret the second PCPS axis and the PCC with caution when niche breadth may be phylogenetically conserved; (iv) interpret a lack of power under high dispersal as a property of the metacommunity rather than as evidence against niche-based assembly; and (v) use evoPCA or phylofactorization, rather than PCPS axes, to identify the clades associated with a gradient.</w:t>
       </w:r>
     </w:p>
     <w:bookmarkEnd w:id="55"/>

</xml_diff>

<commit_message>
Resultados da rodada com ótimos uniformes: o efeito de γ vem da análise, não da distribuição dos ótimos
Co-Authored-By: Claude Opus 5.5 <noreply@anthropic.com>
</commit_message>
<xml_diff>
--- a/manuscript/methods_results.docx
+++ b/manuscript/methods_results.docx
@@ -813,7 +813,7 @@
         <w:t xml:space="preserve"> </w:t>
       </w:r>
       <w:r>
-        <w:t xml:space="preserve">could carry phylogenetic signal, with the same marginal distribution as without signal, so that the two cases differed only in how the values were arranged on the tree (Appendix S1). We removed empty sites and pruned absent species from the tree before analysis, as one would with real data, and analysed both incidence and abundance data.</w:t>
+        <w:t xml:space="preserve">could carry phylogenetic signal, with the same marginal distribution as without signal, so that the two cases differed only in how the values were arranged on the tree (Appendix S1). We removed empty sites and pruned absent species from the tree before analysis, as one would with real data, and analysed both incidence and abundance data. Since tree shape changes both the distribution of the optima and the tree used in the analysis, we repeated the power scenarios with the optima given, by ranks, the same evenly spaced distribution in every tree (Appendix S1).</w:t>
       </w:r>
     </w:p>
     <w:bookmarkEnd w:id="28"/>
@@ -2300,7 +2300,7 @@
         </w:r>
       </w:hyperlink>
       <w:r>
-        <w:t xml:space="preserve">). At N = 100 in S3b, low γ reduced the power of GLM PCPS1 from 0.74 to 0.34 (contrast −0.40, 95% CI −0.45 to −0.34) and that of the PCC from 0.98 to 0.73 (−0.25, −0.30 to −0.21), whereas the power of PERMANOVA did not change (0.01, −0.02 to 0.05), and high imbalance reduced power by at most 0.09. Consequently, the ranking of the tests changed with tree shape, since in S3b the PCC was the most powerful test in Yule trees and the third with low γ. Thus, H4 was supported for power.</w:t>
+        <w:t xml:space="preserve">). At N = 100 in S3b, low γ reduced the power of GLM PCPS1 from 0.74 to 0.34 (contrast −0.40, 95% CI −0.45 to −0.34) and that of the PCC from 0.98 to 0.73 (−0.25, −0.30 to −0.21), whereas the power of PERMANOVA did not change (0.01, −0.02 to 0.05), and high imbalance reduced power by at most 0.09. Consequently, the ranking of the tests changed with tree shape, since in S3b the PCC was the most powerful test in Yule trees and the third with low γ. Thus, H4 was supported for power. With the optima given the same distribution in every tree, low γ still reduced the power of GLM PCPS1 (from 0.77 to 0.24) and of the PCC (from 0.99 to 0.80), and not that of PERMANOVA (raw rates at N = 100 in S3b; Appendix S2).</w:t>
       </w:r>
     </w:p>
     <w:tbl>
@@ -2609,7 +2609,7 @@
         <w:pStyle w:val="BodyText"/>
       </w:pPr>
       <w:r>
-        <w:t xml:space="preserve">Very negative γ reduced the power of the GLM on the first PCPS axis and of the PCC, whereas PERMANOVA was less sensitive to it. The eigenstructure of a phylogenetic matrix is set by the tree (Diniz-Filho et al., 1998), and in trees with long internal branches near the root a few deep splits probably dominate it, so the first PCPS axis and the leading eigenvectors of the PCC probably capture the deepest dichotomy even when the gradient sorts species along another one. This parallels the finding that a small number of phylogenetic eigenvectors may be insufficient to control phylogenetic autocorrelation in ecological analyses (Diniz-Filho et al., 2012). In addition, the RDA on the first two PCPS axes lost much less power with low γ, which agrees with this mechanism. However, the Mantel test, which also uses the whole matrix</w:t>
+        <w:t xml:space="preserve">Very negative γ reduced the power of the GLM on the first PCPS axis and of the PCC, whereas PERMANOVA was less sensitive to it. The eigenstructure of a phylogenetic matrix is set by the tree (Diniz-Filho et al., 1998), and in trees with long internal branches near the root a few deep splits probably dominate it, so the first PCPS axis and the leading eigenvectors of the PCC probably capture the deepest dichotomy even when the gradient sorts species along another one. This parallels the finding that a small number of phylogenetic eigenvectors may be insufficient to control phylogenetic autocorrelation in ecological analyses (Diniz-Filho et al., 2012). In addition, the RDA on the first two PCPS axes lost much less power with low γ, and the loss persisted when the optima had the same distribution in every tree, which agrees with this mechanism and shows that γ acts through the analysis rather than through the optima. However, the Mantel test, which also uses the whole matrix</w:t>
       </w:r>
       <w:r>
         <w:t xml:space="preserve"> </w:t>
@@ -2685,7 +2685,7 @@
         <w:pStyle w:val="BodyText"/>
       </w:pPr>
       <w:r>
-        <w:t xml:space="preserve">Our study also has limitations. First, the grid had no level with γ &gt; 0. Second, the process-based simulations had no spatial structure and used only incidence data and five cells of the grid. Third, we did not vary the number of sites or the length of the gradient, which also change power. Fourth, because optima evolved on the tree, tree shape changed both the distribution of the optima and the tree used in the analysis, and the ages of basal and recent clades also depend on γ, so these effects cannot be separated in our design. Finally, the case study had 13–40 ponds and no significant association, so it illustrates how the methods behave with real data rather than validating them. To the best of our knowledge, and based on searches of the literature, this is the first simulation study to evaluate tests on phylogeny-weighted composition across controlled gradients of tree shape and under process-based metacommunity assembly. In summary, we recommend that empirical studies (i) report γ and the normalized Colless index of the analysed tree; (ii) not rely on a single test, and prefer PERMANOVA or the RDA on the first two PCPS axes, with the max test, to tests on single PCPS axes or phylogenetic eigenvectors when the tree has very negative γ and the pool has 100 or more species; (iii) interpret the second PCPS axis and the PCC with caution when niche breadth may be phylogenetically conserved; (iv) interpret a lack of power under high dispersal as a property of the metacommunity rather than as evidence against niche-based assembly; and (v) use evoPCA or phylofactorization, rather than PCPS axes, to identify the clades associated with a gradient.</w:t>
+        <w:t xml:space="preserve">Our study also has limitations. First, the grid had no level with γ &gt; 0. Second, the process-based simulations had no spatial structure and used only incidence data and five cells of the grid. Third, we did not vary the number of sites or the length of the gradient, which also change power. Fourth, the ages of basal and recent clades also depend on γ, although older clades were recovered more often within each level of γ and depth class. Finally, the case study had 13–40 ponds and no significant association, so it illustrates how the methods behave with real data rather than validating them. To the best of our knowledge, and based on searches of the literature, this is the first simulation study to evaluate tests on phylogeny-weighted composition across controlled gradients of tree shape and under process-based metacommunity assembly. In summary, we recommend that empirical studies (i) report γ and the normalized Colless index of the analysed tree; (ii) not rely on a single test, and prefer PERMANOVA or the RDA on the first two PCPS axes, with the max test, to tests on single PCPS axes or phylogenetic eigenvectors when the tree has very negative γ and the pool has 100 or more species; (iii) interpret the second PCPS axis and the PCC with caution when niche breadth may be phylogenetically conserved; (iv) interpret a lack of power under high dispersal as a property of the metacommunity rather than as evidence against niche-based assembly; and (v) use evoPCA or phylofactorization, rather than PCPS axes, to identify the clades associated with a gradient.</w:t>
       </w:r>
     </w:p>
     <w:bookmarkEnd w:id="55"/>

</xml_diff>

<commit_message>
Resultados da camada espacial (baseada em processos): texto, S2 e recomendações; texto enxuto para < 8.000 palavras
Co-Authored-By: Claude Opus 5.5 <noreply@anthropic.com>
</commit_message>
<xml_diff>
--- a/manuscript/methods_results.docx
+++ b/manuscript/methods_results.docx
@@ -124,7 +124,7 @@
         </m:r>
       </m:oMath>
       <w:r>
-        <w:t xml:space="preserve">, whose principal coordinates of phylogenetic structure (PCPS) can then be related to the gradient (Pillar &amp; Duarte, 2010; Duarte, 2011; Duarte et al., 2016). The phylogenetic community composition approach (PCC) relates species composition to phylogenetic eigenvectors and the gradient (Peres-Neto &amp; Kembel, 2015), whereas evolutionary principal component analysis (evoPCA) and phylofactorization treat branches as units and point to the lineages that drive differences among sites (Pavoine, 2016; Washburne et al., 2017, 2019). These methods have been applied to plants and to animals, including the amphibians of the Americas, where the association between climate and phylogenetic composition depended on the depth of the nodes considered (Duarte et al., 2012, 2014). As a result, an empirical study can choose among tests that differ in what they summarize from the tree, and their behaviour under realistic conditions determines whether the inferences drawn from them are sound.</w:t>
+        <w:t xml:space="preserve">, whose principal coordinates of phylogenetic structure (PCPS) can then be related to the gradient (Pillar &amp; Duarte, 2010; Duarte, 2011; Duarte et al., 2016). The phylogenetic community composition approach (PCC) relates species composition to phylogenetic eigenvectors and the gradient (Peres-Neto &amp; Kembel, 2015), whereas evolutionary principal component analysis (evoPCA) and phylofactorization treat branches as units and point to the lineages that drive differences among sites (Pavoine, 2016; Washburne et al., 2017, 2019). These methods have been applied to plants and to animals, including the amphibians of the Americas, where the association between climate and phylogenetic composition depended on the depth of the nodes considered (Duarte et al., 2012, 2014).</w:t>
       </w:r>
     </w:p>
     <w:p>
@@ -813,7 +813,7 @@
         <w:t xml:space="preserve"> </w:t>
       </w:r>
       <w:r>
-        <w:t xml:space="preserve">could carry phylogenetic signal, with the same marginal distribution as without signal, so that the two cases differed only in how the values were arranged on the tree (Appendix S1). We removed empty sites and pruned absent species from the tree before analysis, as one would with real data, and analysed both incidence and abundance data. Since tree shape changes both the distribution of the optima and the tree used in the analysis, we repeated the power scenarios with the optima given, by ranks, the same evenly spaced distribution in every tree (Appendix S1).</w:t>
+        <w:t xml:space="preserve">could carry phylogenetic signal, with the same marginal distribution as without signal, so that the two cases differed only in how the values were arranged on the tree (Appendix S1). We removed empty sites and pruned absent species from the tree before analysis, as one would with real data, and analysed both incidence and abundance data. Since tree shape changes both the optima and the tree analysed, we repeated the power scenarios with the same evenly spaced optima in every tree (Appendix S1).</w:t>
       </w:r>
     </w:p>
     <w:bookmarkEnd w:id="28"/>
@@ -917,7 +917,7 @@
         </m:sSub>
       </m:oMath>
       <w:r>
-        <w:t xml:space="preserve">, and competition followed a Beverton–Holt model (Beverton &amp; Holt, 1957; Appendix S1). Abundances were then drawn from a Poisson distribution, and a proportion</w:t>
+        <w:t xml:space="preserve">, and competition followed a Beverton–Holt model (Beverton &amp; Holt, 1957; Appendix S1). Abundances were drawn from a Poisson distribution, and a proportion</w:t>
       </w:r>
       <w:r>
         <w:t xml:space="preserve"> </w:t>
@@ -931,7 +931,7 @@
         <w:t xml:space="preserve"> </w:t>
       </w:r>
       <w:r>
-        <w:t xml:space="preserve">of the individuals dispersed uniformly among sites, so that sites had no spatial structure and remained exchangeable, which keeps the site shuffle a valid null model. The dynamics ran for 1,000 steps, and we analysed the final state as incidence data; the full model and its settings are given in Appendix S1. We crossed two dispersal regimes with two competition structures, giving four archetypes. Dispersal was low (</w:t>
+        <w:t xml:space="preserve">of the individuals dispersed uniformly among sites, which keeps sites exchangeable and the site shuffle valid; after 1,000 steps, we analysed the final state as incidence data. We crossed two dispersal regimes with two competition structures, giving four archetypes. Dispersal was low (</w:t>
       </w:r>
       <m:oMath>
         <m:r>
@@ -965,7 +965,7 @@
         </m:r>
       </m:oMath>
       <w:r>
-        <w:t xml:space="preserve">) in mass effects, and competition was either intraspecific only or also interspecific and structured by phylogeny, so that close relatives competed more strongly. Since competition and dispersal remove species, the cell of the grid defined the tree of the regional pool rather than that of the analysed metacommunity, and we calibrated the pool size so that about N species were left after the dynamics (Appendix S1); mass effects with phylogenetic competition could not reach N = 200, and we dropped this combination. These simulations used five cells of the grid (the four corners and the centre) and 1,000 replicates per combination.</w:t>
+        <w:t xml:space="preserve">) in mass effects, and competition was either intraspecific only or also interspecific and structured by phylogeny, so that close relatives competed more strongly. Since competition and dispersal remove species, the cell of the grid defined the tree of the regional pool rather than that of the analysed metacommunity, and we calibrated the pool size so that about N species were left after the dynamics (Appendix S1); mass effects with phylogenetic competition could not reach N = 200, and we dropped this combination. These simulations used five cells of the grid (the four corners and the centre) and 1,000 replicates per combination. We also ran a spatial version at N = 100, with sites on a torus, a spatially autocorrelated gradient, distance-limited dispersal and torus translations instead of the site shuffle, analysed with incidence and abundance data (Appendix S1).</w:t>
       </w:r>
     </w:p>
     <w:bookmarkEnd w:id="29"/>
@@ -2164,7 +2164,7 @@
         <w:t xml:space="preserve"> </w:t>
       </w:r>
       <w:r>
-        <w:t xml:space="preserve">≤ 1.01, no divergent transitions), and their posterior predictive intervals covered the observed rates (Appendix S2, Table S3). The predicted rates were insensitive to the priors, and binomial models with a random effect per condition, which absorb the lack of fit of the fixed structure, predicted almost the same rates (median absolute difference 0.002–0.014; Appendix S2).</w:t>
+        <w:t xml:space="preserve">≤ 1.01, no divergent transitions), and their posterior predictive intervals covered the observed rates (Appendix S2, Table S3). The predicted rates were insensitive to the priors and to the lack of fit of the fixed structure (Appendix S2).</w:t>
       </w:r>
     </w:p>
     <w:p>
@@ -2202,7 +2202,7 @@
         </w:r>
       </w:hyperlink>
       <w:r>
-        <w:t xml:space="preserve">). Compared with the same scenario without signal (S2), signal in σ (S2σ) increased the rejection rate of GLM PCPS2 by 0.02 (95% CI 0.01–0.03) in Yule trees at N = 100, and by 0.05 (0.04–0.06), 0.10 (0.08–0.12) and 0.21 (0.19–0.23) with low γ at N = 50, 100 and 200, with raw rates of up to 0.36. The PCC was inflated by 0.05 (0.03–0.06) in Yule trees and by 0.02 (0.01–0.03) with low γ at N = 100, with raw rates of up to 0.22. In contrast, PERMANOVA, GLM PCPS1 and the Mantel test became more conservative under signal in σ (by 0.005–0.030), and signal in maximum abundance (S2h) did not change the rejection rate of any test. With symmetric Procrustes of the null axes, the inflation of GLM PCPS2 disappeared, but this variant was conservative even without nuisance structure, whereas the RDA PCPS was not inflated (0.004–0.021 in S2σ) and lost much less power with low γ than GLM PCPS1 (posterior medians 0.65 against 0.76 at N = 100 in S3b; Appendix S2). As a result, H2 was rejected as stated.</w:t>
+        <w:t xml:space="preserve">). Compared with the same scenario without signal (S2), signal in σ (S2σ) increased the rejection rate of GLM PCPS2 by 0.02 (95% CI 0.01–0.03) in Yule trees at N = 100, and by 0.05 (0.04–0.06), 0.10 (0.08–0.12) and 0.21 (0.19–0.23) with low γ at N = 50, 100 and 200, with raw rates of up to 0.36. The PCC was inflated by 0.05 (0.03–0.06) in Yule trees and by 0.02 (0.01–0.03) with low γ at N = 100, with raw rates of up to 0.22. In contrast, PERMANOVA, GLM PCPS1 and the Mantel test became more conservative under signal in σ (by 0.005–0.030), and signal in maximum abundance (S2h) did not change the rejection rate of any test. The RDA PCPS was not inflated (0.004–0.021 in S2σ) and lost much less power with low γ than GLM PCPS1 (posterior medians 0.65 against 0.76 at N = 100 in S3b), whereas rotating the null axes by Procrustes removed the inflation of GLM PCPS2 but made it conservative (Appendix S2). As a result, H2 was rejected as stated.</w:t>
       </w:r>
     </w:p>
     <w:tbl>
@@ -2398,7 +2398,7 @@
         </w:r>
       </w:hyperlink>
       <w:r>
-        <w:t xml:space="preserve">). Mass effects reduced the power of every test except GLM PCPS2, by 0.55 (GLM PCPS1) to 0.93 (PCC; 95% CI 0.92–0.94) in Yule pool trees, so that the PCC detected the phylogenetic signal in almost no replicates. Surprisingly, adding phylogenetic competition to mass effects partly restored the power of every test except the PCC; for instance, PERMANOVA lost 0.46 (0.42–0.50) instead of 0.62 (0.58–0.65). However, competition pruned close relatives, which made the γ of the analysed tree more negative and its Colless index lower than those of the pool, especially under mass effects (Appendix S2). Under the null hypothesis, no lower CI bound exceeded 0.075 at N = 100, but raw rates of GLM PCPS2 in S2σ and of the PCC in S2h did at N = 200 (Appendix S2).</w:t>
+        <w:t xml:space="preserve">). Mass effects reduced the power of every test except GLM PCPS2, by 0.55 (GLM PCPS1) to 0.93 (PCC; 95% CI 0.92–0.94) in Yule pool trees, so that the PCC detected the phylogenetic signal in almost no replicates. Surprisingly, adding phylogenetic competition to mass effects partly restored the power of every test except the PCC; for instance, PERMANOVA lost 0.46 (0.42–0.50) instead of 0.62 (0.58–0.65). However, competition pruned close relatives, which made the γ of the analysed tree more negative and its Colless index lower than those of the pool, especially under mass effects (Appendix S2). Under the null hypothesis, no lower CI bound exceeded 0.075 at N = 100, but raw rates of GLM PCPS2 in S2σ and of the PCC in S2h did at N = 200 (Appendix S2). With spatial structure, mass effects reduced power much less (PERMANOVA 0.54 against 0.29 in Yule pool trees), except for the PCC with incidence data (0.02; 0.98 with abundance data), and low γ had the same effect as without it (Appendix S2).</w:t>
       </w:r>
     </w:p>
     <w:tbl>
@@ -2496,7 +2496,7 @@
         </w:r>
       </w:hyperlink>
       <w:r>
-        <w:t xml:space="preserve">). With a shift of 2 and incidence data, and averaged over the cells of the grid, evoPCA and phylofactorization identified the planted node in 0.44–0.88 of the replicates, depending on N and depth, PCPS in 0.12–0.42 (0.02–0.71 in single cells) and PCC in only 0.08–0.12, and the rank of the planted node and the Jaccard similarity between the chosen and the planted clades agreed with this ranking (Appendix S2). Without a planted effect, recovery was 0.003–0.021 for evoPCA and phylofactorization and 0.018–0.050 for PCPS and PCC, so the PCC recovered the planted clade only two to three times more often than by chance even with the largest shift; with a shift of 0.5, mean recovery was 0.07–0.11 and did not exceed 0.30 in any condition (Appendix S2).</w:t>
+        <w:t xml:space="preserve">). With a shift of 2 and incidence data, and averaged over the cells of the grid, evoPCA and phylofactorization identified the planted node in 0.44–0.88 of the replicates, depending on N and depth, PCPS in 0.12–0.42 (0.02–0.71 in single cells) and PCC in only 0.08–0.12, and ranks and Jaccard similarities agreed with this ranking (Appendix S2). Without a planted effect, recovery was 0.003–0.021 for evoPCA and phylofactorization and 0.018–0.050 for PCPS and PCC, so the PCC recovered the planted clade only two to three times more often than by chance even with the largest shift; with a shift of 0.5, mean recovery was 0.07–0.11 and did not exceed 0.30 in any condition (Appendix S2).</w:t>
       </w:r>
     </w:p>
     <w:p>
@@ -2609,51 +2609,31 @@
         <w:pStyle w:val="BodyText"/>
       </w:pPr>
       <w:r>
-        <w:t xml:space="preserve">Very negative γ reduced the power of the GLM on the first PCPS axis and of the PCC, whereas PERMANOVA was less sensitive to it. The eigenstructure of a phylogenetic matrix is set by the tree (Diniz-Filho et al., 1998), and in trees with long internal branches near the root a few deep splits probably dominate it, so the first PCPS axis and the leading eigenvectors of the PCC probably capture the deepest dichotomy even when the gradient sorts species along another one. This parallels the finding that a small number of phylogenetic eigenvectors may be insufficient to control phylogenetic autocorrelation in ecological analyses (Diniz-Filho et al., 2012). In addition, the RDA on the first two PCPS axes lost much less power with low γ, and the loss persisted when the optima had the same distribution in every tree, which agrees with this mechanism and shows that γ acts through the analysis rather than through the optima. However, the Mantel test, which also uses the whole matrix</w:t>
-      </w:r>
-      <w:r>
-        <w:t xml:space="preserve"> </w:t>
-      </w:r>
-      <m:oMath>
-        <m:sSub>
-          <m:e>
-            <m:r>
-              <m:t>D</m:t>
-            </m:r>
-          </m:e>
-          <m:sub>
-            <m:r>
-              <m:t>P</m:t>
-            </m:r>
-          </m:sub>
-        </m:sSub>
-      </m:oMath>
-      <w:r>
-        <w:t xml:space="preserve">, lost up to 0.23 (Appendix S2), and we did not record the eigenvalue spectra of each replicate, so we cannot confirm this mechanism with our data. Taken together, tests on single phylogenetic axes seem to be fragile when the tree has very negative γ.</w:t>
-      </w:r>
-    </w:p>
-    <w:p>
-      <w:pPr>
-        <w:pStyle w:val="BodyText"/>
-      </w:pPr>
-      <w:r>
-        <w:t xml:space="preserve">Phylogenetic signal in niche breadth inflated the type I error of only the second PCPS axis and the PCC. Previous evaluations could not detect this, because their simulations drew niche breadth independently of the phylogeny (Duarte et al., 2016, 2018; Peres-Neto et al., 2017). Permutation tests become liberal when the randomization breaks down a structure of the data that is unrelated to the null hypothesis (Hardy, 2008), and ignored species-level variation in the response to the environment inflates the type I error of site-based tests of trait–environment association (ter Braak et al., 2017). When σ is conserved, clades differ in how widely they spread along the gradient, and this pattern seems to load on the axis orthogonal to the basal contrast of the first PCPS axis, which would explain why its inflation was largest in trees with low γ and with 200 species, although the low level of γ was also more extreme at N = 200. Rotating the null axes by Procrustes removed this inflation but made the test conservative and less powerful (Appendix S2). Unfortunately, the empirical distribution of phylogenetic signal in niche breadth is unknown for most groups. Thus, the second PCPS axis and the PCC should be interpreted with caution when niche breadth may be phylogenetically conserved, and constrained randomizations that preserve phylogenetic structure (Braga et al., 2018) or model-based tests with phylogenetic random effects (Li &amp; Ives, 2017; Tsang &amp; Cadotte, 2025) seem to be promising alternatives.</w:t>
-      </w:r>
-    </w:p>
-    <w:p>
-      <w:pPr>
-        <w:pStyle w:val="BodyText"/>
-      </w:pPr>
-      <w:r>
-        <w:t xml:space="preserve">Mass effects reduced the power of every test except GLM PCPS2 and almost abolished that of the PCC. This is expected from source–sink theory, in which high dispersal homogenizes composition among sites (Mouquet &amp; Loreau, 2003), and it agrees with the low power of phylogenetic diversity indices under mass and priority effects even with strongly conserved traits (Mason &amp; Pavoine, 2013). In contrast, in spatially explicit landscapes mass effects let species dominate subregions instead of homogenizing the whole metacommunity (Thompson et al., 2020), and a spatially implicit resource-competition model failed to predict spatially explicit metacommunities at high dispersal (Ai &amp; Ellwood, 2022). Our uniform dispersal kernel therefore probably represents the most extreme case. Consequently, a non-significant test in a metacommunity with high dispersal does not seem to indicate the absence of environmental filtering on lineages, in line with the warning that the interpretation of community phylogenetic tests should account for dispersal (Kembel, 2009).</w:t>
-      </w:r>
-    </w:p>
-    <w:p>
-      <w:pPr>
-        <w:pStyle w:val="BodyText"/>
-      </w:pPr>
-      <w:r>
-        <w:t xml:space="preserve">Phylogenetic competition partly restored the power lost under mass effects for every test except the PCC, but it also changed the shape of the analysed tree. Competition pruned close relatives, so that the analysed tree had a more negative γ and a lower Colless index than the pool, especially under mass effects, and the effect of the process cannot be separated from that of the change in tree shape. Moreover, our competition kernel imposed the assumptions that trait similarity causes stronger competition and that competition causes exclusion, which are weakly supported as general rules (Gerhold et al., 2015). Accordingly, the competition–relatedness relationship was weak in vascular plants (Cahill et al., 2008), average fitness, but not stabilizing niche differences, showed phylogenetic structure in annual plants (Godoy et al., 2014), and competition can exclude distant relatives when fitness differences are phylogenetically conserved (Mayfield &amp; Levine, 2010). Therefore, this result should be read as an upper bound for a particular competition structure rather than as a general effect of competition.</w:t>
+        <w:t xml:space="preserve">Very negative γ reduced the power of the GLM on the first PCPS axis and of the PCC, whereas PERMANOVA was less sensitive to it. The eigenstructure of a phylogenetic matrix is set by the tree (Diniz-Filho et al., 1998), and in trees with long internal branches near the root a few deep splits probably dominate it, so the first PCPS axis and the leading eigenvectors of the PCC probably capture the deepest dichotomy even when the gradient sorts species along another one. This parallels the finding that a small number of phylogenetic eigenvectors may be insufficient to control phylogenetic autocorrelation in ecological analyses (Diniz-Filho et al., 2012). The RDA on the first two PCPS axes lost much less power, and the loss persisted when the optima had the same distribution in every tree, which agrees with this mechanism and indicates that γ acts through the analysis rather than through the optima. However, we did not record the eigenvalue spectra of each replicate, so we cannot confirm it. Taken together, tests on single phylogenetic axes seem to be fragile when the tree has very negative γ.</w:t>
+      </w:r>
+    </w:p>
+    <w:p>
+      <w:pPr>
+        <w:pStyle w:val="BodyText"/>
+      </w:pPr>
+      <w:r>
+        <w:t xml:space="preserve">Phylogenetic signal in niche breadth inflated the type I error of only the second PCPS axis and the PCC. Previous evaluations could not detect this, because their simulations drew niche breadth independently of the phylogeny (Duarte et al., 2016, 2018; Peres-Neto et al., 2017). Permutation tests become liberal when the randomization breaks down a structure of the data that is unrelated to the null hypothesis (Hardy, 2008), and ignored species-level variation in the response to the environment inflates the type I error of site-based tests of trait–environment association (ter Braak et al., 2017). When σ is conserved, clades differ in how widely they spread along the gradient, and this pattern seems to load on the axis orthogonal to the basal contrast of the first PCPS axis, which would explain why its inflation was largest in trees with low γ and with 200 species, although the low level of γ was also more extreme at N = 200. Rotating the null axes by Procrustes removed this inflation but made the test conservative and less powerful (Appendix S2). Thus, the second PCPS axis and the PCC should be interpreted with caution when niche breadth may be phylogenetically conserved, and constrained randomizations that preserve phylogenetic structure (Braga et al., 2018) or model-based tests with phylogenetic random effects (Li &amp; Ives, 2017; Tsang &amp; Cadotte, 2025) seem to be promising alternatives.</w:t>
+      </w:r>
+    </w:p>
+    <w:p>
+      <w:pPr>
+        <w:pStyle w:val="BodyText"/>
+      </w:pPr>
+      <w:r>
+        <w:t xml:space="preserve">Mass effects reduced the power of every test except GLM PCPS2 and almost abolished that of the PCC. This is expected from source–sink theory, in which high dispersal homogenizes composition among sites (Mouquet &amp; Loreau, 2003), and it agrees with the low power of phylogenetic diversity indices under mass and priority effects even with strongly conserved traits (Mason &amp; Pavoine, 2013). In spatially explicit landscapes, however, mass effects let species dominate subregions instead of homogenizing the whole metacommunity (Thompson et al., 2020), and spatially implicit models misrepresent spatially explicit metacommunities at high dispersal (Ai &amp; Ellwood, 2022). Accordingly, mass effects reduced power much less in our spatial version, so uniform dispersal is the most extreme case. The PCC kept almost no power with incidence data even then, but not with abundance data, which suggests that its failure comes from incidence data, in which widespread species occur almost everywhere. Consequently, a non-significant test in a metacommunity with high dispersal does not seem to indicate the absence of environmental filtering on lineages, in line with the warning that the interpretation of community phylogenetic tests should account for dispersal (Kembel, 2009).</w:t>
+      </w:r>
+    </w:p>
+    <w:p>
+      <w:pPr>
+        <w:pStyle w:val="BodyText"/>
+      </w:pPr>
+      <w:r>
+        <w:t xml:space="preserve">Phylogenetic competition partly restored the power lost under mass effects for every test except the PCC, but it also changed the shape of the analysed tree. Competition pruned close relatives, so that the analysed tree had a more negative γ and a lower Colless index than the pool, especially under mass effects, and the effect of the process cannot be separated from that of the change in tree shape. Moreover, our competition kernel imposed the assumptions that trait similarity causes stronger competition and that competition causes exclusion, which are weakly supported as general rules (Gerhold et al., 2015). Indeed, competition was weakly related to relatedness in vascular plants (Cahill et al., 2008), only fitness differences showed phylogenetic structure in annual plants (Godoy et al., 2014), and competition can exclude distant relatives when fitness differences are conserved (Mayfield &amp; Levine, 2010). Therefore, this result should be read as an upper bound for a particular competition structure rather than as a general effect of competition.</w:t>
       </w:r>
     </w:p>
     <w:p>
@@ -2685,7 +2665,7 @@
         <w:pStyle w:val="BodyText"/>
       </w:pPr>
       <w:r>
-        <w:t xml:space="preserve">Our study also has limitations. First, the grid had no level with γ &gt; 0. Second, the process-based simulations had no spatial structure and used only incidence data and five cells of the grid. Third, we did not vary the number of sites or the length of the gradient, which also change power. Fourth, the ages of basal and recent clades also depend on γ, although older clades were recovered more often within each level of γ and depth class. Finally, the case study had 13–40 ponds and no significant association, so it illustrates how the methods behave with real data rather than validating them. To the best of our knowledge, and based on searches of the literature, this is the first simulation study to evaluate tests on phylogeny-weighted composition across controlled gradients of tree shape and under process-based metacommunity assembly. In summary, we recommend that empirical studies (i) report γ and the normalized Colless index of the analysed tree; (ii) not rely on a single test, and prefer PERMANOVA or the RDA on the first two PCPS axes, with the max test, to tests on single PCPS axes or phylogenetic eigenvectors when the tree has very negative γ and the pool has 100 or more species; (iii) interpret the second PCPS axis and the PCC with caution when niche breadth may be phylogenetically conserved; (iv) interpret a lack of power under high dispersal as a property of the metacommunity rather than as evidence against niche-based assembly; and (v) use evoPCA or phylofactorization, rather than PCPS axes, to identify the clades associated with a gradient.</w:t>
+        <w:t xml:space="preserve">Our study also has limitations, since (i) the grid had no level with γ &gt; 0; (ii) the spatial version covered only N = 100, with an approximate redistribution of dispersers; (iii) we did not vary the number of sites or the length of the gradient; and (iv) the case study, with 13–40 ponds and no significant association, illustrates rather than validates the methods. To the best of our knowledge, and based on searches of the literature, this is the first simulation study to evaluate tests on phylogeny-weighted composition across controlled gradients of tree shape and under process-based metacommunity assembly. In summary, we recommend that empirical studies (i) report γ and the normalized Colless index of the analysed tree; (ii) not rely on a single test, and prefer PERMANOVA or the RDA on the first two PCPS axes, with the max test, to tests on single axes or eigenvectors when γ is very negative; (iii) interpret the second PCPS axis and the PCC with caution when niche breadth may be phylogenetically conserved; (iv) not read a lack of power under high dispersal as evidence against niche-based assembly, and use abundance data with the PCC; and (v) use evoPCA or phylofactorization, rather than PCPS axes, to identify the clades associated with a gradient.</w:t>
       </w:r>
     </w:p>
     <w:bookmarkEnd w:id="55"/>

</xml_diff>

<commit_message>
DOI de conceito do depósito anônimo; script do preprint (docx único, não anonimizado, fora do git)
Co-Authored-By: Claude Opus 5.5 <noreply@anthropic.com>
</commit_message>
<xml_diff>
--- a/manuscript/methods_results.docx
+++ b/manuscript/methods_results.docx
@@ -84,7 +84,7 @@
         <w:pStyle w:val="FirstParagraph"/>
       </w:pPr>
       <w:r>
-        <w:t xml:space="preserve">Data and code availability for review: the code, the rates aggregated by condition and the scripts that reproduce every table and figure are available in an anonymized archive for review (https://doi.org/10.5281/zenodo.23500661); the public repository and its Zenodo archive will be cited after review.</w:t>
+        <w:t xml:space="preserve">Data and code availability for review: the code, the rates aggregated by condition and the scripts that reproduce every table and figure are available in an anonymized archive for review (https://doi.org/10.5281/zenodo.23500660); the public repository and its Zenodo archive will be cited after review.</w:t>
       </w:r>
     </w:p>
     <w:p>
@@ -2127,7 +2127,7 @@
         <w:pStyle w:val="FirstParagraph"/>
       </w:pPr>
       <w:r>
-        <w:t xml:space="preserve">We ran all analyses in R v. 4.6.1 (R Core Team, 2026), with the versions of every package recorded in the lockfile of renv v. 1.3.1 (Ushey &amp; Wickham, 2026); trees were handled with ape v. 5.8-1 (Paradis &amp; Schliep, 2019). The simulation pipeline, its computing environment and its seeds are described in Appendix S1. Code is available in an anonymized archive for review (https://doi.org/10.5281/zenodo.23500661), together with the rates aggregated by condition and the scripts that compute the performance measures and the models from them, which reproduce every table and figure without rerunning the simulations.</w:t>
+        <w:t xml:space="preserve">We ran all analyses in R v. 4.6.1 (R Core Team, 2026), with the versions of every package recorded in the lockfile of renv v. 1.3.1 (Ushey &amp; Wickham, 2026); trees were handled with ape v. 5.8-1 (Paradis &amp; Schliep, 2019). The simulation pipeline, its computing environment and its seeds are described in Appendix S1. Code is available in an anonymized archive for review (https://doi.org/10.5281/zenodo.23500660), together with the rates aggregated by condition and the scripts that compute the performance measures and the models from them, which reproduce every table and figure without rerunning the simulations.</w:t>
       </w:r>
     </w:p>
     <w:bookmarkEnd w:id="36"/>

</xml_diff>

<commit_message>
Correções da revisão de exatidão: alcance das conclusões (dispersão uniforme, PCC com abundância, γ pela análise), atribuições, arredondamentos, DOIs
Co-Authored-By: Claude Opus 5.5 <noreply@anthropic.com>
</commit_message>
<xml_diff>
--- a/manuscript/methods_results.docx
+++ b/manuscript/methods_results.docx
@@ -43,7 +43,7 @@
         </w:numPr>
       </w:pPr>
       <w:r>
-        <w:t xml:space="preserve">Tests relating the phylogenetic structure of metacommunities to environmental gradients, such as the principal coordinates of phylogenetic structure (PCPS) and the phylogenetic community composition approach (PCC), were validated with static simulations, on trees close to Yule and with niche breadth independent of the phylogeny. However, real phylogenies vary in imbalance and branching times, and dispersal and competition assemble metacommunities, so their published performance may not hold for empirical data.</w:t>
+        <w:t xml:space="preserve">Tests relating the phylogenetic structure of metacommunities to environmental gradients, such as the principal coordinates of phylogenetic structure (PCPS) and the phylogenetic community composition approach (PCC), were validated with static simulations on trees close to Yule. However, real phylogenies vary in imbalance and branching times, and dispersal and competition assemble metacommunities.</w:t>
       </w:r>
     </w:p>
     <w:p>
@@ -54,7 +54,7 @@
         </w:numPr>
       </w:pPr>
       <w:r>
-        <w:t xml:space="preserve">We simulated metacommunities on a grid of tree shapes that crossed the distribution of branching times (γ) with topological imbalance (Colless index), with levels from anuran clades, in static simulations reproducing the original validations and process-based simulations with species sorting, mass effects and phylogenetic competition. We modelled the type I error and power of six tests, and clade recovery by four ordination and factorization methods, with beta-binomial models.</w:t>
+        <w:t xml:space="preserve">We simulated metacommunities on a grid of tree shapes that crossed the distribution of branching times (γ) with topological imbalance (Colless index), with levels from anuran clades, in static simulations reproducing the original validations and process-based simulations with species sorting, mass effects and phylogenetic competition. We modelled the type I error and power of six tests, and clade recovery by four methods, with beta-binomial models.</w:t>
       </w:r>
     </w:p>
     <w:p>
@@ -65,7 +65,7 @@
         </w:numPr>
       </w:pPr>
       <w:r>
-        <w:t xml:space="preserve">Tree imbalance did not affect the type I error of any test. Phylogenetic signal in niche breadth inflated the type I error of the linear model on the second PCPS axis, up to 0.36 with low γ and 200 species, and of the PCC, up to 0.22. With 100 species, low γ reduced the power of the linear model on the first PCPS axis by 0.40 and that of the PCC by 0.25, whereas PERMANOVA was less sensitive to tree shape. Mass effects reduced the power of every test except the second PCPS axis, by 0.55–0.93 in Yule trees, and almost abolished that of the PCC. With the largest shift, evoPCA and phylofactorization recovered a planted clade in 0.44–0.88 of the replicates on average, regardless of γ, whereas PCPS depended strongly on γ and PCC rarely found the clade.</w:t>
+        <w:t xml:space="preserve">Tree imbalance did not affect the type I error of any test. Phylogenetic signal in niche breadth inflated the type I error of the linear model on the second PCPS axis, up to 0.36 with low γ and 200 species, and of the PCC, up to 0.22. With 100 species, low γ reduced the power of the linear model on the first PCPS axis by 0.40 and that of the PCC by 0.25, whereas PERMANOVA was less sensitive to tree shape. With uniform dispersal, mass effects reduced the power of every test except the second PCPS axis by 0.55–0.93 and almost abolished that of the PCC; with distance-limited dispersal the losses were smaller, and the PCC kept its power with abundance data. With the largest shift, evoPCA and phylofactorization recovered a planted clade in 0.44–0.88 of the replicates on average, regardless of γ, whereas PCPS depended strongly on γ and PCC rarely found the clade.</w:t>
       </w:r>
     </w:p>
     <w:p>
@@ -76,7 +76,7 @@
         </w:numPr>
       </w:pPr>
       <w:r>
-        <w:t xml:space="preserve">Performance seems to depend on branching times and on the assembly process rather than on tree imbalance. Three regional anuran pools fell at moderate levels of the simulated grid. We recommend reporting γ of the analysed tree, not relying on a single test, interpreting the second PCPS axis and the PCC with caution when niche breadth may be phylogenetically conserved, and using evoPCA or phylofactorization to identify the clades associated with a gradient.</w:t>
+        <w:t xml:space="preserve">Performance seems to depend on branching times and on the assembly process rather than on tree imbalance, and three regional anuran pools fell at moderate levels of the grid. We recommend reporting γ of the analysed tree, not relying on a single test, interpreting the second PCPS axis and the PCC with caution when niche breadth may be conserved, considering abundance data for the PCC, and using evoPCA or phylofactorization to identify clades associated with a gradient.</w:t>
       </w:r>
     </w:p>
     <w:p>
@@ -140,7 +140,7 @@
         <w:pStyle w:val="BodyText"/>
       </w:pPr>
       <w:r>
-        <w:t xml:space="preserve">First, the topology of real trees departs from the Yule model (Heard, 1992; Blum &amp; François, 2006), and a slowdown in diversification towards the present, that is, a negative γ statistic (Pybus &amp; Harvey, 2000), was found in most clades of a large compilation of phylogenies (McPeek, 2008) and in many clades of birds (Phillimore &amp; Price, 2008). Anurans are a likely case, since most living frogs descend from a few lineages that radiated rapidly in the late Cretaceous and early Paleogene (Roelants et al., 2007; Feng et al., 2017). These macroevolutionary processes, such as differences in diversification rate among lineages, also shape the phylogenetic structure of the species pools from which local communities are assembled, and through them that of the communities themselves (Gerhold et al., 2018). The size and topology of the tree change the expected values of phylogenetic signal indices (Münkemüller et al., 2012), the distribution of branch lengths changes whether community metrics, which weight different phylogenetic depths, detect clustering (Mazel et al., 2016), and topology sets the eigenstructure of phylogenetic matrices (Diniz-Filho et al., 1998), which is what PCPS and the PCC summarize. Nonetheless, to our knowledge, no study has evaluated how the distribution of branching times and the imbalance of the tree affect tests on phylogeny-weighted composition. Second, species are not sorted along gradients in isolation. In metacommunities, dispersal and competition interact with environmental filtering (Leibold et al., 2004), and high dispersal homogenizes composition among sites (Mouquet &amp; Loreau, 2003). Dispersal can alter the outcome of community phylogenetic tests (Kembel, 2009; Mason &amp; Pavoine, 2013), and inferring assembly from diversity patterns requires accounting for these processes (Münkemüller et al., 2020). Process-based models now generate species sorting, mass effects and competition from local population dynamics and dispersal (Thompson et al., 2020), which allows these methods to be evaluated under the processes they are meant to detect.</w:t>
+        <w:t xml:space="preserve">First, the topology of real trees departs from the Yule model (Heard, 1992; Blum &amp; François, 2006), and a slowdown in diversification towards the present, that is, a negative γ statistic (Pybus &amp; Harvey, 2000), was found in most clades of a large compilation of phylogenies (McPeek, 2008) and in many clades of birds (Phillimore &amp; Price, 2008). Anurans are a likely case, since most living frogs descend from a few lineages that radiated rapidly in the late Cretaceous and early Paleogene (Roelants et al., 2007; Feng et al., 2017). These macroevolutionary processes, such as differences in diversification rate among lineages, also shape the phylogenetic structure of the species pools from which local communities are assembled, and through them that of the communities themselves (Gerhold et al., 2018). The size and topology of the tree change the expected values of phylogenetic signal indices (Münkemüller et al., 2012), the distribution of branch lengths changes whether community metrics, which weight different phylogenetic depths, detect clustering (Mazel et al., 2016), and topology determines how many phylogenetic eigenvectors are retained (Diniz-Filho et al., 1998), which are what PCPS and the PCC summarize. Nonetheless, to our knowledge, no study has evaluated how the distribution of branching times and the imbalance of the tree affect tests on phylogeny-weighted composition. Second, species are not sorted along gradients in isolation. In metacommunities, dispersal and competition interact with environmental filtering (Leibold et al., 2004), and high dispersal homogenizes composition among sites (Mouquet &amp; Loreau, 2003). Dispersal can alter the outcome of community phylogenetic tests (Kembel, 2009; Mason &amp; Pavoine, 2013), and inferring assembly from diversity patterns requires accounting for these processes (Münkemüller et al., 2020). Process-based models now generate species sorting, mass effects and competition from local population dynamics and dispersal (Thompson et al., 2020), which allows these methods to be evaluated under the processes they are meant to detect.</w:t>
       </w:r>
     </w:p>
     <w:p>
@@ -211,7 +211,7 @@
         </w:r>
       </w:hyperlink>
       <w:r>
-        <w:t xml:space="preserve">). The static simulations follow the protocol of Peres-Neto, Leibold and Dray (2012), which was also used to validate the tests we evaluated, so our results can be compared directly with the published ones. The process-based simulations reproduce metacommunity dynamics with the framework of Thompson et al. (2020), in which species sorting, mass effects and competition emerge from local population dynamics and dispersal. In both, the trees came from a grid of shapes that crosses the distribution of branching times with the imbalance of the topology. The study was not registered. However, we wrote the design and the hypotheses down before the main runs, in a planning document first committed to the code repository on 16 October 2026, and we report the departures from that plan in Appendix S1.</w:t>
+        <w:t xml:space="preserve">). The static simulations follow the protocol of Peres-Neto et al. (2012), which was also used to validate the tests we evaluated, so our results can be compared directly with the published ones. The process-based simulations reproduce metacommunity dynamics with the framework of Thompson et al. (2020), in which species sorting, mass effects and competition emerge from local population dynamics and dispersal. The study was not registered. However, we wrote the design and the hypotheses down before the main runs, in a planning document first committed to the code repository on 16 October 2026, and we report the departures from that plan in Appendix S1.</w:t>
       </w:r>
     </w:p>
     <w:tbl>
@@ -1939,7 +1939,7 @@
         <w:t xml:space="preserve"> </w:t>
       </w:r>
       <w:r>
-        <w:t xml:space="preserve">among the first four, and for phylofactorization the objective of the algorithm (Appendix S1). A method recovered the clade when its best-scoring clade was the planted one or its complement. We also recorded the rank of the planted node among all nodes and the Jaccard similarity between the best-scoring and the planted clades, which give partial credit to nested or slightly larger clades.</w:t>
+        <w:t xml:space="preserve">among the first four, and for phylofactorization the objective of the algorithm (Appendix S1). A method recovered the clade when its best-scoring clade was the planted one or its complement. We also recorded the rank of the planted node among all nodes and the Jaccard similarity between the best-scoring and the planted clades.</w:t>
       </w:r>
     </w:p>
     <w:bookmarkEnd w:id="33"/>
@@ -2164,7 +2164,7 @@
         <w:t xml:space="preserve"> </w:t>
       </w:r>
       <w:r>
-        <w:t xml:space="preserve">≤ 1.01, no divergent transitions), and their posterior predictive intervals covered the observed rates (Appendix S2, Table S3). The predicted rates were insensitive to the priors and to the lack of fit of the fixed structure (Appendix S2).</w:t>
+        <w:t xml:space="preserve">≤ 1.01, no divergent transitions), and their posterior predictive intervals covered the observed rates (Appendix S2, Table S3). The predicted rates were largely insensitive to the priors and to the lack of fit of the fixed structure (Appendix S2).</w:t>
       </w:r>
     </w:p>
     <w:p>
@@ -2183,7 +2183,7 @@
         </w:r>
       </w:hyperlink>
       <w:r>
-        <w:t xml:space="preserve">). In all 75 combinations of test, null scenario and N, the difference in the distance of the type I error from the nominal level between highly imbalanced and Yule trees was within ±0.012, and no 95% CI excluded zero, with incidence or abundance data. The posterior probability of a change smaller than 0.025 exceeded 0.95 in 297 of 300 conditions, and the taxa shuffle alone was not affected either (Appendix S2). Therefore, H1 was not supported at the resolution of our design, although we did not test the medium level of imbalance separately from the high one.</w:t>
+        <w:t xml:space="preserve">). In all 75 combinations of test, null scenario and N, the difference in the distance of the type I error from the nominal level between highly imbalanced and Yule trees was within ±0.012, and no 95% CI excluded zero, with incidence or abundance data. The posterior probability of a change smaller than 0.025 exceeded 0.95 in 297 of 300 conditions, and the taxa shuffle alone was not affected either (Appendix S2). Therefore, H1 was not supported at the resolution of our design.</w:t>
       </w:r>
     </w:p>
     <w:p>
@@ -2202,7 +2202,7 @@
         </w:r>
       </w:hyperlink>
       <w:r>
-        <w:t xml:space="preserve">). Compared with the same scenario without signal (S2), signal in σ (S2σ) increased the rejection rate of GLM PCPS2 by 0.02 (95% CI 0.01–0.03) in Yule trees at N = 100, and by 0.05 (0.04–0.06), 0.10 (0.08–0.12) and 0.21 (0.19–0.23) with low γ at N = 50, 100 and 200, with raw rates of up to 0.36. The PCC was inflated by 0.05 (0.03–0.06) in Yule trees and by 0.02 (0.01–0.03) with low γ at N = 100, with raw rates of up to 0.22. In contrast, PERMANOVA, GLM PCPS1 and the Mantel test became more conservative under signal in σ (by 0.005–0.030), and signal in maximum abundance (S2h) did not change the rejection rate of any test. The RDA PCPS was not inflated (0.004–0.021 in S2σ) and lost much less power with low γ than GLM PCPS1 (posterior medians 0.65 against 0.76 at N = 100 in S3b), whereas rotating the null axes by Procrustes removed the inflation of GLM PCPS2 but made it conservative (Appendix S2). As a result, H2 was rejected as stated.</w:t>
+        <w:t xml:space="preserve">). Compared with the same scenario without signal (S2), signal in σ (S2σ) increased the rejection rate of GLM PCPS2 by 0.02 (95% CI 0.01–0.03) in Yule trees at N = 100, and by 0.05 (0.04–0.06), 0.10 (0.08–0.12) and 0.21 (0.19–0.23) with low γ at N = 50, 100 and 200, with raw rates of up to 0.36. The PCC was inflated by 0.05 (0.03–0.06) in Yule trees and by 0.02 (0.01–0.03) with low γ at N = 100, with raw rates of up to 0.22. In contrast, PERMANOVA, GLM PCPS1 and the Mantel test became more conservative under signal in σ (by 0.005–0.030), and signal in maximum abundance (S2h) did not change the rejection rate of any test. The RDA PCPS was not inflated (0.004–0.021 in S2σ) and lost much less power with low γ than GLM PCPS1 (posterior medians 0.65 with low γ against 0.76 in Yule trees, against 0.34 and 0.74 for GLM PCPS1, at N = 100 in S3b), whereas rotating the null axes by Procrustes removed the inflation of GLM PCPS2 but made it conservative (Appendix S2). As a result, H2 was rejected as stated.</w:t>
       </w:r>
     </w:p>
     <w:tbl>
@@ -2300,7 +2300,7 @@
         </w:r>
       </w:hyperlink>
       <w:r>
-        <w:t xml:space="preserve">). At N = 100 in S3b, low γ reduced the power of GLM PCPS1 from 0.74 to 0.34 (contrast −0.40, 95% CI −0.45 to −0.34) and that of the PCC from 0.98 to 0.73 (−0.25, −0.30 to −0.21), whereas the power of PERMANOVA did not change (0.01, −0.02 to 0.05), and high imbalance reduced power by at most 0.09. Consequently, the ranking of the tests changed with tree shape, since in S3b the PCC was the most powerful test in Yule trees and the third with low γ. Thus, H4 was supported for power. With the optima given the same distribution in every tree, low γ still reduced the power of GLM PCPS1 (from 0.77 to 0.24) and of the PCC (from 0.99 to 0.80), and not that of PERMANOVA (raw rates at N = 100 in S3b; Appendix S2).</w:t>
+        <w:t xml:space="preserve">). At N = 100 in S3b, low γ reduced the power of GLM PCPS1 from 0.74 to 0.34 (contrast −0.40, 95% CI −0.45 to −0.34) and that of the PCC from 0.98 to 0.73 (−0.25, −0.30 to −0.21), whereas the power of PERMANOVA did not change (0.01, −0.02 to 0.05), and high imbalance reduced power by at most 0.09. Consequently, the ranking of the tests changed with tree shape, since in S3b the PCC was the most powerful test in Yule trees and the third with low γ. Thus, H4 was supported for power. With the optima given the same distribution in every tree, low γ still reduced the power of GLM PCPS1 (from 0.77 to 0.25) and of the PCC (from 0.99 to 0.80), and not that of PERMANOVA (raw rates at N = 100 in S3b; Appendix S2).</w:t>
       </w:r>
     </w:p>
     <w:tbl>
@@ -2398,7 +2398,7 @@
         </w:r>
       </w:hyperlink>
       <w:r>
-        <w:t xml:space="preserve">). Mass effects reduced the power of every test except GLM PCPS2, by 0.55 (GLM PCPS1) to 0.93 (PCC; 95% CI 0.92–0.94) in Yule pool trees, so that the PCC detected the phylogenetic signal in almost no replicates. Surprisingly, adding phylogenetic competition to mass effects partly restored the power of every test except the PCC; for instance, PERMANOVA lost 0.46 (0.42–0.50) instead of 0.62 (0.58–0.65). However, competition pruned close relatives, which made the γ of the analysed tree more negative and its Colless index lower than those of the pool, especially under mass effects (Appendix S2). Under the null hypothesis, no lower CI bound exceeded 0.075 at N = 100, but raw rates of GLM PCPS2 in S2σ and of the PCC in S2h did at N = 200 (Appendix S2). With spatial structure, mass effects reduced power much less (PERMANOVA 0.54 against 0.29 in Yule pool trees), except for the PCC with incidence data (0.02; 0.98 with abundance data), and low γ had the same effect as without it (Appendix S2).</w:t>
+        <w:t xml:space="preserve">). Mass effects reduced the power of every test except GLM PCPS2, by 0.55 (GLM PCPS1) to 0.93 (PCC; 95% CI 0.92–0.94) in Yule pool trees, so that the PCC detected the phylogenetic signal in almost no replicates. Surprisingly, adding phylogenetic competition to mass effects partly restored the power of every test except the PCC; for instance, PERMANOVA lost 0.46 (0.42–0.50) instead of 0.62 (0.58–0.65). However, competition pruned close relatives, which made the γ of the analysed tree more negative and its Colless index lower than those of the pool, especially under mass effects (Appendix S2). Under the null hypothesis, no lower CI bound exceeded 0.075 at N = 100, but raw rates of GLM PCPS2 in S2σ and of the PCC in S2h did at N = 100 and 200 (Appendix S2). With spatial structure, more power was retained under mass effects (PERMANOVA 0.54 against 0.29 in Yule pool trees), except for the PCC with incidence data (0.02; 0.98 with abundance data), and low γ had the same effect as without it (Appendix S2).</w:t>
       </w:r>
     </w:p>
     <w:tbl>
@@ -2496,7 +2496,7 @@
         </w:r>
       </w:hyperlink>
       <w:r>
-        <w:t xml:space="preserve">). With a shift of 2 and incidence data, and averaged over the cells of the grid, evoPCA and phylofactorization identified the planted node in 0.44–0.88 of the replicates, depending on N and depth, PCPS in 0.12–0.42 (0.02–0.71 in single cells) and PCC in only 0.08–0.12, and ranks and Jaccard similarities agreed with this ranking (Appendix S2). Without a planted effect, recovery was 0.003–0.021 for evoPCA and phylofactorization and 0.018–0.050 for PCPS and PCC, so the PCC recovered the planted clade only two to three times more often than by chance even with the largest shift; with a shift of 0.5, mean recovery was 0.07–0.11 and did not exceed 0.30 in any condition (Appendix S2).</w:t>
+        <w:t xml:space="preserve">). With a shift of 2 and incidence data, and averaged over the cells of the grid, evoPCA and phylofactorization identified the planted node in 0.44–0.88 of the replicates, depending on N and depth, PCPS in 0.12–0.42 (0.02–0.71 in single cells) and PCC in only 0.08–0.12, and ranks and Jaccard similarities agreed with this ranking (Appendix S2). Without a planted effect, recovery was 0.003–0.021 for evoPCA and phylofactorization and 0.018–0.050 for PCPS and PCC, so the PCC recovered the planted clade only about two to three times more often than by chance even with the largest shift; with a shift of 0.5, mean recovery was 0.07–0.11 and did not exceed 0.30 in any condition (Appendix S2).</w:t>
       </w:r>
     </w:p>
     <w:p>
@@ -2609,7 +2609,7 @@
         <w:pStyle w:val="BodyText"/>
       </w:pPr>
       <w:r>
-        <w:t xml:space="preserve">Very negative γ reduced the power of the GLM on the first PCPS axis and of the PCC, whereas PERMANOVA was less sensitive to it. The eigenstructure of a phylogenetic matrix is set by the tree (Diniz-Filho et al., 1998), and in trees with long internal branches near the root a few deep splits probably dominate it, so the first PCPS axis and the leading eigenvectors of the PCC probably capture the deepest dichotomy even when the gradient sorts species along another one. This parallels the finding that a small number of phylogenetic eigenvectors may be insufficient to control phylogenetic autocorrelation in ecological analyses (Diniz-Filho et al., 2012). The RDA on the first two PCPS axes lost much less power, and the loss persisted when the optima had the same distribution in every tree, which agrees with this mechanism and indicates that γ acts through the analysis rather than through the optima. However, we did not record the eigenvalue spectra of each replicate, so we cannot confirm it. Taken together, tests on single phylogenetic axes seem to be fragile when the tree has very negative γ.</w:t>
+        <w:t xml:space="preserve">Very negative γ reduced the power of the GLM on the first PCPS axis and of the PCC, whereas PERMANOVA was less sensitive to it. The topology of the tree determines how many phylogenetic eigenvectors are needed to describe it (Diniz-Filho et al., 1998), and in trees with long internal branches near the root a few deep splits probably dominate the leading eigenvectors, so the first PCPS axis and the eigenvectors of the PCC may capture the deepest dichotomy even when the gradient sorts species along another one, although the share of variation on the first PCPS axis decreased rather than increased with low γ (Appendix S2). This parallels the finding that a small number of phylogenetic eigenvectors may be insufficient to control phylogenetic autocorrelation in ecological analyses (Diniz-Filho et al., 2012). The RDA on the first two PCPS axes lost much less power, and the loss persisted when the optima had the same distribution in every tree, which agrees with this mechanism and suggests that γ acts mainly through the analysis rather than through the marginal distribution of the optima. However, we did not record the eigenvalue spectra of each replicate, so we cannot confirm it. Taken together, tests on single phylogenetic axes seem to be fragile when the tree has very negative γ.</w:t>
       </w:r>
     </w:p>
     <w:p>
@@ -2625,23 +2625,23 @@
         <w:pStyle w:val="BodyText"/>
       </w:pPr>
       <w:r>
-        <w:t xml:space="preserve">Mass effects reduced the power of every test except GLM PCPS2 and almost abolished that of the PCC. This is expected from source–sink theory, in which high dispersal homogenizes composition among sites (Mouquet &amp; Loreau, 2003), and it agrees with the low power of phylogenetic diversity indices under mass and priority effects even with strongly conserved traits (Mason &amp; Pavoine, 2013). In spatially explicit landscapes, however, mass effects let species dominate subregions instead of homogenizing the whole metacommunity (Thompson et al., 2020), and spatially implicit models misrepresent spatially explicit metacommunities at high dispersal (Ai &amp; Ellwood, 2022). Accordingly, mass effects reduced power much less in our spatial version, so uniform dispersal is the most extreme case. The PCC kept almost no power with incidence data even then, but not with abundance data, which suggests that its failure comes from incidence data, in which widespread species occur almost everywhere. Consequently, a non-significant test in a metacommunity with high dispersal does not seem to indicate the absence of environmental filtering on lineages, in line with the warning that the interpretation of community phylogenetic tests should account for dispersal (Kembel, 2009).</w:t>
-      </w:r>
-    </w:p>
-    <w:p>
-      <w:pPr>
-        <w:pStyle w:val="BodyText"/>
-      </w:pPr>
-      <w:r>
-        <w:t xml:space="preserve">Phylogenetic competition partly restored the power lost under mass effects for every test except the PCC, but it also changed the shape of the analysed tree. Competition pruned close relatives, so that the analysed tree had a more negative γ and a lower Colless index than the pool, especially under mass effects, and the effect of the process cannot be separated from that of the change in tree shape. Moreover, our competition kernel imposed the assumptions that trait similarity causes stronger competition and that competition causes exclusion, which are weakly supported as general rules (Gerhold et al., 2015). Indeed, competition was weakly related to relatedness in vascular plants (Cahill et al., 2008), only fitness differences showed phylogenetic structure in annual plants (Godoy et al., 2014), and competition can exclude distant relatives when fitness differences are conserved (Mayfield &amp; Levine, 2010). Therefore, this result should be read as an upper bound for a particular competition structure rather than as a general effect of competition.</w:t>
-      </w:r>
-    </w:p>
-    <w:p>
-      <w:pPr>
-        <w:pStyle w:val="BodyText"/>
-      </w:pPr>
-      <w:r>
-        <w:t xml:space="preserve">The evoPCA and phylofactorization recovered the planted clade far more often than PCPS and PCC, and independently of γ. Phylofactorization evaluates every edge of the tree (Washburne et al., 2017, 2019) and evoPCA treats every branch as a variable whose abundances enter the ordination (Pavoine, 2016), so the stem branch of the planted clade is always a candidate, whatever the distribution of node depths. In contrast, the PCC tests a global association between phylogenetic eigenvectors, composition and environment (Peres-Neto &amp; Kembel, 2015), and its leading eigenvectors rarely isolated the clade of interest. Node-based analyses of species distributions (Borregaard et al., 2014) follow a similar node-by-node logic and could be added to future comparisons. Thus, branch-wise methods seem to be the appropriate choice to identify which clades respond to a gradient.</w:t>
+        <w:t xml:space="preserve">With uniform dispersal, mass effects reduced the power of every test except GLM PCPS2 and almost abolished that of the PCC. This is expected from source–sink theory, in which high dispersal homogenizes composition among sites (Mouquet &amp; Loreau, 2003), and it agrees with the low power of phylogenetic diversity indices under mass and priority effects even with strongly conserved traits (Mason &amp; Pavoine, 2013). In spatially explicit landscapes, however, mass effects let species dominate subregions instead of homogenizing the whole metacommunity in the model of Thompson et al. (2020), and a spatially implicit model failed to predict spatially explicit metacommunities at high dispersal (Ai &amp; Ellwood, 2022). Accordingly, more power was retained under mass effects in our spatial version, which suggests that uniform dispersal is a severe case. The PCC kept almost no power with incidence data even then, but not with abundance data, which suggests that its failure is tied to incidence data, in which widespread species occur almost everywhere. Consequently, a non-significant test in a metacommunity with high dispersal does not seem to indicate the absence of environmental filtering on lineages, in line with the warning that the interpretation of community phylogenetic tests should account for dispersal (Kembel, 2009).</w:t>
+      </w:r>
+    </w:p>
+    <w:p>
+      <w:pPr>
+        <w:pStyle w:val="BodyText"/>
+      </w:pPr>
+      <w:r>
+        <w:t xml:space="preserve">Phylogenetic competition partly restored the power lost under mass effects for every test except the PCC, but it also changed the shape of the analysed tree. Competition pruned close relatives, so that the analysed tree had a more negative γ and a lower Colless index than the pool, especially under mass effects, and the effect of the process cannot be separated from that of the change in tree shape. Moreover, our competition kernel imposed the assumptions that trait similarity causes stronger competition and that competition causes exclusion, which are weakly supported as general rules (Gerhold et al., 2015). Indeed, competition was weakly related to relatedness in vascular plants (Cahill et al., 2008), average fitness differences, but not stabilising niche differences, showed phylogenetic structure in 18 annual plants (Godoy et al., 2014), and competition can sometimes exclude less related taxa even when traits are conserved (Mayfield &amp; Levine, 2010). Therefore, this result should be read as an upper bound for a particular competition structure rather than as a general effect of competition.</w:t>
+      </w:r>
+    </w:p>
+    <w:p>
+      <w:pPr>
+        <w:pStyle w:val="BodyText"/>
+      </w:pPr>
+      <w:r>
+        <w:t xml:space="preserve">The evoPCA and phylofactorization recovered the planted clade far more often than PCPS and PCC, and independently of γ. Phylofactorization evaluates every edge of the tree (Washburne et al., 2017, 2019) and evoPCA treats every branch as a variable whose abundances enter the ordination (Pavoine, 2016), so the stem branch of the planted clade is always a candidate, whatever the distribution of node depths. In contrast, the PCC tests a global association between phylogenetic eigenvectors, composition and environment (Peres-Neto &amp; Kembel, 2015), and its leading eigenvectors rarely isolated the clade of interest. Thus, branch-wise methods seem to be the appropriate choice to identify which clades respond to a gradient.</w:t>
       </w:r>
     </w:p>
     <w:p>
@@ -2665,17 +2665,17 @@
         <w:pStyle w:val="BodyText"/>
       </w:pPr>
       <w:r>
-        <w:t xml:space="preserve">Our study also has limitations, since (i) the grid had no level with γ &gt; 0; (ii) the spatial version covered only N = 100, with an approximate redistribution of dispersers; (iii) we did not vary the number of sites or the length of the gradient; and (iv) the case study, with 13–40 ponds and no significant association, illustrates rather than validates the methods. To the best of our knowledge, and based on searches of the literature, this is the first simulation study to evaluate tests on phylogeny-weighted composition across controlled gradients of tree shape and under process-based metacommunity assembly. In summary, we recommend that empirical studies (i) report γ and the normalized Colless index of the analysed tree; (ii) not rely on a single test, and prefer PERMANOVA or the RDA on the first two PCPS axes, with the max test, to tests on single axes or eigenvectors when γ is very negative; (iii) interpret the second PCPS axis and the PCC with caution when niche breadth may be phylogenetically conserved; (iv) not read a lack of power under high dispersal as evidence against niche-based assembly, and use abundance data with the PCC; and (v) use evoPCA or phylofactorization, rather than PCPS axes, to identify the clades associated with a gradient.</w:t>
+        <w:t xml:space="preserve">Our study also has limitations, since (i) the grid had no level with γ &gt; 0; (ii) the spatial version covered only N = 100, with an approximate redistribution of dispersers; (iii) we did not vary the number of sites or the length of the gradient; and (iv) the case study, with 13–40 ponds and no significant association, illustrates rather than validates the methods. To the best of our knowledge, and based on searches of the literature, this is the first simulation study to evaluate tests on phylogeny-weighted composition across controlled gradients of tree shape and under process-based metacommunity assembly. In summary, we recommend that empirical studies (i) report γ and the normalized Colless index of the analysed tree; (ii) not rely on a single test, and prefer PERMANOVA or the RDA on the first two PCPS axes, with the max test, to tests on single axes or eigenvectors when γ is very negative; (iii) interpret the second PCPS axis and the PCC with caution when niche breadth may be phylogenetically conserved; (iv) not read a lack of power under high dispersal as evidence against niche-based assembly, and consider abundance data for the PCC; and (v) use evoPCA or phylofactorization, rather than PCPS axes, to identify the clades associated with a gradient.</w:t>
       </w:r>
     </w:p>
     <w:bookmarkEnd w:id="55"/>
-    <w:bookmarkStart w:id="56" w:name="references-verified"/>
+    <w:bookmarkStart w:id="56" w:name="references"/>
     <w:p>
       <w:pPr>
         <w:pStyle w:val="Heading1"/>
       </w:pPr>
       <w:r>
-        <w:t xml:space="preserve">References (verified)</w:t>
+        <w:t xml:space="preserve">References</w:t>
       </w:r>
     </w:p>
     <w:p>
@@ -2762,7 +2762,7 @@
         <w:t xml:space="preserve">On the dynamics of exploited fish populations</w:t>
       </w:r>
       <w:r>
-        <w:t xml:space="preserve">. Fishery Investigations Series II, Vol. 19. London: HMSO (reprinted 1993, Springer, doi:10.1007/978-94-011-2106-4).</w:t>
+        <w:t xml:space="preserve">. Fishery Investigations Series II, Vol. 19. London: HMSO (reprinted 1993, Springer, https://doi.org/10.1007/978-94-011-2106-4)</w:t>
       </w:r>
     </w:p>
     <w:p>
@@ -3904,7 +3904,7 @@
         <w:t xml:space="preserve">R: a language and environment for statistical computing</w:t>
       </w:r>
       <w:r>
-        <w:t xml:space="preserve">. Vienna: R Foundation for Statistical Computing. doi:10.32614/R.manuals.</w:t>
+        <w:t xml:space="preserve">. Vienna: R Foundation for Statistical Computing. https://doi.org/10.32614/R.manuals</w:t>
       </w:r>
     </w:p>
     <w:p>
@@ -3975,7 +3975,7 @@
         <w:pStyle w:val="BodyText"/>
       </w:pPr>
       <w:r>
-        <w:t xml:space="preserve">Ushey, K., &amp; Wickham, H. (2026). renv: project environments. R package version 1.3.1. doi:10.32614/CRAN.package.renv.</w:t>
+        <w:t xml:space="preserve">Ushey, K., &amp; Wickham, H. (2026). renv: project environments. R package version 1.3.1. https://doi.org/10.32614/CRAN.package.renv</w:t>
       </w:r>
     </w:p>
     <w:p>

</xml_diff>

<commit_message>
Colless 1982: páginas 100–104 confirmadas pelo Diogo
Co-Authored-By: Claude Opus 5.5 <noreply@anthropic.com>
</commit_message>
<xml_diff>
--- a/manuscript/methods_results.docx
+++ b/manuscript/methods_results.docx
@@ -2980,7 +2980,7 @@
         <w:pStyle w:val="BodyText"/>
       </w:pPr>
       <w:r>
-        <w:t xml:space="preserve">Colless, D. H. (1982). Review of Phylogenetics: the theory and practice of phylogenetic systematics.</w:t>
+        <w:t xml:space="preserve">Colless, D. H. (1982). Review of: Phylogenetics: The theory and practice of phylogenetic systematics.</w:t>
       </w:r>
       <w:r>
         <w:t xml:space="preserve"> </w:t>
@@ -2993,7 +2993,7 @@
         <w:t xml:space="preserve">Systematic Zoology</w:t>
       </w:r>
       <w:r>
-        <w:t xml:space="preserve">, 31, 100–104. [CITAR: conferir página final] https://doi.org/10.2307/2413420</w:t>
+        <w:t xml:space="preserve">, 31, 100–104. https://doi.org/10.2307/2413420</w:t>
       </w:r>
     </w:p>
     <w:p>

</xml_diff>

<commit_message>
Declaração de uso de IA no formato AIdIT (Drobniak et al. 2026) no texto principal e no preprint
Co-Authored-By: Claude Opus 5.5 <noreply@anthropic.com>
</commit_message>
<xml_diff>
--- a/manuscript/methods_results.docx
+++ b/manuscript/methods_results.docx
@@ -3085,6 +3085,27 @@
         <w:pStyle w:val="BodyText"/>
       </w:pPr>
       <w:r>
+        <w:t xml:space="preserve">Drobniak, S. M., Cendrowska-Pek, M., Gudowska, A., Janas, K., Podkowa, P., Skorb, K., Gronowska, M., Oleś, W., Bikmurzina, F., Boroń, N., Zagalska-Neubauer, M., Nakagawa, S., Łagisz, M., Arct, A., &amp; Rutkowska, J. (2026). A systematic map of generative AI guidelines and reporting in ecology and evolutionary biology: towards the framework of AI disclosure for Improved Transparency (AIdIT).</w:t>
+      </w:r>
+      <w:r>
+        <w:t xml:space="preserve"> </w:t>
+      </w:r>
+      <w:r>
+        <w:rPr>
+          <w:i/>
+          <w:iCs/>
+        </w:rPr>
+        <w:t xml:space="preserve">Research Integrity and Peer Review</w:t>
+      </w:r>
+      <w:r>
+        <w:t xml:space="preserve">, 11, 57. https://doi.org/10.1186/s41073-026-00230-1</w:t>
+      </w:r>
+    </w:p>
+    <w:p>
+      <w:pPr>
+        <w:pStyle w:val="BodyText"/>
+      </w:pPr>
+      <w:r>
         <w:t xml:space="preserve">Duarte, L. D. S. (2011). Phylogenetic habitat filtering influences forest nucleation in grasslands.</w:t>
       </w:r>
       <w:r>
@@ -4063,6 +4084,24 @@
       </w:r>
     </w:p>
     <w:bookmarkEnd w:id="56"/>
+    <w:bookmarkStart w:id="57" w:name="ai-disclosure-statement"/>
+    <w:p>
+      <w:pPr>
+        <w:pStyle w:val="Heading1"/>
+      </w:pPr>
+      <w:r>
+        <w:t xml:space="preserve">AI disclosure statement</w:t>
+      </w:r>
+    </w:p>
+    <w:p>
+      <w:pPr>
+        <w:pStyle w:val="FirstParagraph"/>
+      </w:pPr>
+      <w:r>
+        <w:t xml:space="preserve">We used the following AI engines in the present study: Claude Opus 5.5 through Claude Code (Anthropic; v. claude-opus-5-5; timestamp: 2026-10-21); Consensus (timestamp: 2026-10-20); Undermind (timestamp: 2026-10-20); Scholar Gateway and Wiley Scholar Gateway (timestamp: 2026-10-20); LeapSpace (Elsevier; timestamp: 2026-10-20). Area(s) of generative AI usage: Claude Opus 5.5 - new code generation, refining existing code, code generation for visuals, statistical model formulation, identifying appropriate methods, error management, data cross-checking, bibliography management, identification of literature to cite, summarising multiple data sources, text generation based on prompts, text editing for style/grammar/spelling; Consensus - identification of literature to cite; Undermind - identification of literature to cite; Scholar Gateway and Wiley Scholar Gateway - identification of literature to cite; LeapSpace - identification of literature to cite, summarising multiple data sources. The authors declare that they have verified and approved all content generated or modified by the AI tools used. The use of AI in this paper was in compliance with the ethical regulations of all funders and host institutions. Representative prompts used in AI content generation are available upon request. AI tools were used between 2026-10-16 and 2026-10-21, following the AIdIT framework (Drobniak et al., 2026); all design decisions were made by the author, all numbers in the text are computed from the archived outputs of the analyses, and every reference was checked against its DOI.</w:t>
+      </w:r>
+    </w:p>
+    <w:bookmarkEnd w:id="57"/>
     <w:sectPr>
       <w:footerReference r:id="rId9" w:type="default"/>
       <w:footnotePr>

</xml_diff>

<commit_message>
AIdIT: autor no singular, Portaria CNPq nº 2.664/2026 e log de IA no GitHub (link só no preprint)
Co-Authored-By: Claude Opus 5.5 <noreply@anthropic.com>
</commit_message>
<xml_diff>
--- a/manuscript/methods_results.docx
+++ b/manuscript/methods_results.docx
@@ -2980,6 +2980,27 @@
         <w:pStyle w:val="BodyText"/>
       </w:pPr>
       <w:r>
+        <w:t xml:space="preserve">CNPq (Conselho Nacional de Desenvolvimento Científico e Tecnológico). (2026). Portaria CNPq nº 2.664, de 6 de março de 2026: Política de Integridade na Atividade Científica do CNPq.</w:t>
+      </w:r>
+      <w:r>
+        <w:t xml:space="preserve"> </w:t>
+      </w:r>
+      <w:r>
+        <w:rPr>
+          <w:i/>
+          <w:iCs/>
+        </w:rPr>
+        <w:t xml:space="preserve">Diário Oficial da União</w:t>
+      </w:r>
+      <w:r>
+        <w:t xml:space="preserve">, Seção 1, 11 March 2026, p. 4.</w:t>
+      </w:r>
+    </w:p>
+    <w:p>
+      <w:pPr>
+        <w:pStyle w:val="BodyText"/>
+      </w:pPr>
+      <w:r>
         <w:t xml:space="preserve">Colless, D. H. (1982). Review of: Phylogenetics: The theory and practice of phylogenetic systematics.</w:t>
       </w:r>
       <w:r>
@@ -4098,7 +4119,7 @@
         <w:pStyle w:val="FirstParagraph"/>
       </w:pPr>
       <w:r>
-        <w:t xml:space="preserve">We used the following AI engines in the present study: Claude Opus 5.5 through Claude Code (Anthropic; v. claude-opus-5-5; timestamp: 2026-10-21); Consensus (timestamp: 2026-10-20); Undermind (timestamp: 2026-10-20); Scholar Gateway and Wiley Scholar Gateway (timestamp: 2026-10-20); LeapSpace (Elsevier; timestamp: 2026-10-20). Area(s) of generative AI usage: Claude Opus 5.5 - new code generation, refining existing code, code generation for visuals, statistical model formulation, identifying appropriate methods, error management, data cross-checking, bibliography management, identification of literature to cite, summarising multiple data sources, text generation based on prompts, text editing for style/grammar/spelling; Consensus - identification of literature to cite; Undermind - identification of literature to cite; Scholar Gateway and Wiley Scholar Gateway - identification of literature to cite; LeapSpace - identification of literature to cite, summarising multiple data sources. The authors declare that they have verified and approved all content generated or modified by the AI tools used. The use of AI in this paper was in compliance with the ethical regulations of all funders and host institutions. Representative prompts used in AI content generation are available upon request. AI tools were used between 2026-10-16 and 2026-10-21, following the AIdIT framework (Drobniak et al., 2026); all design decisions were made by the author, all numbers in the text are computed from the archived outputs of the analyses, and every reference was checked against its DOI.</w:t>
+        <w:t xml:space="preserve">We used the following AI engines in the present study: Claude Opus 5.5 through Claude Code (Anthropic; v. claude-opus-5-5; timestamp: 2026-10-21); Consensus (timestamp: 2026-10-20); Undermind (timestamp: 2026-10-20); Scholar Gateway and Wiley Scholar Gateway (timestamp: 2026-10-20); LeapSpace (Elsevier; timestamp: 2026-10-20). Area(s) of generative AI usage: Claude Opus 5.5 - new code generation, refining existing code, code generation for visuals, statistical model formulation, identifying appropriate methods, error management, data cross-checking, bibliography management, identification of literature to cite, summarising multiple data sources, text generation based on prompts, text editing for style/grammar/spelling; Consensus - identification of literature to cite; Undermind - identification of literature to cite; Scholar Gateway and Wiley Scholar Gateway - identification of literature to cite; LeapSpace - identification of literature to cite, summarising multiple data sources. The author declares that all content generated or modified by the AI tools used was verified and approved by the author. The use of AI in this paper was in compliance with the ethical regulations of all funders and host institutions, including the Policy on Integrity in Scientific Activity of the Brazilian National Council for Scientific and Technological Development, which requires the declaration of every use of generative AI (Portaria CNPq nº 2.664, of 6 March 2026; CNPq, 2026). Representative prompts used in AI content generation are available upon request, and a log of the interactions with the AI engines is kept in the public code repository (docs/AI_INTERACTION_LOG.md), which will be cited after review. AI tools were used between 2026-10-16 and 2026-10-21, following the AIdIT framework (Drobniak et al., 2026); all design decisions were made by the author, all numbers in the text are computed from the archived outputs of the analyses, and every reference was checked against its DOI.</w:t>
       </w:r>
     </w:p>
     <w:bookmarkEnd w:id="57"/>

</xml_diff>